<commit_message>
Panduan: aturan & tahapan seperti Matdas, urutan level, Coba per sub level, grafik suara
Bagian baru 1.6 (lapisan aturan, satu pilihan per rombel, Berhenti/Lanjut, urutan level,
syarat dengar/baca, mandiri sama dengan sesi); 1.1, 1.2, 2.3, 2.7, 3.1, 4.3, 4.12 dan
tanya jawab disesuaikan. Versi 15 Okt 2026.

Co-Authored-By: Claude Opus 5.5 <noreply@anthropic.com>
</commit_message>
<xml_diff>
--- a/Panduan_Membaca_Data_English_Reading.docx
+++ b/Panduan_Membaca_Data_English_Reading.docx
@@ -117,10 +117,7 @@
         <w:t>Analisis Siswa</w:t>
       </w:r>
       <w:r>
-        <w:t xml:space="preserve"> — gambaran lengkap sat</w:t>
-      </w:r>
-      <w:r>
-        <w:t>u siswa</w:t>
+        <w:t xml:space="preserve"> — gambaran lengkap satu siswa</w:t>
       </w:r>
     </w:p>
     <w:p>
@@ -138,12 +135,7 @@
     </w:p>
     <w:p>
       <w:r>
-        <w:rPr>
-          <w:color w:val="5B6B7D"/>
-          <w:sz w:val="20"/>
-          <w:szCs w:val="20"/>
-        </w:rPr>
-        <w:t>Versi: 13 Oktober 2026 (sesuai tampilan aplikasi per tanggal tersebut)</w:t>
+        <w:t>Versi: 15 Oktober 2026 (sesuai tampilan aplikasi per tanggal tersebut)</w:t>
       </w:r>
     </w:p>
     <w:p>
@@ -181,7 +173,10 @@
               <w:tab w:val="right" w:leader="dot" w:pos="9628"/>
             </w:tabs>
             <w:rPr>
+              <w:rFonts w:asciiTheme="minorHAnsi" w:eastAsiaTheme="minorEastAsia" w:hAnsiTheme="minorHAnsi" w:cstheme="minorBidi"/>
               <w:noProof/>
+              <w:sz w:val="22"/>
+              <w:szCs w:val="22"/>
             </w:rPr>
           </w:pPr>
           <w:r>
@@ -193,7 +188,7 @@
           <w:r>
             <w:fldChar w:fldCharType="separate"/>
           </w:r>
-          <w:hyperlink w:anchor="_Toc242773714" w:history="1">
+          <w:hyperlink w:anchor="_Toc242966006" w:history="1">
             <w:r>
               <w:rPr>
                 <w:rStyle w:val="Hyperlink"/>
@@ -217,7 +212,7 @@
               <w:rPr>
                 <w:noProof/>
               </w:rPr>
-              <w:instrText xml:space="preserve"> PAGEREF _Toc242773714 \h </w:instrText>
+              <w:instrText xml:space="preserve"> PAGEREF _Toc242966006 \h </w:instrText>
             </w:r>
             <w:r>
               <w:rPr>
@@ -251,10 +246,13 @@
               <w:tab w:val="right" w:leader="dot" w:pos="9628"/>
             </w:tabs>
             <w:rPr>
+              <w:rFonts w:asciiTheme="minorHAnsi" w:eastAsiaTheme="minorEastAsia" w:hAnsiTheme="minorHAnsi" w:cstheme="minorBidi"/>
               <w:noProof/>
+              <w:sz w:val="22"/>
+              <w:szCs w:val="22"/>
             </w:rPr>
           </w:pPr>
-          <w:hyperlink w:anchor="_Toc242773715" w:history="1">
+          <w:hyperlink w:anchor="_Toc242966007" w:history="1">
             <w:r>
               <w:rPr>
                 <w:rStyle w:val="Hyperlink"/>
@@ -278,7 +276,7 @@
               <w:rPr>
                 <w:noProof/>
               </w:rPr>
-              <w:instrText xml:space="preserve"> PAGEREF _Toc242773715 \h </w:instrText>
+              <w:instrText xml:space="preserve"> PAGEREF _Toc242966007 \h </w:instrText>
             </w:r>
             <w:r>
               <w:rPr>
@@ -312,10 +310,13 @@
               <w:tab w:val="right" w:leader="dot" w:pos="9628"/>
             </w:tabs>
             <w:rPr>
+              <w:rFonts w:asciiTheme="minorHAnsi" w:eastAsiaTheme="minorEastAsia" w:hAnsiTheme="minorHAnsi" w:cstheme="minorBidi"/>
               <w:noProof/>
+              <w:sz w:val="22"/>
+              <w:szCs w:val="22"/>
             </w:rPr>
           </w:pPr>
-          <w:hyperlink w:anchor="_Toc242773716" w:history="1">
+          <w:hyperlink w:anchor="_Toc242966008" w:history="1">
             <w:r>
               <w:rPr>
                 <w:rStyle w:val="Hyperlink"/>
@@ -339,7 +340,7 @@
               <w:rPr>
                 <w:noProof/>
               </w:rPr>
-              <w:instrText xml:space="preserve"> PAGEREF _Toc242773716 \h </w:instrText>
+              <w:instrText xml:space="preserve"> PAGEREF _Toc242966008 \h </w:instrText>
             </w:r>
             <w:r>
               <w:rPr>
@@ -373,10 +374,13 @@
               <w:tab w:val="right" w:leader="dot" w:pos="9628"/>
             </w:tabs>
             <w:rPr>
+              <w:rFonts w:asciiTheme="minorHAnsi" w:eastAsiaTheme="minorEastAsia" w:hAnsiTheme="minorHAnsi" w:cstheme="minorBidi"/>
               <w:noProof/>
+              <w:sz w:val="22"/>
+              <w:szCs w:val="22"/>
             </w:rPr>
           </w:pPr>
-          <w:hyperlink w:anchor="_Toc242773717" w:history="1">
+          <w:hyperlink w:anchor="_Toc242966009" w:history="1">
             <w:r>
               <w:rPr>
                 <w:rStyle w:val="Hyperlink"/>
@@ -400,7 +404,7 @@
               <w:rPr>
                 <w:noProof/>
               </w:rPr>
-              <w:instrText xml:space="preserve"> PAGEREF _Toc242773717 \h </w:instrText>
+              <w:instrText xml:space="preserve"> PAGEREF _Toc242966009 \h </w:instrText>
             </w:r>
             <w:r>
               <w:rPr>
@@ -434,10 +438,13 @@
               <w:tab w:val="right" w:leader="dot" w:pos="9628"/>
             </w:tabs>
             <w:rPr>
+              <w:rFonts w:asciiTheme="minorHAnsi" w:eastAsiaTheme="minorEastAsia" w:hAnsiTheme="minorHAnsi" w:cstheme="minorBidi"/>
               <w:noProof/>
+              <w:sz w:val="22"/>
+              <w:szCs w:val="22"/>
             </w:rPr>
           </w:pPr>
-          <w:hyperlink w:anchor="_Toc242773718" w:history="1">
+          <w:hyperlink w:anchor="_Toc242966010" w:history="1">
             <w:r>
               <w:rPr>
                 <w:rStyle w:val="Hyperlink"/>
@@ -461,7 +468,7 @@
               <w:rPr>
                 <w:noProof/>
               </w:rPr>
-              <w:instrText xml:space="preserve"> PAGEREF _Toc242773718 \h </w:instrText>
+              <w:instrText xml:space="preserve"> PAGEREF _Toc242966010 \h </w:instrText>
             </w:r>
             <w:r>
               <w:rPr>
@@ -495,10 +502,13 @@
               <w:tab w:val="right" w:leader="dot" w:pos="9628"/>
             </w:tabs>
             <w:rPr>
+              <w:rFonts w:asciiTheme="minorHAnsi" w:eastAsiaTheme="minorEastAsia" w:hAnsiTheme="minorHAnsi" w:cstheme="minorBidi"/>
               <w:noProof/>
+              <w:sz w:val="22"/>
+              <w:szCs w:val="22"/>
             </w:rPr>
           </w:pPr>
-          <w:hyperlink w:anchor="_Toc242773719" w:history="1">
+          <w:hyperlink w:anchor="_Toc242966011" w:history="1">
             <w:r>
               <w:rPr>
                 <w:rStyle w:val="Hyperlink"/>
@@ -522,7 +532,7 @@
               <w:rPr>
                 <w:noProof/>
               </w:rPr>
-              <w:instrText xml:space="preserve"> PAGEREF _Toc242773719 \h </w:instrText>
+              <w:instrText xml:space="preserve"> PAGEREF _Toc242966011 \h </w:instrText>
             </w:r>
             <w:r>
               <w:rPr>
@@ -539,7 +549,71 @@
               <w:rPr>
                 <w:noProof/>
               </w:rPr>
-              <w:t>4</w:t>
+              <w:t>5</w:t>
+            </w:r>
+            <w:r>
+              <w:rPr>
+                <w:noProof/>
+              </w:rPr>
+              <w:fldChar w:fldCharType="end"/>
+            </w:r>
+          </w:hyperlink>
+        </w:p>
+        <w:p>
+          <w:pPr>
+            <w:pStyle w:val="TOC2"/>
+            <w:tabs>
+              <w:tab w:val="right" w:leader="dot" w:pos="9628"/>
+            </w:tabs>
+            <w:rPr>
+              <w:rFonts w:asciiTheme="minorHAnsi" w:eastAsiaTheme="minorEastAsia" w:hAnsiTheme="minorHAnsi" w:cstheme="minorBidi"/>
+              <w:noProof/>
+              <w:sz w:val="22"/>
+              <w:szCs w:val="22"/>
+            </w:rPr>
+          </w:pPr>
+          <w:hyperlink w:anchor="_Toc242966012" w:history="1">
+            <w:r>
+              <w:rPr>
+                <w:rStyle w:val="Hyperlink"/>
+                <w:noProof/>
+              </w:rPr>
+              <w:t>1.6 Aturan dan tahapan: cara sistem memilih</w:t>
+            </w:r>
+            <w:r>
+              <w:rPr>
+                <w:noProof/>
+              </w:rPr>
+              <w:tab/>
+            </w:r>
+            <w:r>
+              <w:rPr>
+                <w:noProof/>
+              </w:rPr>
+              <w:fldChar w:fldCharType="begin"/>
+            </w:r>
+            <w:r>
+              <w:rPr>
+                <w:noProof/>
+              </w:rPr>
+              <w:instrText xml:space="preserve"> PAGEREF _Toc242966012 \h </w:instrText>
+            </w:r>
+            <w:r>
+              <w:rPr>
+                <w:noProof/>
+              </w:rPr>
+            </w:r>
+            <w:r>
+              <w:rPr>
+                <w:noProof/>
+              </w:rPr>
+              <w:fldChar w:fldCharType="separate"/>
+            </w:r>
+            <w:r>
+              <w:rPr>
+                <w:noProof/>
+              </w:rPr>
+              <w:t>5</w:t>
             </w:r>
             <w:r>
               <w:rPr>
@@ -556,10 +630,13 @@
               <w:tab w:val="right" w:leader="dot" w:pos="9628"/>
             </w:tabs>
             <w:rPr>
+              <w:rFonts w:asciiTheme="minorHAnsi" w:eastAsiaTheme="minorEastAsia" w:hAnsiTheme="minorHAnsi" w:cstheme="minorBidi"/>
               <w:noProof/>
+              <w:sz w:val="22"/>
+              <w:szCs w:val="22"/>
             </w:rPr>
           </w:pPr>
-          <w:hyperlink w:anchor="_Toc242773720" w:history="1">
+          <w:hyperlink w:anchor="_Toc242966013" w:history="1">
             <w:r>
               <w:rPr>
                 <w:rStyle w:val="Hyperlink"/>
@@ -583,7 +660,7 @@
               <w:rPr>
                 <w:noProof/>
               </w:rPr>
-              <w:instrText xml:space="preserve"> PAGEREF _Toc242773720 \h </w:instrText>
+              <w:instrText xml:space="preserve"> PAGEREF _Toc242966013 \h </w:instrText>
             </w:r>
             <w:r>
               <w:rPr>
@@ -600,7 +677,7 @@
               <w:rPr>
                 <w:noProof/>
               </w:rPr>
-              <w:t>6</w:t>
+              <w:t>7</w:t>
             </w:r>
             <w:r>
               <w:rPr>
@@ -617,10 +694,13 @@
               <w:tab w:val="right" w:leader="dot" w:pos="9628"/>
             </w:tabs>
             <w:rPr>
+              <w:rFonts w:asciiTheme="minorHAnsi" w:eastAsiaTheme="minorEastAsia" w:hAnsiTheme="minorHAnsi" w:cstheme="minorBidi"/>
               <w:noProof/>
+              <w:sz w:val="22"/>
+              <w:szCs w:val="22"/>
             </w:rPr>
           </w:pPr>
-          <w:hyperlink w:anchor="_Toc242773721" w:history="1">
+          <w:hyperlink w:anchor="_Toc242966014" w:history="1">
             <w:r>
               <w:rPr>
                 <w:rStyle w:val="Hyperlink"/>
@@ -644,7 +724,7 @@
               <w:rPr>
                 <w:noProof/>
               </w:rPr>
-              <w:instrText xml:space="preserve"> PAGEREF _Toc242773721 \h </w:instrText>
+              <w:instrText xml:space="preserve"> PAGEREF _Toc242966014 \h </w:instrText>
             </w:r>
             <w:r>
               <w:rPr>
@@ -661,7 +741,7 @@
               <w:rPr>
                 <w:noProof/>
               </w:rPr>
-              <w:t>6</w:t>
+              <w:t>7</w:t>
             </w:r>
             <w:r>
               <w:rPr>
@@ -678,10 +758,13 @@
               <w:tab w:val="right" w:leader="dot" w:pos="9628"/>
             </w:tabs>
             <w:rPr>
+              <w:rFonts w:asciiTheme="minorHAnsi" w:eastAsiaTheme="minorEastAsia" w:hAnsiTheme="minorHAnsi" w:cstheme="minorBidi"/>
               <w:noProof/>
+              <w:sz w:val="22"/>
+              <w:szCs w:val="22"/>
             </w:rPr>
           </w:pPr>
-          <w:hyperlink w:anchor="_Toc242773722" w:history="1">
+          <w:hyperlink w:anchor="_Toc242966015" w:history="1">
             <w:r>
               <w:rPr>
                 <w:rStyle w:val="Hyperlink"/>
@@ -705,7 +788,7 @@
               <w:rPr>
                 <w:noProof/>
               </w:rPr>
-              <w:instrText xml:space="preserve"> PAGEREF _Toc242773722 \h </w:instrText>
+              <w:instrText xml:space="preserve"> PAGEREF _Toc242966015 \h </w:instrText>
             </w:r>
             <w:r>
               <w:rPr>
@@ -722,7 +805,7 @@
               <w:rPr>
                 <w:noProof/>
               </w:rPr>
-              <w:t>6</w:t>
+              <w:t>7</w:t>
             </w:r>
             <w:r>
               <w:rPr>
@@ -739,10 +822,13 @@
               <w:tab w:val="right" w:leader="dot" w:pos="9628"/>
             </w:tabs>
             <w:rPr>
+              <w:rFonts w:asciiTheme="minorHAnsi" w:eastAsiaTheme="minorEastAsia" w:hAnsiTheme="minorHAnsi" w:cstheme="minorBidi"/>
               <w:noProof/>
+              <w:sz w:val="22"/>
+              <w:szCs w:val="22"/>
             </w:rPr>
           </w:pPr>
-          <w:hyperlink w:anchor="_Toc242773723" w:history="1">
+          <w:hyperlink w:anchor="_Toc242966016" w:history="1">
             <w:r>
               <w:rPr>
                 <w:rStyle w:val="Hyperlink"/>
@@ -766,7 +852,7 @@
               <w:rPr>
                 <w:noProof/>
               </w:rPr>
-              <w:instrText xml:space="preserve"> PAGEREF _Toc242773723 \h </w:instrText>
+              <w:instrText xml:space="preserve"> PAGEREF _Toc242966016 \h </w:instrText>
             </w:r>
             <w:r>
               <w:rPr>
@@ -783,7 +869,7 @@
               <w:rPr>
                 <w:noProof/>
               </w:rPr>
-              <w:t>7</w:t>
+              <w:t>8</w:t>
             </w:r>
             <w:r>
               <w:rPr>
@@ -800,10 +886,13 @@
               <w:tab w:val="right" w:leader="dot" w:pos="9628"/>
             </w:tabs>
             <w:rPr>
+              <w:rFonts w:asciiTheme="minorHAnsi" w:eastAsiaTheme="minorEastAsia" w:hAnsiTheme="minorHAnsi" w:cstheme="minorBidi"/>
               <w:noProof/>
+              <w:sz w:val="22"/>
+              <w:szCs w:val="22"/>
             </w:rPr>
           </w:pPr>
-          <w:hyperlink w:anchor="_Toc242773724" w:history="1">
+          <w:hyperlink w:anchor="_Toc242966017" w:history="1">
             <w:r>
               <w:rPr>
                 <w:rStyle w:val="Hyperlink"/>
@@ -827,7 +916,7 @@
               <w:rPr>
                 <w:noProof/>
               </w:rPr>
-              <w:instrText xml:space="preserve"> PAGEREF _Toc242773724 \h </w:instrText>
+              <w:instrText xml:space="preserve"> PAGEREF _Toc242966017 \h </w:instrText>
             </w:r>
             <w:r>
               <w:rPr>
@@ -844,7 +933,7 @@
               <w:rPr>
                 <w:noProof/>
               </w:rPr>
-              <w:t>7</w:t>
+              <w:t>8</w:t>
             </w:r>
             <w:r>
               <w:rPr>
@@ -861,10 +950,13 @@
               <w:tab w:val="right" w:leader="dot" w:pos="9628"/>
             </w:tabs>
             <w:rPr>
+              <w:rFonts w:asciiTheme="minorHAnsi" w:eastAsiaTheme="minorEastAsia" w:hAnsiTheme="minorHAnsi" w:cstheme="minorBidi"/>
               <w:noProof/>
+              <w:sz w:val="22"/>
+              <w:szCs w:val="22"/>
             </w:rPr>
           </w:pPr>
-          <w:hyperlink w:anchor="_Toc242773725" w:history="1">
+          <w:hyperlink w:anchor="_Toc242966018" w:history="1">
             <w:r>
               <w:rPr>
                 <w:rStyle w:val="Hyperlink"/>
@@ -888,7 +980,7 @@
               <w:rPr>
                 <w:noProof/>
               </w:rPr>
-              <w:instrText xml:space="preserve"> PAGEREF _Toc242773725 \h </w:instrText>
+              <w:instrText xml:space="preserve"> PAGEREF _Toc242966018 \h </w:instrText>
             </w:r>
             <w:r>
               <w:rPr>
@@ -905,7 +997,7 @@
               <w:rPr>
                 <w:noProof/>
               </w:rPr>
-              <w:t>8</w:t>
+              <w:t>9</w:t>
             </w:r>
             <w:r>
               <w:rPr>
@@ -922,10 +1014,13 @@
               <w:tab w:val="right" w:leader="dot" w:pos="9628"/>
             </w:tabs>
             <w:rPr>
+              <w:rFonts w:asciiTheme="minorHAnsi" w:eastAsiaTheme="minorEastAsia" w:hAnsiTheme="minorHAnsi" w:cstheme="minorBidi"/>
               <w:noProof/>
+              <w:sz w:val="22"/>
+              <w:szCs w:val="22"/>
             </w:rPr>
           </w:pPr>
-          <w:hyperlink w:anchor="_Toc242773726" w:history="1">
+          <w:hyperlink w:anchor="_Toc242966019" w:history="1">
             <w:r>
               <w:rPr>
                 <w:rStyle w:val="Hyperlink"/>
@@ -949,7 +1044,7 @@
               <w:rPr>
                 <w:noProof/>
               </w:rPr>
-              <w:instrText xml:space="preserve"> PAGEREF _Toc242773726 \h </w:instrText>
+              <w:instrText xml:space="preserve"> PAGEREF _Toc242966019 \h </w:instrText>
             </w:r>
             <w:r>
               <w:rPr>
@@ -966,7 +1061,7 @@
               <w:rPr>
                 <w:noProof/>
               </w:rPr>
-              <w:t>8</w:t>
+              <w:t>9</w:t>
             </w:r>
             <w:r>
               <w:rPr>
@@ -983,10 +1078,13 @@
               <w:tab w:val="right" w:leader="dot" w:pos="9628"/>
             </w:tabs>
             <w:rPr>
+              <w:rFonts w:asciiTheme="minorHAnsi" w:eastAsiaTheme="minorEastAsia" w:hAnsiTheme="minorHAnsi" w:cstheme="minorBidi"/>
               <w:noProof/>
+              <w:sz w:val="22"/>
+              <w:szCs w:val="22"/>
             </w:rPr>
           </w:pPr>
-          <w:hyperlink w:anchor="_Toc242773727" w:history="1">
+          <w:hyperlink w:anchor="_Toc242966020" w:history="1">
             <w:r>
               <w:rPr>
                 <w:rStyle w:val="Hyperlink"/>
@@ -1010,7 +1108,7 @@
               <w:rPr>
                 <w:noProof/>
               </w:rPr>
-              <w:instrText xml:space="preserve"> PAGEREF _Toc242773727 \h </w:instrText>
+              <w:instrText xml:space="preserve"> PAGEREF _Toc242966020 \h </w:instrText>
             </w:r>
             <w:r>
               <w:rPr>
@@ -1027,7 +1125,7 @@
               <w:rPr>
                 <w:noProof/>
               </w:rPr>
-              <w:t>9</w:t>
+              <w:t>10</w:t>
             </w:r>
             <w:r>
               <w:rPr>
@@ -1044,10 +1142,13 @@
               <w:tab w:val="right" w:leader="dot" w:pos="9628"/>
             </w:tabs>
             <w:rPr>
+              <w:rFonts w:asciiTheme="minorHAnsi" w:eastAsiaTheme="minorEastAsia" w:hAnsiTheme="minorHAnsi" w:cstheme="minorBidi"/>
               <w:noProof/>
+              <w:sz w:val="22"/>
+              <w:szCs w:val="22"/>
             </w:rPr>
           </w:pPr>
-          <w:hyperlink w:anchor="_Toc242773728" w:history="1">
+          <w:hyperlink w:anchor="_Toc242966021" w:history="1">
             <w:r>
               <w:rPr>
                 <w:rStyle w:val="Hyperlink"/>
@@ -1071,7 +1172,7 @@
               <w:rPr>
                 <w:noProof/>
               </w:rPr>
-              <w:instrText xml:space="preserve"> PAGEREF _Toc242773728 \h </w:instrText>
+              <w:instrText xml:space="preserve"> PAGEREF _Toc242966021 \h </w:instrText>
             </w:r>
             <w:r>
               <w:rPr>
@@ -1088,7 +1189,7 @@
               <w:rPr>
                 <w:noProof/>
               </w:rPr>
-              <w:t>10</w:t>
+              <w:t>11</w:t>
             </w:r>
             <w:r>
               <w:rPr>
@@ -1105,10 +1206,13 @@
               <w:tab w:val="right" w:leader="dot" w:pos="9628"/>
             </w:tabs>
             <w:rPr>
+              <w:rFonts w:asciiTheme="minorHAnsi" w:eastAsiaTheme="minorEastAsia" w:hAnsiTheme="minorHAnsi" w:cstheme="minorBidi"/>
               <w:noProof/>
+              <w:sz w:val="22"/>
+              <w:szCs w:val="22"/>
             </w:rPr>
           </w:pPr>
-          <w:hyperlink w:anchor="_Toc242773729" w:history="1">
+          <w:hyperlink w:anchor="_Toc242966022" w:history="1">
             <w:r>
               <w:rPr>
                 <w:rStyle w:val="Hyperlink"/>
@@ -1132,7 +1236,7 @@
               <w:rPr>
                 <w:noProof/>
               </w:rPr>
-              <w:instrText xml:space="preserve"> PAGEREF _Toc242773729 \h </w:instrText>
+              <w:instrText xml:space="preserve"> PAGEREF _Toc242966022 \h </w:instrText>
             </w:r>
             <w:r>
               <w:rPr>
@@ -1149,7 +1253,7 @@
               <w:rPr>
                 <w:noProof/>
               </w:rPr>
-              <w:t>10</w:t>
+              <w:t>11</w:t>
             </w:r>
             <w:r>
               <w:rPr>
@@ -1166,10 +1270,13 @@
               <w:tab w:val="right" w:leader="dot" w:pos="9628"/>
             </w:tabs>
             <w:rPr>
+              <w:rFonts w:asciiTheme="minorHAnsi" w:eastAsiaTheme="minorEastAsia" w:hAnsiTheme="minorHAnsi" w:cstheme="minorBidi"/>
               <w:noProof/>
+              <w:sz w:val="22"/>
+              <w:szCs w:val="22"/>
             </w:rPr>
           </w:pPr>
-          <w:hyperlink w:anchor="_Toc242773730" w:history="1">
+          <w:hyperlink w:anchor="_Toc242966023" w:history="1">
             <w:r>
               <w:rPr>
                 <w:rStyle w:val="Hyperlink"/>
@@ -1193,7 +1300,7 @@
               <w:rPr>
                 <w:noProof/>
               </w:rPr>
-              <w:instrText xml:space="preserve"> PAGEREF _Toc242773730 \h </w:instrText>
+              <w:instrText xml:space="preserve"> PAGEREF _Toc242966023 \h </w:instrText>
             </w:r>
             <w:r>
               <w:rPr>
@@ -1210,7 +1317,7 @@
               <w:rPr>
                 <w:noProof/>
               </w:rPr>
-              <w:t>11</w:t>
+              <w:t>12</w:t>
             </w:r>
             <w:r>
               <w:rPr>
@@ -1227,10 +1334,13 @@
               <w:tab w:val="right" w:leader="dot" w:pos="9628"/>
             </w:tabs>
             <w:rPr>
+              <w:rFonts w:asciiTheme="minorHAnsi" w:eastAsiaTheme="minorEastAsia" w:hAnsiTheme="minorHAnsi" w:cstheme="minorBidi"/>
               <w:noProof/>
+              <w:sz w:val="22"/>
+              <w:szCs w:val="22"/>
             </w:rPr>
           </w:pPr>
-          <w:hyperlink w:anchor="_Toc242773731" w:history="1">
+          <w:hyperlink w:anchor="_Toc242966024" w:history="1">
             <w:r>
               <w:rPr>
                 <w:rStyle w:val="Hyperlink"/>
@@ -1254,7 +1364,7 @@
               <w:rPr>
                 <w:noProof/>
               </w:rPr>
-              <w:instrText xml:space="preserve"> PAGEREF _Toc242773731 \h </w:instrText>
+              <w:instrText xml:space="preserve"> PAGEREF _Toc242966024 \h </w:instrText>
             </w:r>
             <w:r>
               <w:rPr>
@@ -1271,7 +1381,7 @@
               <w:rPr>
                 <w:noProof/>
               </w:rPr>
-              <w:t>13</w:t>
+              <w:t>14</w:t>
             </w:r>
             <w:r>
               <w:rPr>
@@ -1288,10 +1398,13 @@
               <w:tab w:val="right" w:leader="dot" w:pos="9628"/>
             </w:tabs>
             <w:rPr>
+              <w:rFonts w:asciiTheme="minorHAnsi" w:eastAsiaTheme="minorEastAsia" w:hAnsiTheme="minorHAnsi" w:cstheme="minorBidi"/>
               <w:noProof/>
+              <w:sz w:val="22"/>
+              <w:szCs w:val="22"/>
             </w:rPr>
           </w:pPr>
-          <w:hyperlink w:anchor="_Toc242773732" w:history="1">
+          <w:hyperlink w:anchor="_Toc242966025" w:history="1">
             <w:r>
               <w:rPr>
                 <w:rStyle w:val="Hyperlink"/>
@@ -1315,7 +1428,7 @@
               <w:rPr>
                 <w:noProof/>
               </w:rPr>
-              <w:instrText xml:space="preserve"> PAGEREF _Toc242773732 \h </w:instrText>
+              <w:instrText xml:space="preserve"> PAGEREF _Toc242966025 \h </w:instrText>
             </w:r>
             <w:r>
               <w:rPr>
@@ -1332,7 +1445,7 @@
               <w:rPr>
                 <w:noProof/>
               </w:rPr>
-              <w:t>15</w:t>
+              <w:t>16</w:t>
             </w:r>
             <w:r>
               <w:rPr>
@@ -1349,10 +1462,13 @@
               <w:tab w:val="right" w:leader="dot" w:pos="9628"/>
             </w:tabs>
             <w:rPr>
+              <w:rFonts w:asciiTheme="minorHAnsi" w:eastAsiaTheme="minorEastAsia" w:hAnsiTheme="minorHAnsi" w:cstheme="minorBidi"/>
               <w:noProof/>
+              <w:sz w:val="22"/>
+              <w:szCs w:val="22"/>
             </w:rPr>
           </w:pPr>
-          <w:hyperlink w:anchor="_Toc242773733" w:history="1">
+          <w:hyperlink w:anchor="_Toc242966026" w:history="1">
             <w:r>
               <w:rPr>
                 <w:rStyle w:val="Hyperlink"/>
@@ -1376,7 +1492,7 @@
               <w:rPr>
                 <w:noProof/>
               </w:rPr>
-              <w:instrText xml:space="preserve"> PAGEREF _Toc242773733 \h </w:instrText>
+              <w:instrText xml:space="preserve"> PAGEREF _Toc242966026 \h </w:instrText>
             </w:r>
             <w:r>
               <w:rPr>
@@ -1393,7 +1509,7 @@
               <w:rPr>
                 <w:noProof/>
               </w:rPr>
-              <w:t>15</w:t>
+              <w:t>16</w:t>
             </w:r>
             <w:r>
               <w:rPr>
@@ -1410,10 +1526,13 @@
               <w:tab w:val="right" w:leader="dot" w:pos="9628"/>
             </w:tabs>
             <w:rPr>
+              <w:rFonts w:asciiTheme="minorHAnsi" w:eastAsiaTheme="minorEastAsia" w:hAnsiTheme="minorHAnsi" w:cstheme="minorBidi"/>
               <w:noProof/>
+              <w:sz w:val="22"/>
+              <w:szCs w:val="22"/>
             </w:rPr>
           </w:pPr>
-          <w:hyperlink w:anchor="_Toc242773734" w:history="1">
+          <w:hyperlink w:anchor="_Toc242966027" w:history="1">
             <w:r>
               <w:rPr>
                 <w:rStyle w:val="Hyperlink"/>
@@ -1437,7 +1556,7 @@
               <w:rPr>
                 <w:noProof/>
               </w:rPr>
-              <w:instrText xml:space="preserve"> PAGEREF _Toc242773734 \h </w:instrText>
+              <w:instrText xml:space="preserve"> PAGEREF _Toc242966027 \h </w:instrText>
             </w:r>
             <w:r>
               <w:rPr>
@@ -1454,7 +1573,7 @@
               <w:rPr>
                 <w:noProof/>
               </w:rPr>
-              <w:t>15</w:t>
+              <w:t>16</w:t>
             </w:r>
             <w:r>
               <w:rPr>
@@ -1471,10 +1590,13 @@
               <w:tab w:val="right" w:leader="dot" w:pos="9628"/>
             </w:tabs>
             <w:rPr>
+              <w:rFonts w:asciiTheme="minorHAnsi" w:eastAsiaTheme="minorEastAsia" w:hAnsiTheme="minorHAnsi" w:cstheme="minorBidi"/>
               <w:noProof/>
+              <w:sz w:val="22"/>
+              <w:szCs w:val="22"/>
             </w:rPr>
           </w:pPr>
-          <w:hyperlink w:anchor="_Toc242773735" w:history="1">
+          <w:hyperlink w:anchor="_Toc242966028" w:history="1">
             <w:r>
               <w:rPr>
                 <w:rStyle w:val="Hyperlink"/>
@@ -1498,7 +1620,7 @@
               <w:rPr>
                 <w:noProof/>
               </w:rPr>
-              <w:instrText xml:space="preserve"> PAGEREF _Toc242773735 \h </w:instrText>
+              <w:instrText xml:space="preserve"> PAGEREF _Toc242966028 \h </w:instrText>
             </w:r>
             <w:r>
               <w:rPr>
@@ -1515,7 +1637,7 @@
               <w:rPr>
                 <w:noProof/>
               </w:rPr>
-              <w:t>16</w:t>
+              <w:t>17</w:t>
             </w:r>
             <w:r>
               <w:rPr>
@@ -1532,10 +1654,13 @@
               <w:tab w:val="right" w:leader="dot" w:pos="9628"/>
             </w:tabs>
             <w:rPr>
+              <w:rFonts w:asciiTheme="minorHAnsi" w:eastAsiaTheme="minorEastAsia" w:hAnsiTheme="minorHAnsi" w:cstheme="minorBidi"/>
               <w:noProof/>
+              <w:sz w:val="22"/>
+              <w:szCs w:val="22"/>
             </w:rPr>
           </w:pPr>
-          <w:hyperlink w:anchor="_Toc242773736" w:history="1">
+          <w:hyperlink w:anchor="_Toc242966029" w:history="1">
             <w:r>
               <w:rPr>
                 <w:rStyle w:val="Hyperlink"/>
@@ -1559,7 +1684,7 @@
               <w:rPr>
                 <w:noProof/>
               </w:rPr>
-              <w:instrText xml:space="preserve"> PAGEREF _Toc242773736 \h </w:instrText>
+              <w:instrText xml:space="preserve"> PAGEREF _Toc242966029 \h </w:instrText>
             </w:r>
             <w:r>
               <w:rPr>
@@ -1576,7 +1701,7 @@
               <w:rPr>
                 <w:noProof/>
               </w:rPr>
-              <w:t>16</w:t>
+              <w:t>17</w:t>
             </w:r>
             <w:r>
               <w:rPr>
@@ -1593,10 +1718,13 @@
               <w:tab w:val="right" w:leader="dot" w:pos="9628"/>
             </w:tabs>
             <w:rPr>
+              <w:rFonts w:asciiTheme="minorHAnsi" w:eastAsiaTheme="minorEastAsia" w:hAnsiTheme="minorHAnsi" w:cstheme="minorBidi"/>
               <w:noProof/>
+              <w:sz w:val="22"/>
+              <w:szCs w:val="22"/>
             </w:rPr>
           </w:pPr>
-          <w:hyperlink w:anchor="_Toc242773737" w:history="1">
+          <w:hyperlink w:anchor="_Toc242966030" w:history="1">
             <w:r>
               <w:rPr>
                 <w:rStyle w:val="Hyperlink"/>
@@ -1620,7 +1748,7 @@
               <w:rPr>
                 <w:noProof/>
               </w:rPr>
-              <w:instrText xml:space="preserve"> PAGEREF _Toc242773737 \h </w:instrText>
+              <w:instrText xml:space="preserve"> PAGEREF _Toc242966030 \h </w:instrText>
             </w:r>
             <w:r>
               <w:rPr>
@@ -1637,7 +1765,7 @@
               <w:rPr>
                 <w:noProof/>
               </w:rPr>
-              <w:t>17</w:t>
+              <w:t>18</w:t>
             </w:r>
             <w:r>
               <w:rPr>
@@ -1654,10 +1782,13 @@
               <w:tab w:val="right" w:leader="dot" w:pos="9628"/>
             </w:tabs>
             <w:rPr>
+              <w:rFonts w:asciiTheme="minorHAnsi" w:eastAsiaTheme="minorEastAsia" w:hAnsiTheme="minorHAnsi" w:cstheme="minorBidi"/>
               <w:noProof/>
+              <w:sz w:val="22"/>
+              <w:szCs w:val="22"/>
             </w:rPr>
           </w:pPr>
-          <w:hyperlink w:anchor="_Toc242773738" w:history="1">
+          <w:hyperlink w:anchor="_Toc242966031" w:history="1">
             <w:r>
               <w:rPr>
                 <w:rStyle w:val="Hyperlink"/>
@@ -1681,7 +1812,7 @@
               <w:rPr>
                 <w:noProof/>
               </w:rPr>
-              <w:instrText xml:space="preserve"> PAGEREF _Toc242773738 \h </w:instrText>
+              <w:instrText xml:space="preserve"> PAGEREF _Toc242966031 \h </w:instrText>
             </w:r>
             <w:r>
               <w:rPr>
@@ -1698,7 +1829,7 @@
               <w:rPr>
                 <w:noProof/>
               </w:rPr>
-              <w:t>17</w:t>
+              <w:t>18</w:t>
             </w:r>
             <w:r>
               <w:rPr>
@@ -1715,10 +1846,13 @@
               <w:tab w:val="right" w:leader="dot" w:pos="9628"/>
             </w:tabs>
             <w:rPr>
+              <w:rFonts w:asciiTheme="minorHAnsi" w:eastAsiaTheme="minorEastAsia" w:hAnsiTheme="minorHAnsi" w:cstheme="minorBidi"/>
               <w:noProof/>
+              <w:sz w:val="22"/>
+              <w:szCs w:val="22"/>
             </w:rPr>
           </w:pPr>
-          <w:hyperlink w:anchor="_Toc242773739" w:history="1">
+          <w:hyperlink w:anchor="_Toc242966032" w:history="1">
             <w:r>
               <w:rPr>
                 <w:rStyle w:val="Hyperlink"/>
@@ -1742,7 +1876,7 @@
               <w:rPr>
                 <w:noProof/>
               </w:rPr>
-              <w:instrText xml:space="preserve"> PAGEREF _Toc242773739 \h </w:instrText>
+              <w:instrText xml:space="preserve"> PAGEREF _Toc242966032 \h </w:instrText>
             </w:r>
             <w:r>
               <w:rPr>
@@ -1759,7 +1893,7 @@
               <w:rPr>
                 <w:noProof/>
               </w:rPr>
-              <w:t>17</w:t>
+              <w:t>18</w:t>
             </w:r>
             <w:r>
               <w:rPr>
@@ -1776,10 +1910,13 @@
               <w:tab w:val="right" w:leader="dot" w:pos="9628"/>
             </w:tabs>
             <w:rPr>
+              <w:rFonts w:asciiTheme="minorHAnsi" w:eastAsiaTheme="minorEastAsia" w:hAnsiTheme="minorHAnsi" w:cstheme="minorBidi"/>
               <w:noProof/>
+              <w:sz w:val="22"/>
+              <w:szCs w:val="22"/>
             </w:rPr>
           </w:pPr>
-          <w:hyperlink w:anchor="_Toc242773740" w:history="1">
+          <w:hyperlink w:anchor="_Toc242966033" w:history="1">
             <w:r>
               <w:rPr>
                 <w:rStyle w:val="Hyperlink"/>
@@ -1803,7 +1940,7 @@
               <w:rPr>
                 <w:noProof/>
               </w:rPr>
-              <w:instrText xml:space="preserve"> PAGEREF _Toc242773740 \h </w:instrText>
+              <w:instrText xml:space="preserve"> PAGEREF _Toc242966033 \h </w:instrText>
             </w:r>
             <w:r>
               <w:rPr>
@@ -1820,7 +1957,7 @@
               <w:rPr>
                 <w:noProof/>
               </w:rPr>
-              <w:t>17</w:t>
+              <w:t>18</w:t>
             </w:r>
             <w:r>
               <w:rPr>
@@ -1837,10 +1974,13 @@
               <w:tab w:val="right" w:leader="dot" w:pos="9628"/>
             </w:tabs>
             <w:rPr>
+              <w:rFonts w:asciiTheme="minorHAnsi" w:eastAsiaTheme="minorEastAsia" w:hAnsiTheme="minorHAnsi" w:cstheme="minorBidi"/>
               <w:noProof/>
+              <w:sz w:val="22"/>
+              <w:szCs w:val="22"/>
             </w:rPr>
           </w:pPr>
-          <w:hyperlink w:anchor="_Toc242773741" w:history="1">
+          <w:hyperlink w:anchor="_Toc242966034" w:history="1">
             <w:r>
               <w:rPr>
                 <w:rStyle w:val="Hyperlink"/>
@@ -1864,7 +2004,7 @@
               <w:rPr>
                 <w:noProof/>
               </w:rPr>
-              <w:instrText xml:space="preserve"> PAGEREF _Toc242773741 \h </w:instrText>
+              <w:instrText xml:space="preserve"> PAGEREF _Toc242966034 \h </w:instrText>
             </w:r>
             <w:r>
               <w:rPr>
@@ -1881,7 +2021,7 @@
               <w:rPr>
                 <w:noProof/>
               </w:rPr>
-              <w:t>18</w:t>
+              <w:t>19</w:t>
             </w:r>
             <w:r>
               <w:rPr>
@@ -1898,10 +2038,13 @@
               <w:tab w:val="right" w:leader="dot" w:pos="9628"/>
             </w:tabs>
             <w:rPr>
+              <w:rFonts w:asciiTheme="minorHAnsi" w:eastAsiaTheme="minorEastAsia" w:hAnsiTheme="minorHAnsi" w:cstheme="minorBidi"/>
               <w:noProof/>
+              <w:sz w:val="22"/>
+              <w:szCs w:val="22"/>
             </w:rPr>
           </w:pPr>
-          <w:hyperlink w:anchor="_Toc242773742" w:history="1">
+          <w:hyperlink w:anchor="_Toc242966035" w:history="1">
             <w:r>
               <w:rPr>
                 <w:rStyle w:val="Hyperlink"/>
@@ -1925,7 +2068,7 @@
               <w:rPr>
                 <w:noProof/>
               </w:rPr>
-              <w:instrText xml:space="preserve"> PAGEREF _Toc242773742 \h </w:instrText>
+              <w:instrText xml:space="preserve"> PAGEREF _Toc242966035 \h </w:instrText>
             </w:r>
             <w:r>
               <w:rPr>
@@ -1942,7 +2085,7 @@
               <w:rPr>
                 <w:noProof/>
               </w:rPr>
-              <w:t>18</w:t>
+              <w:t>19</w:t>
             </w:r>
             <w:r>
               <w:rPr>
@@ -1959,10 +2102,13 @@
               <w:tab w:val="right" w:leader="dot" w:pos="9628"/>
             </w:tabs>
             <w:rPr>
+              <w:rFonts w:asciiTheme="minorHAnsi" w:eastAsiaTheme="minorEastAsia" w:hAnsiTheme="minorHAnsi" w:cstheme="minorBidi"/>
               <w:noProof/>
+              <w:sz w:val="22"/>
+              <w:szCs w:val="22"/>
             </w:rPr>
           </w:pPr>
-          <w:hyperlink w:anchor="_Toc242773743" w:history="1">
+          <w:hyperlink w:anchor="_Toc242966036" w:history="1">
             <w:r>
               <w:rPr>
                 <w:rStyle w:val="Hyperlink"/>
@@ -1986,7 +2132,7 @@
               <w:rPr>
                 <w:noProof/>
               </w:rPr>
-              <w:instrText xml:space="preserve"> PAGEREF _Toc242773743 \h </w:instrText>
+              <w:instrText xml:space="preserve"> PAGEREF _Toc242966036 \h </w:instrText>
             </w:r>
             <w:r>
               <w:rPr>
@@ -2003,7 +2149,7 @@
               <w:rPr>
                 <w:noProof/>
               </w:rPr>
-              <w:t>19</w:t>
+              <w:t>20</w:t>
             </w:r>
             <w:r>
               <w:rPr>
@@ -2020,10 +2166,13 @@
               <w:tab w:val="right" w:leader="dot" w:pos="9628"/>
             </w:tabs>
             <w:rPr>
+              <w:rFonts w:asciiTheme="minorHAnsi" w:eastAsiaTheme="minorEastAsia" w:hAnsiTheme="minorHAnsi" w:cstheme="minorBidi"/>
               <w:noProof/>
+              <w:sz w:val="22"/>
+              <w:szCs w:val="22"/>
             </w:rPr>
           </w:pPr>
-          <w:hyperlink w:anchor="_Toc242773744" w:history="1">
+          <w:hyperlink w:anchor="_Toc242966037" w:history="1">
             <w:r>
               <w:rPr>
                 <w:rStyle w:val="Hyperlink"/>
@@ -2047,7 +2196,7 @@
               <w:rPr>
                 <w:noProof/>
               </w:rPr>
-              <w:instrText xml:space="preserve"> PAGEREF _Toc242773744 \h </w:instrText>
+              <w:instrText xml:space="preserve"> PAGEREF _Toc242966037 \h </w:instrText>
             </w:r>
             <w:r>
               <w:rPr>
@@ -2064,7 +2213,7 @@
               <w:rPr>
                 <w:noProof/>
               </w:rPr>
-              <w:t>19</w:t>
+              <w:t>20</w:t>
             </w:r>
             <w:r>
               <w:rPr>
@@ -2081,10 +2230,13 @@
               <w:tab w:val="right" w:leader="dot" w:pos="9628"/>
             </w:tabs>
             <w:rPr>
+              <w:rFonts w:asciiTheme="minorHAnsi" w:eastAsiaTheme="minorEastAsia" w:hAnsiTheme="minorHAnsi" w:cstheme="minorBidi"/>
               <w:noProof/>
+              <w:sz w:val="22"/>
+              <w:szCs w:val="22"/>
             </w:rPr>
           </w:pPr>
-          <w:hyperlink w:anchor="_Toc242773745" w:history="1">
+          <w:hyperlink w:anchor="_Toc242966038" w:history="1">
             <w:r>
               <w:rPr>
                 <w:rStyle w:val="Hyperlink"/>
@@ -2108,7 +2260,7 @@
               <w:rPr>
                 <w:noProof/>
               </w:rPr>
-              <w:instrText xml:space="preserve"> PAGEREF _Toc242773745 \h </w:instrText>
+              <w:instrText xml:space="preserve"> PAGEREF _Toc242966038 \h </w:instrText>
             </w:r>
             <w:r>
               <w:rPr>
@@ -2125,7 +2277,7 @@
               <w:rPr>
                 <w:noProof/>
               </w:rPr>
-              <w:t>20</w:t>
+              <w:t>21</w:t>
             </w:r>
             <w:r>
               <w:rPr>
@@ -2142,10 +2294,13 @@
               <w:tab w:val="right" w:leader="dot" w:pos="9628"/>
             </w:tabs>
             <w:rPr>
+              <w:rFonts w:asciiTheme="minorHAnsi" w:eastAsiaTheme="minorEastAsia" w:hAnsiTheme="minorHAnsi" w:cstheme="minorBidi"/>
               <w:noProof/>
+              <w:sz w:val="22"/>
+              <w:szCs w:val="22"/>
             </w:rPr>
           </w:pPr>
-          <w:hyperlink w:anchor="_Toc242773746" w:history="1">
+          <w:hyperlink w:anchor="_Toc242966039" w:history="1">
             <w:r>
               <w:rPr>
                 <w:rStyle w:val="Hyperlink"/>
@@ -2169,7 +2324,7 @@
               <w:rPr>
                 <w:noProof/>
               </w:rPr>
-              <w:instrText xml:space="preserve"> PAGEREF _Toc242773746 \h </w:instrText>
+              <w:instrText xml:space="preserve"> PAGEREF _Toc242966039 \h </w:instrText>
             </w:r>
             <w:r>
               <w:rPr>
@@ -2186,7 +2341,7 @@
               <w:rPr>
                 <w:noProof/>
               </w:rPr>
-              <w:t>20</w:t>
+              <w:t>21</w:t>
             </w:r>
             <w:r>
               <w:rPr>
@@ -2203,10 +2358,13 @@
               <w:tab w:val="right" w:leader="dot" w:pos="9628"/>
             </w:tabs>
             <w:rPr>
+              <w:rFonts w:asciiTheme="minorHAnsi" w:eastAsiaTheme="minorEastAsia" w:hAnsiTheme="minorHAnsi" w:cstheme="minorBidi"/>
               <w:noProof/>
+              <w:sz w:val="22"/>
+              <w:szCs w:val="22"/>
             </w:rPr>
           </w:pPr>
-          <w:hyperlink w:anchor="_Toc242773747" w:history="1">
+          <w:hyperlink w:anchor="_Toc242966040" w:history="1">
             <w:r>
               <w:rPr>
                 <w:rStyle w:val="Hyperlink"/>
@@ -2230,7 +2388,7 @@
               <w:rPr>
                 <w:noProof/>
               </w:rPr>
-              <w:instrText xml:space="preserve"> PAGEREF _Toc242773747 \h </w:instrText>
+              <w:instrText xml:space="preserve"> PAGEREF _Toc242966040 \h </w:instrText>
             </w:r>
             <w:r>
               <w:rPr>
@@ -2247,7 +2405,7 @@
               <w:rPr>
                 <w:noProof/>
               </w:rPr>
-              <w:t>21</w:t>
+              <w:t>22</w:t>
             </w:r>
             <w:r>
               <w:rPr>
@@ -2269,7 +2427,7 @@
         <w:pStyle w:val="Heading1"/>
         <w:pageBreakBefore/>
       </w:pPr>
-      <w:bookmarkStart w:id="0" w:name="_Toc242773714"/>
+      <w:bookmarkStart w:id="0" w:name="_Toc242966006"/>
       <w:r>
         <w:lastRenderedPageBreak/>
         <w:t>1. Sebelum Mulai: Istilah Dasar</w:t>
@@ -2288,7 +2446,7 @@
       <w:pPr>
         <w:pStyle w:val="Heading2"/>
       </w:pPr>
-      <w:bookmarkStart w:id="1" w:name="_Toc242773715"/>
+      <w:bookmarkStart w:id="1" w:name="_Toc242966007"/>
       <w:r>
         <w:t>1.1 Susunan materi: Tahap, Level, dan Sub level</w:t>
       </w:r>
@@ -2299,10 +2457,7 @@
         <w:spacing w:after="120" w:line="276" w:lineRule="auto"/>
       </w:pPr>
       <w:r>
-        <w:t>Materi English Reading tersusun b</w:t>
-      </w:r>
-      <w:r>
-        <w:t>erjenjang dalam enam tahap:</w:t>
+        <w:t>Materi English Reading tersusun berjenjang dalam enam tahap:</w:t>
       </w:r>
     </w:p>
     <w:tbl>
@@ -3525,70 +3680,7 @@
                 <w:sz w:val="19"/>
                 <w:szCs w:val="19"/>
               </w:rPr>
-              <w:t>👀</w:t>
-            </w:r>
-            <w:r>
-              <w:rPr>
-                <w:sz w:val="19"/>
-                <w:szCs w:val="19"/>
-              </w:rPr>
-              <w:t xml:space="preserve"> Kenali, </w:t>
-            </w:r>
-            <w:r>
-              <w:rPr>
-                <w:sz w:val="19"/>
-                <w:szCs w:val="19"/>
-              </w:rPr>
-              <w:t>👂</w:t>
-            </w:r>
-            <w:r>
-              <w:rPr>
-                <w:sz w:val="19"/>
-                <w:szCs w:val="19"/>
-              </w:rPr>
-              <w:t xml:space="preserve"> Dengar, </w:t>
-            </w:r>
-            <w:r>
-              <w:rPr>
-                <w:sz w:val="19"/>
-                <w:szCs w:val="19"/>
-              </w:rPr>
-              <w:t>💬</w:t>
-            </w:r>
-            <w:r>
-              <w:rPr>
-                <w:sz w:val="19"/>
-                <w:szCs w:val="19"/>
-              </w:rPr>
-              <w:t xml:space="preserve"> Situasi, </w:t>
-            </w:r>
-            <w:r>
-              <w:rPr>
-                <w:sz w:val="19"/>
-                <w:szCs w:val="19"/>
-              </w:rPr>
-              <w:t>🧩</w:t>
-            </w:r>
-            <w:r>
-              <w:rPr>
-                <w:sz w:val="19"/>
-                <w:szCs w:val="19"/>
-              </w:rPr>
-              <w:t xml:space="preserve"> Lengkapi &amp; susun, </w:t>
-            </w:r>
-            <w:r>
-              <w:rPr>
-                <w:sz w:val="19"/>
-                <w:szCs w:val="19"/>
-              </w:rPr>
-              <w:t>🎤</w:t>
-            </w:r>
-            <w:r>
-              <w:rPr>
-                <w:sz w:val="19"/>
-                <w:szCs w:val="19"/>
-              </w:rPr>
-              <w:t xml:space="preserve"> Ucapkan</w:t>
+              <w:t>👀 Kenali, 👂 Dengar, 💬 Situasi, 🧩 Lengkapi &amp; susun, 🎤 Ucapkan</w:t>
             </w:r>
           </w:p>
         </w:tc>
@@ -3653,14 +3745,7 @@
                 <w:sz w:val="19"/>
                 <w:szCs w:val="19"/>
               </w:rPr>
-              <w:t>Urutan bawaan seluruh mate</w:t>
-            </w:r>
-            <w:r>
-              <w:rPr>
-                <w:sz w:val="19"/>
-                <w:szCs w:val="19"/>
-              </w:rPr>
-              <w:t>ri dari Tahap 0 sampai Tahap 5, tanpa materi yang ditutup admin.</w:t>
+              <w:t>Urutan bawaan seluruh materi dari Tahap 0 sampai Tahap 5, tanpa materi yang ditutup admin.</w:t>
             </w:r>
           </w:p>
         </w:tc>
@@ -3756,7 +3841,55 @@
                 <w:sz w:val="19"/>
                 <w:szCs w:val="19"/>
               </w:rPr>
-              <w:t>Pilihan materi (tahap → level → sub level) yang dipasang untuk satu rombel atau siswa tertentu, mis. untuk remedial atau persiapan ujian.</w:t>
+              <w:t xml:space="preserve">Pilihan materi (tahap → level → sub level) </w:t>
+            </w:r>
+            <w:r>
+              <w:rPr>
+                <w:b/>
+                <w:bCs/>
+                <w:sz w:val="19"/>
+                <w:szCs w:val="19"/>
+              </w:rPr>
+              <w:t>beserta aturannya</w:t>
+            </w:r>
+            <w:r>
+              <w:rPr>
+                <w:sz w:val="19"/>
+                <w:szCs w:val="19"/>
+              </w:rPr>
+              <w:t>, dipasang untuk satu rombel atau siswa tertentu, mis. untuk remedial atau persiapan ujian. Di dalamnya: aturan dasar, aturan per tahap/level, dan apa yang terjadi sesudah semua level tuntas (</w:t>
+            </w:r>
+            <w:r>
+              <w:rPr>
+                <w:i/>
+                <w:iCs/>
+                <w:sz w:val="19"/>
+                <w:szCs w:val="19"/>
+              </w:rPr>
+              <w:t>Berhenti</w:t>
+            </w:r>
+            <w:r>
+              <w:rPr>
+                <w:sz w:val="19"/>
+                <w:szCs w:val="19"/>
+              </w:rPr>
+              <w:t xml:space="preserve"> atau </w:t>
+            </w:r>
+            <w:r>
+              <w:rPr>
+                <w:i/>
+                <w:iCs/>
+                <w:sz w:val="19"/>
+                <w:szCs w:val="19"/>
+              </w:rPr>
+              <w:t>Lanjut ke Tahapan Level</w:t>
+            </w:r>
+            <w:r>
+              <w:rPr>
+                <w:sz w:val="19"/>
+                <w:szCs w:val="19"/>
+              </w:rPr>
+              <w:t>). Lihat 1.6.</w:t>
             </w:r>
           </w:p>
         </w:tc>
@@ -3801,7 +3934,7 @@
       <w:pPr>
         <w:pStyle w:val="Heading2"/>
       </w:pPr>
-      <w:bookmarkStart w:id="2" w:name="_Toc242773716"/>
+      <w:bookmarkStart w:id="2" w:name="_Toc242966008"/>
       <w:r>
         <w:t>1.2 Istilah kemajuan dan nilai</w:t>
       </w:r>
@@ -4156,6 +4289,7 @@
                 <w:sz w:val="19"/>
                 <w:szCs w:val="19"/>
               </w:rPr>
+              <w:lastRenderedPageBreak/>
               <w:t>Posisi / Posisi sekarang</w:t>
             </w:r>
           </w:p>
@@ -4186,7 +4320,23 @@
                 <w:sz w:val="19"/>
                 <w:szCs w:val="19"/>
               </w:rPr>
-              <w:t>Level pertama yang belum tuntas pada tahapan yang berlaku bagi siswa (Tahap N · Level n: judul).</w:t>
+              <w:t xml:space="preserve">Level pertama yang belum tuntas pada tahapan yang berlaku bagi siswa (Tahap N · Level n: judul). Pada tahapan berujung </w:t>
+            </w:r>
+            <w:r>
+              <w:rPr>
+                <w:i/>
+                <w:iCs/>
+                <w:sz w:val="19"/>
+                <w:szCs w:val="19"/>
+              </w:rPr>
+              <w:t>Lanjut</w:t>
+            </w:r>
+            <w:r>
+              <w:rPr>
+                <w:sz w:val="19"/>
+                <w:szCs w:val="19"/>
+              </w:rPr>
+              <w:t xml:space="preserve"> yang sudah tuntas, posisi berlanjut ke Tahapan Level.</w:t>
             </w:r>
           </w:p>
         </w:tc>
@@ -4267,14 +4417,7 @@
                 <w:sz w:val="19"/>
                 <w:szCs w:val="19"/>
               </w:rPr>
-              <w:t>. Siswa dengan tahapan khusus bisa punya jumlah level yang berbeda dari te</w:t>
-            </w:r>
-            <w:r>
-              <w:rPr>
-                <w:sz w:val="19"/>
-                <w:szCs w:val="19"/>
-              </w:rPr>
-              <w:t>mannya.</w:t>
+              <w:t>. Siswa dengan tahapan khusus bisa punya jumlah level yang berbeda dari temannya.</w:t>
             </w:r>
           </w:p>
         </w:tc>
@@ -4311,7 +4454,6 @@
                 <w:sz w:val="19"/>
                 <w:szCs w:val="19"/>
               </w:rPr>
-              <w:lastRenderedPageBreak/>
               <w:t>Rata-rata nilai</w:t>
             </w:r>
           </w:p>
@@ -4474,14 +4616,7 @@
                 <w:sz w:val="19"/>
                 <w:szCs w:val="19"/>
               </w:rPr>
-              <w:t xml:space="preserve">Hasil Baca &amp; Koreksi: kata yang dikenali tepat ÷ kata yang dibaca. Menilai apakah kata dikenali, </w:t>
-            </w:r>
-            <w:r>
-              <w:rPr>
-                <w:sz w:val="19"/>
-                <w:szCs w:val="19"/>
-              </w:rPr>
-              <w:t>bukan penilaian fonetik rinci.</w:t>
+              <w:t>Hasil Baca &amp; Koreksi: kata yang dikenali tepat ÷ kata yang dibaca. Menilai apakah kata dikenali, bukan penilaian fonetik rinci.</w:t>
             </w:r>
           </w:p>
         </w:tc>
@@ -4613,7 +4748,120 @@
                 <w:sz w:val="19"/>
                 <w:szCs w:val="19"/>
               </w:rPr>
-              <w:t>Semua level pada tahapan yang berlaku sudah tuntas.</w:t>
+              <w:t xml:space="preserve">Semua level pada tahapan yang berlaku sudah tuntas. Tahapan berujung </w:t>
+            </w:r>
+            <w:r>
+              <w:rPr>
+                <w:i/>
+                <w:iCs/>
+                <w:sz w:val="19"/>
+                <w:szCs w:val="19"/>
+              </w:rPr>
+              <w:t>Berhenti</w:t>
+            </w:r>
+            <w:r>
+              <w:rPr>
+                <w:sz w:val="19"/>
+                <w:szCs w:val="19"/>
+              </w:rPr>
+              <w:t xml:space="preserve">: siswa melihat "Tahapan latihan selesai" dan kolom Posisi menulis "Tahapan selesai". Tahapan berujung </w:t>
+            </w:r>
+            <w:r>
+              <w:rPr>
+                <w:i/>
+                <w:iCs/>
+                <w:sz w:val="19"/>
+                <w:szCs w:val="19"/>
+              </w:rPr>
+              <w:t>Lanjut</w:t>
+            </w:r>
+            <w:r>
+              <w:rPr>
+                <w:sz w:val="19"/>
+                <w:szCs w:val="19"/>
+              </w:rPr>
+              <w:t>: siswa otomatis melanjutkan Tahapan Level.</w:t>
+            </w:r>
+          </w:p>
+        </w:tc>
+      </w:tr>
+      <w:tr>
+        <w:trPr>
+          <w:cantSplit/>
+        </w:trPr>
+        <w:tc>
+          <w:tcPr>
+            <w:tcW w:w="2891" w:type="dxa"/>
+            <w:tcBorders>
+              <w:top w:val="single" w:sz="4" w:space="0" w:color="C9D3DE"/>
+              <w:left w:val="single" w:sz="4" w:space="0" w:color="C9D3DE"/>
+              <w:bottom w:val="single" w:sz="4" w:space="0" w:color="C9D3DE"/>
+              <w:right w:val="single" w:sz="4" w:space="0" w:color="C9D3DE"/>
+            </w:tcBorders>
+            <w:tcMar>
+              <w:top w:w="70" w:type="dxa"/>
+              <w:left w:w="110" w:type="dxa"/>
+              <w:bottom w:w="70" w:type="dxa"/>
+              <w:right w:w="110" w:type="dxa"/>
+            </w:tcMar>
+          </w:tcPr>
+          <w:p>
+            <w:pPr>
+              <w:spacing w:after="30"/>
+            </w:pPr>
+            <w:r>
+              <w:rPr>
+                <w:b/>
+                <w:bCs/>
+                <w:sz w:val="19"/>
+                <w:szCs w:val="19"/>
+              </w:rPr>
+              <w:t>Tahapan selesai</w:t>
+            </w:r>
+          </w:p>
+        </w:tc>
+        <w:tc>
+          <w:tcPr>
+            <w:tcW w:w="6747" w:type="dxa"/>
+            <w:tcBorders>
+              <w:top w:val="single" w:sz="4" w:space="0" w:color="C9D3DE"/>
+              <w:left w:val="single" w:sz="4" w:space="0" w:color="C9D3DE"/>
+              <w:bottom w:val="single" w:sz="4" w:space="0" w:color="C9D3DE"/>
+              <w:right w:val="single" w:sz="4" w:space="0" w:color="C9D3DE"/>
+            </w:tcBorders>
+            <w:tcMar>
+              <w:top w:w="70" w:type="dxa"/>
+              <w:left w:w="110" w:type="dxa"/>
+              <w:bottom w:w="70" w:type="dxa"/>
+              <w:right w:w="110" w:type="dxa"/>
+            </w:tcMar>
+          </w:tcPr>
+          <w:p>
+            <w:pPr>
+              <w:spacing w:after="30"/>
+            </w:pPr>
+            <w:r>
+              <w:rPr>
+                <w:sz w:val="19"/>
+                <w:szCs w:val="19"/>
+              </w:rPr>
+              <w:t xml:space="preserve">Semua level tahapan khusus berujung </w:t>
+            </w:r>
+            <w:r>
+              <w:rPr>
+                <w:i/>
+                <w:iCs/>
+                <w:sz w:val="19"/>
+                <w:szCs w:val="19"/>
+              </w:rPr>
+              <w:t>Berhenti</w:t>
+            </w:r>
+            <w:r>
+              <w:rPr>
+                <w:sz w:val="19"/>
+                <w:szCs w:val="19"/>
+              </w:rPr>
+              <w:t xml:space="preserve"> sudah tuntas. Siswa melihat "Tahapan latihan selesai" dan menunggu arahan guru.</w:t>
             </w:r>
           </w:p>
         </w:tc>
@@ -4628,7 +4876,7 @@
       <w:pPr>
         <w:pStyle w:val="Heading2"/>
       </w:pPr>
-      <w:bookmarkStart w:id="3" w:name="_Toc242773717"/>
+      <w:bookmarkStart w:id="3" w:name="_Toc242966009"/>
       <w:r>
         <w:t>1.3 Sesi kelas dan latihan mandiri</w:t>
       </w:r>
@@ -4844,14 +5092,7 @@
                 <w:sz w:val="19"/>
                 <w:szCs w:val="19"/>
               </w:rPr>
-              <w:t>Di luar se</w:t>
-            </w:r>
-            <w:r>
-              <w:rPr>
-                <w:sz w:val="19"/>
-                <w:szCs w:val="19"/>
-              </w:rPr>
-              <w:t>si kelas, kapan saja (bila diizinkan admin).</w:t>
+              <w:t>Di luar sesi kelas, kapan saja (bila diizinkan admin).</w:t>
             </w:r>
           </w:p>
         </w:tc>
@@ -5340,7 +5581,7 @@
       <w:pPr>
         <w:pStyle w:val="Heading2"/>
       </w:pPr>
-      <w:bookmarkStart w:id="4" w:name="_Toc242773718"/>
+      <w:bookmarkStart w:id="4" w:name="_Toc242966010"/>
       <w:r>
         <w:t>1.4 Ukuran waktu "7 hari" dan "30 hari"</w:t>
       </w:r>
@@ -5418,6 +5659,7 @@
           <w:b/>
           <w:bCs/>
         </w:rPr>
+        <w:lastRenderedPageBreak/>
         <w:t>Macet</w:t>
       </w:r>
       <w:r>
@@ -5428,14 +5670,7 @@
           <w:b/>
           <w:bCs/>
         </w:rPr>
-        <w:t xml:space="preserve">30 hari </w:t>
-      </w:r>
-      <w:r>
-        <w:rPr>
-          <w:b/>
-          <w:bCs/>
-        </w:rPr>
-        <w:t>terakhir</w:t>
+        <w:t>30 hari terakhir</w:t>
       </w:r>
       <w:r>
         <w:t>: satu sub level dicoba 3 kali atau lebih tanpa pernah mencapai 80%.</w:t>
@@ -5468,7 +5703,7 @@
       <w:pPr>
         <w:pStyle w:val="Heading2"/>
       </w:pPr>
-      <w:bookmarkStart w:id="5" w:name="_Toc242773719"/>
+      <w:bookmarkStart w:id="5" w:name="_Toc242966011"/>
       <w:r>
         <w:t>1.5 Arti warna label</w:t>
       </w:r>
@@ -5533,7 +5768,6 @@
                 <w:sz w:val="19"/>
                 <w:szCs w:val="19"/>
               </w:rPr>
-              <w:lastRenderedPageBreak/>
               <w:t>Warna</w:t>
             </w:r>
           </w:p>
@@ -5567,17 +5801,7 @@
                 <w:sz w:val="19"/>
                 <w:szCs w:val="19"/>
               </w:rPr>
-              <w:t>Arti um</w:t>
-            </w:r>
-            <w:r>
-              <w:rPr>
-                <w:b/>
-                <w:bCs/>
-                <w:color w:val="FFFFFF"/>
-                <w:sz w:val="19"/>
-                <w:szCs w:val="19"/>
-              </w:rPr>
-              <w:t>um</w:t>
+              <w:t>Arti umum</w:t>
             </w:r>
           </w:p>
         </w:tc>
@@ -6182,15 +6406,1124 @@
     </w:p>
     <w:p>
       <w:pPr>
+        <w:pStyle w:val="Heading2"/>
+      </w:pPr>
+      <w:bookmarkStart w:id="6" w:name="_Toc242966012"/>
+      <w:r>
+        <w:t>1.6 Aturan dan tahapan: cara sistem memilih</w:t>
+      </w:r>
+      <w:bookmarkEnd w:id="6"/>
+    </w:p>
+    <w:p>
+      <w:pPr>
+        <w:spacing w:before="120" w:after="120" w:line="276" w:lineRule="auto"/>
+      </w:pPr>
+      <w:r>
+        <w:t xml:space="preserve">Aturan latihan (jumlah soal, syarat dengar/baca, bila jawaban salah, urutan level, dan lainnya) disusun </w:t>
+      </w:r>
+      <w:r>
+        <w:rPr>
+          <w:b/>
+          <w:bCs/>
+        </w:rPr>
+        <w:t>berlapis</w:t>
+      </w:r>
+      <w:r>
+        <w:t>. Lapisan yang lebih atas menang, isian demi isian; isian yang tidak diatur mengikuti lapisan di bawahnya.</w:t>
+      </w:r>
+    </w:p>
+    <w:tbl>
+      <w:tblPr>
+        <w:tblW w:w="9638" w:type="dxa"/>
+        <w:tblBorders>
+          <w:top w:val="single" w:sz="4" w:space="0" w:color="auto"/>
+          <w:left w:val="single" w:sz="4" w:space="0" w:color="auto"/>
+          <w:bottom w:val="single" w:sz="4" w:space="0" w:color="auto"/>
+          <w:right w:val="single" w:sz="4" w:space="0" w:color="auto"/>
+          <w:insideH w:val="single" w:sz="4" w:space="0" w:color="auto"/>
+          <w:insideV w:val="single" w:sz="4" w:space="0" w:color="auto"/>
+        </w:tblBorders>
+        <w:tblLook w:val="04A0" w:firstRow="1" w:lastRow="0" w:firstColumn="1" w:lastColumn="0" w:noHBand="0" w:noVBand="1"/>
+      </w:tblPr>
+      <w:tblGrid>
+        <w:gridCol w:w="2600"/>
+        <w:gridCol w:w="7038"/>
+      </w:tblGrid>
+      <w:tr>
+        <w:trPr>
+          <w:tblHeader/>
+        </w:trPr>
+        <w:tc>
+          <w:tcPr>
+            <w:tcW w:w="2600" w:type="dxa"/>
+            <w:tcBorders>
+              <w:top w:val="single" w:sz="4" w:space="0" w:color="C9D3DE"/>
+              <w:left w:val="single" w:sz="4" w:space="0" w:color="C9D3DE"/>
+              <w:bottom w:val="single" w:sz="4" w:space="0" w:color="C9D3DE"/>
+              <w:right w:val="single" w:sz="4" w:space="0" w:color="C9D3DE"/>
+            </w:tcBorders>
+            <w:shd w:val="clear" w:color="auto" w:fill="1F3A5F"/>
+            <w:tcMar>
+              <w:top w:w="70" w:type="dxa"/>
+              <w:left w:w="110" w:type="dxa"/>
+              <w:bottom w:w="70" w:type="dxa"/>
+              <w:right w:w="110" w:type="dxa"/>
+            </w:tcMar>
+          </w:tcPr>
+          <w:p>
+            <w:pPr>
+              <w:spacing w:after="30"/>
+            </w:pPr>
+            <w:r>
+              <w:rPr>
+                <w:b/>
+                <w:bCs/>
+                <w:color w:val="FFFFFF"/>
+                <w:sz w:val="19"/>
+                <w:szCs w:val="19"/>
+              </w:rPr>
+              <w:t>Lapisan (atas = paling kuat)</w:t>
+            </w:r>
+          </w:p>
+        </w:tc>
+        <w:tc>
+          <w:tcPr>
+            <w:tcW w:w="7038" w:type="dxa"/>
+            <w:tcBorders>
+              <w:top w:val="single" w:sz="4" w:space="0" w:color="C9D3DE"/>
+              <w:left w:val="single" w:sz="4" w:space="0" w:color="C9D3DE"/>
+              <w:bottom w:val="single" w:sz="4" w:space="0" w:color="C9D3DE"/>
+              <w:right w:val="single" w:sz="4" w:space="0" w:color="C9D3DE"/>
+            </w:tcBorders>
+            <w:shd w:val="clear" w:color="auto" w:fill="1F3A5F"/>
+            <w:tcMar>
+              <w:top w:w="70" w:type="dxa"/>
+              <w:left w:w="110" w:type="dxa"/>
+              <w:bottom w:w="70" w:type="dxa"/>
+              <w:right w:w="110" w:type="dxa"/>
+            </w:tcMar>
+          </w:tcPr>
+          <w:p>
+            <w:pPr>
+              <w:spacing w:after="30"/>
+            </w:pPr>
+            <w:r>
+              <w:rPr>
+                <w:b/>
+                <w:bCs/>
+                <w:color w:val="FFFFFF"/>
+                <w:sz w:val="19"/>
+                <w:szCs w:val="19"/>
+              </w:rPr>
+              <w:t>Asalnya</w:t>
+            </w:r>
+          </w:p>
+        </w:tc>
+      </w:tr>
+      <w:tr>
+        <w:trPr>
+          <w:cantSplit/>
+        </w:trPr>
+        <w:tc>
+          <w:tcPr>
+            <w:tcW w:w="2600" w:type="dxa"/>
+            <w:tcBorders>
+              <w:top w:val="single" w:sz="4" w:space="0" w:color="C9D3DE"/>
+              <w:left w:val="single" w:sz="4" w:space="0" w:color="C9D3DE"/>
+              <w:bottom w:val="single" w:sz="4" w:space="0" w:color="C9D3DE"/>
+              <w:right w:val="single" w:sz="4" w:space="0" w:color="C9D3DE"/>
+            </w:tcBorders>
+            <w:tcMar>
+              <w:top w:w="70" w:type="dxa"/>
+              <w:left w:w="110" w:type="dxa"/>
+              <w:bottom w:w="70" w:type="dxa"/>
+              <w:right w:w="110" w:type="dxa"/>
+            </w:tcMar>
+          </w:tcPr>
+          <w:p>
+            <w:pPr>
+              <w:spacing w:after="30"/>
+            </w:pPr>
+            <w:r>
+              <w:rPr>
+                <w:b/>
+                <w:bCs/>
+                <w:sz w:val="19"/>
+                <w:szCs w:val="19"/>
+              </w:rPr>
+              <w:t>1. Profil siswa</w:t>
+            </w:r>
+          </w:p>
+        </w:tc>
+        <w:tc>
+          <w:tcPr>
+            <w:tcW w:w="7038" w:type="dxa"/>
+            <w:tcBorders>
+              <w:top w:val="single" w:sz="4" w:space="0" w:color="C9D3DE"/>
+              <w:left w:val="single" w:sz="4" w:space="0" w:color="C9D3DE"/>
+              <w:bottom w:val="single" w:sz="4" w:space="0" w:color="C9D3DE"/>
+              <w:right w:val="single" w:sz="4" w:space="0" w:color="C9D3DE"/>
+            </w:tcBorders>
+            <w:tcMar>
+              <w:top w:w="70" w:type="dxa"/>
+              <w:left w:w="110" w:type="dxa"/>
+              <w:bottom w:w="70" w:type="dxa"/>
+              <w:right w:w="110" w:type="dxa"/>
+            </w:tcMar>
+          </w:tcPr>
+          <w:p>
+            <w:pPr>
+              <w:spacing w:after="30"/>
+            </w:pPr>
+            <w:r>
+              <w:rPr>
+                <w:sz w:val="19"/>
+                <w:szCs w:val="19"/>
+              </w:rPr>
+              <w:t>Dipasang untuk siswa tertentu lewat Sesi Kegiatan atau Analisis Siswa.</w:t>
+            </w:r>
+          </w:p>
+        </w:tc>
+      </w:tr>
+      <w:tr>
+        <w:trPr>
+          <w:cantSplit/>
+        </w:trPr>
+        <w:tc>
+          <w:tcPr>
+            <w:tcW w:w="2600" w:type="dxa"/>
+            <w:tcBorders>
+              <w:top w:val="single" w:sz="4" w:space="0" w:color="C9D3DE"/>
+              <w:left w:val="single" w:sz="4" w:space="0" w:color="C9D3DE"/>
+              <w:bottom w:val="single" w:sz="4" w:space="0" w:color="C9D3DE"/>
+              <w:right w:val="single" w:sz="4" w:space="0" w:color="C9D3DE"/>
+            </w:tcBorders>
+            <w:shd w:val="clear" w:color="auto" w:fill="F8FAFC"/>
+            <w:tcMar>
+              <w:top w:w="70" w:type="dxa"/>
+              <w:left w:w="110" w:type="dxa"/>
+              <w:bottom w:w="70" w:type="dxa"/>
+              <w:right w:w="110" w:type="dxa"/>
+            </w:tcMar>
+          </w:tcPr>
+          <w:p>
+            <w:pPr>
+              <w:spacing w:after="30"/>
+            </w:pPr>
+            <w:r>
+              <w:rPr>
+                <w:b/>
+                <w:bCs/>
+                <w:sz w:val="19"/>
+                <w:szCs w:val="19"/>
+              </w:rPr>
+              <w:t>2. Aturan per bagian tahapan</w:t>
+            </w:r>
+          </w:p>
+        </w:tc>
+        <w:tc>
+          <w:tcPr>
+            <w:tcW w:w="7038" w:type="dxa"/>
+            <w:tcBorders>
+              <w:top w:val="single" w:sz="4" w:space="0" w:color="C9D3DE"/>
+              <w:left w:val="single" w:sz="4" w:space="0" w:color="C9D3DE"/>
+              <w:bottom w:val="single" w:sz="4" w:space="0" w:color="C9D3DE"/>
+              <w:right w:val="single" w:sz="4" w:space="0" w:color="C9D3DE"/>
+            </w:tcBorders>
+            <w:shd w:val="clear" w:color="auto" w:fill="F8FAFC"/>
+            <w:tcMar>
+              <w:top w:w="70" w:type="dxa"/>
+              <w:left w:w="110" w:type="dxa"/>
+              <w:bottom w:w="70" w:type="dxa"/>
+              <w:right w:w="110" w:type="dxa"/>
+            </w:tcMar>
+          </w:tcPr>
+          <w:p>
+            <w:pPr>
+              <w:spacing w:after="30"/>
+            </w:pPr>
+            <w:r>
+              <w:rPr>
+                <w:sz w:val="19"/>
+                <w:szCs w:val="19"/>
+              </w:rPr>
+              <w:t xml:space="preserve">Profil yang dipasang pada </w:t>
+            </w:r>
+            <w:r>
+              <w:rPr>
+                <w:b/>
+                <w:bCs/>
+                <w:sz w:val="19"/>
+                <w:szCs w:val="19"/>
+              </w:rPr>
+              <w:t>tahap</w:t>
+            </w:r>
+            <w:r>
+              <w:rPr>
+                <w:sz w:val="19"/>
+                <w:szCs w:val="19"/>
+              </w:rPr>
+              <w:t xml:space="preserve"> atau </w:t>
+            </w:r>
+            <w:r>
+              <w:rPr>
+                <w:b/>
+                <w:bCs/>
+                <w:sz w:val="19"/>
+                <w:szCs w:val="19"/>
+              </w:rPr>
+              <w:t>level</w:t>
+            </w:r>
+            <w:r>
+              <w:rPr>
+                <w:sz w:val="19"/>
+                <w:szCs w:val="19"/>
+              </w:rPr>
+              <w:t xml:space="preserve"> tertentu di dalam tahapan khusus; berlaku selama siswa mengerjakan bagian itu. Termasuk profil </w:t>
+            </w:r>
+            <w:r>
+              <w:rPr>
+                <w:i/>
+                <w:iCs/>
+                <w:sz w:val="19"/>
+                <w:szCs w:val="19"/>
+              </w:rPr>
+              <w:t>sesudah tahapan</w:t>
+            </w:r>
+            <w:r>
+              <w:rPr>
+                <w:sz w:val="19"/>
+                <w:szCs w:val="19"/>
+              </w:rPr>
+              <w:t xml:space="preserve"> untuk materi lanjutan pada tahapan berujung Lanjut.</w:t>
+            </w:r>
+          </w:p>
+        </w:tc>
+      </w:tr>
+      <w:tr>
+        <w:trPr>
+          <w:cantSplit/>
+        </w:trPr>
+        <w:tc>
+          <w:tcPr>
+            <w:tcW w:w="2600" w:type="dxa"/>
+            <w:tcBorders>
+              <w:top w:val="single" w:sz="4" w:space="0" w:color="C9D3DE"/>
+              <w:left w:val="single" w:sz="4" w:space="0" w:color="C9D3DE"/>
+              <w:bottom w:val="single" w:sz="4" w:space="0" w:color="C9D3DE"/>
+              <w:right w:val="single" w:sz="4" w:space="0" w:color="C9D3DE"/>
+            </w:tcBorders>
+            <w:tcMar>
+              <w:top w:w="70" w:type="dxa"/>
+              <w:left w:w="110" w:type="dxa"/>
+              <w:bottom w:w="70" w:type="dxa"/>
+              <w:right w:w="110" w:type="dxa"/>
+            </w:tcMar>
+          </w:tcPr>
+          <w:p>
+            <w:pPr>
+              <w:spacing w:after="30"/>
+            </w:pPr>
+            <w:r>
+              <w:rPr>
+                <w:b/>
+                <w:bCs/>
+                <w:sz w:val="19"/>
+                <w:szCs w:val="19"/>
+              </w:rPr>
+              <w:t>3. Aturan dasar</w:t>
+            </w:r>
+          </w:p>
+        </w:tc>
+        <w:tc>
+          <w:tcPr>
+            <w:tcW w:w="7038" w:type="dxa"/>
+            <w:tcBorders>
+              <w:top w:val="single" w:sz="4" w:space="0" w:color="C9D3DE"/>
+              <w:left w:val="single" w:sz="4" w:space="0" w:color="C9D3DE"/>
+              <w:bottom w:val="single" w:sz="4" w:space="0" w:color="C9D3DE"/>
+              <w:right w:val="single" w:sz="4" w:space="0" w:color="C9D3DE"/>
+            </w:tcBorders>
+            <w:tcMar>
+              <w:top w:w="70" w:type="dxa"/>
+              <w:left w:w="110" w:type="dxa"/>
+              <w:bottom w:w="70" w:type="dxa"/>
+              <w:right w:w="110" w:type="dxa"/>
+            </w:tcMar>
+          </w:tcPr>
+          <w:p>
+            <w:pPr>
+              <w:spacing w:after="30"/>
+            </w:pPr>
+            <w:r>
+              <w:rPr>
+                <w:sz w:val="19"/>
+                <w:szCs w:val="19"/>
+              </w:rPr>
+              <w:t xml:space="preserve">Rombel bertahapan khusus: </w:t>
+            </w:r>
+            <w:r>
+              <w:rPr>
+                <w:b/>
+                <w:bCs/>
+                <w:sz w:val="19"/>
+                <w:szCs w:val="19"/>
+              </w:rPr>
+              <w:t>aturan dasar tahapan</w:t>
+            </w:r>
+            <w:r>
+              <w:rPr>
+                <w:sz w:val="19"/>
+                <w:szCs w:val="19"/>
+              </w:rPr>
+              <w:t xml:space="preserve"> itu. Rombel tanpa tahapan khusus: </w:t>
+            </w:r>
+            <w:r>
+              <w:rPr>
+                <w:b/>
+                <w:bCs/>
+                <w:sz w:val="19"/>
+                <w:szCs w:val="19"/>
+              </w:rPr>
+              <w:t>profil aturan rombel</w:t>
+            </w:r>
+            <w:r>
+              <w:rPr>
+                <w:sz w:val="19"/>
+                <w:szCs w:val="19"/>
+              </w:rPr>
+              <w:t>.</w:t>
+            </w:r>
+          </w:p>
+        </w:tc>
+      </w:tr>
+      <w:tr>
+        <w:trPr>
+          <w:cantSplit/>
+        </w:trPr>
+        <w:tc>
+          <w:tcPr>
+            <w:tcW w:w="2600" w:type="dxa"/>
+            <w:tcBorders>
+              <w:top w:val="single" w:sz="4" w:space="0" w:color="C9D3DE"/>
+              <w:left w:val="single" w:sz="4" w:space="0" w:color="C9D3DE"/>
+              <w:bottom w:val="single" w:sz="4" w:space="0" w:color="C9D3DE"/>
+              <w:right w:val="single" w:sz="4" w:space="0" w:color="C9D3DE"/>
+            </w:tcBorders>
+            <w:shd w:val="clear" w:color="auto" w:fill="F8FAFC"/>
+            <w:tcMar>
+              <w:top w:w="70" w:type="dxa"/>
+              <w:left w:w="110" w:type="dxa"/>
+              <w:bottom w:w="70" w:type="dxa"/>
+              <w:right w:w="110" w:type="dxa"/>
+            </w:tcMar>
+          </w:tcPr>
+          <w:p>
+            <w:pPr>
+              <w:spacing w:after="30"/>
+            </w:pPr>
+            <w:r>
+              <w:rPr>
+                <w:b/>
+                <w:bCs/>
+                <w:sz w:val="19"/>
+                <w:szCs w:val="19"/>
+              </w:rPr>
+              <w:t>4. Pengaturan Umum</w:t>
+            </w:r>
+          </w:p>
+        </w:tc>
+        <w:tc>
+          <w:tcPr>
+            <w:tcW w:w="7038" w:type="dxa"/>
+            <w:tcBorders>
+              <w:top w:val="single" w:sz="4" w:space="0" w:color="C9D3DE"/>
+              <w:left w:val="single" w:sz="4" w:space="0" w:color="C9D3DE"/>
+              <w:bottom w:val="single" w:sz="4" w:space="0" w:color="C9D3DE"/>
+              <w:right w:val="single" w:sz="4" w:space="0" w:color="C9D3DE"/>
+            </w:tcBorders>
+            <w:shd w:val="clear" w:color="auto" w:fill="F8FAFC"/>
+            <w:tcMar>
+              <w:top w:w="70" w:type="dxa"/>
+              <w:left w:w="110" w:type="dxa"/>
+              <w:bottom w:w="70" w:type="dxa"/>
+              <w:right w:w="110" w:type="dxa"/>
+            </w:tcMar>
+          </w:tcPr>
+          <w:p>
+            <w:pPr>
+              <w:spacing w:after="30"/>
+            </w:pPr>
+            <w:r>
+              <w:rPr>
+                <w:sz w:val="19"/>
+                <w:szCs w:val="19"/>
+              </w:rPr>
+              <w:t>Diatur admin; berlaku bila tidak ada lapisan di atasnya.</w:t>
+            </w:r>
+          </w:p>
+        </w:tc>
+      </w:tr>
+    </w:tbl>
+    <w:p>
+      <w:pPr>
+        <w:spacing w:before="120" w:after="120" w:line="276" w:lineRule="auto"/>
+      </w:pPr>
+      <w:r>
+        <w:rPr>
+          <w:b/>
+          <w:bCs/>
+        </w:rPr>
+        <w:t>Satu pilihan per rombel.</w:t>
+      </w:r>
+      <w:r>
+        <w:t xml:space="preserve"> Untuk sesi di sekolah, rombel memakai </w:t>
+      </w:r>
+      <w:r>
+        <w:rPr>
+          <w:i/>
+          <w:iCs/>
+        </w:rPr>
+        <w:t>tahapan khusus</w:t>
+      </w:r>
+      <w:r>
+        <w:t xml:space="preserve"> (aturannya ada di dalam tahapan) </w:t>
+      </w:r>
+      <w:r>
+        <w:rPr>
+          <w:b/>
+          <w:bCs/>
+        </w:rPr>
+        <w:t>atau</w:t>
+      </w:r>
+      <w:r>
+        <w:t xml:space="preserve"> urutan </w:t>
+      </w:r>
+      <w:r>
+        <w:rPr>
+          <w:i/>
+          <w:iCs/>
+        </w:rPr>
+        <w:t>Tahapan Level</w:t>
+      </w:r>
+      <w:r>
+        <w:t xml:space="preserve"> dengan profil aturan, tidak keduanya. Memasang yang satu otomatis melepas yang lain.</w:t>
+      </w:r>
+    </w:p>
+    <w:tbl>
+      <w:tblPr>
+        <w:tblW w:w="9638" w:type="dxa"/>
+        <w:tblBorders>
+          <w:top w:val="single" w:sz="4" w:space="0" w:color="auto"/>
+          <w:left w:val="single" w:sz="4" w:space="0" w:color="auto"/>
+          <w:bottom w:val="single" w:sz="4" w:space="0" w:color="auto"/>
+          <w:right w:val="single" w:sz="4" w:space="0" w:color="auto"/>
+          <w:insideH w:val="single" w:sz="4" w:space="0" w:color="auto"/>
+          <w:insideV w:val="single" w:sz="4" w:space="0" w:color="auto"/>
+        </w:tblBorders>
+        <w:tblLook w:val="04A0" w:firstRow="1" w:lastRow="0" w:firstColumn="1" w:lastColumn="0" w:noHBand="0" w:noVBand="1"/>
+      </w:tblPr>
+      <w:tblGrid>
+        <w:gridCol w:w="2600"/>
+        <w:gridCol w:w="7038"/>
+      </w:tblGrid>
+      <w:tr>
+        <w:trPr>
+          <w:tblHeader/>
+        </w:trPr>
+        <w:tc>
+          <w:tcPr>
+            <w:tcW w:w="2600" w:type="dxa"/>
+            <w:tcBorders>
+              <w:top w:val="single" w:sz="4" w:space="0" w:color="C9D3DE"/>
+              <w:left w:val="single" w:sz="4" w:space="0" w:color="C9D3DE"/>
+              <w:bottom w:val="single" w:sz="4" w:space="0" w:color="C9D3DE"/>
+              <w:right w:val="single" w:sz="4" w:space="0" w:color="C9D3DE"/>
+            </w:tcBorders>
+            <w:shd w:val="clear" w:color="auto" w:fill="1F3A5F"/>
+            <w:tcMar>
+              <w:top w:w="70" w:type="dxa"/>
+              <w:left w:w="110" w:type="dxa"/>
+              <w:bottom w:w="70" w:type="dxa"/>
+              <w:right w:w="110" w:type="dxa"/>
+            </w:tcMar>
+          </w:tcPr>
+          <w:p>
+            <w:pPr>
+              <w:spacing w:after="30"/>
+            </w:pPr>
+            <w:r>
+              <w:rPr>
+                <w:b/>
+                <w:bCs/>
+                <w:color w:val="FFFFFF"/>
+                <w:sz w:val="19"/>
+                <w:szCs w:val="19"/>
+              </w:rPr>
+              <w:t>Istilah</w:t>
+            </w:r>
+          </w:p>
+        </w:tc>
+        <w:tc>
+          <w:tcPr>
+            <w:tcW w:w="7038" w:type="dxa"/>
+            <w:tcBorders>
+              <w:top w:val="single" w:sz="4" w:space="0" w:color="C9D3DE"/>
+              <w:left w:val="single" w:sz="4" w:space="0" w:color="C9D3DE"/>
+              <w:bottom w:val="single" w:sz="4" w:space="0" w:color="C9D3DE"/>
+              <w:right w:val="single" w:sz="4" w:space="0" w:color="C9D3DE"/>
+            </w:tcBorders>
+            <w:shd w:val="clear" w:color="auto" w:fill="1F3A5F"/>
+            <w:tcMar>
+              <w:top w:w="70" w:type="dxa"/>
+              <w:left w:w="110" w:type="dxa"/>
+              <w:bottom w:w="70" w:type="dxa"/>
+              <w:right w:w="110" w:type="dxa"/>
+            </w:tcMar>
+          </w:tcPr>
+          <w:p>
+            <w:pPr>
+              <w:spacing w:after="30"/>
+            </w:pPr>
+            <w:r>
+              <w:rPr>
+                <w:b/>
+                <w:bCs/>
+                <w:color w:val="FFFFFF"/>
+                <w:sz w:val="19"/>
+                <w:szCs w:val="19"/>
+              </w:rPr>
+              <w:t>Arti</w:t>
+            </w:r>
+          </w:p>
+        </w:tc>
+      </w:tr>
+      <w:tr>
+        <w:trPr>
+          <w:cantSplit/>
+        </w:trPr>
+        <w:tc>
+          <w:tcPr>
+            <w:tcW w:w="2600" w:type="dxa"/>
+            <w:tcBorders>
+              <w:top w:val="single" w:sz="4" w:space="0" w:color="C9D3DE"/>
+              <w:left w:val="single" w:sz="4" w:space="0" w:color="C9D3DE"/>
+              <w:bottom w:val="single" w:sz="4" w:space="0" w:color="C9D3DE"/>
+              <w:right w:val="single" w:sz="4" w:space="0" w:color="C9D3DE"/>
+            </w:tcBorders>
+            <w:tcMar>
+              <w:top w:w="70" w:type="dxa"/>
+              <w:left w:w="110" w:type="dxa"/>
+              <w:bottom w:w="70" w:type="dxa"/>
+              <w:right w:w="110" w:type="dxa"/>
+            </w:tcMar>
+          </w:tcPr>
+          <w:p>
+            <w:pPr>
+              <w:spacing w:after="30"/>
+            </w:pPr>
+            <w:r>
+              <w:rPr>
+                <w:b/>
+                <w:bCs/>
+                <w:sz w:val="19"/>
+                <w:szCs w:val="19"/>
+              </w:rPr>
+              <w:t>Sesudah tahapan: Berhenti</w:t>
+            </w:r>
+          </w:p>
+        </w:tc>
+        <w:tc>
+          <w:tcPr>
+            <w:tcW w:w="7038" w:type="dxa"/>
+            <w:tcBorders>
+              <w:top w:val="single" w:sz="4" w:space="0" w:color="C9D3DE"/>
+              <w:left w:val="single" w:sz="4" w:space="0" w:color="C9D3DE"/>
+              <w:bottom w:val="single" w:sz="4" w:space="0" w:color="C9D3DE"/>
+              <w:right w:val="single" w:sz="4" w:space="0" w:color="C9D3DE"/>
+            </w:tcBorders>
+            <w:tcMar>
+              <w:top w:w="70" w:type="dxa"/>
+              <w:left w:w="110" w:type="dxa"/>
+              <w:bottom w:w="70" w:type="dxa"/>
+              <w:right w:w="110" w:type="dxa"/>
+            </w:tcMar>
+          </w:tcPr>
+          <w:p>
+            <w:pPr>
+              <w:spacing w:after="30"/>
+            </w:pPr>
+            <w:r>
+              <w:rPr>
+                <w:sz w:val="19"/>
+                <w:szCs w:val="19"/>
+              </w:rPr>
+              <w:t>Setelah semua level tahapan tuntas, siswa melihat "Tahapan latihan sele</w:t>
+            </w:r>
+            <w:r>
+              <w:rPr>
+                <w:sz w:val="19"/>
+                <w:szCs w:val="19"/>
+              </w:rPr>
+              <w:t>sai" dan menunggu arahan guru. Level yang sudah tuntas tetap boleh diulang.</w:t>
+            </w:r>
+          </w:p>
+        </w:tc>
+      </w:tr>
+      <w:tr>
+        <w:trPr>
+          <w:cantSplit/>
+        </w:trPr>
+        <w:tc>
+          <w:tcPr>
+            <w:tcW w:w="2600" w:type="dxa"/>
+            <w:tcBorders>
+              <w:top w:val="single" w:sz="4" w:space="0" w:color="C9D3DE"/>
+              <w:left w:val="single" w:sz="4" w:space="0" w:color="C9D3DE"/>
+              <w:bottom w:val="single" w:sz="4" w:space="0" w:color="C9D3DE"/>
+              <w:right w:val="single" w:sz="4" w:space="0" w:color="C9D3DE"/>
+            </w:tcBorders>
+            <w:shd w:val="clear" w:color="auto" w:fill="F8FAFC"/>
+            <w:tcMar>
+              <w:top w:w="70" w:type="dxa"/>
+              <w:left w:w="110" w:type="dxa"/>
+              <w:bottom w:w="70" w:type="dxa"/>
+              <w:right w:w="110" w:type="dxa"/>
+            </w:tcMar>
+          </w:tcPr>
+          <w:p>
+            <w:pPr>
+              <w:spacing w:after="30"/>
+            </w:pPr>
+            <w:r>
+              <w:rPr>
+                <w:b/>
+                <w:bCs/>
+                <w:sz w:val="19"/>
+                <w:szCs w:val="19"/>
+              </w:rPr>
+              <w:t>Sesudah tahapan: Lanjut</w:t>
+            </w:r>
+          </w:p>
+        </w:tc>
+        <w:tc>
+          <w:tcPr>
+            <w:tcW w:w="7038" w:type="dxa"/>
+            <w:tcBorders>
+              <w:top w:val="single" w:sz="4" w:space="0" w:color="C9D3DE"/>
+              <w:left w:val="single" w:sz="4" w:space="0" w:color="C9D3DE"/>
+              <w:bottom w:val="single" w:sz="4" w:space="0" w:color="C9D3DE"/>
+              <w:right w:val="single" w:sz="4" w:space="0" w:color="C9D3DE"/>
+            </w:tcBorders>
+            <w:shd w:val="clear" w:color="auto" w:fill="F8FAFC"/>
+            <w:tcMar>
+              <w:top w:w="70" w:type="dxa"/>
+              <w:left w:w="110" w:type="dxa"/>
+              <w:bottom w:w="70" w:type="dxa"/>
+              <w:right w:w="110" w:type="dxa"/>
+            </w:tcMar>
+          </w:tcPr>
+          <w:p>
+            <w:pPr>
+              <w:spacing w:after="30"/>
+            </w:pPr>
+            <w:r>
+              <w:rPr>
+                <w:sz w:val="19"/>
+                <w:szCs w:val="19"/>
+              </w:rPr>
+              <w:t xml:space="preserve">Setelah semua level tahapan tuntas, materi Tahapan Level lainnya ikut terbuka (tanpa yang ditutup admin), dengan profil </w:t>
+            </w:r>
+            <w:r>
+              <w:rPr>
+                <w:i/>
+                <w:iCs/>
+                <w:sz w:val="19"/>
+                <w:szCs w:val="19"/>
+              </w:rPr>
+              <w:t>sesudah tahapan</w:t>
+            </w:r>
+            <w:r>
+              <w:rPr>
+                <w:sz w:val="19"/>
+                <w:szCs w:val="19"/>
+              </w:rPr>
+              <w:t xml:space="preserve"> bila diisi.</w:t>
+            </w:r>
+          </w:p>
+        </w:tc>
+      </w:tr>
+      <w:tr>
+        <w:trPr>
+          <w:cantSplit/>
+        </w:trPr>
+        <w:tc>
+          <w:tcPr>
+            <w:tcW w:w="2600" w:type="dxa"/>
+            <w:tcBorders>
+              <w:top w:val="single" w:sz="4" w:space="0" w:color="C9D3DE"/>
+              <w:left w:val="single" w:sz="4" w:space="0" w:color="C9D3DE"/>
+              <w:bottom w:val="single" w:sz="4" w:space="0" w:color="C9D3DE"/>
+              <w:right w:val="single" w:sz="4" w:space="0" w:color="C9D3DE"/>
+            </w:tcBorders>
+            <w:tcMar>
+              <w:top w:w="70" w:type="dxa"/>
+              <w:left w:w="110" w:type="dxa"/>
+              <w:bottom w:w="70" w:type="dxa"/>
+              <w:right w:w="110" w:type="dxa"/>
+            </w:tcMar>
+          </w:tcPr>
+          <w:p>
+            <w:pPr>
+              <w:spacing w:after="30"/>
+            </w:pPr>
+            <w:r>
+              <w:rPr>
+                <w:b/>
+                <w:bCs/>
+                <w:sz w:val="19"/>
+                <w:szCs w:val="19"/>
+              </w:rPr>
+              <w:lastRenderedPageBreak/>
+              <w:t>Urutan level</w:t>
+            </w:r>
+          </w:p>
+        </w:tc>
+        <w:tc>
+          <w:tcPr>
+            <w:tcW w:w="7038" w:type="dxa"/>
+            <w:tcBorders>
+              <w:top w:val="single" w:sz="4" w:space="0" w:color="C9D3DE"/>
+              <w:left w:val="single" w:sz="4" w:space="0" w:color="C9D3DE"/>
+              <w:bottom w:val="single" w:sz="4" w:space="0" w:color="C9D3DE"/>
+              <w:right w:val="single" w:sz="4" w:space="0" w:color="C9D3DE"/>
+            </w:tcBorders>
+            <w:tcMar>
+              <w:top w:w="70" w:type="dxa"/>
+              <w:left w:w="110" w:type="dxa"/>
+              <w:bottom w:w="70" w:type="dxa"/>
+              <w:right w:w="110" w:type="dxa"/>
+            </w:tcMar>
+          </w:tcPr>
+          <w:p>
+            <w:pPr>
+              <w:spacing w:after="30"/>
+            </w:pPr>
+            <w:r>
+              <w:rPr>
+                <w:i/>
+                <w:iCs/>
+                <w:sz w:val="19"/>
+                <w:szCs w:val="19"/>
+              </w:rPr>
+              <w:t>Berurutan</w:t>
+            </w:r>
+            <w:r>
+              <w:rPr>
+                <w:sz w:val="19"/>
+                <w:szCs w:val="19"/>
+              </w:rPr>
+              <w:t xml:space="preserve">: level berikut terbuka setelah level sebelumnya tuntas (ikon </w:t>
+            </w:r>
+            <w:r>
+              <w:rPr>
+                <w:sz w:val="19"/>
+                <w:szCs w:val="19"/>
+              </w:rPr>
+              <w:t>🔒</w:t>
+            </w:r>
+            <w:r>
+              <w:rPr>
+                <w:sz w:val="19"/>
+                <w:szCs w:val="19"/>
+              </w:rPr>
+              <w:t xml:space="preserve"> pada level yang belu</w:t>
+            </w:r>
+            <w:r>
+              <w:rPr>
+                <w:sz w:val="19"/>
+                <w:szCs w:val="19"/>
+              </w:rPr>
+              <w:t xml:space="preserve">m terbuka); level yang sudah tuntas atau pernah dikerjakan tetap terbuka. </w:t>
+            </w:r>
+            <w:r>
+              <w:rPr>
+                <w:i/>
+                <w:iCs/>
+                <w:sz w:val="19"/>
+                <w:szCs w:val="19"/>
+              </w:rPr>
+              <w:t>Bebas</w:t>
+            </w:r>
+            <w:r>
+              <w:rPr>
+                <w:sz w:val="19"/>
+                <w:szCs w:val="19"/>
+              </w:rPr>
+              <w:t>: siswa boleh memilih level mana saja. Bawaannya Bebas.</w:t>
+            </w:r>
+          </w:p>
+        </w:tc>
+      </w:tr>
+      <w:tr>
+        <w:trPr>
+          <w:cantSplit/>
+        </w:trPr>
+        <w:tc>
+          <w:tcPr>
+            <w:tcW w:w="2600" w:type="dxa"/>
+            <w:tcBorders>
+              <w:top w:val="single" w:sz="4" w:space="0" w:color="C9D3DE"/>
+              <w:left w:val="single" w:sz="4" w:space="0" w:color="C9D3DE"/>
+              <w:bottom w:val="single" w:sz="4" w:space="0" w:color="C9D3DE"/>
+              <w:right w:val="single" w:sz="4" w:space="0" w:color="C9D3DE"/>
+            </w:tcBorders>
+            <w:shd w:val="clear" w:color="auto" w:fill="F8FAFC"/>
+            <w:tcMar>
+              <w:top w:w="70" w:type="dxa"/>
+              <w:left w:w="110" w:type="dxa"/>
+              <w:bottom w:w="70" w:type="dxa"/>
+              <w:right w:w="110" w:type="dxa"/>
+            </w:tcMar>
+          </w:tcPr>
+          <w:p>
+            <w:pPr>
+              <w:spacing w:after="30"/>
+            </w:pPr>
+            <w:r>
+              <w:rPr>
+                <w:b/>
+                <w:bCs/>
+                <w:sz w:val="19"/>
+                <w:szCs w:val="19"/>
+              </w:rPr>
+              <w:t>Syarat dengar/baca</w:t>
+            </w:r>
+          </w:p>
+        </w:tc>
+        <w:tc>
+          <w:tcPr>
+            <w:tcW w:w="7038" w:type="dxa"/>
+            <w:tcBorders>
+              <w:top w:val="single" w:sz="4" w:space="0" w:color="C9D3DE"/>
+              <w:left w:val="single" w:sz="4" w:space="0" w:color="C9D3DE"/>
+              <w:bottom w:val="single" w:sz="4" w:space="0" w:color="C9D3DE"/>
+              <w:right w:val="single" w:sz="4" w:space="0" w:color="C9D3DE"/>
+            </w:tcBorders>
+            <w:shd w:val="clear" w:color="auto" w:fill="F8FAFC"/>
+            <w:tcMar>
+              <w:top w:w="70" w:type="dxa"/>
+              <w:left w:w="110" w:type="dxa"/>
+              <w:bottom w:w="70" w:type="dxa"/>
+              <w:right w:w="110" w:type="dxa"/>
+            </w:tcMar>
+          </w:tcPr>
+          <w:p>
+            <w:pPr>
+              <w:spacing w:after="30"/>
+            </w:pPr>
+            <w:r>
+              <w:rPr>
+                <w:sz w:val="19"/>
+                <w:szCs w:val="19"/>
+              </w:rPr>
+              <w:t xml:space="preserve">Teks didengar dan/atau dibaca dulu sebelum </w:t>
+            </w:r>
+            <w:r>
+              <w:rPr>
+                <w:b/>
+                <w:bCs/>
+                <w:sz w:val="19"/>
+                <w:szCs w:val="19"/>
+              </w:rPr>
+              <w:t>sub level pertama yang dipakai</w:t>
+            </w:r>
+            <w:r>
+              <w:rPr>
+                <w:sz w:val="19"/>
+                <w:szCs w:val="19"/>
+              </w:rPr>
+              <w:t xml:space="preserve"> tahapan: sub level 1, atau mis. sub level 6 pada tahapan yang hanya memakai sub level 6–10.</w:t>
+            </w:r>
+          </w:p>
+        </w:tc>
+      </w:tr>
+      <w:tr>
+        <w:trPr>
+          <w:cantSplit/>
+        </w:trPr>
+        <w:tc>
+          <w:tcPr>
+            <w:tcW w:w="2600" w:type="dxa"/>
+            <w:tcBorders>
+              <w:top w:val="single" w:sz="4" w:space="0" w:color="C9D3DE"/>
+              <w:left w:val="single" w:sz="4" w:space="0" w:color="C9D3DE"/>
+              <w:bottom w:val="single" w:sz="4" w:space="0" w:color="C9D3DE"/>
+              <w:right w:val="single" w:sz="4" w:space="0" w:color="C9D3DE"/>
+            </w:tcBorders>
+            <w:tcMar>
+              <w:top w:w="70" w:type="dxa"/>
+              <w:left w:w="110" w:type="dxa"/>
+              <w:bottom w:w="70" w:type="dxa"/>
+              <w:right w:w="110" w:type="dxa"/>
+            </w:tcMar>
+          </w:tcPr>
+          <w:p>
+            <w:pPr>
+              <w:spacing w:after="30"/>
+            </w:pPr>
+            <w:r>
+              <w:rPr>
+                <w:b/>
+                <w:bCs/>
+                <w:sz w:val="19"/>
+                <w:szCs w:val="19"/>
+              </w:rPr>
+              <w:t>Aturan latihan mandiri</w:t>
+            </w:r>
+          </w:p>
+        </w:tc>
+        <w:tc>
+          <w:tcPr>
+            <w:tcW w:w="7038" w:type="dxa"/>
+            <w:tcBorders>
+              <w:top w:val="single" w:sz="4" w:space="0" w:color="C9D3DE"/>
+              <w:left w:val="single" w:sz="4" w:space="0" w:color="C9D3DE"/>
+              <w:bottom w:val="single" w:sz="4" w:space="0" w:color="C9D3DE"/>
+              <w:right w:val="single" w:sz="4" w:space="0" w:color="C9D3DE"/>
+            </w:tcBorders>
+            <w:tcMar>
+              <w:top w:w="70" w:type="dxa"/>
+              <w:left w:w="110" w:type="dxa"/>
+              <w:bottom w:w="70" w:type="dxa"/>
+              <w:right w:w="110" w:type="dxa"/>
+            </w:tcMar>
+          </w:tcPr>
+          <w:p>
+            <w:pPr>
+              <w:spacing w:after="30"/>
+            </w:pPr>
+            <w:r>
+              <w:rPr>
+                <w:sz w:val="19"/>
+                <w:szCs w:val="19"/>
+              </w:rPr>
+              <w:t xml:space="preserve">Pengaturan Umum, profil tertentu, atau </w:t>
+            </w:r>
+            <w:r>
+              <w:rPr>
+                <w:b/>
+                <w:bCs/>
+                <w:sz w:val="19"/>
+                <w:szCs w:val="19"/>
+              </w:rPr>
+              <w:t>Sama dengan sesi kelompok</w:t>
+            </w:r>
+            <w:r>
+              <w:rPr>
+                <w:sz w:val="19"/>
+                <w:szCs w:val="19"/>
+              </w:rPr>
+              <w:t xml:space="preserve"> (aturan sesi, termasuk aturan per bagian tah</w:t>
+            </w:r>
+            <w:r>
+              <w:rPr>
+                <w:sz w:val="19"/>
+                <w:szCs w:val="19"/>
+              </w:rPr>
+              <w:t>apan). Materi mandiri tetap pilihan siswa atau saran tahapan.</w:t>
+            </w:r>
+          </w:p>
+        </w:tc>
+      </w:tr>
+    </w:tbl>
+    <w:p/>
+    <w:tbl>
+      <w:tblPr>
+        <w:tblW w:w="9638" w:type="dxa"/>
+        <w:tblLook w:val="04A0" w:firstRow="1" w:lastRow="0" w:firstColumn="1" w:lastColumn="0" w:noHBand="0" w:noVBand="1"/>
+      </w:tblPr>
+      <w:tblGrid>
+        <w:gridCol w:w="9638"/>
+      </w:tblGrid>
+      <w:tr>
+        <w:trPr>
+          <w:cantSplit/>
+        </w:trPr>
+        <w:tc>
+          <w:tcPr>
+            <w:tcW w:w="9638" w:type="dxa"/>
+            <w:tcBorders>
+              <w:top w:val="single" w:sz="4" w:space="0" w:color="EAF6EE"/>
+              <w:left w:val="single" w:sz="24" w:space="0" w:color="2F7A4B"/>
+              <w:bottom w:val="single" w:sz="4" w:space="0" w:color="EAF6EE"/>
+              <w:right w:val="single" w:sz="4" w:space="0" w:color="EAF6EE"/>
+            </w:tcBorders>
+            <w:shd w:val="clear" w:color="auto" w:fill="EAF6EE"/>
+            <w:tcMar>
+              <w:top w:w="110" w:type="dxa"/>
+              <w:left w:w="200" w:type="dxa"/>
+              <w:bottom w:w="110" w:type="dxa"/>
+              <w:right w:w="160" w:type="dxa"/>
+            </w:tcMar>
+          </w:tcPr>
+          <w:p>
+            <w:pPr>
+              <w:spacing w:after="60"/>
+            </w:pPr>
+            <w:r>
+              <w:rPr>
+                <w:b/>
+                <w:bCs/>
+                <w:color w:val="2F7A4B"/>
+                <w:sz w:val="20"/>
+                <w:szCs w:val="20"/>
+              </w:rPr>
+              <w:t>Perlu diingat</w:t>
+            </w:r>
+          </w:p>
+          <w:p>
+            <w:pPr>
+              <w:spacing w:after="50" w:line="264" w:lineRule="auto"/>
+            </w:pPr>
+            <w:r>
+              <w:rPr>
+                <w:sz w:val="19"/>
+                <w:szCs w:val="19"/>
+              </w:rPr>
+              <w:t xml:space="preserve">Pengawasan keluar halaman, kode buka kunci, dan lama sesi selalu mengikuti </w:t>
+            </w:r>
+            <w:r>
+              <w:rPr>
+                <w:b/>
+                <w:bCs/>
+                <w:sz w:val="19"/>
+                <w:szCs w:val="19"/>
+              </w:rPr>
+              <w:t>aturan dasar</w:t>
+            </w:r>
+            <w:r>
+              <w:rPr>
+                <w:sz w:val="19"/>
+                <w:szCs w:val="19"/>
+              </w:rPr>
+              <w:t xml:space="preserve"> (dan profil siswa), bukan aturan per bagian, karena dihitung server untuk seluruh sesi. Jumlah soal, akurasi membaca, dan batas salah dari profil dipakai apa adanya (mis. 12 soal atau 95%).</w:t>
+            </w:r>
+          </w:p>
+        </w:tc>
+      </w:tr>
+    </w:tbl>
+    <w:p>
+      <w:pPr>
         <w:pStyle w:val="Heading1"/>
         <w:pageBreakBefore/>
       </w:pPr>
-      <w:bookmarkStart w:id="6" w:name="_Toc242773720"/>
+      <w:bookmarkStart w:id="7" w:name="_Toc242966013"/>
       <w:r>
         <w:lastRenderedPageBreak/>
         <w:t>2. Tab Sesi Kegiatan</w:t>
       </w:r>
-      <w:bookmarkEnd w:id="6"/>
+      <w:bookmarkEnd w:id="7"/>
     </w:p>
     <w:p>
       <w:pPr>
@@ -6207,10 +7540,7 @@
         <w:t>ruang kendali saat pelajaran berlangsung</w:t>
       </w:r>
       <w:r>
-        <w:t>: membuka sesi latihan, membagikan kode akses, melihat siapa yang sedang berlatih atau terkunci, dan mengatur siswa tertentu. Data diperbarui otomatis setiap 30</w:t>
-      </w:r>
-      <w:r>
-        <w:t xml:space="preserve"> detik selama tab terbuka.</w:t>
+        <w:t>: membuka sesi latihan, membagikan kode akses, melihat siapa yang sedang berlatih atau terkunci, dan mengatur siswa tertentu. Data diperbarui otomatis setiap 30 detik selama tab terbuka.</w:t>
       </w:r>
     </w:p>
     <w:p>
@@ -6335,11 +7665,11 @@
       <w:pPr>
         <w:pStyle w:val="Heading2"/>
       </w:pPr>
-      <w:bookmarkStart w:id="7" w:name="_Toc242773721"/>
+      <w:bookmarkStart w:id="8" w:name="_Toc242966014"/>
       <w:r>
         <w:t>2.1 Bilah saringan</w:t>
       </w:r>
-      <w:bookmarkEnd w:id="7"/>
+      <w:bookmarkEnd w:id="8"/>
     </w:p>
     <w:tbl>
       <w:tblPr>
@@ -6835,11 +8165,11 @@
       <w:pPr>
         <w:pStyle w:val="Heading2"/>
       </w:pPr>
-      <w:bookmarkStart w:id="8" w:name="_Toc242773722"/>
+      <w:bookmarkStart w:id="9" w:name="_Toc242966015"/>
       <w:r>
         <w:t>2.2 Kartu Sesi latihan</w:t>
       </w:r>
-      <w:bookmarkEnd w:id="8"/>
+      <w:bookmarkEnd w:id="9"/>
     </w:p>
     <w:p>
       <w:pPr>
@@ -7136,14 +8466,7 @@
                 <w:sz w:val="19"/>
                 <w:szCs w:val="19"/>
               </w:rPr>
-              <w:t>Tidak ada sesi kelas. Keterangan: "siswa hanya bisa latihan mandiri" (atau "siswa tidak bisa masuk" bila latihan</w:t>
-            </w:r>
-            <w:r>
-              <w:rPr>
-                <w:sz w:val="19"/>
-                <w:szCs w:val="19"/>
-              </w:rPr>
-              <w:t xml:space="preserve"> mandiri dimatikan admin), ditambah "N berlatih mandiri" bila ada yang sedang latihan sendiri.</w:t>
+              <w:t>Tidak ada sesi kelas. Keterangan: "siswa hanya bisa latihan mandiri" (atau "siswa tidak bisa masuk" bila latihan mandiri dimatikan admin), ditambah "N berlatih mandiri" bila ada yang sedang latihan sendiri.</w:t>
             </w:r>
           </w:p>
         </w:tc>
@@ -7424,14 +8747,7 @@
                 <w:sz w:val="19"/>
                 <w:szCs w:val="19"/>
               </w:rPr>
-              <w:t>. Urutan: sub level lulus → ra</w:t>
-            </w:r>
-            <w:r>
-              <w:rPr>
-                <w:sz w:val="19"/>
-                <w:szCs w:val="19"/>
-              </w:rPr>
-              <w:t>ta-rata nilai → banyak kegiatan.</w:t>
+              <w:t>. Urutan: sub level lulus → rata-rata nilai → banyak kegiatan.</w:t>
             </w:r>
           </w:p>
         </w:tc>
@@ -7666,11 +8982,11 @@
       <w:pPr>
         <w:pStyle w:val="Heading2"/>
       </w:pPr>
-      <w:bookmarkStart w:id="9" w:name="_Toc242773723"/>
+      <w:bookmarkStart w:id="10" w:name="_Toc242966016"/>
       <w:r>
         <w:t>2.3 Kotak Aturan dan tahapan yang berlaku</w:t>
       </w:r>
-      <w:bookmarkEnd w:id="9"/>
+      <w:bookmarkEnd w:id="10"/>
     </w:p>
     <w:p>
       <w:pPr>
@@ -7687,10 +9003,7 @@
         <w:t>"Aturan dan materi apa yang sedang dipakai rombel ini?"</w:t>
       </w:r>
       <w:r>
-        <w:t xml:space="preserve"> Satu</w:t>
-      </w:r>
-      <w:r>
-        <w:t xml:space="preserve"> baris per rombel (bila lebih dari 3 rombel, kotak dilipat; ketuk untuk membuka).</w:t>
+        <w:t xml:space="preserve"> Satu baris per rombel (bila lebih dari 3 rombel, kotak dilipat; ketuk untuk membuka).</w:t>
       </w:r>
     </w:p>
     <w:tbl>
@@ -7812,7 +9125,7 @@
                 <w:sz w:val="19"/>
                 <w:szCs w:val="19"/>
               </w:rPr>
-              <w:t>Aturan rombel</w:t>
+              <w:t>Aturan rombel / Aturan dasar tahapan</w:t>
             </w:r>
           </w:p>
         </w:tc>
@@ -7841,7 +9154,23 @@
                 <w:sz w:val="19"/>
                 <w:szCs w:val="19"/>
               </w:rPr>
-              <w:t>Bila rombel memakai profil aturan: nama profil dan isian yang berbeda. Bila tidak: "Pengaturan Umum" beserta 4 isian utama — jumlah soal per sub level, bila jawaban salah, batas keluar halaman, lama satu sesi.</w:t>
+              <w:t xml:space="preserve">Rombel tanpa tahapan khusus: nama profil aturan rombel dan isian yang berbeda, atau "Pengaturan Umum" beserta 4 isian utama — jumlah soal per sub level, bila jawaban salah, batas keluar halaman, lama satu sesi. Rombel bertahapan khusus: judulnya menjadi </w:t>
+            </w:r>
+            <w:r>
+              <w:rPr>
+                <w:b/>
+                <w:bCs/>
+                <w:sz w:val="19"/>
+                <w:szCs w:val="19"/>
+              </w:rPr>
+              <w:t>Aturan dasar tahapan</w:t>
+            </w:r>
+            <w:r>
+              <w:rPr>
+                <w:sz w:val="19"/>
+                <w:szCs w:val="19"/>
+              </w:rPr>
+              <w:t xml:space="preserve"> dan isinya aturan dasar tahapan itu.</w:t>
             </w:r>
           </w:p>
         </w:tc>
@@ -7908,14 +9237,7 @@
                 <w:sz w:val="19"/>
                 <w:szCs w:val="19"/>
               </w:rPr>
-              <w:t>Bila memakai tahapan khusus: n</w:t>
-            </w:r>
-            <w:r>
-              <w:rPr>
-                <w:sz w:val="19"/>
-                <w:szCs w:val="19"/>
-              </w:rPr>
-              <w:t>amanya dan ringkasan isinya, mis. "2 tahap · 14 level · 120 sub level". Bila tidak: "Tahapan Level — urutan bawaan" beserta ringkasannya.</w:t>
+              <w:t>Bila memakai tahapan khusus: namanya, ringkasan isinya (mis. "2 tahap · 14 level · 120 sub level"), aturan per bagian (mis. "Tahap 4: Santai 20 soal"), dan apa yang terjadi sesudahnya (berhenti atau lanjut ke Tahapan Level). Bila tidak: "Tahapan Level — urutan bawaan" beserta ringkasannya.</w:t>
             </w:r>
           </w:p>
         </w:tc>
@@ -8003,24 +9325,21 @@
           <w:b/>
           <w:bCs/>
         </w:rPr>
-        <w:t>siswa → rombel → Pengaturan Umum</w:t>
+        <w:t>siswa → aturan per bagian tahapan → aturan dasar (tahapan atau profil rombel) → Pengaturan Umum</w:t>
       </w:r>
       <w:r>
-        <w:t>. Isian yang tidak diatu</w:t>
-      </w:r>
-      <w:r>
-        <w:t>r di lapisan atas mengikuti lapisan di bawahnya.</w:t>
+        <w:t>. Isian yang tidak diatur di lapisan atas mengikuti lapisan di bawahnya. Lihat 1.6.</w:t>
       </w:r>
     </w:p>
     <w:p>
       <w:pPr>
         <w:pStyle w:val="Heading2"/>
       </w:pPr>
-      <w:bookmarkStart w:id="10" w:name="_Toc242773724"/>
+      <w:bookmarkStart w:id="11" w:name="_Toc242966017"/>
       <w:r>
         <w:t>2.4 Enam kotak ringkasan</w:t>
       </w:r>
-      <w:bookmarkEnd w:id="10"/>
+      <w:bookmarkEnd w:id="11"/>
     </w:p>
     <w:tbl>
       <w:tblPr>
@@ -8793,6 +10112,7 @@
                 <w:sz w:val="19"/>
                 <w:szCs w:val="19"/>
               </w:rPr>
+              <w:lastRenderedPageBreak/>
               <w:t>tamat semua level</w:t>
             </w:r>
           </w:p>
@@ -8889,7 +10209,6 @@
                 <w:sz w:val="19"/>
                 <w:szCs w:val="19"/>
               </w:rPr>
-              <w:lastRenderedPageBreak/>
               <w:t>terkunci (keluar halaman)</w:t>
             </w:r>
           </w:p>
@@ -9133,14 +10452,7 @@
                 <w:sz w:val="19"/>
                 <w:szCs w:val="19"/>
               </w:rPr>
-              <w:t>Kotak yang nilainya 0 untuk hal yang bersifat peringatan (terkunci, keluar halama</w:t>
-            </w:r>
-            <w:r>
-              <w:rPr>
-                <w:sz w:val="19"/>
-                <w:szCs w:val="19"/>
-              </w:rPr>
-              <w:t>n, tamat) ditampilkan redup agar mata langsung tertuju ke kotak yang berwarna.</w:t>
+              <w:t>Kotak yang nilainya 0 untuk hal yang bersifat peringatan (terkunci, keluar halaman, tamat) ditampilkan redup agar mata langsung tertuju ke kotak yang berwarna.</w:t>
             </w:r>
           </w:p>
         </w:tc>
@@ -9155,11 +10467,11 @@
       <w:pPr>
         <w:pStyle w:val="Heading2"/>
       </w:pPr>
-      <w:bookmarkStart w:id="11" w:name="_Toc242773725"/>
+      <w:bookmarkStart w:id="12" w:name="_Toc242966018"/>
       <w:r>
         <w:t>2.5 Tabel siswa</w:t>
       </w:r>
-      <w:bookmarkEnd w:id="11"/>
+      <w:bookmarkEnd w:id="12"/>
     </w:p>
     <w:tbl>
       <w:tblPr>
@@ -9280,16 +10592,7 @@
                 <w:sz w:val="19"/>
                 <w:szCs w:val="19"/>
               </w:rPr>
-              <w:t>☐</w:t>
-            </w:r>
-            <w:r>
-              <w:rPr>
-                <w:b/>
-                <w:bCs/>
-                <w:sz w:val="19"/>
-                <w:szCs w:val="19"/>
-              </w:rPr>
-              <w:t xml:space="preserve"> (kotak centang)</w:t>
+              <w:t>☐ (kotak centang)</w:t>
             </w:r>
           </w:p>
         </w:tc>
@@ -9649,14 +10952,7 @@
                 <w:sz w:val="19"/>
                 <w:szCs w:val="19"/>
               </w:rPr>
-              <w:t>Banyak keluar halaman yang dihitung saat sesi kelas dalam 7 hari terakhir. Keluar yang lebih singkat dari toler</w:t>
-            </w:r>
-            <w:r>
-              <w:rPr>
-                <w:sz w:val="19"/>
-                <w:szCs w:val="19"/>
-              </w:rPr>
-              <w:t>ansi hanya dicatat, tidak dihitung.</w:t>
+              <w:t>Banyak keluar halaman yang dihitung saat sesi kelas dalam 7 hari terakhir. Keluar yang lebih singkat dari toleransi hanya dicatat, tidak dihitung.</w:t>
             </w:r>
           </w:p>
         </w:tc>
@@ -9736,11 +11032,11 @@
       <w:pPr>
         <w:pStyle w:val="Heading2"/>
       </w:pPr>
-      <w:bookmarkStart w:id="12" w:name="_Toc242773726"/>
+      <w:bookmarkStart w:id="13" w:name="_Toc242966019"/>
       <w:r>
         <w:t>2.6 Arti kolom Status</w:t>
       </w:r>
-      <w:bookmarkEnd w:id="12"/>
+      <w:bookmarkEnd w:id="13"/>
     </w:p>
     <w:p>
       <w:pPr>
@@ -10478,6 +11774,7 @@
                 <w:sz w:val="19"/>
                 <w:szCs w:val="19"/>
               </w:rPr>
+              <w:lastRenderedPageBreak/>
               <w:t>6</w:t>
             </w:r>
           </w:p>
@@ -10751,11 +12048,11 @@
       <w:pPr>
         <w:pStyle w:val="Heading2"/>
       </w:pPr>
-      <w:bookmarkStart w:id="13" w:name="_Toc242773727"/>
+      <w:bookmarkStart w:id="14" w:name="_Toc242966020"/>
       <w:r>
         <w:t>2.7 Bilah aksi untuk siswa terpilih</w:t>
       </w:r>
-      <w:bookmarkEnd w:id="13"/>
+      <w:bookmarkEnd w:id="14"/>
     </w:p>
     <w:p>
       <w:pPr>
@@ -10782,10 +12079,7 @@
         <w:t>Atur aturan &amp; tahapan</w:t>
       </w:r>
       <w:r>
-        <w:t xml:space="preserve"> — membuka panel empat pili</w:t>
-      </w:r>
-      <w:r>
-        <w:t xml:space="preserve">han: </w:t>
+        <w:t xml:space="preserve"> — membuka panel empat pilihan: </w:t>
       </w:r>
       <w:r>
         <w:rPr>
@@ -10805,7 +12099,7 @@
         <w:t>Tahapan sesi</w:t>
       </w:r>
       <w:r>
-        <w:t xml:space="preserve"> (materi), </w:t>
+        <w:t xml:space="preserve"> (materi beserta aturannya), </w:t>
       </w:r>
       <w:r>
         <w:rPr>
@@ -10815,7 +12109,17 @@
         <w:t>Aturan mandiri</w:t>
       </w:r>
       <w:r>
-        <w:t xml:space="preserve">, dan </w:t>
+        <w:t xml:space="preserve"> (termasuk </w:t>
+      </w:r>
+      <w:r>
+        <w:rPr>
+          <w:i/>
+          <w:iCs/>
+        </w:rPr>
+        <w:t>Sama dengan sesi kelompok</w:t>
+      </w:r>
+      <w:r>
+        <w:t xml:space="preserve">), dan </w:t>
       </w:r>
       <w:r>
         <w:rPr>
@@ -10875,10 +12179,7 @@
         <w:t>Batal pilih</w:t>
       </w:r>
       <w:r>
-        <w:t xml:space="preserve"> — mengosongkan</w:t>
-      </w:r>
-      <w:r>
-        <w:t xml:space="preserve"> centang.</w:t>
+        <w:t xml:space="preserve"> — mengosongkan centang.</w:t>
       </w:r>
     </w:p>
     <w:tbl>
@@ -11159,14 +12460,7 @@
                 <w:sz w:val="19"/>
                 <w:szCs w:val="19"/>
               </w:rPr>
-              <w:t>, atau biarkan tert</w:t>
-            </w:r>
-            <w:r>
-              <w:rPr>
-                <w:sz w:val="19"/>
-                <w:szCs w:val="19"/>
-              </w:rPr>
-              <w:t>utup sendiri saat waktunya habis.</w:t>
+              <w:t>, atau biarkan tertutup sendiri saat waktunya habis.</w:t>
             </w:r>
           </w:p>
         </w:tc>
@@ -11182,12 +12476,12 @@
         <w:pStyle w:val="Heading1"/>
         <w:pageBreakBefore/>
       </w:pPr>
-      <w:bookmarkStart w:id="14" w:name="_Toc242773728"/>
+      <w:bookmarkStart w:id="15" w:name="_Toc242966021"/>
       <w:r>
         <w:lastRenderedPageBreak/>
         <w:t>3. Tab Perkembangan Siswa</w:t>
       </w:r>
-      <w:bookmarkEnd w:id="14"/>
+      <w:bookmarkEnd w:id="15"/>
     </w:p>
     <w:p>
       <w:pPr>
@@ -11214,10 +12508,7 @@
         <w:t>kemajuan resmi</w:t>
       </w:r>
       <w:r>
-        <w:t xml:space="preserve"> (sesi kelas), kecuali kol</w:t>
-      </w:r>
-      <w:r>
-        <w:t>om yang tegas bertuliskan "mandiri".</w:t>
+        <w:t xml:space="preserve"> (sesi kelas), kecuali kolom yang tegas bertuliskan "mandiri".</w:t>
       </w:r>
     </w:p>
     <w:p>
@@ -11282,14 +12573,11 @@
       <w:pPr>
         <w:pStyle w:val="Heading2"/>
       </w:pPr>
-      <w:bookmarkStart w:id="15" w:name="_Toc242773729"/>
+      <w:bookmarkStart w:id="16" w:name="_Toc242966022"/>
       <w:r>
-        <w:t>3.1 Sub</w:t>
+        <w:t>3.1 Sub-tab Per Siswa</w:t>
       </w:r>
-      <w:r>
-        <w:t>-tab Per Siswa</w:t>
-      </w:r>
-      <w:bookmarkEnd w:id="15"/>
+      <w:bookmarkEnd w:id="16"/>
     </w:p>
     <w:p>
       <w:pPr>
@@ -11960,7 +13248,7 @@
                 <w:sz w:val="19"/>
                 <w:szCs w:val="19"/>
               </w:rPr>
-              <w:t>Tahap (dengan namanya) dan level yang sedang dikerjakan. "Semua level tuntas" bila tamat.</w:t>
+              <w:t>Tahap (dengan namanya) dan level yang sedang dikerjakan. "Semua level tuntas" bila tamat, atau "Tahapan selesai" bila tahapan khususnya (berujung Berhenti) sudah tuntas.</w:t>
             </w:r>
           </w:p>
         </w:tc>
@@ -12708,10 +13996,7 @@
         <w:t>skor</w:t>
       </w:r>
       <w:r>
-        <w:t xml:space="preserve"> dipakai untuk urutan "perlu perhatian dulu": skor semua label dijumlahkan, siswa de</w:t>
-      </w:r>
-      <w:r>
-        <w:t>ngan jumlah terbesar tampil paling atas.</w:t>
+        <w:t xml:space="preserve"> dipakai untuk urutan "perlu perhatian dulu": skor semua label dijumlahkan, siswa dengan jumlah terbesar tampil paling atas.</w:t>
       </w:r>
     </w:p>
     <w:tbl>
@@ -14432,14 +15717,7 @@
                 <w:sz w:val="19"/>
                 <w:szCs w:val="19"/>
               </w:rPr>
-              <w:t xml:space="preserve">Artinya: Dimas rajin berlatih di rumah, tetapi dalam sesi kelas tidak ada sub level yang lulus seminggu ini dan ada </w:t>
-            </w:r>
-            <w:r>
-              <w:rPr>
-                <w:sz w:val="19"/>
-                <w:szCs w:val="19"/>
-              </w:rPr>
-              <w:t xml:space="preserve">sub level yang sudah dicoba 3 kali tanpa mencapai 80%. Langkah berikutnya: ketuk namanya → lihat </w:t>
+              <w:t xml:space="preserve">Artinya: Dimas rajin berlatih di rumah, tetapi dalam sesi kelas tidak ada sub level yang lulus seminggu ini dan ada sub level yang sudah dicoba 3 kali tanpa mencapai 80%. Langkah berikutnya: ketuk namanya → lihat </w:t>
             </w:r>
             <w:r>
               <w:rPr>
@@ -14486,11 +15764,11 @@
       <w:pPr>
         <w:pStyle w:val="Heading2"/>
       </w:pPr>
-      <w:bookmarkStart w:id="16" w:name="_Toc242773730"/>
+      <w:bookmarkStart w:id="17" w:name="_Toc242966023"/>
       <w:r>
         <w:t>3.2 Sub-tab Per Rombel</w:t>
       </w:r>
-      <w:bookmarkEnd w:id="16"/>
+      <w:bookmarkEnd w:id="17"/>
     </w:p>
     <w:p>
       <w:pPr>
@@ -15354,10 +16632,7 @@
         <w:t>banyak siswa yang sedang berada di tahap itu</w:t>
       </w:r>
       <w:r>
-        <w:t>. Bila ada, ditambah batang "Tamat semua tahap". Di bawah grafik tertulis berapa siswa yang belu</w:t>
-      </w:r>
-      <w:r>
-        <w:t>m mulai.</w:t>
+        <w:t>. Bila ada, ditambah batang "Tamat semua tahap". Di bawah grafik tertulis berapa siswa yang belum mulai.</w:t>
       </w:r>
     </w:p>
     <w:p>
@@ -15414,14 +16689,7 @@
           <w:b/>
           <w:bCs/>
         </w:rPr>
-        <w:t>Masih banyak di Tah</w:t>
-      </w:r>
-      <w:r>
-        <w:rPr>
-          <w:b/>
-          <w:bCs/>
-        </w:rPr>
-        <w:t>ap 0</w:t>
+        <w:t>Masih banyak di Tahap 0</w:t>
       </w:r>
       <w:r>
         <w:t xml:space="preserve"> pada rombel kelas 11/12 → kosakata dasar menjadi hambatan; pertimbangkan tahapan yang memadatkan Tahap 0.</w:t>
@@ -16158,14 +17426,7 @@
                 <w:sz w:val="19"/>
                 <w:szCs w:val="19"/>
               </w:rPr>
-              <w:t xml:space="preserve"> menunjukkan seberapa lebar rentang kemampuan di rombel itu. Bila rombel memakai tahapan khusus yang berbeda, "rata-rata level tuntas" tidak bisa dibandingkan langsung karena</w:t>
-            </w:r>
-            <w:r>
-              <w:rPr>
-                <w:sz w:val="19"/>
-                <w:szCs w:val="19"/>
-              </w:rPr>
-              <w:t xml:space="preserve"> jumlah levelnya berbeda.</w:t>
+              <w:t xml:space="preserve"> menunjukkan seberapa lebar rentang kemampuan di rombel itu. Bila rombel memakai tahapan khusus yang berbeda, "rata-rata level tuntas" tidak bisa dibandingkan langsung karena jumlah levelnya berbeda.</w:t>
             </w:r>
           </w:p>
         </w:tc>
@@ -16180,12 +17441,12 @@
       <w:pPr>
         <w:pStyle w:val="Heading2"/>
       </w:pPr>
-      <w:bookmarkStart w:id="17" w:name="_Toc242773731"/>
+      <w:bookmarkStart w:id="18" w:name="_Toc242966024"/>
       <w:r>
         <w:lastRenderedPageBreak/>
         <w:t>3.3 Sub-tab Peringkat</w:t>
       </w:r>
-      <w:bookmarkEnd w:id="17"/>
+      <w:bookmarkEnd w:id="18"/>
     </w:p>
     <w:p>
       <w:pPr>
@@ -16202,10 +17463,7 @@
         <w:t>Hanya kemajuan resmi</w:t>
       </w:r>
       <w:r>
-        <w:t xml:space="preserve"> yang dihitung; latihan mandiri tidak ikut. Level tuntas mengikuti tahapan yang berlaku bagi tiap siswa. Nilai yang sama mendapat peringkat yang sama (mis. 1, 2, 2, 4). Peringkat 1–3 ditandai warna emas, perak, perunggu, dan kolom yang menjadi dasar pering</w:t>
-      </w:r>
-      <w:r>
-        <w:t>kat disorot.</w:t>
+        <w:t xml:space="preserve"> yang dihitung; latihan mandiri tidak ikut. Level tuntas mengikuti tahapan yang berlaku bagi tiap siswa. Nilai yang sama mendapat peringkat yang sama (mis. 1, 2, 2, 4). Peringkat 1–3 ditandai warna emas, perak, perunggu, dan kolom yang menjadi dasar peringkat disorot.</w:t>
       </w:r>
     </w:p>
     <w:p>
@@ -19280,14 +20538,7 @@
                 <w:sz w:val="19"/>
                 <w:szCs w:val="19"/>
               </w:rPr>
-              <w:t xml:space="preserve">Jumlah siswa dan </w:t>
-            </w:r>
-            <w:r>
-              <w:rPr>
-                <w:sz w:val="19"/>
-                <w:szCs w:val="19"/>
-              </w:rPr>
-              <w:t>yang berlatih dalam periode.</w:t>
+              <w:t>Jumlah siswa dan yang berlatih dalam periode.</w:t>
             </w:r>
           </w:p>
         </w:tc>
@@ -19567,12 +20818,12 @@
         <w:pStyle w:val="Heading1"/>
         <w:pageBreakBefore/>
       </w:pPr>
-      <w:bookmarkStart w:id="18" w:name="_Toc242773732"/>
+      <w:bookmarkStart w:id="19" w:name="_Toc242966025"/>
       <w:r>
         <w:lastRenderedPageBreak/>
         <w:t>4. Tab Analisis Siswa</w:t>
       </w:r>
-      <w:bookmarkEnd w:id="18"/>
+      <w:bookmarkEnd w:id="19"/>
     </w:p>
     <w:p>
       <w:pPr>
@@ -20938,11 +22189,11 @@
       <w:pPr>
         <w:pStyle w:val="Heading2"/>
       </w:pPr>
-      <w:bookmarkStart w:id="19" w:name="_Toc242773733"/>
+      <w:bookmarkStart w:id="20" w:name="_Toc242966026"/>
       <w:r>
         <w:t>4.1 Kartu identitas</w:t>
       </w:r>
-      <w:bookmarkEnd w:id="19"/>
+      <w:bookmarkEnd w:id="20"/>
     </w:p>
     <w:p>
       <w:pPr>
@@ -20986,11 +22237,11 @@
       <w:pPr>
         <w:pStyle w:val="Heading2"/>
       </w:pPr>
-      <w:bookmarkStart w:id="20" w:name="_Toc242773734"/>
+      <w:bookmarkStart w:id="21" w:name="_Toc242966027"/>
       <w:r>
         <w:t>4.2 Enam kotak ringkasan</w:t>
       </w:r>
-      <w:bookmarkEnd w:id="20"/>
+      <w:bookmarkEnd w:id="21"/>
     </w:p>
     <w:tbl>
       <w:tblPr>
@@ -21148,15 +22399,7 @@
                 <w:sz w:val="16"/>
                 <w:szCs w:val="16"/>
               </w:rPr>
-              <w:t>rata-</w:t>
-            </w:r>
-            <w:r>
-              <w:rPr>
-                <w:color w:val="5B6B7D"/>
-                <w:sz w:val="16"/>
-                <w:szCs w:val="16"/>
-              </w:rPr>
-              <w:t>rata nilai (190 sub level)</w:t>
+              <w:t>rata-rata nilai (190 sub level)</w:t>
             </w:r>
           </w:p>
         </w:tc>
@@ -22022,11 +23265,11 @@
       <w:pPr>
         <w:pStyle w:val="Heading2"/>
       </w:pPr>
-      <w:bookmarkStart w:id="21" w:name="_Toc242773735"/>
+      <w:bookmarkStart w:id="22" w:name="_Toc242966028"/>
       <w:r>
         <w:t>4.3 Kotak terkunci dan Aturan yang berlaku</w:t>
       </w:r>
-      <w:bookmarkEnd w:id="21"/>
+      <w:bookmarkEnd w:id="22"/>
     </w:p>
     <w:p>
       <w:pPr>
@@ -22061,10 +23304,30 @@
         <w:t>Aturan dan tahapan yang berlaku</w:t>
       </w:r>
       <w:r>
-        <w:t xml:space="preserve"> bisa dibuka-tutup. Labelnya "Pengaturan Umu</w:t>
+        <w:t xml:space="preserve"> bisa dibuka-tutup. Labelnya "Pengaturan Umum" bila tidak ada aturan khusus, atau "N aturan khusus" (kuning) bila ada, ditambah label tahapan bila memakai tahapan khusus. Isinya setiap aturan beserta asalnya (</w:t>
       </w:r>
       <w:r>
-        <w:t xml:space="preserve">m" bila tidak ada aturan khusus, atau "N aturan khusus" (kuning) bila ada, ditambah label tahapan bila memakai tahapan khusus. Isinya setiap aturan beserta asalnya (siswa / rombel / umum), dikelompokkan: </w:t>
+        <w:rPr>
+          <w:b/>
+          <w:bCs/>
+        </w:rPr>
+        <w:t>siswa / rombel / tahapan / umum</w:t>
+      </w:r>
+      <w:r>
+        <w:t xml:space="preserve">; </w:t>
+      </w:r>
+      <w:r>
+        <w:rPr>
+          <w:i/>
+          <w:iCs/>
+        </w:rPr>
+        <w:t>tahapan</w:t>
+      </w:r>
+      <w:r>
+        <w:t xml:space="preserve"> = atur</w:t>
+      </w:r>
+      <w:r>
+        <w:t xml:space="preserve">an dasar tahapan), dikelompokkan: </w:t>
       </w:r>
       <w:r>
         <w:rPr>
@@ -22074,10 +23337,7 @@
         <w:t>Halaman latihan</w:t>
       </w:r>
       <w:r>
-        <w:t xml:space="preserve"> (jawaban benar saat salah, bila jawa</w:t>
-      </w:r>
-      <w:r>
-        <w:t xml:space="preserve">ban salah), </w:t>
+        <w:t xml:space="preserve"> (jawaban benar saat salah, bila jawaban salah), </w:t>
       </w:r>
       <w:r>
         <w:rPr>
@@ -22087,7 +23347,7 @@
         <w:t>Naik sub level</w:t>
       </w:r>
       <w:r>
-        <w:t xml:space="preserve"> (jumlah soal, batas salah, harus dengar, harus baca, akurasi membaca minimal), </w:t>
+        <w:t xml:space="preserve"> (jumlah soal, batas salah, harus dengar, harus baca, akurasi membaca minimal, urutan level), </w:t>
       </w:r>
       <w:r>
         <w:rPr>
@@ -22107,7 +23367,30 @@
         <w:t>Sesi</w:t>
       </w:r>
       <w:r>
-        <w:t xml:space="preserve"> (lama satu sesi).</w:t>
+        <w:t xml:space="preserve"> (lama satu ses</w:t>
+      </w:r>
+      <w:r>
+        <w:t xml:space="preserve">i). Bila tahapannya punya aturan per tahap/level, di bawahnya ada daftar </w:t>
+      </w:r>
+      <w:r>
+        <w:rPr>
+          <w:b/>
+          <w:bCs/>
+        </w:rPr>
+        <w:t>Aturan berbeda di bagian tahapan</w:t>
+      </w:r>
+      <w:r>
+        <w:t xml:space="preserve">. Bagian latihan mandiri menyebut bila aturannya </w:t>
+      </w:r>
+      <w:r>
+        <w:rPr>
+          <w:b/>
+          <w:bCs/>
+        </w:rPr>
+        <w:t>Sama dengan sesi kelompok</w:t>
+      </w:r>
+      <w:r>
+        <w:t>.</w:t>
       </w:r>
     </w:p>
     <w:tbl>
@@ -22171,14 +23454,7 @@
                 <w:sz w:val="19"/>
                 <w:szCs w:val="19"/>
               </w:rPr>
-              <w:t>Bila siswa mengeluh "kok saya harus membaca dulu, teman saya tidak", kotak ini me</w:t>
-            </w:r>
-            <w:r>
-              <w:rPr>
-                <w:sz w:val="19"/>
-                <w:szCs w:val="19"/>
-              </w:rPr>
-              <w:t>nunjukkan aturan mana yang berlaku untuknya dan dari mana asalnya.</w:t>
+              <w:t>Bila siswa mengeluh "kok saya harus membaca dulu, teman saya tidak", kotak ini menunjukkan aturan mana yang berlaku untuknya dan dari mana asalnya.</w:t>
             </w:r>
           </w:p>
         </w:tc>
@@ -22193,11 +23469,11 @@
       <w:pPr>
         <w:pStyle w:val="Heading2"/>
       </w:pPr>
-      <w:bookmarkStart w:id="22" w:name="_Toc242773736"/>
+      <w:bookmarkStart w:id="23" w:name="_Toc242966029"/>
       <w:r>
         <w:t>4.4 Catatan otomatis</w:t>
       </w:r>
-      <w:bookmarkEnd w:id="22"/>
+      <w:bookmarkEnd w:id="23"/>
     </w:p>
     <w:p>
       <w:pPr>
@@ -22404,14 +23680,7 @@
                 <w:sz w:val="19"/>
                 <w:szCs w:val="19"/>
               </w:rPr>
-              <w:t>"Macet di N sub level (3 kali atau lebih dicoba tanpa mencapai 80%): (level · sub level) (3×, terbaik 70%)</w:t>
-            </w:r>
-            <w:r>
-              <w:rPr>
-                <w:sz w:val="19"/>
-                <w:szCs w:val="19"/>
-              </w:rPr>
-              <w:t>…"</w:t>
+              <w:t>"Macet di N sub level (3 kali atau lebih dicoba tanpa mencapai 80%): (level · sub level) (3×, terbaik 70%)…"</w:t>
             </w:r>
           </w:p>
         </w:tc>
@@ -22520,35 +23789,7 @@
                 <w:sz w:val="19"/>
                 <w:szCs w:val="19"/>
               </w:rPr>
-              <w:t>Jenis sub level dengan rata-rata terendah (minimal 3 kali) bila di bawah 80%. Mis. "</w:t>
-            </w:r>
-            <w:r>
-              <w:rPr>
-                <w:sz w:val="19"/>
-                <w:szCs w:val="19"/>
-              </w:rPr>
-              <w:t>🎤</w:t>
-            </w:r>
-            <w:r>
-              <w:rPr>
-                <w:sz w:val="19"/>
-                <w:szCs w:val="19"/>
-              </w:rPr>
-              <w:t xml:space="preserve"> Ucapkan" lemah = kesulitan pelafalan, "</w:t>
-            </w:r>
-            <w:r>
-              <w:rPr>
-                <w:sz w:val="19"/>
-                <w:szCs w:val="19"/>
-              </w:rPr>
-              <w:t>🧠</w:t>
-            </w:r>
-            <w:r>
-              <w:rPr>
-                <w:sz w:val="19"/>
-                <w:szCs w:val="19"/>
-              </w:rPr>
-              <w:t xml:space="preserve"> Inferensi" lemah = kesulitan menyimpulkan.</w:t>
+              <w:t>Jenis sub level dengan rata-rata terendah (minimal 3 kali) bila di bawah 80%. Mis. "🎤 Ucapkan" lemah = kesulitan pelafalan, "🧠 Inferensi" lemah = kesulitan menyimpulkan.</w:t>
             </w:r>
           </w:p>
         </w:tc>
@@ -22613,14 +23854,7 @@
                 <w:sz w:val="19"/>
                 <w:szCs w:val="19"/>
               </w:rPr>
-              <w:t>Rata-rata 1</w:t>
-            </w:r>
-            <w:r>
-              <w:rPr>
-                <w:sz w:val="19"/>
-                <w:szCs w:val="19"/>
-              </w:rPr>
-              <w:t>0 hasil Baca &amp; Koreksi terakhir dalam sesi.</w:t>
+              <w:t>Rata-rata 10 hasil Baca &amp; Koreksi terakhir dalam sesi.</w:t>
             </w:r>
           </w:p>
         </w:tc>
@@ -22782,14 +24016,7 @@
                 <w:sz w:val="19"/>
                 <w:szCs w:val="19"/>
               </w:rPr>
-              <w:t>"Latihan mandiri: N hari dalam se</w:t>
-            </w:r>
-            <w:r>
-              <w:rPr>
-                <w:sz w:val="19"/>
-                <w:szCs w:val="19"/>
-              </w:rPr>
-              <w:t>minggu terakhir dan M hari dalam sebulan; X level tuntas di jalur mandiri (resmi: Y)."</w:t>
+              <w:t>"Latihan mandiri: N hari dalam seminggu terakhir dan M hari dalam sebulan; X level tuntas di jalur mandiri (resmi: Y)."</w:t>
             </w:r>
           </w:p>
         </w:tc>
@@ -22914,12 +24141,12 @@
       <w:pPr>
         <w:pStyle w:val="Heading2"/>
       </w:pPr>
-      <w:bookmarkStart w:id="23" w:name="_Toc242773737"/>
+      <w:bookmarkStart w:id="24" w:name="_Toc242966030"/>
       <w:r>
         <w:lastRenderedPageBreak/>
         <w:t>4.5 Riwayat semester (arsip)</w:t>
       </w:r>
-      <w:bookmarkEnd w:id="23"/>
+      <w:bookmarkEnd w:id="24"/>
     </w:p>
     <w:p>
       <w:pPr>
@@ -23013,11 +24240,11 @@
       <w:pPr>
         <w:pStyle w:val="Heading2"/>
       </w:pPr>
-      <w:bookmarkStart w:id="24" w:name="_Toc242773738"/>
+      <w:bookmarkStart w:id="25" w:name="_Toc242966031"/>
       <w:r>
         <w:t>4.6 Kartu Latihan mandiri (di luar sesi)</w:t>
       </w:r>
-      <w:bookmarkEnd w:id="24"/>
+      <w:bookmarkEnd w:id="25"/>
     </w:p>
     <w:p>
       <w:pPr>
@@ -23034,10 +24261,7 @@
         <w:t>tidak menaikkan kemajuan resmi</w:t>
       </w:r>
       <w:r>
-        <w:t xml:space="preserve">. Paragraf pembuka menyebut </w:t>
-      </w:r>
-      <w:r>
-        <w:t>pilihan siswa saat berlatih sendiri, mis. "biasanya 10 soal per sub level, jawaban ditampilkan pada 40% latihan".</w:t>
+        <w:t>. Paragraf pembuka menyebut pilihan siswa saat berlatih sendiri, mis. "biasanya 10 soal per sub level, jawaban ditampilkan pada 40% latihan".</w:t>
       </w:r>
     </w:p>
     <w:tbl>
@@ -23542,11 +24766,11 @@
       <w:pPr>
         <w:pStyle w:val="Heading2"/>
       </w:pPr>
-      <w:bookmarkStart w:id="25" w:name="_Toc242773739"/>
+      <w:bookmarkStart w:id="26" w:name="_Toc242966032"/>
       <w:r>
         <w:t>4.7 Grafik Kemajuan sub level lulus</w:t>
       </w:r>
-      <w:bookmarkEnd w:id="25"/>
+      <w:bookmarkEnd w:id="26"/>
     </w:p>
     <w:p>
       <w:pPr>
@@ -23563,10 +24787,7 @@
         <w:t>kumulatif</w:t>
       </w:r>
       <w:r>
-        <w:t xml:space="preserve">: setiap titik adalah satu tanggal siswa berlatih dalam 2 bulan terakhir, tingginya = total sub level yang sudah lulus </w:t>
-      </w:r>
-      <w:r>
-        <w:t>sampai tanggal itu (sub level yang lulus ulang tidak dihitung dua kali).</w:t>
+        <w:t>: setiap titik adalah satu tanggal siswa berlatih dalam 2 bulan terakhir, tingginya = total sub level yang sudah lulus sampai tanggal itu (sub level yang lulus ulang tidak dihitung dua kali).</w:t>
       </w:r>
     </w:p>
     <w:tbl>
@@ -23931,11 +25152,11 @@
       <w:pPr>
         <w:pStyle w:val="Heading2"/>
       </w:pPr>
-      <w:bookmarkStart w:id="26" w:name="_Toc242773740"/>
+      <w:bookmarkStart w:id="27" w:name="_Toc242966033"/>
       <w:r>
         <w:t>4.8 Kegiatan per jenis</w:t>
       </w:r>
-      <w:bookmarkEnd w:id="26"/>
+      <w:bookmarkEnd w:id="27"/>
     </w:p>
     <w:p>
       <w:pPr>
@@ -24074,16 +25295,7 @@
                 <w:sz w:val="19"/>
                 <w:szCs w:val="19"/>
               </w:rPr>
-              <w:t>👀</w:t>
-            </w:r>
-            <w:r>
-              <w:rPr>
-                <w:b/>
-                <w:bCs/>
-                <w:sz w:val="19"/>
-                <w:szCs w:val="19"/>
-              </w:rPr>
-              <w:t xml:space="preserve"> Kenali</w:t>
+              <w:t>👀 Kenali</w:t>
             </w:r>
           </w:p>
         </w:tc>
@@ -24149,16 +25361,7 @@
                 <w:sz w:val="19"/>
                 <w:szCs w:val="19"/>
               </w:rPr>
-              <w:t>👂</w:t>
-            </w:r>
-            <w:r>
-              <w:rPr>
-                <w:b/>
-                <w:bCs/>
-                <w:sz w:val="19"/>
-                <w:szCs w:val="19"/>
-              </w:rPr>
-              <w:t xml:space="preserve"> Dengar / Dengar &amp; pahami</w:t>
+              <w:t>👂 Dengar / Dengar &amp; pahami</w:t>
             </w:r>
           </w:p>
         </w:tc>
@@ -24225,16 +25428,7 @@
                 <w:szCs w:val="19"/>
               </w:rPr>
               <w:lastRenderedPageBreak/>
-              <w:t>💬</w:t>
-            </w:r>
-            <w:r>
-              <w:rPr>
-                <w:b/>
-                <w:bCs/>
-                <w:sz w:val="19"/>
-                <w:szCs w:val="19"/>
-              </w:rPr>
-              <w:t xml:space="preserve"> Situasi</w:t>
+              <w:t>💬 Situasi</w:t>
             </w:r>
           </w:p>
         </w:tc>
@@ -24300,16 +25494,7 @@
                 <w:sz w:val="19"/>
                 <w:szCs w:val="19"/>
               </w:rPr>
-              <w:t>🧩</w:t>
-            </w:r>
-            <w:r>
-              <w:rPr>
-                <w:b/>
-                <w:bCs/>
-                <w:sz w:val="19"/>
-                <w:szCs w:val="19"/>
-              </w:rPr>
-              <w:t xml:space="preserve"> Lengkapi &amp; susun / Susun kalimat</w:t>
+              <w:t>🧩 Lengkapi &amp; susun / Susun kalimat</w:t>
             </w:r>
           </w:p>
         </w:tc>
@@ -24375,16 +25560,7 @@
                 <w:sz w:val="19"/>
                 <w:szCs w:val="19"/>
               </w:rPr>
-              <w:t>🎤</w:t>
-            </w:r>
-            <w:r>
-              <w:rPr>
-                <w:b/>
-                <w:bCs/>
-                <w:sz w:val="19"/>
-                <w:szCs w:val="19"/>
-              </w:rPr>
-              <w:t xml:space="preserve"> Ucapkan / Terjemahkan &amp; ucapkan / Baca kalimat</w:t>
+              <w:t>🎤 Ucapkan / Terjemahkan &amp; ucapkan / Baca kalimat</w:t>
             </w:r>
           </w:p>
         </w:tc>
@@ -24450,61 +25626,7 @@
                 <w:sz w:val="19"/>
                 <w:szCs w:val="19"/>
               </w:rPr>
-              <w:t>☝</w:t>
-            </w:r>
-            <w:r>
-              <w:rPr>
-                <w:b/>
-                <w:bCs/>
-                <w:sz w:val="19"/>
-                <w:szCs w:val="19"/>
-              </w:rPr>
-              <w:t>️</w:t>
-            </w:r>
-            <w:r>
-              <w:rPr>
-                <w:b/>
-                <w:bCs/>
-                <w:sz w:val="19"/>
-                <w:szCs w:val="19"/>
-              </w:rPr>
-              <w:t xml:space="preserve"> Pilih bentuk, ⚖</w:t>
-            </w:r>
-            <w:r>
-              <w:rPr>
-                <w:b/>
-                <w:bCs/>
-                <w:sz w:val="19"/>
-                <w:szCs w:val="19"/>
-              </w:rPr>
-              <w:t>️</w:t>
-            </w:r>
-            <w:r>
-              <w:rPr>
-                <w:b/>
-                <w:bCs/>
-                <w:sz w:val="19"/>
-                <w:szCs w:val="19"/>
-              </w:rPr>
-              <w:t xml:space="preserve"> Benar atau salah, ✏</w:t>
-            </w:r>
-            <w:r>
-              <w:rPr>
-                <w:b/>
-                <w:bCs/>
-                <w:sz w:val="19"/>
-                <w:szCs w:val="19"/>
-              </w:rPr>
-              <w:t>️</w:t>
-            </w:r>
-            <w:r>
-              <w:rPr>
-                <w:b/>
-                <w:bCs/>
-                <w:sz w:val="19"/>
-                <w:szCs w:val="19"/>
-              </w:rPr>
-              <w:t xml:space="preserve"> Lengkapi</w:t>
+              <w:t>☝️ Pilih bentuk, ⚖️ Benar atau salah, ✏️ Lengkapi</w:t>
             </w:r>
           </w:p>
         </w:tc>
@@ -24570,52 +25692,7 @@
                 <w:sz w:val="19"/>
                 <w:szCs w:val="19"/>
               </w:rPr>
-              <w:t>📚</w:t>
-            </w:r>
-            <w:r>
-              <w:rPr>
-                <w:b/>
-                <w:bCs/>
-                <w:sz w:val="19"/>
-                <w:szCs w:val="19"/>
-              </w:rPr>
-              <w:t xml:space="preserve"> Kosakata bacaan, </w:t>
-            </w:r>
-            <w:r>
-              <w:rPr>
-                <w:b/>
-                <w:bCs/>
-                <w:sz w:val="19"/>
-                <w:szCs w:val="19"/>
-              </w:rPr>
-              <w:t>🔢</w:t>
-            </w:r>
-            <w:r>
-              <w:rPr>
-                <w:b/>
-                <w:bCs/>
-                <w:sz w:val="19"/>
-                <w:szCs w:val="19"/>
-              </w:rPr>
-              <w:t xml:space="preserve"> Urutkan, </w:t>
-            </w:r>
-            <w:r>
-              <w:rPr>
-                <w:b/>
-                <w:bCs/>
-                <w:sz w:val="19"/>
-                <w:szCs w:val="19"/>
-              </w:rPr>
-              <w:t>📝</w:t>
-            </w:r>
-            <w:r>
-              <w:rPr>
-                <w:b/>
-                <w:bCs/>
-                <w:sz w:val="19"/>
-                <w:szCs w:val="19"/>
-              </w:rPr>
-              <w:t xml:space="preserve"> Pemahaman</w:t>
+              <w:t>📚 Kosakata bacaan, 🔢 Urutkan, 📝 Pemahaman</w:t>
             </w:r>
           </w:p>
         </w:tc>
@@ -24681,25 +25758,7 @@
                 <w:sz w:val="19"/>
                 <w:szCs w:val="19"/>
               </w:rPr>
-              <w:t>✏</w:t>
-            </w:r>
-            <w:r>
-              <w:rPr>
-                <w:b/>
-                <w:bCs/>
-                <w:sz w:val="19"/>
-                <w:szCs w:val="19"/>
-              </w:rPr>
-              <w:t>️</w:t>
-            </w:r>
-            <w:r>
-              <w:rPr>
-                <w:b/>
-                <w:bCs/>
-                <w:sz w:val="19"/>
-                <w:szCs w:val="19"/>
-              </w:rPr>
-              <w:t xml:space="preserve"> Rumpang teks</w:t>
+              <w:t>✏️ Rumpang teks</w:t>
             </w:r>
           </w:p>
         </w:tc>
@@ -24765,16 +25824,7 @@
                 <w:sz w:val="19"/>
                 <w:szCs w:val="19"/>
               </w:rPr>
-              <w:t>💡</w:t>
-            </w:r>
-            <w:r>
-              <w:rPr>
-                <w:b/>
-                <w:bCs/>
-                <w:sz w:val="19"/>
-                <w:szCs w:val="19"/>
-              </w:rPr>
-              <w:t xml:space="preserve"> Ide pokok &amp; struktur/organisasi</w:t>
+              <w:t>💡 Ide pokok &amp; struktur/organisasi</w:t>
             </w:r>
           </w:p>
         </w:tc>
@@ -24840,52 +25890,7 @@
                 <w:sz w:val="19"/>
                 <w:szCs w:val="19"/>
               </w:rPr>
-              <w:t>🔎</w:t>
-            </w:r>
-            <w:r>
-              <w:rPr>
-                <w:b/>
-                <w:bCs/>
-                <w:sz w:val="19"/>
-                <w:szCs w:val="19"/>
-              </w:rPr>
-              <w:t xml:space="preserve"> Rincian &amp; rujukan, </w:t>
-            </w:r>
-            <w:r>
-              <w:rPr>
-                <w:b/>
-                <w:bCs/>
-                <w:sz w:val="19"/>
-                <w:szCs w:val="19"/>
-              </w:rPr>
-              <w:t>📖</w:t>
-            </w:r>
-            <w:r>
-              <w:rPr>
-                <w:b/>
-                <w:bCs/>
-                <w:sz w:val="19"/>
-                <w:szCs w:val="19"/>
-              </w:rPr>
-              <w:t xml:space="preserve"> Makna kata, </w:t>
-            </w:r>
-            <w:r>
-              <w:rPr>
-                <w:b/>
-                <w:bCs/>
-                <w:sz w:val="19"/>
-                <w:szCs w:val="19"/>
-              </w:rPr>
-              <w:t>🧠</w:t>
-            </w:r>
-            <w:r>
-              <w:rPr>
-                <w:b/>
-                <w:bCs/>
-                <w:sz w:val="19"/>
-                <w:szCs w:val="19"/>
-              </w:rPr>
-              <w:t xml:space="preserve"> Inferensi &amp; sikap penulis</w:t>
+              <w:t>🔎 Rincian &amp; rujukan, 📖 Makna kata, 🧠 Inferensi &amp; sikap penulis</w:t>
             </w:r>
           </w:p>
         </w:tc>
@@ -24951,34 +25956,7 @@
                 <w:sz w:val="19"/>
                 <w:szCs w:val="19"/>
               </w:rPr>
-              <w:t>🚀</w:t>
-            </w:r>
-            <w:r>
-              <w:rPr>
-                <w:b/>
-                <w:bCs/>
-                <w:sz w:val="19"/>
-                <w:szCs w:val="19"/>
-              </w:rPr>
-              <w:t xml:space="preserve"> Uji siap naik tahap, ⏱</w:t>
-            </w:r>
-            <w:r>
-              <w:rPr>
-                <w:b/>
-                <w:bCs/>
-                <w:sz w:val="19"/>
-                <w:szCs w:val="19"/>
-              </w:rPr>
-              <w:t>️</w:t>
-            </w:r>
-            <w:r>
-              <w:rPr>
-                <w:b/>
-                <w:bCs/>
-                <w:sz w:val="19"/>
-                <w:szCs w:val="19"/>
-              </w:rPr>
-              <w:t xml:space="preserve"> Simulasi TKA / UTBK/SNBT</w:t>
+              <w:t>🚀 Uji siap naik tahap, ⏱️ Simulasi TKA / UTBK/SNBT</w:t>
             </w:r>
           </w:p>
         </w:tc>
@@ -25095,14 +26073,7 @@
                 <w:sz w:val="19"/>
                 <w:szCs w:val="19"/>
               </w:rPr>
-              <w:t>, latihan pelafal</w:t>
-            </w:r>
-            <w:r>
-              <w:rPr>
-                <w:sz w:val="19"/>
-                <w:szCs w:val="19"/>
-              </w:rPr>
-              <w:t xml:space="preserve">an dan menyimak lebih tepat; bila jenis </w:t>
+              <w:t xml:space="preserve">, latihan pelafalan dan menyimak lebih tepat; bila jenis </w:t>
             </w:r>
             <w:r>
               <w:rPr>
@@ -25149,11 +26120,11 @@
       <w:pPr>
         <w:pStyle w:val="Heading2"/>
       </w:pPr>
-      <w:bookmarkStart w:id="27" w:name="_Toc242773741"/>
+      <w:bookmarkStart w:id="28" w:name="_Toc242966034"/>
       <w:r>
         <w:t>4.9 Per tahap</w:t>
       </w:r>
-      <w:bookmarkEnd w:id="27"/>
+      <w:bookmarkEnd w:id="28"/>
     </w:p>
     <w:tbl>
       <w:tblPr>
@@ -25517,11 +26488,11 @@
       <w:pPr>
         <w:pStyle w:val="Heading2"/>
       </w:pPr>
-      <w:bookmarkStart w:id="28" w:name="_Toc242773742"/>
+      <w:bookmarkStart w:id="29" w:name="_Toc242966035"/>
       <w:r>
         <w:t>4.10 Hasil di bawah 80% terakhir</w:t>
       </w:r>
-      <w:bookmarkEnd w:id="28"/>
+      <w:bookmarkEnd w:id="29"/>
     </w:p>
     <w:p>
       <w:pPr>
@@ -25811,49 +26782,7 @@
                 <w:sz w:val="19"/>
                 <w:szCs w:val="19"/>
               </w:rPr>
-              <w:t xml:space="preserve">Jenis sub level, atau </w:t>
-            </w:r>
-            <w:r>
-              <w:rPr>
-                <w:sz w:val="19"/>
-                <w:szCs w:val="19"/>
-              </w:rPr>
-              <w:t>🎤</w:t>
-            </w:r>
-            <w:r>
-              <w:rPr>
-                <w:sz w:val="19"/>
-                <w:szCs w:val="19"/>
-              </w:rPr>
-              <w:t xml:space="preserve"> Baca &amp; Koreksi, </w:t>
-            </w:r>
-            <w:r>
-              <w:rPr>
-                <w:sz w:val="19"/>
-                <w:szCs w:val="19"/>
-              </w:rPr>
-              <w:t>🎧</w:t>
-            </w:r>
-            <w:r>
-              <w:rPr>
-                <w:sz w:val="19"/>
-                <w:szCs w:val="19"/>
-              </w:rPr>
-              <w:t xml:space="preserve"> Dengar sampai selesai, </w:t>
-            </w:r>
-            <w:r>
-              <w:rPr>
-                <w:sz w:val="19"/>
-                <w:szCs w:val="19"/>
-              </w:rPr>
-              <w:t>📝</w:t>
-            </w:r>
-            <w:r>
-              <w:rPr>
-                <w:sz w:val="19"/>
-                <w:szCs w:val="19"/>
-              </w:rPr>
-              <w:t xml:space="preserve"> Soal pemahaman.</w:t>
+              <w:t>Jenis sub level, atau 🎤 Baca &amp; Koreksi, 🎧 Dengar sampai selesai, 📝 Soal pemahaman.</w:t>
             </w:r>
           </w:p>
         </w:tc>
@@ -26058,21 +26987,7 @@
                 <w:sz w:val="19"/>
                 <w:szCs w:val="19"/>
               </w:rPr>
-              <w:t xml:space="preserve">T0 · L5 Numbers 11 to 100 · </w:t>
-            </w:r>
-            <w:r>
-              <w:rPr>
-                <w:sz w:val="19"/>
-                <w:szCs w:val="19"/>
-              </w:rPr>
-              <w:t>🎤</w:t>
-            </w:r>
-            <w:r>
-              <w:rPr>
-                <w:sz w:val="19"/>
-                <w:szCs w:val="19"/>
-              </w:rPr>
-              <w:t xml:space="preserve"> Ucapkan · </w:t>
+              <w:t xml:space="preserve">T0 · L5 Numbers 11 to 100 · 🎤 Ucapkan · </w:t>
             </w:r>
             <w:r>
               <w:rPr>
@@ -26103,21 +27018,18 @@
       <w:pPr>
         <w:pStyle w:val="Heading2"/>
       </w:pPr>
-      <w:bookmarkStart w:id="29" w:name="_Toc242773743"/>
+      <w:bookmarkStart w:id="30" w:name="_Toc242966036"/>
       <w:r>
         <w:t>4.11 Riwayat sub level lulus</w:t>
       </w:r>
-      <w:bookmarkEnd w:id="29"/>
+      <w:bookmarkEnd w:id="30"/>
     </w:p>
     <w:p>
       <w:pPr>
         <w:spacing w:after="120" w:line="276" w:lineRule="auto"/>
       </w:pPr>
       <w:r>
-        <w:t>Sub level yang lulus untuk pertama kalinya, terbaru di atas (hing</w:t>
-      </w:r>
-      <w:r>
-        <w:t>ga 60 baris).</w:t>
+        <w:t>Sub level yang lulus untuk pertama kalinya, terbaru di atas (hingga 60 baris).</w:t>
       </w:r>
     </w:p>
     <w:tbl>
@@ -26634,11 +27546,11 @@
       <w:pPr>
         <w:pStyle w:val="Heading2"/>
       </w:pPr>
-      <w:bookmarkStart w:id="30" w:name="_Toc242773744"/>
+      <w:bookmarkStart w:id="31" w:name="_Toc242966037"/>
       <w:r>
         <w:t>4.12 Aturan dan tahapan siswa ini, Hapus data latihan</w:t>
       </w:r>
-      <w:bookmarkEnd w:id="30"/>
+      <w:bookmarkEnd w:id="31"/>
     </w:p>
     <w:p>
       <w:pPr>
@@ -26657,7 +27569,57 @@
         <w:t>Aturan dan tahapan siswa ini</w:t>
       </w:r>
       <w:r>
-        <w:t xml:space="preserve"> — empat pilihan (Aturan sesi, Aturan mandiri, Saran mandiri, Tahapan sesi) untuk siswa yang perlu remedial atau pengayaan sendiri. "Ikut rombel" untuk kembali. Tekan </w:t>
+        <w:t xml:space="preserve"> — empat pilihan (</w:t>
+      </w:r>
+      <w:r>
+        <w:rPr>
+          <w:i/>
+          <w:iCs/>
+        </w:rPr>
+        <w:t>Aturan sesi</w:t>
+      </w:r>
+      <w:r>
+        <w:t xml:space="preserve">, </w:t>
+      </w:r>
+      <w:r>
+        <w:rPr>
+          <w:i/>
+          <w:iCs/>
+        </w:rPr>
+        <w:t>Aturan mandiri</w:t>
+      </w:r>
+      <w:r>
+        <w:t xml:space="preserve"> (bisa </w:t>
+      </w:r>
+      <w:r>
+        <w:rPr>
+          <w:i/>
+          <w:iCs/>
+        </w:rPr>
+        <w:t>Sama dengan sesi kelompok</w:t>
+      </w:r>
+      <w:r>
+        <w:t xml:space="preserve">), </w:t>
+      </w:r>
+      <w:r>
+        <w:rPr>
+          <w:i/>
+          <w:iCs/>
+        </w:rPr>
+        <w:t>Saran mandiri</w:t>
+      </w:r>
+      <w:r>
+        <w:t xml:space="preserve">, </w:t>
+      </w:r>
+      <w:r>
+        <w:rPr>
+          <w:i/>
+          <w:iCs/>
+        </w:rPr>
+        <w:t>Tahapan sesi</w:t>
+      </w:r>
+      <w:r>
+        <w:t xml:space="preserve">) untuk siswa yang perlu remedial atau pengayaan sendiri. "Ikut rombel" untuk kembali. Tekan </w:t>
       </w:r>
       <w:r>
         <w:rPr>
@@ -26667,20 +27629,7 @@
         <w:t>Simpan</w:t>
       </w:r>
       <w:r>
-        <w:t xml:space="preserve">. </w:t>
-      </w:r>
-      <w:r>
-        <w:rPr>
-          <w:b/>
-          <w:bCs/>
-        </w:rPr>
-        <w:t>Kemajuan siswa tidak berubah</w:t>
-      </w:r>
-      <w:r>
-        <w:t>, tetapi angka level tuntas dan posisi dihitung ulang</w:t>
-      </w:r>
-      <w:r>
-        <w:t xml:space="preserve"> menurut tahapan barunya.</w:t>
+        <w:t>. Kemajuan siswa tidak berubah, tetapi angka level tuntas dan posisi dihitung ulang menurut tahapan barunya.</w:t>
       </w:r>
     </w:p>
     <w:p>
@@ -26771,14 +27720,7 @@
                 <w:sz w:val="19"/>
                 <w:szCs w:val="19"/>
               </w:rPr>
-              <w:t>Mengganti tahapan mengubah penyebut kemajuan (jumlah level) dan bisa mengubah p</w:t>
-            </w:r>
-            <w:r>
-              <w:rPr>
-                <w:sz w:val="19"/>
-                <w:szCs w:val="19"/>
-              </w:rPr>
-              <w:t>osisi yang tampil, karena posisi = level pertama yang belum tuntas pada tahapan itu. Nilai yang sudah diraih tetap tersimpan.</w:t>
+              <w:t>Mengganti tahapan mengubah penyebut kemajuan (jumlah level) dan bisa mengubah posisi yang tampil, karena posisi = level pertama yang belum tuntas pada tahapan itu. Nilai yang sudah diraih tetap tersimpan.</w:t>
             </w:r>
           </w:p>
         </w:tc>
@@ -26794,22 +27736,22 @@
         <w:pStyle w:val="Heading1"/>
         <w:pageBreakBefore/>
       </w:pPr>
-      <w:bookmarkStart w:id="31" w:name="_Toc242773745"/>
+      <w:bookmarkStart w:id="32" w:name="_Toc242966038"/>
       <w:r>
         <w:lastRenderedPageBreak/>
         <w:t>5. Dari Data ke Tindakan</w:t>
       </w:r>
-      <w:bookmarkEnd w:id="31"/>
+      <w:bookmarkEnd w:id="32"/>
     </w:p>
     <w:p>
       <w:pPr>
         <w:pStyle w:val="Heading2"/>
       </w:pPr>
-      <w:bookmarkStart w:id="32" w:name="_Toc242773746"/>
+      <w:bookmarkStart w:id="33" w:name="_Toc242966039"/>
       <w:r>
         <w:t>5.1 Situasi umum dan tindakan</w:t>
       </w:r>
-      <w:bookmarkEnd w:id="32"/>
+      <w:bookmarkEnd w:id="33"/>
     </w:p>
     <w:p>
       <w:pPr>
@@ -27549,21 +28491,7 @@
                 <w:sz w:val="19"/>
                 <w:szCs w:val="19"/>
               </w:rPr>
-              <w:t xml:space="preserve">Analisis → akurasi membaca rendah; </w:t>
-            </w:r>
-            <w:r>
-              <w:rPr>
-                <w:sz w:val="19"/>
-                <w:szCs w:val="19"/>
-              </w:rPr>
-              <w:t>🎤</w:t>
-            </w:r>
-            <w:r>
-              <w:rPr>
-                <w:sz w:val="19"/>
-                <w:szCs w:val="19"/>
-              </w:rPr>
-              <w:t xml:space="preserve"> Ucapkan paling lemah</w:t>
+              <w:t>Analisis → akurasi membaca rendah; 🎤 Ucapkan paling lemah</w:t>
             </w:r>
           </w:p>
         </w:tc>
@@ -27999,14 +28927,7 @@
                 <w:sz w:val="19"/>
                 <w:szCs w:val="19"/>
               </w:rPr>
-              <w:t xml:space="preserve">Cek frekuensi sesi dan partisipasi; samakan aturan/tahapan </w:t>
-            </w:r>
-            <w:r>
-              <w:rPr>
-                <w:sz w:val="19"/>
-                <w:szCs w:val="19"/>
-              </w:rPr>
-              <w:t>bila berbeda.</w:t>
+              <w:t>Cek frekuensi sesi dan partisipasi; samakan aturan/tahapan bila berbeda.</w:t>
             </w:r>
           </w:p>
         </w:tc>
@@ -28022,12 +28943,12 @@
         <w:pStyle w:val="Heading2"/>
         <w:pageBreakBefore/>
       </w:pPr>
-      <w:bookmarkStart w:id="33" w:name="_Toc242773747"/>
+      <w:bookmarkStart w:id="34" w:name="_Toc242966040"/>
       <w:r>
         <w:lastRenderedPageBreak/>
         <w:t>5.2 Tanya jawab singkat</w:t>
       </w:r>
-      <w:bookmarkEnd w:id="33"/>
+      <w:bookmarkEnd w:id="34"/>
     </w:p>
     <w:tbl>
       <w:tblPr>
@@ -28240,14 +29161,7 @@
                 <w:sz w:val="19"/>
                 <w:szCs w:val="19"/>
               </w:rPr>
-              <w:t>Latihan mandiri sengaja tidak men</w:t>
-            </w:r>
-            <w:r>
-              <w:rPr>
-                <w:sz w:val="19"/>
-                <w:szCs w:val="19"/>
-              </w:rPr>
-              <w:t>aikkan kemajuan resmi. Kemajuan resmi hanya naik dari sesi kelas yang diawasi.</w:t>
+              <w:t>Latihan mandiri sengaja tidak menaikkan kemajuan resmi. Kemajuan resmi hanya naik dari sesi kelas yang diawasi.</w:t>
             </w:r>
           </w:p>
         </w:tc>
@@ -28375,14 +29289,7 @@
                 <w:sz w:val="19"/>
                 <w:szCs w:val="19"/>
               </w:rPr>
-              <w:t xml:space="preserve">Per Siswa memakai semua nilai sejak awal, sedangkan Peringkat </w:t>
-            </w:r>
-            <w:r>
-              <w:rPr>
-                <w:sz w:val="19"/>
-                <w:szCs w:val="19"/>
-              </w:rPr>
-              <w:t>memakai nilai dalam periode yang dipilih (mis. 30 hari).</w:t>
+              <w:t>Per Siswa memakai semua nilai sejak awal, sedangkan Peringkat memakai nilai dalam periode yang dipilih (mis. 30 hari).</w:t>
             </w:r>
           </w:p>
         </w:tc>
@@ -28510,14 +29417,7 @@
                 <w:sz w:val="19"/>
                 <w:szCs w:val="19"/>
               </w:rPr>
-              <w:t>Waktu dihitung dari lama sesi (masuk sampai kegiatan terakhir), bukan per soal. Siswa yang masuk lalu diam lama tetap</w:t>
-            </w:r>
-            <w:r>
-              <w:rPr>
-                <w:sz w:val="19"/>
-                <w:szCs w:val="19"/>
-              </w:rPr>
-              <w:t xml:space="preserve"> terhitung sampai kegiatan terakhirnya.</w:t>
+              <w:t>Waktu dihitung dari lama sesi (masuk sampai kegiatan terakhir), bukan per soal. Siswa yang masuk lalu diam lama tetap terhitung sampai kegiatan terakhirnya.</w:t>
             </w:r>
           </w:p>
         </w:tc>
@@ -28613,6 +29513,435 @@
                 <w:szCs w:val="19"/>
               </w:rPr>
               <w:t>.</w:t>
+            </w:r>
+          </w:p>
+        </w:tc>
+      </w:tr>
+      <w:tr>
+        <w:trPr>
+          <w:cantSplit/>
+        </w:trPr>
+        <w:tc>
+          <w:tcPr>
+            <w:tcW w:w="3855" w:type="dxa"/>
+            <w:tcBorders>
+              <w:top w:val="single" w:sz="4" w:space="0" w:color="C9D3DE"/>
+              <w:left w:val="single" w:sz="4" w:space="0" w:color="C9D3DE"/>
+              <w:bottom w:val="single" w:sz="4" w:space="0" w:color="C9D3DE"/>
+              <w:right w:val="single" w:sz="4" w:space="0" w:color="C9D3DE"/>
+            </w:tcBorders>
+            <w:shd w:val="clear" w:color="auto" w:fill="F8FAFC"/>
+            <w:tcMar>
+              <w:top w:w="70" w:type="dxa"/>
+              <w:left w:w="110" w:type="dxa"/>
+              <w:bottom w:w="70" w:type="dxa"/>
+              <w:right w:w="110" w:type="dxa"/>
+            </w:tcMar>
+          </w:tcPr>
+          <w:p>
+            <w:pPr>
+              <w:spacing w:after="30"/>
+            </w:pPr>
+            <w:r>
+              <w:rPr>
+                <w:sz w:val="19"/>
+                <w:szCs w:val="19"/>
+              </w:rPr>
+              <w:t xml:space="preserve">Siswa tidak bisa membuka level berikutnya (ada ikon </w:t>
+            </w:r>
+            <w:r>
+              <w:rPr>
+                <w:sz w:val="19"/>
+                <w:szCs w:val="19"/>
+              </w:rPr>
+              <w:t>🔒</w:t>
+            </w:r>
+            <w:r>
+              <w:rPr>
+                <w:sz w:val="19"/>
+                <w:szCs w:val="19"/>
+              </w:rPr>
+              <w:t>)?</w:t>
+            </w:r>
+          </w:p>
+        </w:tc>
+        <w:tc>
+          <w:tcPr>
+            <w:tcW w:w="5783" w:type="dxa"/>
+            <w:tcBorders>
+              <w:top w:val="single" w:sz="4" w:space="0" w:color="C9D3DE"/>
+              <w:left w:val="single" w:sz="4" w:space="0" w:color="C9D3DE"/>
+              <w:bottom w:val="single" w:sz="4" w:space="0" w:color="C9D3DE"/>
+              <w:right w:val="single" w:sz="4" w:space="0" w:color="C9D3DE"/>
+            </w:tcBorders>
+            <w:shd w:val="clear" w:color="auto" w:fill="F8FAFC"/>
+            <w:tcMar>
+              <w:top w:w="70" w:type="dxa"/>
+              <w:left w:w="110" w:type="dxa"/>
+              <w:bottom w:w="70" w:type="dxa"/>
+              <w:right w:w="110" w:type="dxa"/>
+            </w:tcMar>
+          </w:tcPr>
+          <w:p>
+            <w:pPr>
+              <w:spacing w:after="30"/>
+            </w:pPr>
+            <w:r>
+              <w:rPr>
+                <w:sz w:val="19"/>
+                <w:szCs w:val="19"/>
+              </w:rPr>
+              <w:t xml:space="preserve">Urutan level sedang </w:t>
+            </w:r>
+            <w:r>
+              <w:rPr>
+                <w:b/>
+                <w:bCs/>
+                <w:sz w:val="19"/>
+                <w:szCs w:val="19"/>
+              </w:rPr>
+              <w:t>Berurutan</w:t>
+            </w:r>
+            <w:r>
+              <w:rPr>
+                <w:sz w:val="19"/>
+                <w:szCs w:val="19"/>
+              </w:rPr>
+              <w:t xml:space="preserve"> (Pengaturan Umum atau profil aturan). Level berikut terbuka setelah level sebelumnya tuntas.</w:t>
+            </w:r>
+          </w:p>
+        </w:tc>
+      </w:tr>
+      <w:tr>
+        <w:trPr>
+          <w:cantSplit/>
+        </w:trPr>
+        <w:tc>
+          <w:tcPr>
+            <w:tcW w:w="3855" w:type="dxa"/>
+            <w:tcBorders>
+              <w:top w:val="single" w:sz="4" w:space="0" w:color="C9D3DE"/>
+              <w:left w:val="single" w:sz="4" w:space="0" w:color="C9D3DE"/>
+              <w:bottom w:val="single" w:sz="4" w:space="0" w:color="C9D3DE"/>
+              <w:right w:val="single" w:sz="4" w:space="0" w:color="C9D3DE"/>
+            </w:tcBorders>
+            <w:tcMar>
+              <w:top w:w="70" w:type="dxa"/>
+              <w:left w:w="110" w:type="dxa"/>
+              <w:bottom w:w="70" w:type="dxa"/>
+              <w:right w:w="110" w:type="dxa"/>
+            </w:tcMar>
+          </w:tcPr>
+          <w:p>
+            <w:pPr>
+              <w:spacing w:after="30"/>
+            </w:pPr>
+            <w:r>
+              <w:rPr>
+                <w:sz w:val="19"/>
+                <w:szCs w:val="19"/>
+              </w:rPr>
+              <w:t>Siswa melihat "Tahapan latihan selesai"?</w:t>
+            </w:r>
+          </w:p>
+        </w:tc>
+        <w:tc>
+          <w:tcPr>
+            <w:tcW w:w="5783" w:type="dxa"/>
+            <w:tcBorders>
+              <w:top w:val="single" w:sz="4" w:space="0" w:color="C9D3DE"/>
+              <w:left w:val="single" w:sz="4" w:space="0" w:color="C9D3DE"/>
+              <w:bottom w:val="single" w:sz="4" w:space="0" w:color="C9D3DE"/>
+              <w:right w:val="single" w:sz="4" w:space="0" w:color="C9D3DE"/>
+            </w:tcBorders>
+            <w:tcMar>
+              <w:top w:w="70" w:type="dxa"/>
+              <w:left w:w="110" w:type="dxa"/>
+              <w:bottom w:w="70" w:type="dxa"/>
+              <w:right w:w="110" w:type="dxa"/>
+            </w:tcMar>
+          </w:tcPr>
+          <w:p>
+            <w:pPr>
+              <w:spacing w:after="30"/>
+            </w:pPr>
+            <w:r>
+              <w:rPr>
+                <w:sz w:val="19"/>
+                <w:szCs w:val="19"/>
+              </w:rPr>
+              <w:t>Semua level tahapan khususnya suda</w:t>
+            </w:r>
+            <w:r>
+              <w:rPr>
+                <w:sz w:val="19"/>
+                <w:szCs w:val="19"/>
+              </w:rPr>
+              <w:t xml:space="preserve">h tuntas dan tahapan itu berujung </w:t>
+            </w:r>
+            <w:r>
+              <w:rPr>
+                <w:b/>
+                <w:bCs/>
+                <w:sz w:val="19"/>
+                <w:szCs w:val="19"/>
+              </w:rPr>
+              <w:t>Berhenti</w:t>
+            </w:r>
+            <w:r>
+              <w:rPr>
+                <w:sz w:val="19"/>
+                <w:szCs w:val="19"/>
+              </w:rPr>
+              <w:t xml:space="preserve">. Pasang tahapan baru, atau ubah ujungnya menjadi </w:t>
+            </w:r>
+            <w:r>
+              <w:rPr>
+                <w:b/>
+                <w:bCs/>
+                <w:sz w:val="19"/>
+                <w:szCs w:val="19"/>
+              </w:rPr>
+              <w:t>Lanjut ke Tahapan Level</w:t>
+            </w:r>
+            <w:r>
+              <w:rPr>
+                <w:sz w:val="19"/>
+                <w:szCs w:val="19"/>
+              </w:rPr>
+              <w:t>.</w:t>
+            </w:r>
+          </w:p>
+        </w:tc>
+      </w:tr>
+      <w:tr>
+        <w:trPr>
+          <w:cantSplit/>
+        </w:trPr>
+        <w:tc>
+          <w:tcPr>
+            <w:tcW w:w="3855" w:type="dxa"/>
+            <w:tcBorders>
+              <w:top w:val="single" w:sz="4" w:space="0" w:color="C9D3DE"/>
+              <w:left w:val="single" w:sz="4" w:space="0" w:color="C9D3DE"/>
+              <w:bottom w:val="single" w:sz="4" w:space="0" w:color="C9D3DE"/>
+              <w:right w:val="single" w:sz="4" w:space="0" w:color="C9D3DE"/>
+            </w:tcBorders>
+            <w:shd w:val="clear" w:color="auto" w:fill="F8FAFC"/>
+            <w:tcMar>
+              <w:top w:w="70" w:type="dxa"/>
+              <w:left w:w="110" w:type="dxa"/>
+              <w:bottom w:w="70" w:type="dxa"/>
+              <w:right w:w="110" w:type="dxa"/>
+            </w:tcMar>
+          </w:tcPr>
+          <w:p>
+            <w:pPr>
+              <w:spacing w:after="30"/>
+            </w:pPr>
+            <w:r>
+              <w:rPr>
+                <w:sz w:val="19"/>
+                <w:szCs w:val="19"/>
+              </w:rPr>
+              <w:t>Sub level 6 terkunci padahal sub level 1–5 tidak dipakai tahapan?</w:t>
+            </w:r>
+          </w:p>
+        </w:tc>
+        <w:tc>
+          <w:tcPr>
+            <w:tcW w:w="5783" w:type="dxa"/>
+            <w:tcBorders>
+              <w:top w:val="single" w:sz="4" w:space="0" w:color="C9D3DE"/>
+              <w:left w:val="single" w:sz="4" w:space="0" w:color="C9D3DE"/>
+              <w:bottom w:val="single" w:sz="4" w:space="0" w:color="C9D3DE"/>
+              <w:right w:val="single" w:sz="4" w:space="0" w:color="C9D3DE"/>
+            </w:tcBorders>
+            <w:shd w:val="clear" w:color="auto" w:fill="F8FAFC"/>
+            <w:tcMar>
+              <w:top w:w="70" w:type="dxa"/>
+              <w:left w:w="110" w:type="dxa"/>
+              <w:bottom w:w="70" w:type="dxa"/>
+              <w:right w:w="110" w:type="dxa"/>
+            </w:tcMar>
+          </w:tcPr>
+          <w:p>
+            <w:pPr>
+              <w:spacing w:after="30"/>
+            </w:pPr>
+            <w:r>
+              <w:rPr>
+                <w:sz w:val="19"/>
+                <w:szCs w:val="19"/>
+              </w:rPr>
+              <w:t>Syarat dengar/baca berlaku sebelum sub level pertama yang dipakai tahapan. Siswa perlu mendengar/membaca teksnya dulu, atau matikan syarat itu lewat profil aturan (bisa per tahap/level).</w:t>
+            </w:r>
+          </w:p>
+        </w:tc>
+      </w:tr>
+      <w:tr>
+        <w:trPr>
+          <w:cantSplit/>
+        </w:trPr>
+        <w:tc>
+          <w:tcPr>
+            <w:tcW w:w="3855" w:type="dxa"/>
+            <w:tcBorders>
+              <w:top w:val="single" w:sz="4" w:space="0" w:color="C9D3DE"/>
+              <w:left w:val="single" w:sz="4" w:space="0" w:color="C9D3DE"/>
+              <w:bottom w:val="single" w:sz="4" w:space="0" w:color="C9D3DE"/>
+              <w:right w:val="single" w:sz="4" w:space="0" w:color="C9D3DE"/>
+            </w:tcBorders>
+            <w:tcMar>
+              <w:top w:w="70" w:type="dxa"/>
+              <w:left w:w="110" w:type="dxa"/>
+              <w:bottom w:w="70" w:type="dxa"/>
+              <w:right w:w="110" w:type="dxa"/>
+            </w:tcMar>
+          </w:tcPr>
+          <w:p>
+            <w:pPr>
+              <w:spacing w:after="30"/>
+            </w:pPr>
+            <w:r>
+              <w:rPr>
+                <w:sz w:val="19"/>
+                <w:szCs w:val="19"/>
+              </w:rPr>
+              <w:t>Bagaimana guru melihat bentuk soal tiap sub level?</w:t>
+            </w:r>
+          </w:p>
+        </w:tc>
+        <w:tc>
+          <w:tcPr>
+            <w:tcW w:w="5783" w:type="dxa"/>
+            <w:tcBorders>
+              <w:top w:val="single" w:sz="4" w:space="0" w:color="C9D3DE"/>
+              <w:left w:val="single" w:sz="4" w:space="0" w:color="C9D3DE"/>
+              <w:bottom w:val="single" w:sz="4" w:space="0" w:color="C9D3DE"/>
+              <w:right w:val="single" w:sz="4" w:space="0" w:color="C9D3DE"/>
+            </w:tcBorders>
+            <w:tcMar>
+              <w:top w:w="70" w:type="dxa"/>
+              <w:left w:w="110" w:type="dxa"/>
+              <w:bottom w:w="70" w:type="dxa"/>
+              <w:right w:w="110" w:type="dxa"/>
+            </w:tcMar>
+          </w:tcPr>
+          <w:p>
+            <w:pPr>
+              <w:spacing w:after="30"/>
+            </w:pPr>
+            <w:r>
+              <w:rPr>
+                <w:sz w:val="19"/>
+                <w:szCs w:val="19"/>
+              </w:rPr>
+              <w:t xml:space="preserve">Tab </w:t>
+            </w:r>
+            <w:r>
+              <w:rPr>
+                <w:b/>
+                <w:bCs/>
+                <w:sz w:val="19"/>
+                <w:szCs w:val="19"/>
+              </w:rPr>
+              <w:t>Tahapan Level</w:t>
+            </w:r>
+            <w:r>
+              <w:rPr>
+                <w:sz w:val="19"/>
+                <w:szCs w:val="19"/>
+              </w:rPr>
+              <w:t xml:space="preserve"> → buka level → tombol </w:t>
+            </w:r>
+            <w:r>
+              <w:rPr>
+                <w:b/>
+                <w:bCs/>
+                <w:sz w:val="19"/>
+                <w:szCs w:val="19"/>
+              </w:rPr>
+              <w:t>Coba</w:t>
+            </w:r>
+            <w:r>
+              <w:rPr>
+                <w:sz w:val="19"/>
+                <w:szCs w:val="19"/>
+              </w:rPr>
+              <w:t xml:space="preserve"> di samping sub level. Uji coba terbuka di tab baru, semua sub level terbuka tanpa syarat, dan tidak masuk rekap.</w:t>
+            </w:r>
+          </w:p>
+        </w:tc>
+      </w:tr>
+      <w:tr>
+        <w:trPr>
+          <w:cantSplit/>
+        </w:trPr>
+        <w:tc>
+          <w:tcPr>
+            <w:tcW w:w="3855" w:type="dxa"/>
+            <w:tcBorders>
+              <w:top w:val="single" w:sz="4" w:space="0" w:color="C9D3DE"/>
+              <w:left w:val="single" w:sz="4" w:space="0" w:color="C9D3DE"/>
+              <w:bottom w:val="single" w:sz="4" w:space="0" w:color="C9D3DE"/>
+              <w:right w:val="single" w:sz="4" w:space="0" w:color="C9D3DE"/>
+            </w:tcBorders>
+            <w:shd w:val="clear" w:color="auto" w:fill="F8FAFC"/>
+            <w:tcMar>
+              <w:top w:w="70" w:type="dxa"/>
+              <w:left w:w="110" w:type="dxa"/>
+              <w:bottom w:w="70" w:type="dxa"/>
+              <w:right w:w="110" w:type="dxa"/>
+            </w:tcMar>
+          </w:tcPr>
+          <w:p>
+            <w:pPr>
+              <w:spacing w:after="30"/>
+            </w:pPr>
+            <w:r>
+              <w:rPr>
+                <w:sz w:val="19"/>
+                <w:szCs w:val="19"/>
+              </w:rPr>
+              <w:t>Grafik suara bergerak, tetapi statusnya "tertangkap pengenal suara"?</w:t>
+            </w:r>
+          </w:p>
+        </w:tc>
+        <w:tc>
+          <w:tcPr>
+            <w:tcW w:w="5783" w:type="dxa"/>
+            <w:tcBorders>
+              <w:top w:val="single" w:sz="4" w:space="0" w:color="C9D3DE"/>
+              <w:left w:val="single" w:sz="4" w:space="0" w:color="C9D3DE"/>
+              <w:bottom w:val="single" w:sz="4" w:space="0" w:color="C9D3DE"/>
+              <w:right w:val="single" w:sz="4" w:space="0" w:color="C9D3DE"/>
+            </w:tcBorders>
+            <w:shd w:val="clear" w:color="auto" w:fill="F8FAFC"/>
+            <w:tcMar>
+              <w:top w:w="70" w:type="dxa"/>
+              <w:left w:w="110" w:type="dxa"/>
+              <w:bottom w:w="70" w:type="dxa"/>
+              <w:right w:w="110" w:type="dxa"/>
+            </w:tcMar>
+          </w:tcPr>
+          <w:p>
+            <w:pPr>
+              <w:spacing w:after="30"/>
+            </w:pPr>
+            <w:r>
+              <w:rPr>
+                <w:sz w:val="19"/>
+                <w:szCs w:val="19"/>
+              </w:rPr>
+              <w:t>HP itu tidak bisa memakai mikrofon untuk grafik dan pengenal suara sekaligus, sehingga grafik digerakkan sinyal pengenal suara. Penilaian tetap berjalan normal. Saat membaca, kata yang su</w:t>
+            </w:r>
+            <w:r>
+              <w:rPr>
+                <w:sz w:val="19"/>
+                <w:szCs w:val="19"/>
+              </w:rPr>
+              <w:t>dah dikenali berubah menjadi latar hijau tua.</w:t>
             </w:r>
           </w:p>
         </w:tc>

</xml_diff>

<commit_message>
Panduan: peringkat Paling rajin latihan mandiri (17 Okt 2026)
Co-Authored-By: Claude Opus 5.5 <noreply@anthropic.com>
</commit_message>
<xml_diff>
--- a/Panduan_Membaca_Data_English_Reading.docx
+++ b/Panduan_Membaca_Data_English_Reading.docx
@@ -135,7 +135,10 @@
     </w:p>
     <w:p>
       <w:r>
-        <w:t>Versi: 15 Oktober 2026 (sesuai tampilan aplikasi per tanggal tersebut)</w:t>
+        <w:t>Versi: 17 Oktober 2026, menambah peringkat Paling rajin latihan mandiri</w:t>
+      </w:r>
+      <w:r>
+        <w:t xml:space="preserve"> (sesuai tampilan aplikasi per tanggal tersebut)</w:t>
       </w:r>
     </w:p>
     <w:p>
@@ -188,7 +191,7 @@
           <w:r>
             <w:fldChar w:fldCharType="separate"/>
           </w:r>
-          <w:hyperlink w:anchor="_Toc242966006" w:history="1">
+          <w:hyperlink w:anchor="_Toc243165940" w:history="1">
             <w:r>
               <w:rPr>
                 <w:rStyle w:val="Hyperlink"/>
@@ -212,7 +215,7 @@
               <w:rPr>
                 <w:noProof/>
               </w:rPr>
-              <w:instrText xml:space="preserve"> PAGEREF _Toc242966006 \h </w:instrText>
+              <w:instrText xml:space="preserve"> PAGEREF _Toc243165940 \h </w:instrText>
             </w:r>
             <w:r>
               <w:rPr>
@@ -252,7 +255,7 @@
               <w:szCs w:val="22"/>
             </w:rPr>
           </w:pPr>
-          <w:hyperlink w:anchor="_Toc242966007" w:history="1">
+          <w:hyperlink w:anchor="_Toc243165941" w:history="1">
             <w:r>
               <w:rPr>
                 <w:rStyle w:val="Hyperlink"/>
@@ -276,7 +279,7 @@
               <w:rPr>
                 <w:noProof/>
               </w:rPr>
-              <w:instrText xml:space="preserve"> PAGEREF _Toc242966007 \h </w:instrText>
+              <w:instrText xml:space="preserve"> PAGEREF _Toc243165941 \h </w:instrText>
             </w:r>
             <w:r>
               <w:rPr>
@@ -316,7 +319,7 @@
               <w:szCs w:val="22"/>
             </w:rPr>
           </w:pPr>
-          <w:hyperlink w:anchor="_Toc242966008" w:history="1">
+          <w:hyperlink w:anchor="_Toc243165942" w:history="1">
             <w:r>
               <w:rPr>
                 <w:rStyle w:val="Hyperlink"/>
@@ -340,7 +343,7 @@
               <w:rPr>
                 <w:noProof/>
               </w:rPr>
-              <w:instrText xml:space="preserve"> PAGEREF _Toc242966008 \h </w:instrText>
+              <w:instrText xml:space="preserve"> PAGEREF _Toc243165942 \h </w:instrText>
             </w:r>
             <w:r>
               <w:rPr>
@@ -380,7 +383,7 @@
               <w:szCs w:val="22"/>
             </w:rPr>
           </w:pPr>
-          <w:hyperlink w:anchor="_Toc242966009" w:history="1">
+          <w:hyperlink w:anchor="_Toc243165943" w:history="1">
             <w:r>
               <w:rPr>
                 <w:rStyle w:val="Hyperlink"/>
@@ -404,7 +407,7 @@
               <w:rPr>
                 <w:noProof/>
               </w:rPr>
-              <w:instrText xml:space="preserve"> PAGEREF _Toc242966009 \h </w:instrText>
+              <w:instrText xml:space="preserve"> PAGEREF _Toc243165943 \h </w:instrText>
             </w:r>
             <w:r>
               <w:rPr>
@@ -444,7 +447,7 @@
               <w:szCs w:val="22"/>
             </w:rPr>
           </w:pPr>
-          <w:hyperlink w:anchor="_Toc242966010" w:history="1">
+          <w:hyperlink w:anchor="_Toc243165944" w:history="1">
             <w:r>
               <w:rPr>
                 <w:rStyle w:val="Hyperlink"/>
@@ -468,7 +471,7 @@
               <w:rPr>
                 <w:noProof/>
               </w:rPr>
-              <w:instrText xml:space="preserve"> PAGEREF _Toc242966010 \h </w:instrText>
+              <w:instrText xml:space="preserve"> PAGEREF _Toc243165944 \h </w:instrText>
             </w:r>
             <w:r>
               <w:rPr>
@@ -508,7 +511,7 @@
               <w:szCs w:val="22"/>
             </w:rPr>
           </w:pPr>
-          <w:hyperlink w:anchor="_Toc242966011" w:history="1">
+          <w:hyperlink w:anchor="_Toc243165945" w:history="1">
             <w:r>
               <w:rPr>
                 <w:rStyle w:val="Hyperlink"/>
@@ -532,7 +535,7 @@
               <w:rPr>
                 <w:noProof/>
               </w:rPr>
-              <w:instrText xml:space="preserve"> PAGEREF _Toc242966011 \h </w:instrText>
+              <w:instrText xml:space="preserve"> PAGEREF _Toc243165945 \h </w:instrText>
             </w:r>
             <w:r>
               <w:rPr>
@@ -572,7 +575,7 @@
               <w:szCs w:val="22"/>
             </w:rPr>
           </w:pPr>
-          <w:hyperlink w:anchor="_Toc242966012" w:history="1">
+          <w:hyperlink w:anchor="_Toc243165946" w:history="1">
             <w:r>
               <w:rPr>
                 <w:rStyle w:val="Hyperlink"/>
@@ -596,7 +599,7 @@
               <w:rPr>
                 <w:noProof/>
               </w:rPr>
-              <w:instrText xml:space="preserve"> PAGEREF _Toc242966012 \h </w:instrText>
+              <w:instrText xml:space="preserve"> PAGEREF _Toc243165946 \h </w:instrText>
             </w:r>
             <w:r>
               <w:rPr>
@@ -636,7 +639,7 @@
               <w:szCs w:val="22"/>
             </w:rPr>
           </w:pPr>
-          <w:hyperlink w:anchor="_Toc242966013" w:history="1">
+          <w:hyperlink w:anchor="_Toc243165947" w:history="1">
             <w:r>
               <w:rPr>
                 <w:rStyle w:val="Hyperlink"/>
@@ -660,7 +663,7 @@
               <w:rPr>
                 <w:noProof/>
               </w:rPr>
-              <w:instrText xml:space="preserve"> PAGEREF _Toc242966013 \h </w:instrText>
+              <w:instrText xml:space="preserve"> PAGEREF _Toc243165947 \h </w:instrText>
             </w:r>
             <w:r>
               <w:rPr>
@@ -700,7 +703,7 @@
               <w:szCs w:val="22"/>
             </w:rPr>
           </w:pPr>
-          <w:hyperlink w:anchor="_Toc242966014" w:history="1">
+          <w:hyperlink w:anchor="_Toc243165948" w:history="1">
             <w:r>
               <w:rPr>
                 <w:rStyle w:val="Hyperlink"/>
@@ -724,7 +727,7 @@
               <w:rPr>
                 <w:noProof/>
               </w:rPr>
-              <w:instrText xml:space="preserve"> PAGEREF _Toc242966014 \h </w:instrText>
+              <w:instrText xml:space="preserve"> PAGEREF _Toc243165948 \h </w:instrText>
             </w:r>
             <w:r>
               <w:rPr>
@@ -764,7 +767,7 @@
               <w:szCs w:val="22"/>
             </w:rPr>
           </w:pPr>
-          <w:hyperlink w:anchor="_Toc242966015" w:history="1">
+          <w:hyperlink w:anchor="_Toc243165949" w:history="1">
             <w:r>
               <w:rPr>
                 <w:rStyle w:val="Hyperlink"/>
@@ -788,7 +791,7 @@
               <w:rPr>
                 <w:noProof/>
               </w:rPr>
-              <w:instrText xml:space="preserve"> PAGEREF _Toc242966015 \h </w:instrText>
+              <w:instrText xml:space="preserve"> PAGEREF _Toc243165949 \h </w:instrText>
             </w:r>
             <w:r>
               <w:rPr>
@@ -828,7 +831,7 @@
               <w:szCs w:val="22"/>
             </w:rPr>
           </w:pPr>
-          <w:hyperlink w:anchor="_Toc242966016" w:history="1">
+          <w:hyperlink w:anchor="_Toc243165950" w:history="1">
             <w:r>
               <w:rPr>
                 <w:rStyle w:val="Hyperlink"/>
@@ -852,7 +855,7 @@
               <w:rPr>
                 <w:noProof/>
               </w:rPr>
-              <w:instrText xml:space="preserve"> PAGEREF _Toc242966016 \h </w:instrText>
+              <w:instrText xml:space="preserve"> PAGEREF _Toc243165950 \h </w:instrText>
             </w:r>
             <w:r>
               <w:rPr>
@@ -892,7 +895,7 @@
               <w:szCs w:val="22"/>
             </w:rPr>
           </w:pPr>
-          <w:hyperlink w:anchor="_Toc242966017" w:history="1">
+          <w:hyperlink w:anchor="_Toc243165951" w:history="1">
             <w:r>
               <w:rPr>
                 <w:rStyle w:val="Hyperlink"/>
@@ -916,7 +919,7 @@
               <w:rPr>
                 <w:noProof/>
               </w:rPr>
-              <w:instrText xml:space="preserve"> PAGEREF _Toc242966017 \h </w:instrText>
+              <w:instrText xml:space="preserve"> PAGEREF _Toc243165951 \h </w:instrText>
             </w:r>
             <w:r>
               <w:rPr>
@@ -956,7 +959,7 @@
               <w:szCs w:val="22"/>
             </w:rPr>
           </w:pPr>
-          <w:hyperlink w:anchor="_Toc242966018" w:history="1">
+          <w:hyperlink w:anchor="_Toc243165952" w:history="1">
             <w:r>
               <w:rPr>
                 <w:rStyle w:val="Hyperlink"/>
@@ -980,7 +983,7 @@
               <w:rPr>
                 <w:noProof/>
               </w:rPr>
-              <w:instrText xml:space="preserve"> PAGEREF _Toc242966018 \h </w:instrText>
+              <w:instrText xml:space="preserve"> PAGEREF _Toc243165952 \h </w:instrText>
             </w:r>
             <w:r>
               <w:rPr>
@@ -1020,7 +1023,7 @@
               <w:szCs w:val="22"/>
             </w:rPr>
           </w:pPr>
-          <w:hyperlink w:anchor="_Toc242966019" w:history="1">
+          <w:hyperlink w:anchor="_Toc243165953" w:history="1">
             <w:r>
               <w:rPr>
                 <w:rStyle w:val="Hyperlink"/>
@@ -1044,7 +1047,7 @@
               <w:rPr>
                 <w:noProof/>
               </w:rPr>
-              <w:instrText xml:space="preserve"> PAGEREF _Toc242966019 \h </w:instrText>
+              <w:instrText xml:space="preserve"> PAGEREF _Toc243165953 \h </w:instrText>
             </w:r>
             <w:r>
               <w:rPr>
@@ -1084,7 +1087,7 @@
               <w:szCs w:val="22"/>
             </w:rPr>
           </w:pPr>
-          <w:hyperlink w:anchor="_Toc242966020" w:history="1">
+          <w:hyperlink w:anchor="_Toc243165954" w:history="1">
             <w:r>
               <w:rPr>
                 <w:rStyle w:val="Hyperlink"/>
@@ -1108,7 +1111,7 @@
               <w:rPr>
                 <w:noProof/>
               </w:rPr>
-              <w:instrText xml:space="preserve"> PAGEREF _Toc242966020 \h </w:instrText>
+              <w:instrText xml:space="preserve"> PAGEREF _Toc243165954 \h </w:instrText>
             </w:r>
             <w:r>
               <w:rPr>
@@ -1148,7 +1151,7 @@
               <w:szCs w:val="22"/>
             </w:rPr>
           </w:pPr>
-          <w:hyperlink w:anchor="_Toc242966021" w:history="1">
+          <w:hyperlink w:anchor="_Toc243165955" w:history="1">
             <w:r>
               <w:rPr>
                 <w:rStyle w:val="Hyperlink"/>
@@ -1172,7 +1175,7 @@
               <w:rPr>
                 <w:noProof/>
               </w:rPr>
-              <w:instrText xml:space="preserve"> PAGEREF _Toc242966021 \h </w:instrText>
+              <w:instrText xml:space="preserve"> PAGEREF _Toc243165955 \h </w:instrText>
             </w:r>
             <w:r>
               <w:rPr>
@@ -1212,7 +1215,7 @@
               <w:szCs w:val="22"/>
             </w:rPr>
           </w:pPr>
-          <w:hyperlink w:anchor="_Toc242966022" w:history="1">
+          <w:hyperlink w:anchor="_Toc243165956" w:history="1">
             <w:r>
               <w:rPr>
                 <w:rStyle w:val="Hyperlink"/>
@@ -1236,7 +1239,7 @@
               <w:rPr>
                 <w:noProof/>
               </w:rPr>
-              <w:instrText xml:space="preserve"> PAGEREF _Toc242966022 \h </w:instrText>
+              <w:instrText xml:space="preserve"> PAGEREF _Toc243165956 \h </w:instrText>
             </w:r>
             <w:r>
               <w:rPr>
@@ -1276,7 +1279,7 @@
               <w:szCs w:val="22"/>
             </w:rPr>
           </w:pPr>
-          <w:hyperlink w:anchor="_Toc242966023" w:history="1">
+          <w:hyperlink w:anchor="_Toc243165957" w:history="1">
             <w:r>
               <w:rPr>
                 <w:rStyle w:val="Hyperlink"/>
@@ -1300,7 +1303,7 @@
               <w:rPr>
                 <w:noProof/>
               </w:rPr>
-              <w:instrText xml:space="preserve"> PAGEREF _Toc242966023 \h </w:instrText>
+              <w:instrText xml:space="preserve"> PAGEREF _Toc243165957 \h </w:instrText>
             </w:r>
             <w:r>
               <w:rPr>
@@ -1340,7 +1343,7 @@
               <w:szCs w:val="22"/>
             </w:rPr>
           </w:pPr>
-          <w:hyperlink w:anchor="_Toc242966024" w:history="1">
+          <w:hyperlink w:anchor="_Toc243165958" w:history="1">
             <w:r>
               <w:rPr>
                 <w:rStyle w:val="Hyperlink"/>
@@ -1364,7 +1367,7 @@
               <w:rPr>
                 <w:noProof/>
               </w:rPr>
-              <w:instrText xml:space="preserve"> PAGEREF _Toc242966024 \h </w:instrText>
+              <w:instrText xml:space="preserve"> PAGEREF _Toc243165958 \h </w:instrText>
             </w:r>
             <w:r>
               <w:rPr>
@@ -1404,7 +1407,7 @@
               <w:szCs w:val="22"/>
             </w:rPr>
           </w:pPr>
-          <w:hyperlink w:anchor="_Toc242966025" w:history="1">
+          <w:hyperlink w:anchor="_Toc243165959" w:history="1">
             <w:r>
               <w:rPr>
                 <w:rStyle w:val="Hyperlink"/>
@@ -1428,7 +1431,7 @@
               <w:rPr>
                 <w:noProof/>
               </w:rPr>
-              <w:instrText xml:space="preserve"> PAGEREF _Toc242966025 \h </w:instrText>
+              <w:instrText xml:space="preserve"> PAGEREF _Toc243165959 \h </w:instrText>
             </w:r>
             <w:r>
               <w:rPr>
@@ -1445,7 +1448,7 @@
               <w:rPr>
                 <w:noProof/>
               </w:rPr>
-              <w:t>16</w:t>
+              <w:t>17</w:t>
             </w:r>
             <w:r>
               <w:rPr>
@@ -1468,7 +1471,7 @@
               <w:szCs w:val="22"/>
             </w:rPr>
           </w:pPr>
-          <w:hyperlink w:anchor="_Toc242966026" w:history="1">
+          <w:hyperlink w:anchor="_Toc243165960" w:history="1">
             <w:r>
               <w:rPr>
                 <w:rStyle w:val="Hyperlink"/>
@@ -1492,7 +1495,7 @@
               <w:rPr>
                 <w:noProof/>
               </w:rPr>
-              <w:instrText xml:space="preserve"> PAGEREF _Toc242966026 \h </w:instrText>
+              <w:instrText xml:space="preserve"> PAGEREF _Toc243165960 \h </w:instrText>
             </w:r>
             <w:r>
               <w:rPr>
@@ -1509,7 +1512,7 @@
               <w:rPr>
                 <w:noProof/>
               </w:rPr>
-              <w:t>16</w:t>
+              <w:t>17</w:t>
             </w:r>
             <w:r>
               <w:rPr>
@@ -1532,7 +1535,7 @@
               <w:szCs w:val="22"/>
             </w:rPr>
           </w:pPr>
-          <w:hyperlink w:anchor="_Toc242966027" w:history="1">
+          <w:hyperlink w:anchor="_Toc243165961" w:history="1">
             <w:r>
               <w:rPr>
                 <w:rStyle w:val="Hyperlink"/>
@@ -1556,7 +1559,7 @@
               <w:rPr>
                 <w:noProof/>
               </w:rPr>
-              <w:instrText xml:space="preserve"> PAGEREF _Toc242966027 \h </w:instrText>
+              <w:instrText xml:space="preserve"> PAGEREF _Toc243165961 \h </w:instrText>
             </w:r>
             <w:r>
               <w:rPr>
@@ -1573,7 +1576,7 @@
               <w:rPr>
                 <w:noProof/>
               </w:rPr>
-              <w:t>16</w:t>
+              <w:t>17</w:t>
             </w:r>
             <w:r>
               <w:rPr>
@@ -1596,7 +1599,7 @@
               <w:szCs w:val="22"/>
             </w:rPr>
           </w:pPr>
-          <w:hyperlink w:anchor="_Toc242966028" w:history="1">
+          <w:hyperlink w:anchor="_Toc243165962" w:history="1">
             <w:r>
               <w:rPr>
                 <w:rStyle w:val="Hyperlink"/>
@@ -1620,7 +1623,7 @@
               <w:rPr>
                 <w:noProof/>
               </w:rPr>
-              <w:instrText xml:space="preserve"> PAGEREF _Toc242966028 \h </w:instrText>
+              <w:instrText xml:space="preserve"> PAGEREF _Toc243165962 \h </w:instrText>
             </w:r>
             <w:r>
               <w:rPr>
@@ -1637,7 +1640,7 @@
               <w:rPr>
                 <w:noProof/>
               </w:rPr>
-              <w:t>17</w:t>
+              <w:t>18</w:t>
             </w:r>
             <w:r>
               <w:rPr>
@@ -1660,7 +1663,7 @@
               <w:szCs w:val="22"/>
             </w:rPr>
           </w:pPr>
-          <w:hyperlink w:anchor="_Toc242966029" w:history="1">
+          <w:hyperlink w:anchor="_Toc243165963" w:history="1">
             <w:r>
               <w:rPr>
                 <w:rStyle w:val="Hyperlink"/>
@@ -1684,7 +1687,7 @@
               <w:rPr>
                 <w:noProof/>
               </w:rPr>
-              <w:instrText xml:space="preserve"> PAGEREF _Toc242966029 \h </w:instrText>
+              <w:instrText xml:space="preserve"> PAGEREF _Toc243165963 \h </w:instrText>
             </w:r>
             <w:r>
               <w:rPr>
@@ -1701,7 +1704,7 @@
               <w:rPr>
                 <w:noProof/>
               </w:rPr>
-              <w:t>17</w:t>
+              <w:t>18</w:t>
             </w:r>
             <w:r>
               <w:rPr>
@@ -1724,7 +1727,7 @@
               <w:szCs w:val="22"/>
             </w:rPr>
           </w:pPr>
-          <w:hyperlink w:anchor="_Toc242966030" w:history="1">
+          <w:hyperlink w:anchor="_Toc243165964" w:history="1">
             <w:r>
               <w:rPr>
                 <w:rStyle w:val="Hyperlink"/>
@@ -1748,7 +1751,7 @@
               <w:rPr>
                 <w:noProof/>
               </w:rPr>
-              <w:instrText xml:space="preserve"> PAGEREF _Toc242966030 \h </w:instrText>
+              <w:instrText xml:space="preserve"> PAGEREF _Toc243165964 \h </w:instrText>
             </w:r>
             <w:r>
               <w:rPr>
@@ -1765,7 +1768,7 @@
               <w:rPr>
                 <w:noProof/>
               </w:rPr>
-              <w:t>18</w:t>
+              <w:t>19</w:t>
             </w:r>
             <w:r>
               <w:rPr>
@@ -1788,7 +1791,7 @@
               <w:szCs w:val="22"/>
             </w:rPr>
           </w:pPr>
-          <w:hyperlink w:anchor="_Toc242966031" w:history="1">
+          <w:hyperlink w:anchor="_Toc243165965" w:history="1">
             <w:r>
               <w:rPr>
                 <w:rStyle w:val="Hyperlink"/>
@@ -1812,7 +1815,7 @@
               <w:rPr>
                 <w:noProof/>
               </w:rPr>
-              <w:instrText xml:space="preserve"> PAGEREF _Toc242966031 \h </w:instrText>
+              <w:instrText xml:space="preserve"> PAGEREF _Toc243165965 \h </w:instrText>
             </w:r>
             <w:r>
               <w:rPr>
@@ -1829,7 +1832,7 @@
               <w:rPr>
                 <w:noProof/>
               </w:rPr>
-              <w:t>18</w:t>
+              <w:t>19</w:t>
             </w:r>
             <w:r>
               <w:rPr>
@@ -1852,7 +1855,7 @@
               <w:szCs w:val="22"/>
             </w:rPr>
           </w:pPr>
-          <w:hyperlink w:anchor="_Toc242966032" w:history="1">
+          <w:hyperlink w:anchor="_Toc243165966" w:history="1">
             <w:r>
               <w:rPr>
                 <w:rStyle w:val="Hyperlink"/>
@@ -1876,7 +1879,7 @@
               <w:rPr>
                 <w:noProof/>
               </w:rPr>
-              <w:instrText xml:space="preserve"> PAGEREF _Toc242966032 \h </w:instrText>
+              <w:instrText xml:space="preserve"> PAGEREF _Toc243165966 \h </w:instrText>
             </w:r>
             <w:r>
               <w:rPr>
@@ -1893,7 +1896,7 @@
               <w:rPr>
                 <w:noProof/>
               </w:rPr>
-              <w:t>18</w:t>
+              <w:t>19</w:t>
             </w:r>
             <w:r>
               <w:rPr>
@@ -1916,7 +1919,7 @@
               <w:szCs w:val="22"/>
             </w:rPr>
           </w:pPr>
-          <w:hyperlink w:anchor="_Toc242966033" w:history="1">
+          <w:hyperlink w:anchor="_Toc243165967" w:history="1">
             <w:r>
               <w:rPr>
                 <w:rStyle w:val="Hyperlink"/>
@@ -1940,7 +1943,7 @@
               <w:rPr>
                 <w:noProof/>
               </w:rPr>
-              <w:instrText xml:space="preserve"> PAGEREF _Toc242966033 \h </w:instrText>
+              <w:instrText xml:space="preserve"> PAGEREF _Toc243165967 \h </w:instrText>
             </w:r>
             <w:r>
               <w:rPr>
@@ -1957,7 +1960,7 @@
               <w:rPr>
                 <w:noProof/>
               </w:rPr>
-              <w:t>18</w:t>
+              <w:t>19</w:t>
             </w:r>
             <w:r>
               <w:rPr>
@@ -1980,7 +1983,7 @@
               <w:szCs w:val="22"/>
             </w:rPr>
           </w:pPr>
-          <w:hyperlink w:anchor="_Toc242966034" w:history="1">
+          <w:hyperlink w:anchor="_Toc243165968" w:history="1">
             <w:r>
               <w:rPr>
                 <w:rStyle w:val="Hyperlink"/>
@@ -2004,7 +2007,7 @@
               <w:rPr>
                 <w:noProof/>
               </w:rPr>
-              <w:instrText xml:space="preserve"> PAGEREF _Toc242966034 \h </w:instrText>
+              <w:instrText xml:space="preserve"> PAGEREF _Toc243165968 \h </w:instrText>
             </w:r>
             <w:r>
               <w:rPr>
@@ -2021,7 +2024,7 @@
               <w:rPr>
                 <w:noProof/>
               </w:rPr>
-              <w:t>19</w:t>
+              <w:t>20</w:t>
             </w:r>
             <w:r>
               <w:rPr>
@@ -2044,7 +2047,7 @@
               <w:szCs w:val="22"/>
             </w:rPr>
           </w:pPr>
-          <w:hyperlink w:anchor="_Toc242966035" w:history="1">
+          <w:hyperlink w:anchor="_Toc243165969" w:history="1">
             <w:r>
               <w:rPr>
                 <w:rStyle w:val="Hyperlink"/>
@@ -2068,7 +2071,7 @@
               <w:rPr>
                 <w:noProof/>
               </w:rPr>
-              <w:instrText xml:space="preserve"> PAGEREF _Toc242966035 \h </w:instrText>
+              <w:instrText xml:space="preserve"> PAGEREF _Toc243165969 \h </w:instrText>
             </w:r>
             <w:r>
               <w:rPr>
@@ -2085,7 +2088,7 @@
               <w:rPr>
                 <w:noProof/>
               </w:rPr>
-              <w:t>19</w:t>
+              <w:t>20</w:t>
             </w:r>
             <w:r>
               <w:rPr>
@@ -2108,7 +2111,7 @@
               <w:szCs w:val="22"/>
             </w:rPr>
           </w:pPr>
-          <w:hyperlink w:anchor="_Toc242966036" w:history="1">
+          <w:hyperlink w:anchor="_Toc243165970" w:history="1">
             <w:r>
               <w:rPr>
                 <w:rStyle w:val="Hyperlink"/>
@@ -2132,7 +2135,7 @@
               <w:rPr>
                 <w:noProof/>
               </w:rPr>
-              <w:instrText xml:space="preserve"> PAGEREF _Toc242966036 \h </w:instrText>
+              <w:instrText xml:space="preserve"> PAGEREF _Toc243165970 \h </w:instrText>
             </w:r>
             <w:r>
               <w:rPr>
@@ -2149,7 +2152,7 @@
               <w:rPr>
                 <w:noProof/>
               </w:rPr>
-              <w:t>20</w:t>
+              <w:t>21</w:t>
             </w:r>
             <w:r>
               <w:rPr>
@@ -2172,7 +2175,7 @@
               <w:szCs w:val="22"/>
             </w:rPr>
           </w:pPr>
-          <w:hyperlink w:anchor="_Toc242966037" w:history="1">
+          <w:hyperlink w:anchor="_Toc243165971" w:history="1">
             <w:r>
               <w:rPr>
                 <w:rStyle w:val="Hyperlink"/>
@@ -2196,7 +2199,7 @@
               <w:rPr>
                 <w:noProof/>
               </w:rPr>
-              <w:instrText xml:space="preserve"> PAGEREF _Toc242966037 \h </w:instrText>
+              <w:instrText xml:space="preserve"> PAGEREF _Toc243165971 \h </w:instrText>
             </w:r>
             <w:r>
               <w:rPr>
@@ -2213,7 +2216,7 @@
               <w:rPr>
                 <w:noProof/>
               </w:rPr>
-              <w:t>20</w:t>
+              <w:t>21</w:t>
             </w:r>
             <w:r>
               <w:rPr>
@@ -2236,7 +2239,7 @@
               <w:szCs w:val="22"/>
             </w:rPr>
           </w:pPr>
-          <w:hyperlink w:anchor="_Toc242966038" w:history="1">
+          <w:hyperlink w:anchor="_Toc243165972" w:history="1">
             <w:r>
               <w:rPr>
                 <w:rStyle w:val="Hyperlink"/>
@@ -2260,7 +2263,7 @@
               <w:rPr>
                 <w:noProof/>
               </w:rPr>
-              <w:instrText xml:space="preserve"> PAGEREF _Toc242966038 \h </w:instrText>
+              <w:instrText xml:space="preserve"> PAGEREF _Toc243165972 \h </w:instrText>
             </w:r>
             <w:r>
               <w:rPr>
@@ -2277,7 +2280,7 @@
               <w:rPr>
                 <w:noProof/>
               </w:rPr>
-              <w:t>21</w:t>
+              <w:t>22</w:t>
             </w:r>
             <w:r>
               <w:rPr>
@@ -2300,7 +2303,7 @@
               <w:szCs w:val="22"/>
             </w:rPr>
           </w:pPr>
-          <w:hyperlink w:anchor="_Toc242966039" w:history="1">
+          <w:hyperlink w:anchor="_Toc243165973" w:history="1">
             <w:r>
               <w:rPr>
                 <w:rStyle w:val="Hyperlink"/>
@@ -2324,7 +2327,7 @@
               <w:rPr>
                 <w:noProof/>
               </w:rPr>
-              <w:instrText xml:space="preserve"> PAGEREF _Toc242966039 \h </w:instrText>
+              <w:instrText xml:space="preserve"> PAGEREF _Toc243165973 \h </w:instrText>
             </w:r>
             <w:r>
               <w:rPr>
@@ -2341,7 +2344,7 @@
               <w:rPr>
                 <w:noProof/>
               </w:rPr>
-              <w:t>21</w:t>
+              <w:t>22</w:t>
             </w:r>
             <w:r>
               <w:rPr>
@@ -2364,7 +2367,7 @@
               <w:szCs w:val="22"/>
             </w:rPr>
           </w:pPr>
-          <w:hyperlink w:anchor="_Toc242966040" w:history="1">
+          <w:hyperlink w:anchor="_Toc243165974" w:history="1">
             <w:r>
               <w:rPr>
                 <w:rStyle w:val="Hyperlink"/>
@@ -2388,7 +2391,7 @@
               <w:rPr>
                 <w:noProof/>
               </w:rPr>
-              <w:instrText xml:space="preserve"> PAGEREF _Toc242966040 \h </w:instrText>
+              <w:instrText xml:space="preserve"> PAGEREF _Toc243165974 \h </w:instrText>
             </w:r>
             <w:r>
               <w:rPr>
@@ -2405,7 +2408,7 @@
               <w:rPr>
                 <w:noProof/>
               </w:rPr>
-              <w:t>22</w:t>
+              <w:t>23</w:t>
             </w:r>
             <w:r>
               <w:rPr>
@@ -2427,7 +2430,7 @@
         <w:pStyle w:val="Heading1"/>
         <w:pageBreakBefore/>
       </w:pPr>
-      <w:bookmarkStart w:id="0" w:name="_Toc242966006"/>
+      <w:bookmarkStart w:id="0" w:name="_Toc243165940"/>
       <w:r>
         <w:lastRenderedPageBreak/>
         <w:t>1. Sebelum Mulai: Istilah Dasar</w:t>
@@ -2446,7 +2449,7 @@
       <w:pPr>
         <w:pStyle w:val="Heading2"/>
       </w:pPr>
-      <w:bookmarkStart w:id="1" w:name="_Toc242966007"/>
+      <w:bookmarkStart w:id="1" w:name="_Toc243165941"/>
       <w:r>
         <w:t>1.1 Susunan materi: Tahap, Level, dan Sub level</w:t>
       </w:r>
@@ -3934,7 +3937,7 @@
       <w:pPr>
         <w:pStyle w:val="Heading2"/>
       </w:pPr>
-      <w:bookmarkStart w:id="2" w:name="_Toc242966008"/>
+      <w:bookmarkStart w:id="2" w:name="_Toc243165942"/>
       <w:r>
         <w:t>1.2 Istilah kemajuan dan nilai</w:t>
       </w:r>
@@ -4876,7 +4879,7 @@
       <w:pPr>
         <w:pStyle w:val="Heading2"/>
       </w:pPr>
-      <w:bookmarkStart w:id="3" w:name="_Toc242966009"/>
+      <w:bookmarkStart w:id="3" w:name="_Toc243165943"/>
       <w:r>
         <w:t>1.3 Sesi kelas dan latihan mandiri</w:t>
       </w:r>
@@ -5465,7 +5468,7 @@
                 <w:sz w:val="19"/>
                 <w:szCs w:val="19"/>
               </w:rPr>
-              <w:t>Semua tabel, grafik, peringkat, dan analisis.</w:t>
+              <w:t>Semua tabel, grafik, peringkat, dan analisis (kecuali peringkat Paling rajin latihan mandiri).</w:t>
             </w:r>
           </w:p>
         </w:tc>
@@ -5494,7 +5497,7 @@
                 <w:sz w:val="19"/>
                 <w:szCs w:val="19"/>
               </w:rPr>
-              <w:t>Hanya kolom/kartu bertanda "mandiri"; dipakai untuk menilai ketekunan.</w:t>
+              <w:t>Hanya kolom/kartu bertanda “mandiri” dan peringkat Paling rajin latihan mandiri; dipakai untuk menilai ketekunan.</w:t>
             </w:r>
           </w:p>
         </w:tc>
@@ -5581,7 +5584,7 @@
       <w:pPr>
         <w:pStyle w:val="Heading2"/>
       </w:pPr>
-      <w:bookmarkStart w:id="4" w:name="_Toc242966010"/>
+      <w:bookmarkStart w:id="4" w:name="_Toc243165944"/>
       <w:r>
         <w:t>1.4 Ukuran waktu "7 hari" dan "30 hari"</w:t>
       </w:r>
@@ -5609,6 +5612,7 @@
           <w:b/>
           <w:bCs/>
         </w:rPr>
+        <w:lastRenderedPageBreak/>
         <w:t>Tidak aktif</w:t>
       </w:r>
       <w:r>
@@ -5659,7 +5663,6 @@
           <w:b/>
           <w:bCs/>
         </w:rPr>
-        <w:lastRenderedPageBreak/>
         <w:t>Macet</w:t>
       </w:r>
       <w:r>
@@ -5703,7 +5706,7 @@
       <w:pPr>
         <w:pStyle w:val="Heading2"/>
       </w:pPr>
-      <w:bookmarkStart w:id="5" w:name="_Toc242966011"/>
+      <w:bookmarkStart w:id="5" w:name="_Toc243165945"/>
       <w:r>
         <w:t>1.5 Arti warna label</w:t>
       </w:r>
@@ -6408,7 +6411,7 @@
       <w:pPr>
         <w:pStyle w:val="Heading2"/>
       </w:pPr>
-      <w:bookmarkStart w:id="6" w:name="_Toc242966012"/>
+      <w:bookmarkStart w:id="6" w:name="_Toc243165946"/>
       <w:r>
         <w:t>1.6 Aturan dan tahapan: cara sistem memilih</w:t>
       </w:r>
@@ -7058,14 +7061,7 @@
                 <w:sz w:val="19"/>
                 <w:szCs w:val="19"/>
               </w:rPr>
-              <w:t>Setelah semua level tahapan tuntas, siswa melihat "Tahapan latihan sele</w:t>
-            </w:r>
-            <w:r>
-              <w:rPr>
-                <w:sz w:val="19"/>
-                <w:szCs w:val="19"/>
-              </w:rPr>
-              <w:t>sai" dan menunggu arahan guru. Level yang sudah tuntas tetap boleh diulang.</w:t>
+              <w:t>Setelah semua level tahapan tuntas, siswa melihat "Tahapan latihan selesai" dan menunggu arahan guru. Level yang sudah tuntas tetap boleh diulang.</w:t>
             </w:r>
           </w:p>
         </w:tc>
@@ -7223,28 +7219,7 @@
                 <w:sz w:val="19"/>
                 <w:szCs w:val="19"/>
               </w:rPr>
-              <w:t xml:space="preserve">: level berikut terbuka setelah level sebelumnya tuntas (ikon </w:t>
-            </w:r>
-            <w:r>
-              <w:rPr>
-                <w:sz w:val="19"/>
-                <w:szCs w:val="19"/>
-              </w:rPr>
-              <w:t>🔒</w:t>
-            </w:r>
-            <w:r>
-              <w:rPr>
-                <w:sz w:val="19"/>
-                <w:szCs w:val="19"/>
-              </w:rPr>
-              <w:t xml:space="preserve"> pada level yang belu</w:t>
-            </w:r>
-            <w:r>
-              <w:rPr>
-                <w:sz w:val="19"/>
-                <w:szCs w:val="19"/>
-              </w:rPr>
-              <w:t xml:space="preserve">m terbuka); level yang sudah tuntas atau pernah dikerjakan tetap terbuka. </w:t>
+              <w:t xml:space="preserve">: level berikut terbuka setelah level sebelumnya tuntas (ikon 🔒 pada level yang belum terbuka); level yang sudah tuntas atau pernah dikerjakan tetap terbuka. </w:t>
             </w:r>
             <w:r>
               <w:rPr>
@@ -7424,14 +7399,7 @@
                 <w:sz w:val="19"/>
                 <w:szCs w:val="19"/>
               </w:rPr>
-              <w:t xml:space="preserve"> (aturan sesi, termasuk aturan per bagian tah</w:t>
-            </w:r>
-            <w:r>
-              <w:rPr>
-                <w:sz w:val="19"/>
-                <w:szCs w:val="19"/>
-              </w:rPr>
-              <w:t>apan). Materi mandiri tetap pilihan siswa atau saran tahapan.</w:t>
+              <w:t xml:space="preserve"> (aturan sesi, termasuk aturan per bagian tahapan). Materi mandiri tetap pilihan siswa atau saran tahapan.</w:t>
             </w:r>
           </w:p>
         </w:tc>
@@ -7518,7 +7486,7 @@
         <w:pStyle w:val="Heading1"/>
         <w:pageBreakBefore/>
       </w:pPr>
-      <w:bookmarkStart w:id="7" w:name="_Toc242966013"/>
+      <w:bookmarkStart w:id="7" w:name="_Toc243165947"/>
       <w:r>
         <w:lastRenderedPageBreak/>
         <w:t>2. Tab Sesi Kegiatan</w:t>
@@ -7665,7 +7633,7 @@
       <w:pPr>
         <w:pStyle w:val="Heading2"/>
       </w:pPr>
-      <w:bookmarkStart w:id="8" w:name="_Toc242966014"/>
+      <w:bookmarkStart w:id="8" w:name="_Toc243165948"/>
       <w:r>
         <w:t>2.1 Bilah saringan</w:t>
       </w:r>
@@ -8165,7 +8133,7 @@
       <w:pPr>
         <w:pStyle w:val="Heading2"/>
       </w:pPr>
-      <w:bookmarkStart w:id="9" w:name="_Toc242966015"/>
+      <w:bookmarkStart w:id="9" w:name="_Toc243165949"/>
       <w:r>
         <w:t>2.2 Kartu Sesi latihan</w:t>
       </w:r>
@@ -8982,7 +8950,7 @@
       <w:pPr>
         <w:pStyle w:val="Heading2"/>
       </w:pPr>
-      <w:bookmarkStart w:id="10" w:name="_Toc242966016"/>
+      <w:bookmarkStart w:id="10" w:name="_Toc243165950"/>
       <w:r>
         <w:t>2.3 Kotak Aturan dan tahapan yang berlaku</w:t>
       </w:r>
@@ -9335,7 +9303,7 @@
       <w:pPr>
         <w:pStyle w:val="Heading2"/>
       </w:pPr>
-      <w:bookmarkStart w:id="11" w:name="_Toc242966017"/>
+      <w:bookmarkStart w:id="11" w:name="_Toc243165951"/>
       <w:r>
         <w:t>2.4 Enam kotak ringkasan</w:t>
       </w:r>
@@ -10467,7 +10435,7 @@
       <w:pPr>
         <w:pStyle w:val="Heading2"/>
       </w:pPr>
-      <w:bookmarkStart w:id="12" w:name="_Toc242966018"/>
+      <w:bookmarkStart w:id="12" w:name="_Toc243165952"/>
       <w:r>
         <w:t>2.5 Tabel siswa</w:t>
       </w:r>
@@ -11032,7 +11000,7 @@
       <w:pPr>
         <w:pStyle w:val="Heading2"/>
       </w:pPr>
-      <w:bookmarkStart w:id="13" w:name="_Toc242966019"/>
+      <w:bookmarkStart w:id="13" w:name="_Toc243165953"/>
       <w:r>
         <w:t>2.6 Arti kolom Status</w:t>
       </w:r>
@@ -12048,7 +12016,7 @@
       <w:pPr>
         <w:pStyle w:val="Heading2"/>
       </w:pPr>
-      <w:bookmarkStart w:id="14" w:name="_Toc242966020"/>
+      <w:bookmarkStart w:id="14" w:name="_Toc243165954"/>
       <w:r>
         <w:t>2.7 Bilah aksi untuk siswa terpilih</w:t>
       </w:r>
@@ -12476,7 +12444,7 @@
         <w:pStyle w:val="Heading1"/>
         <w:pageBreakBefore/>
       </w:pPr>
-      <w:bookmarkStart w:id="15" w:name="_Toc242966021"/>
+      <w:bookmarkStart w:id="15" w:name="_Toc243165955"/>
       <w:r>
         <w:lastRenderedPageBreak/>
         <w:t>3. Tab Perkembangan Siswa</w:t>
@@ -12508,7 +12476,10 @@
         <w:t>kemajuan resmi</w:t>
       </w:r>
       <w:r>
-        <w:t xml:space="preserve"> (sesi kelas), kecuali kolom yang tegas bertuliskan "mandiri".</w:t>
+        <w:t xml:space="preserve"> (sesi kelas), </w:t>
+      </w:r>
+      <w:r>
+        <w:t>kecuali kolom yang tegas bertuliskan “mandiri” dan peringkat Paling rajin latihan mandiri.</w:t>
       </w:r>
     </w:p>
     <w:p>
@@ -12573,7 +12544,7 @@
       <w:pPr>
         <w:pStyle w:val="Heading2"/>
       </w:pPr>
-      <w:bookmarkStart w:id="16" w:name="_Toc242966022"/>
+      <w:bookmarkStart w:id="16" w:name="_Toc243165956"/>
       <w:r>
         <w:t>3.1 Sub-tab Per Siswa</w:t>
       </w:r>
@@ -15764,7 +15735,7 @@
       <w:pPr>
         <w:pStyle w:val="Heading2"/>
       </w:pPr>
-      <w:bookmarkStart w:id="17" w:name="_Toc242966023"/>
+      <w:bookmarkStart w:id="17" w:name="_Toc243165957"/>
       <w:r>
         <w:t>3.2 Sub-tab Per Rombel</w:t>
       </w:r>
@@ -17441,7 +17412,7 @@
       <w:pPr>
         <w:pStyle w:val="Heading2"/>
       </w:pPr>
-      <w:bookmarkStart w:id="18" w:name="_Toc242966024"/>
+      <w:bookmarkStart w:id="18" w:name="_Toc243165958"/>
       <w:r>
         <w:lastRenderedPageBreak/>
         <w:t>3.3 Sub-tab Peringkat</w:t>
@@ -17463,7 +17434,10 @@
         <w:t>Hanya kemajuan resmi</w:t>
       </w:r>
       <w:r>
-        <w:t xml:space="preserve"> yang dihitung; latihan mandiri tidak ikut. Level tuntas mengikuti tahapan yang berlaku bagi tiap siswa. Nilai yang sama mendapat peringkat yang sama (mis. 1, 2, 2, 4). Peringkat 1–3 ditandai warna emas, perak, perunggu, dan kolom yang menjadi dasar peringkat disorot.</w:t>
+        <w:t xml:space="preserve"> yang dihitung, kecuali jenis Paling rajin latihan mandiri yang khusus menghitung latihan di luar sesi kelas.</w:t>
+      </w:r>
+      <w:r>
+        <w:t xml:space="preserve"> Level tuntas mengikuti tahapan yang berlaku bagi tiap siswa. Nilai yang sama mendapat peringkat yang sama (mis. 1, 2, 2, 4). Peringkat 1–3 ditandai warna emas, perak, perunggu, dan kolom yang menjadi dasar peringkat disorot.</w:t>
       </w:r>
     </w:p>
     <w:p>
@@ -17786,7 +17760,7 @@
                 <w:sz w:val="19"/>
                 <w:szCs w:val="19"/>
               </w:rPr>
-              <w:t>Enam jenis; lihat 3.3.2.</w:t>
+              <w:t>Tujuh jenis; lihat 3.3.2.</w:t>
             </w:r>
           </w:p>
         </w:tc>
@@ -17918,7 +17892,7 @@
                 <w:sz w:val="19"/>
                 <w:szCs w:val="19"/>
               </w:rPr>
-              <w:t>Excel berisi peringkat lengkap dan tabel perbandingan.</w:t>
+              <w:t>Excel berisi peringkat lengkap dan tabel perbandingan. Kolom latihan mandiri (hari, kegiatan, rata-rata nilai, menit, sub level lulus) ikut di setiap jenis.</w:t>
             </w:r>
           </w:p>
         </w:tc>
@@ -17934,7 +17908,10 @@
         <w:pStyle w:val="Heading3"/>
       </w:pPr>
       <w:r>
-        <w:t>3.3.2 Enam jenis peringkat</w:t>
+        <w:t xml:space="preserve">3.3.2 </w:t>
+      </w:r>
+      <w:r>
+        <w:t>Tujuh jenis peringkat</w:t>
       </w:r>
     </w:p>
     <w:tbl>
@@ -18140,6 +18117,7 @@
               <w:bottom w:val="single" w:sz="4" w:space="0" w:color="C9D3DE"/>
               <w:right w:val="single" w:sz="4" w:space="0" w:color="C9D3DE"/>
             </w:tcBorders>
+            <w:shd w:val="clear" w:color="auto" w:fill="auto"/>
             <w:tcMar>
               <w:top w:w="70" w:type="dxa"/>
               <w:left w:w="110" w:type="dxa"/>
@@ -18171,6 +18149,7 @@
               <w:bottom w:val="single" w:sz="4" w:space="0" w:color="C9D3DE"/>
               <w:right w:val="single" w:sz="4" w:space="0" w:color="C9D3DE"/>
             </w:tcBorders>
+            <w:shd w:val="clear" w:color="auto" w:fill="auto"/>
             <w:tcMar>
               <w:top w:w="70" w:type="dxa"/>
               <w:left w:w="110" w:type="dxa"/>
@@ -18200,6 +18179,7 @@
               <w:bottom w:val="single" w:sz="4" w:space="0" w:color="C9D3DE"/>
               <w:right w:val="single" w:sz="4" w:space="0" w:color="C9D3DE"/>
             </w:tcBorders>
+            <w:shd w:val="clear" w:color="auto" w:fill="auto"/>
             <w:tcMar>
               <w:top w:w="70" w:type="dxa"/>
               <w:left w:w="110" w:type="dxa"/>
@@ -18229,6 +18209,7 @@
               <w:bottom w:val="single" w:sz="4" w:space="0" w:color="C9D3DE"/>
               <w:right w:val="single" w:sz="4" w:space="0" w:color="C9D3DE"/>
             </w:tcBorders>
+            <w:shd w:val="clear" w:color="auto" w:fill="auto"/>
             <w:tcMar>
               <w:top w:w="70" w:type="dxa"/>
               <w:left w:w="110" w:type="dxa"/>
@@ -18258,6 +18239,7 @@
               <w:bottom w:val="single" w:sz="4" w:space="0" w:color="C9D3DE"/>
               <w:right w:val="single" w:sz="4" w:space="0" w:color="C9D3DE"/>
             </w:tcBorders>
+            <w:shd w:val="clear" w:color="auto" w:fill="auto"/>
             <w:tcMar>
               <w:top w:w="70" w:type="dxa"/>
               <w:left w:w="110" w:type="dxa"/>
@@ -18449,6 +18431,7 @@
               <w:bottom w:val="single" w:sz="4" w:space="0" w:color="C9D3DE"/>
               <w:right w:val="single" w:sz="4" w:space="0" w:color="C9D3DE"/>
             </w:tcBorders>
+            <w:shd w:val="clear" w:color="auto" w:fill="auto"/>
             <w:tcMar>
               <w:top w:w="70" w:type="dxa"/>
               <w:left w:w="110" w:type="dxa"/>
@@ -18480,6 +18463,7 @@
               <w:bottom w:val="single" w:sz="4" w:space="0" w:color="C9D3DE"/>
               <w:right w:val="single" w:sz="4" w:space="0" w:color="C9D3DE"/>
             </w:tcBorders>
+            <w:shd w:val="clear" w:color="auto" w:fill="auto"/>
             <w:tcMar>
               <w:top w:w="70" w:type="dxa"/>
               <w:left w:w="110" w:type="dxa"/>
@@ -18509,6 +18493,7 @@
               <w:bottom w:val="single" w:sz="4" w:space="0" w:color="C9D3DE"/>
               <w:right w:val="single" w:sz="4" w:space="0" w:color="C9D3DE"/>
             </w:tcBorders>
+            <w:shd w:val="clear" w:color="auto" w:fill="auto"/>
             <w:tcMar>
               <w:top w:w="70" w:type="dxa"/>
               <w:left w:w="110" w:type="dxa"/>
@@ -18538,6 +18523,7 @@
               <w:bottom w:val="single" w:sz="4" w:space="0" w:color="C9D3DE"/>
               <w:right w:val="single" w:sz="4" w:space="0" w:color="C9D3DE"/>
             </w:tcBorders>
+            <w:shd w:val="clear" w:color="auto" w:fill="auto"/>
             <w:tcMar>
               <w:top w:w="70" w:type="dxa"/>
               <w:left w:w="110" w:type="dxa"/>
@@ -18567,6 +18553,7 @@
               <w:bottom w:val="single" w:sz="4" w:space="0" w:color="C9D3DE"/>
               <w:right w:val="single" w:sz="4" w:space="0" w:color="C9D3DE"/>
             </w:tcBorders>
+            <w:shd w:val="clear" w:color="auto" w:fill="auto"/>
             <w:tcMar>
               <w:top w:w="70" w:type="dxa"/>
               <w:left w:w="110" w:type="dxa"/>
@@ -18758,25 +18745,32 @@
               <w:bottom w:val="single" w:sz="4" w:space="0" w:color="C9D3DE"/>
               <w:right w:val="single" w:sz="4" w:space="0" w:color="C9D3DE"/>
             </w:tcBorders>
-            <w:tcMar>
-              <w:top w:w="70" w:type="dxa"/>
-              <w:left w:w="110" w:type="dxa"/>
-              <w:bottom w:w="70" w:type="dxa"/>
-              <w:right w:w="110" w:type="dxa"/>
-            </w:tcMar>
-          </w:tcPr>
-          <w:p>
-            <w:pPr>
-              <w:spacing w:after="30"/>
-            </w:pPr>
-            <w:r>
-              <w:rPr>
-                <w:b/>
-                <w:bCs/>
-                <w:sz w:val="19"/>
-                <w:szCs w:val="19"/>
-              </w:rPr>
-              <w:t>Nilai terbaik</w:t>
+            <w:shd w:val="clear" w:color="auto" w:fill="auto"/>
+            <w:tcMar>
+              <w:top w:w="70" w:type="dxa"/>
+              <w:left w:w="110" w:type="dxa"/>
+              <w:bottom w:w="70" w:type="dxa"/>
+              <w:right w:w="110" w:type="dxa"/>
+            </w:tcMar>
+          </w:tcPr>
+          <w:p>
+            <w:pPr>
+              <w:spacing w:after="30"/>
+              <w:rPr>
+                <w:b/>
+                <w:bCs/>
+                <w:sz w:val="19"/>
+                <w:szCs w:val="19"/>
+              </w:rPr>
+            </w:pPr>
+            <w:r>
+              <w:rPr>
+                <w:b/>
+                <w:bCs/>
+                <w:sz w:val="19"/>
+                <w:szCs w:val="19"/>
+              </w:rPr>
+              <w:t>Paling rajin latihan mandiri</w:t>
             </w:r>
           </w:p>
         </w:tc>
@@ -18789,23 +18783,28 @@
               <w:bottom w:val="single" w:sz="4" w:space="0" w:color="C9D3DE"/>
               <w:right w:val="single" w:sz="4" w:space="0" w:color="C9D3DE"/>
             </w:tcBorders>
-            <w:tcMar>
-              <w:top w:w="70" w:type="dxa"/>
-              <w:left w:w="110" w:type="dxa"/>
-              <w:bottom w:w="70" w:type="dxa"/>
-              <w:right w:w="110" w:type="dxa"/>
-            </w:tcMar>
-          </w:tcPr>
-          <w:p>
-            <w:pPr>
-              <w:spacing w:after="30"/>
-            </w:pPr>
-            <w:r>
-              <w:rPr>
-                <w:sz w:val="19"/>
-                <w:szCs w:val="19"/>
-              </w:rPr>
-              <w:t>Rata-rata nilai sub level dalam periode.</w:t>
+            <w:shd w:val="clear" w:color="auto" w:fill="auto"/>
+            <w:tcMar>
+              <w:top w:w="70" w:type="dxa"/>
+              <w:left w:w="110" w:type="dxa"/>
+              <w:bottom w:w="70" w:type="dxa"/>
+              <w:right w:w="110" w:type="dxa"/>
+            </w:tcMar>
+          </w:tcPr>
+          <w:p>
+            <w:pPr>
+              <w:spacing w:after="30"/>
+              <w:rPr>
+                <w:sz w:val="19"/>
+                <w:szCs w:val="19"/>
+              </w:rPr>
+            </w:pPr>
+            <w:r>
+              <w:rPr>
+                <w:sz w:val="19"/>
+                <w:szCs w:val="19"/>
+              </w:rPr>
+              <w:t>Banyak hari berlatih mandiri (di luar sesi kelas) dalam periode.</w:t>
             </w:r>
           </w:p>
         </w:tc>
@@ -18818,23 +18817,28 @@
               <w:bottom w:val="single" w:sz="4" w:space="0" w:color="C9D3DE"/>
               <w:right w:val="single" w:sz="4" w:space="0" w:color="C9D3DE"/>
             </w:tcBorders>
-            <w:tcMar>
-              <w:top w:w="70" w:type="dxa"/>
-              <w:left w:w="110" w:type="dxa"/>
-              <w:bottom w:w="70" w:type="dxa"/>
-              <w:right w:w="110" w:type="dxa"/>
-            </w:tcMar>
-          </w:tcPr>
-          <w:p>
-            <w:pPr>
-              <w:spacing w:after="30"/>
-            </w:pPr>
-            <w:r>
-              <w:rPr>
-                <w:sz w:val="19"/>
-                <w:szCs w:val="19"/>
-              </w:rPr>
-              <w:t>Lebih banyak sub level dikerjakan.</w:t>
+            <w:shd w:val="clear" w:color="auto" w:fill="auto"/>
+            <w:tcMar>
+              <w:top w:w="70" w:type="dxa"/>
+              <w:left w:w="110" w:type="dxa"/>
+              <w:bottom w:w="70" w:type="dxa"/>
+              <w:right w:w="110" w:type="dxa"/>
+            </w:tcMar>
+          </w:tcPr>
+          <w:p>
+            <w:pPr>
+              <w:spacing w:after="30"/>
+              <w:rPr>
+                <w:sz w:val="19"/>
+                <w:szCs w:val="19"/>
+              </w:rPr>
+            </w:pPr>
+            <w:r>
+              <w:rPr>
+                <w:sz w:val="19"/>
+                <w:szCs w:val="19"/>
+              </w:rPr>
+              <w:t>Lebih banyak kegiatan mandiri, lalu lebih lama berlatih.</w:t>
             </w:r>
           </w:p>
         </w:tc>
@@ -18847,23 +18851,28 @@
               <w:bottom w:val="single" w:sz="4" w:space="0" w:color="C9D3DE"/>
               <w:right w:val="single" w:sz="4" w:space="0" w:color="C9D3DE"/>
             </w:tcBorders>
-            <w:tcMar>
-              <w:top w:w="70" w:type="dxa"/>
-              <w:left w:w="110" w:type="dxa"/>
-              <w:bottom w:w="70" w:type="dxa"/>
-              <w:right w:w="110" w:type="dxa"/>
-            </w:tcMar>
-          </w:tcPr>
-          <w:p>
-            <w:pPr>
-              <w:spacing w:after="30"/>
-            </w:pPr>
-            <w:r>
-              <w:rPr>
-                <w:sz w:val="19"/>
-                <w:szCs w:val="19"/>
-              </w:rPr>
-              <w:t>≥ 10 sub level dikerjakan.</w:t>
+            <w:shd w:val="clear" w:color="auto" w:fill="auto"/>
+            <w:tcMar>
+              <w:top w:w="70" w:type="dxa"/>
+              <w:left w:w="110" w:type="dxa"/>
+              <w:bottom w:w="70" w:type="dxa"/>
+              <w:right w:w="110" w:type="dxa"/>
+            </w:tcMar>
+          </w:tcPr>
+          <w:p>
+            <w:pPr>
+              <w:spacing w:after="30"/>
+              <w:rPr>
+                <w:sz w:val="19"/>
+                <w:szCs w:val="19"/>
+              </w:rPr>
+            </w:pPr>
+            <w:r>
+              <w:rPr>
+                <w:sz w:val="19"/>
+                <w:szCs w:val="19"/>
+              </w:rPr>
+              <w:t>Berlatih mandiri ≥ 1 hari.</w:t>
             </w:r>
           </w:p>
         </w:tc>
@@ -18876,16 +18885,21 @@
               <w:bottom w:val="single" w:sz="4" w:space="0" w:color="C9D3DE"/>
               <w:right w:val="single" w:sz="4" w:space="0" w:color="C9D3DE"/>
             </w:tcBorders>
-            <w:tcMar>
-              <w:top w:w="70" w:type="dxa"/>
-              <w:left w:w="110" w:type="dxa"/>
-              <w:bottom w:w="70" w:type="dxa"/>
-              <w:right w:w="110" w:type="dxa"/>
-            </w:tcMar>
-          </w:tcPr>
-          <w:p>
-            <w:pPr>
-              <w:spacing w:after="30"/>
+            <w:shd w:val="clear" w:color="auto" w:fill="auto"/>
+            <w:tcMar>
+              <w:top w:w="70" w:type="dxa"/>
+              <w:left w:w="110" w:type="dxa"/>
+              <w:bottom w:w="70" w:type="dxa"/>
+              <w:right w:w="110" w:type="dxa"/>
+            </w:tcMar>
+          </w:tcPr>
+          <w:p>
+            <w:pPr>
+              <w:spacing w:after="30"/>
+              <w:rPr>
+                <w:sz w:val="19"/>
+                <w:szCs w:val="19"/>
+              </w:rPr>
             </w:pPr>
             <w:r>
               <w:rPr>
@@ -18929,6 +18943,163 @@
                 <w:sz w:val="19"/>
                 <w:szCs w:val="19"/>
               </w:rPr>
+              <w:t>Nilai terbaik</w:t>
+            </w:r>
+          </w:p>
+        </w:tc>
+        <w:tc>
+          <w:tcPr>
+            <w:tcW w:w="2505" w:type="dxa"/>
+            <w:tcBorders>
+              <w:top w:val="single" w:sz="4" w:space="0" w:color="C9D3DE"/>
+              <w:left w:val="single" w:sz="4" w:space="0" w:color="C9D3DE"/>
+              <w:bottom w:val="single" w:sz="4" w:space="0" w:color="C9D3DE"/>
+              <w:right w:val="single" w:sz="4" w:space="0" w:color="C9D3DE"/>
+            </w:tcBorders>
+            <w:shd w:val="clear" w:color="auto" w:fill="F8FAFC"/>
+            <w:tcMar>
+              <w:top w:w="70" w:type="dxa"/>
+              <w:left w:w="110" w:type="dxa"/>
+              <w:bottom w:w="70" w:type="dxa"/>
+              <w:right w:w="110" w:type="dxa"/>
+            </w:tcMar>
+          </w:tcPr>
+          <w:p>
+            <w:pPr>
+              <w:spacing w:after="30"/>
+            </w:pPr>
+            <w:r>
+              <w:rPr>
+                <w:sz w:val="19"/>
+                <w:szCs w:val="19"/>
+              </w:rPr>
+              <w:t>Rata-rata nilai sub level dalam periode.</w:t>
+            </w:r>
+          </w:p>
+        </w:tc>
+        <w:tc>
+          <w:tcPr>
+            <w:tcW w:w="2313" w:type="dxa"/>
+            <w:tcBorders>
+              <w:top w:val="single" w:sz="4" w:space="0" w:color="C9D3DE"/>
+              <w:left w:val="single" w:sz="4" w:space="0" w:color="C9D3DE"/>
+              <w:bottom w:val="single" w:sz="4" w:space="0" w:color="C9D3DE"/>
+              <w:right w:val="single" w:sz="4" w:space="0" w:color="C9D3DE"/>
+            </w:tcBorders>
+            <w:shd w:val="clear" w:color="auto" w:fill="F8FAFC"/>
+            <w:tcMar>
+              <w:top w:w="70" w:type="dxa"/>
+              <w:left w:w="110" w:type="dxa"/>
+              <w:bottom w:w="70" w:type="dxa"/>
+              <w:right w:w="110" w:type="dxa"/>
+            </w:tcMar>
+          </w:tcPr>
+          <w:p>
+            <w:pPr>
+              <w:spacing w:after="30"/>
+            </w:pPr>
+            <w:r>
+              <w:rPr>
+                <w:sz w:val="19"/>
+                <w:szCs w:val="19"/>
+              </w:rPr>
+              <w:t>Lebih banyak sub level dikerjakan.</w:t>
+            </w:r>
+          </w:p>
+        </w:tc>
+        <w:tc>
+          <w:tcPr>
+            <w:tcW w:w="1927" w:type="dxa"/>
+            <w:tcBorders>
+              <w:top w:val="single" w:sz="4" w:space="0" w:color="C9D3DE"/>
+              <w:left w:val="single" w:sz="4" w:space="0" w:color="C9D3DE"/>
+              <w:bottom w:val="single" w:sz="4" w:space="0" w:color="C9D3DE"/>
+              <w:right w:val="single" w:sz="4" w:space="0" w:color="C9D3DE"/>
+            </w:tcBorders>
+            <w:shd w:val="clear" w:color="auto" w:fill="F8FAFC"/>
+            <w:tcMar>
+              <w:top w:w="70" w:type="dxa"/>
+              <w:left w:w="110" w:type="dxa"/>
+              <w:bottom w:w="70" w:type="dxa"/>
+              <w:right w:w="110" w:type="dxa"/>
+            </w:tcMar>
+          </w:tcPr>
+          <w:p>
+            <w:pPr>
+              <w:spacing w:after="30"/>
+            </w:pPr>
+            <w:r>
+              <w:rPr>
+                <w:sz w:val="19"/>
+                <w:szCs w:val="19"/>
+              </w:rPr>
+              <w:t>≥ 10 sub level dikerjakan.</w:t>
+            </w:r>
+          </w:p>
+        </w:tc>
+        <w:tc>
+          <w:tcPr>
+            <w:tcW w:w="966" w:type="dxa"/>
+            <w:tcBorders>
+              <w:top w:val="single" w:sz="4" w:space="0" w:color="C9D3DE"/>
+              <w:left w:val="single" w:sz="4" w:space="0" w:color="C9D3DE"/>
+              <w:bottom w:val="single" w:sz="4" w:space="0" w:color="C9D3DE"/>
+              <w:right w:val="single" w:sz="4" w:space="0" w:color="C9D3DE"/>
+            </w:tcBorders>
+            <w:shd w:val="clear" w:color="auto" w:fill="F8FAFC"/>
+            <w:tcMar>
+              <w:top w:w="70" w:type="dxa"/>
+              <w:left w:w="110" w:type="dxa"/>
+              <w:bottom w:w="70" w:type="dxa"/>
+              <w:right w:w="110" w:type="dxa"/>
+            </w:tcMar>
+          </w:tcPr>
+          <w:p>
+            <w:pPr>
+              <w:spacing w:after="30"/>
+            </w:pPr>
+            <w:r>
+              <w:rPr>
+                <w:sz w:val="19"/>
+                <w:szCs w:val="19"/>
+              </w:rPr>
+              <w:t>Ya</w:t>
+            </w:r>
+          </w:p>
+        </w:tc>
+      </w:tr>
+      <w:tr>
+        <w:trPr>
+          <w:cantSplit/>
+        </w:trPr>
+        <w:tc>
+          <w:tcPr>
+            <w:tcW w:w="1927" w:type="dxa"/>
+            <w:tcBorders>
+              <w:top w:val="single" w:sz="4" w:space="0" w:color="C9D3DE"/>
+              <w:left w:val="single" w:sz="4" w:space="0" w:color="C9D3DE"/>
+              <w:bottom w:val="single" w:sz="4" w:space="0" w:color="C9D3DE"/>
+              <w:right w:val="single" w:sz="4" w:space="0" w:color="C9D3DE"/>
+            </w:tcBorders>
+            <w:shd w:val="clear" w:color="auto" w:fill="auto"/>
+            <w:tcMar>
+              <w:top w:w="70" w:type="dxa"/>
+              <w:left w:w="110" w:type="dxa"/>
+              <w:bottom w:w="70" w:type="dxa"/>
+              <w:right w:w="110" w:type="dxa"/>
+            </w:tcMar>
+          </w:tcPr>
+          <w:p>
+            <w:pPr>
+              <w:spacing w:after="30"/>
+            </w:pPr>
+            <w:r>
+              <w:rPr>
+                <w:b/>
+                <w:bCs/>
+                <w:sz w:val="19"/>
+                <w:szCs w:val="19"/>
+              </w:rPr>
               <w:t>Perlu perhatian</w:t>
             </w:r>
           </w:p>
@@ -18942,7 +19113,7 @@
               <w:bottom w:val="single" w:sz="4" w:space="0" w:color="C9D3DE"/>
               <w:right w:val="single" w:sz="4" w:space="0" w:color="C9D3DE"/>
             </w:tcBorders>
-            <w:shd w:val="clear" w:color="auto" w:fill="F8FAFC"/>
+            <w:shd w:val="clear" w:color="auto" w:fill="auto"/>
             <w:tcMar>
               <w:top w:w="70" w:type="dxa"/>
               <w:left w:w="110" w:type="dxa"/>
@@ -18972,7 +19143,7 @@
               <w:bottom w:val="single" w:sz="4" w:space="0" w:color="C9D3DE"/>
               <w:right w:val="single" w:sz="4" w:space="0" w:color="C9D3DE"/>
             </w:tcBorders>
-            <w:shd w:val="clear" w:color="auto" w:fill="F8FAFC"/>
+            <w:shd w:val="clear" w:color="auto" w:fill="auto"/>
             <w:tcMar>
               <w:top w:w="70" w:type="dxa"/>
               <w:left w:w="110" w:type="dxa"/>
@@ -19002,7 +19173,7 @@
               <w:bottom w:val="single" w:sz="4" w:space="0" w:color="C9D3DE"/>
               <w:right w:val="single" w:sz="4" w:space="0" w:color="C9D3DE"/>
             </w:tcBorders>
-            <w:shd w:val="clear" w:color="auto" w:fill="F8FAFC"/>
+            <w:shd w:val="clear" w:color="auto" w:fill="auto"/>
             <w:tcMar>
               <w:top w:w="70" w:type="dxa"/>
               <w:left w:w="110" w:type="dxa"/>
@@ -19032,7 +19203,7 @@
               <w:bottom w:val="single" w:sz="4" w:space="0" w:color="C9D3DE"/>
               <w:right w:val="single" w:sz="4" w:space="0" w:color="C9D3DE"/>
             </w:tcBorders>
-            <w:shd w:val="clear" w:color="auto" w:fill="F8FAFC"/>
+            <w:shd w:val="clear" w:color="auto" w:fill="auto"/>
             <w:tcMar>
               <w:top w:w="70" w:type="dxa"/>
               <w:left w:w="110" w:type="dxa"/>
@@ -19185,6 +19356,7 @@
         <w:pStyle w:val="Heading3"/>
       </w:pPr>
       <w:r>
+        <w:lastRenderedPageBreak/>
         <w:t>3.3.3 Kotak ringkasan Peringkat</w:t>
       </w:r>
     </w:p>
@@ -19289,6 +19461,7 @@
               <w:bottom w:val="single" w:sz="4" w:space="0" w:color="C9D3DE"/>
               <w:right w:val="single" w:sz="4" w:space="0" w:color="C9D3DE"/>
             </w:tcBorders>
+            <w:shd w:val="clear" w:color="auto" w:fill="auto"/>
             <w:tcMar>
               <w:top w:w="70" w:type="dxa"/>
               <w:left w:w="110" w:type="dxa"/>
@@ -19320,6 +19493,7 @@
               <w:bottom w:val="single" w:sz="4" w:space="0" w:color="C9D3DE"/>
               <w:right w:val="single" w:sz="4" w:space="0" w:color="C9D3DE"/>
             </w:tcBorders>
+            <w:shd w:val="clear" w:color="auto" w:fill="auto"/>
             <w:tcMar>
               <w:top w:w="70" w:type="dxa"/>
               <w:left w:w="110" w:type="dxa"/>
@@ -19421,6 +19595,7 @@
               <w:bottom w:val="single" w:sz="4" w:space="0" w:color="C9D3DE"/>
               <w:right w:val="single" w:sz="4" w:space="0" w:color="C9D3DE"/>
             </w:tcBorders>
+            <w:shd w:val="clear" w:color="auto" w:fill="auto"/>
             <w:tcMar>
               <w:top w:w="70" w:type="dxa"/>
               <w:left w:w="110" w:type="dxa"/>
@@ -19452,6 +19627,7 @@
               <w:bottom w:val="single" w:sz="4" w:space="0" w:color="C9D3DE"/>
               <w:right w:val="single" w:sz="4" w:space="0" w:color="C9D3DE"/>
             </w:tcBorders>
+            <w:shd w:val="clear" w:color="auto" w:fill="auto"/>
             <w:tcMar>
               <w:top w:w="70" w:type="dxa"/>
               <w:left w:w="110" w:type="dxa"/>
@@ -19505,7 +19681,6 @@
                 <w:sz w:val="19"/>
                 <w:szCs w:val="19"/>
               </w:rPr>
-              <w:lastRenderedPageBreak/>
               <w:t>sub level lulus dalam periode</w:t>
             </w:r>
           </w:p>
@@ -19554,6 +19729,7 @@
               <w:bottom w:val="single" w:sz="4" w:space="0" w:color="C9D3DE"/>
               <w:right w:val="single" w:sz="4" w:space="0" w:color="C9D3DE"/>
             </w:tcBorders>
+            <w:shd w:val="clear" w:color="auto" w:fill="auto"/>
             <w:tcMar>
               <w:top w:w="70" w:type="dxa"/>
               <w:left w:w="110" w:type="dxa"/>
@@ -19585,6 +19761,7 @@
               <w:bottom w:val="single" w:sz="4" w:space="0" w:color="C9D3DE"/>
               <w:right w:val="single" w:sz="4" w:space="0" w:color="C9D3DE"/>
             </w:tcBorders>
+            <w:shd w:val="clear" w:color="auto" w:fill="auto"/>
             <w:tcMar>
               <w:top w:w="70" w:type="dxa"/>
               <w:left w:w="110" w:type="dxa"/>
@@ -19602,6 +19779,83 @@
                 <w:szCs w:val="19"/>
               </w:rPr>
               <w:t>Rata-rata nilai sub level gabungan dalam periode.</w:t>
+            </w:r>
+          </w:p>
+        </w:tc>
+      </w:tr>
+      <w:tr>
+        <w:trPr>
+          <w:cantSplit/>
+        </w:trPr>
+        <w:tc>
+          <w:tcPr>
+            <w:tcW w:w="3373" w:type="dxa"/>
+            <w:tcBorders>
+              <w:top w:val="single" w:sz="4" w:space="0" w:color="C9D3DE"/>
+              <w:left w:val="single" w:sz="4" w:space="0" w:color="C9D3DE"/>
+              <w:bottom w:val="single" w:sz="4" w:space="0" w:color="C9D3DE"/>
+              <w:right w:val="single" w:sz="4" w:space="0" w:color="C9D3DE"/>
+            </w:tcBorders>
+            <w:shd w:val="clear" w:color="auto" w:fill="F8FAFC"/>
+            <w:tcMar>
+              <w:top w:w="70" w:type="dxa"/>
+              <w:left w:w="110" w:type="dxa"/>
+              <w:bottom w:w="70" w:type="dxa"/>
+              <w:right w:w="110" w:type="dxa"/>
+            </w:tcMar>
+          </w:tcPr>
+          <w:p>
+            <w:pPr>
+              <w:spacing w:after="30"/>
+              <w:rPr>
+                <w:b/>
+                <w:bCs/>
+                <w:sz w:val="19"/>
+                <w:szCs w:val="19"/>
+              </w:rPr>
+            </w:pPr>
+            <w:r>
+              <w:rPr>
+                <w:b/>
+                <w:bCs/>
+                <w:sz w:val="19"/>
+                <w:szCs w:val="19"/>
+              </w:rPr>
+              <w:t>berlatih mandiri dalam periode</w:t>
+            </w:r>
+          </w:p>
+        </w:tc>
+        <w:tc>
+          <w:tcPr>
+            <w:tcW w:w="6265" w:type="dxa"/>
+            <w:tcBorders>
+              <w:top w:val="single" w:sz="4" w:space="0" w:color="C9D3DE"/>
+              <w:left w:val="single" w:sz="4" w:space="0" w:color="C9D3DE"/>
+              <w:bottom w:val="single" w:sz="4" w:space="0" w:color="C9D3DE"/>
+              <w:right w:val="single" w:sz="4" w:space="0" w:color="C9D3DE"/>
+            </w:tcBorders>
+            <w:shd w:val="clear" w:color="auto" w:fill="F8FAFC"/>
+            <w:tcMar>
+              <w:top w:w="70" w:type="dxa"/>
+              <w:left w:w="110" w:type="dxa"/>
+              <w:bottom w:w="70" w:type="dxa"/>
+              <w:right w:w="110" w:type="dxa"/>
+            </w:tcMar>
+          </w:tcPr>
+          <w:p>
+            <w:pPr>
+              <w:spacing w:after="30"/>
+              <w:rPr>
+                <w:sz w:val="19"/>
+                <w:szCs w:val="19"/>
+              </w:rPr>
+            </w:pPr>
+            <w:r>
+              <w:rPr>
+                <w:sz w:val="19"/>
+                <w:szCs w:val="19"/>
+              </w:rPr>
+              <w:t>Hanya pada jenis Paling rajin latihan mandiri, menggantikan kotak rata-rata nilai: siswa yang berlatih mandiri minimal sekali dalam periode.</w:t>
             </w:r>
           </w:p>
         </w:tc>
@@ -19721,6 +19975,7 @@
               <w:bottom w:val="single" w:sz="4" w:space="0" w:color="C9D3DE"/>
               <w:right w:val="single" w:sz="4" w:space="0" w:color="C9D3DE"/>
             </w:tcBorders>
+            <w:shd w:val="clear" w:color="auto" w:fill="auto"/>
             <w:tcMar>
               <w:top w:w="70" w:type="dxa"/>
               <w:left w:w="110" w:type="dxa"/>
@@ -19752,6 +20007,7 @@
               <w:bottom w:val="single" w:sz="4" w:space="0" w:color="C9D3DE"/>
               <w:right w:val="single" w:sz="4" w:space="0" w:color="C9D3DE"/>
             </w:tcBorders>
+            <w:shd w:val="clear" w:color="auto" w:fill="auto"/>
             <w:tcMar>
               <w:top w:w="70" w:type="dxa"/>
               <w:left w:w="110" w:type="dxa"/>
@@ -19853,6 +20109,7 @@
               <w:bottom w:val="single" w:sz="4" w:space="0" w:color="C9D3DE"/>
               <w:right w:val="single" w:sz="4" w:space="0" w:color="C9D3DE"/>
             </w:tcBorders>
+            <w:shd w:val="clear" w:color="auto" w:fill="auto"/>
             <w:tcMar>
               <w:top w:w="70" w:type="dxa"/>
               <w:left w:w="110" w:type="dxa"/>
@@ -19884,6 +20141,7 @@
               <w:bottom w:val="single" w:sz="4" w:space="0" w:color="C9D3DE"/>
               <w:right w:val="single" w:sz="4" w:space="0" w:color="C9D3DE"/>
             </w:tcBorders>
+            <w:shd w:val="clear" w:color="auto" w:fill="auto"/>
             <w:tcMar>
               <w:top w:w="70" w:type="dxa"/>
               <w:left w:w="110" w:type="dxa"/>
@@ -19985,6 +20243,7 @@
               <w:bottom w:val="single" w:sz="4" w:space="0" w:color="C9D3DE"/>
               <w:right w:val="single" w:sz="4" w:space="0" w:color="C9D3DE"/>
             </w:tcBorders>
+            <w:shd w:val="clear" w:color="auto" w:fill="auto"/>
             <w:tcMar>
               <w:top w:w="70" w:type="dxa"/>
               <w:left w:w="110" w:type="dxa"/>
@@ -20016,6 +20275,7 @@
               <w:bottom w:val="single" w:sz="4" w:space="0" w:color="C9D3DE"/>
               <w:right w:val="single" w:sz="4" w:space="0" w:color="C9D3DE"/>
             </w:tcBorders>
+            <w:shd w:val="clear" w:color="auto" w:fill="auto"/>
             <w:tcMar>
               <w:top w:w="70" w:type="dxa"/>
               <w:left w:w="110" w:type="dxa"/>
@@ -20117,6 +20377,7 @@
               <w:bottom w:val="single" w:sz="4" w:space="0" w:color="C9D3DE"/>
               <w:right w:val="single" w:sz="4" w:space="0" w:color="C9D3DE"/>
             </w:tcBorders>
+            <w:shd w:val="clear" w:color="auto" w:fill="auto"/>
             <w:tcMar>
               <w:top w:w="70" w:type="dxa"/>
               <w:left w:w="110" w:type="dxa"/>
@@ -20148,6 +20409,7 @@
               <w:bottom w:val="single" w:sz="4" w:space="0" w:color="C9D3DE"/>
               <w:right w:val="single" w:sz="4" w:space="0" w:color="C9D3DE"/>
             </w:tcBorders>
+            <w:shd w:val="clear" w:color="auto" w:fill="auto"/>
             <w:tcMar>
               <w:top w:w="70" w:type="dxa"/>
               <w:left w:w="110" w:type="dxa"/>
@@ -20249,6 +20511,7 @@
               <w:bottom w:val="single" w:sz="4" w:space="0" w:color="C9D3DE"/>
               <w:right w:val="single" w:sz="4" w:space="0" w:color="C9D3DE"/>
             </w:tcBorders>
+            <w:shd w:val="clear" w:color="auto" w:fill="auto"/>
             <w:tcMar>
               <w:top w:w="70" w:type="dxa"/>
               <w:left w:w="110" w:type="dxa"/>
@@ -20280,6 +20543,7 @@
               <w:bottom w:val="single" w:sz="4" w:space="0" w:color="C9D3DE"/>
               <w:right w:val="single" w:sz="4" w:space="0" w:color="C9D3DE"/>
             </w:tcBorders>
+            <w:shd w:val="clear" w:color="auto" w:fill="auto"/>
             <w:tcMar>
               <w:top w:w="70" w:type="dxa"/>
               <w:left w:w="110" w:type="dxa"/>
@@ -20364,6 +20628,83 @@
                 <w:szCs w:val="19"/>
               </w:rPr>
               <w:t>Hanya pada jenis Perlu perhatian: banyak sub level macet dan kapan terakhir lulus sub level.</w:t>
+            </w:r>
+          </w:p>
+        </w:tc>
+      </w:tr>
+      <w:tr>
+        <w:trPr>
+          <w:cantSplit/>
+        </w:trPr>
+        <w:tc>
+          <w:tcPr>
+            <w:tcW w:w="2891" w:type="dxa"/>
+            <w:tcBorders>
+              <w:top w:val="single" w:sz="4" w:space="0" w:color="C9D3DE"/>
+              <w:left w:val="single" w:sz="4" w:space="0" w:color="C9D3DE"/>
+              <w:bottom w:val="single" w:sz="4" w:space="0" w:color="C9D3DE"/>
+              <w:right w:val="single" w:sz="4" w:space="0" w:color="C9D3DE"/>
+            </w:tcBorders>
+            <w:shd w:val="clear" w:color="auto" w:fill="auto"/>
+            <w:tcMar>
+              <w:top w:w="70" w:type="dxa"/>
+              <w:left w:w="110" w:type="dxa"/>
+              <w:bottom w:w="70" w:type="dxa"/>
+              <w:right w:w="110" w:type="dxa"/>
+            </w:tcMar>
+          </w:tcPr>
+          <w:p>
+            <w:pPr>
+              <w:spacing w:after="30"/>
+              <w:rPr>
+                <w:b/>
+                <w:bCs/>
+                <w:sz w:val="19"/>
+                <w:szCs w:val="19"/>
+              </w:rPr>
+            </w:pPr>
+            <w:r>
+              <w:rPr>
+                <w:b/>
+                <w:bCs/>
+                <w:sz w:val="19"/>
+                <w:szCs w:val="19"/>
+              </w:rPr>
+              <w:t>Latihan mandiri (periode)</w:t>
+            </w:r>
+          </w:p>
+        </w:tc>
+        <w:tc>
+          <w:tcPr>
+            <w:tcW w:w="6747" w:type="dxa"/>
+            <w:tcBorders>
+              <w:top w:val="single" w:sz="4" w:space="0" w:color="C9D3DE"/>
+              <w:left w:val="single" w:sz="4" w:space="0" w:color="C9D3DE"/>
+              <w:bottom w:val="single" w:sz="4" w:space="0" w:color="C9D3DE"/>
+              <w:right w:val="single" w:sz="4" w:space="0" w:color="C9D3DE"/>
+            </w:tcBorders>
+            <w:shd w:val="clear" w:color="auto" w:fill="auto"/>
+            <w:tcMar>
+              <w:top w:w="70" w:type="dxa"/>
+              <w:left w:w="110" w:type="dxa"/>
+              <w:bottom w:w="70" w:type="dxa"/>
+              <w:right w:w="110" w:type="dxa"/>
+            </w:tcMar>
+          </w:tcPr>
+          <w:p>
+            <w:pPr>
+              <w:spacing w:after="30"/>
+              <w:rPr>
+                <w:sz w:val="19"/>
+                <w:szCs w:val="19"/>
+              </w:rPr>
+            </w:pPr>
+            <w:r>
+              <w:rPr>
+                <w:sz w:val="19"/>
+                <w:szCs w:val="19"/>
+              </w:rPr>
+              <w:t>Hanya pada jenis Paling rajin latihan mandiri: baris atas "N hari · M kegiatan"; baris bawah rata-rata nilai, waktu latihan, dan sub level yang lulus saat latihan mandiri. "–" = tidak berlatih mandiri dalam periode.</w:t>
             </w:r>
           </w:p>
         </w:tc>
@@ -20773,6 +21114,7 @@
                 <w:sz w:val="19"/>
                 <w:szCs w:val="19"/>
               </w:rPr>
+              <w:lastRenderedPageBreak/>
               <w:t>Level tertinggi / Paling cepat naik</w:t>
             </w:r>
           </w:p>
@@ -20818,7 +21160,7 @@
         <w:pStyle w:val="Heading1"/>
         <w:pageBreakBefore/>
       </w:pPr>
-      <w:bookmarkStart w:id="19" w:name="_Toc242966025"/>
+      <w:bookmarkStart w:id="19" w:name="_Toc243165959"/>
       <w:r>
         <w:lastRenderedPageBreak/>
         <w:t>4. Tab Analisis Siswa</w:t>
@@ -22189,7 +22531,7 @@
       <w:pPr>
         <w:pStyle w:val="Heading2"/>
       </w:pPr>
-      <w:bookmarkStart w:id="20" w:name="_Toc242966026"/>
+      <w:bookmarkStart w:id="20" w:name="_Toc243165960"/>
       <w:r>
         <w:t>4.1 Kartu identitas</w:t>
       </w:r>
@@ -22237,7 +22579,7 @@
       <w:pPr>
         <w:pStyle w:val="Heading2"/>
       </w:pPr>
-      <w:bookmarkStart w:id="21" w:name="_Toc242966027"/>
+      <w:bookmarkStart w:id="21" w:name="_Toc243165961"/>
       <w:r>
         <w:t>4.2 Enam kotak ringkasan</w:t>
       </w:r>
@@ -23265,7 +23607,7 @@
       <w:pPr>
         <w:pStyle w:val="Heading2"/>
       </w:pPr>
-      <w:bookmarkStart w:id="22" w:name="_Toc242966028"/>
+      <w:bookmarkStart w:id="22" w:name="_Toc243165962"/>
       <w:r>
         <w:t>4.3 Kotak terkunci dan Aturan yang berlaku</w:t>
       </w:r>
@@ -23324,10 +23666,7 @@
         <w:t>tahapan</w:t>
       </w:r>
       <w:r>
-        <w:t xml:space="preserve"> = atur</w:t>
-      </w:r>
-      <w:r>
-        <w:t xml:space="preserve">an dasar tahapan), dikelompokkan: </w:t>
+        <w:t xml:space="preserve"> = aturan dasar tahapan), dikelompokkan: </w:t>
       </w:r>
       <w:r>
         <w:rPr>
@@ -23367,10 +23706,7 @@
         <w:t>Sesi</w:t>
       </w:r>
       <w:r>
-        <w:t xml:space="preserve"> (lama satu ses</w:t>
-      </w:r>
-      <w:r>
-        <w:t xml:space="preserve">i). Bila tahapannya punya aturan per tahap/level, di bawahnya ada daftar </w:t>
+        <w:t xml:space="preserve"> (lama satu sesi). Bila tahapannya punya aturan per tahap/level, di bawahnya ada daftar </w:t>
       </w:r>
       <w:r>
         <w:rPr>
@@ -23469,7 +23805,7 @@
       <w:pPr>
         <w:pStyle w:val="Heading2"/>
       </w:pPr>
-      <w:bookmarkStart w:id="23" w:name="_Toc242966029"/>
+      <w:bookmarkStart w:id="23" w:name="_Toc243165963"/>
       <w:r>
         <w:t>4.4 Catatan otomatis</w:t>
       </w:r>
@@ -24141,7 +24477,7 @@
       <w:pPr>
         <w:pStyle w:val="Heading2"/>
       </w:pPr>
-      <w:bookmarkStart w:id="24" w:name="_Toc242966030"/>
+      <w:bookmarkStart w:id="24" w:name="_Toc243165964"/>
       <w:r>
         <w:lastRenderedPageBreak/>
         <w:t>4.5 Riwayat semester (arsip)</w:t>
@@ -24240,7 +24576,7 @@
       <w:pPr>
         <w:pStyle w:val="Heading2"/>
       </w:pPr>
-      <w:bookmarkStart w:id="25" w:name="_Toc242966031"/>
+      <w:bookmarkStart w:id="25" w:name="_Toc243165965"/>
       <w:r>
         <w:t>4.6 Kartu Latihan mandiri (di luar sesi)</w:t>
       </w:r>
@@ -24766,7 +25102,7 @@
       <w:pPr>
         <w:pStyle w:val="Heading2"/>
       </w:pPr>
-      <w:bookmarkStart w:id="26" w:name="_Toc242966032"/>
+      <w:bookmarkStart w:id="26" w:name="_Toc243165966"/>
       <w:r>
         <w:t>4.7 Grafik Kemajuan sub level lulus</w:t>
       </w:r>
@@ -25152,7 +25488,7 @@
       <w:pPr>
         <w:pStyle w:val="Heading2"/>
       </w:pPr>
-      <w:bookmarkStart w:id="27" w:name="_Toc242966033"/>
+      <w:bookmarkStart w:id="27" w:name="_Toc243165967"/>
       <w:r>
         <w:t>4.8 Kegiatan per jenis</w:t>
       </w:r>
@@ -26120,7 +26456,7 @@
       <w:pPr>
         <w:pStyle w:val="Heading2"/>
       </w:pPr>
-      <w:bookmarkStart w:id="28" w:name="_Toc242966034"/>
+      <w:bookmarkStart w:id="28" w:name="_Toc243165968"/>
       <w:r>
         <w:t>4.9 Per tahap</w:t>
       </w:r>
@@ -26488,7 +26824,7 @@
       <w:pPr>
         <w:pStyle w:val="Heading2"/>
       </w:pPr>
-      <w:bookmarkStart w:id="29" w:name="_Toc242966035"/>
+      <w:bookmarkStart w:id="29" w:name="_Toc243165969"/>
       <w:r>
         <w:t>4.10 Hasil di bawah 80% terakhir</w:t>
       </w:r>
@@ -27018,7 +27354,7 @@
       <w:pPr>
         <w:pStyle w:val="Heading2"/>
       </w:pPr>
-      <w:bookmarkStart w:id="30" w:name="_Toc242966036"/>
+      <w:bookmarkStart w:id="30" w:name="_Toc243165970"/>
       <w:r>
         <w:t>4.11 Riwayat sub level lulus</w:t>
       </w:r>
@@ -27546,7 +27882,7 @@
       <w:pPr>
         <w:pStyle w:val="Heading2"/>
       </w:pPr>
-      <w:bookmarkStart w:id="31" w:name="_Toc242966037"/>
+      <w:bookmarkStart w:id="31" w:name="_Toc243165971"/>
       <w:r>
         <w:t>4.12 Aturan dan tahapan siswa ini, Hapus data latihan</w:t>
       </w:r>
@@ -27736,7 +28072,7 @@
         <w:pStyle w:val="Heading1"/>
         <w:pageBreakBefore/>
       </w:pPr>
-      <w:bookmarkStart w:id="32" w:name="_Toc242966038"/>
+      <w:bookmarkStart w:id="32" w:name="_Toc243165972"/>
       <w:r>
         <w:lastRenderedPageBreak/>
         <w:t>5. Dari Data ke Tindakan</w:t>
@@ -27747,7 +28083,7 @@
       <w:pPr>
         <w:pStyle w:val="Heading2"/>
       </w:pPr>
-      <w:bookmarkStart w:id="33" w:name="_Toc242966039"/>
+      <w:bookmarkStart w:id="33" w:name="_Toc243165973"/>
       <w:r>
         <w:t>5.1 Situasi umum dan tindakan</w:t>
       </w:r>
@@ -28943,7 +29279,7 @@
         <w:pStyle w:val="Heading2"/>
         <w:pageBreakBefore/>
       </w:pPr>
-      <w:bookmarkStart w:id="34" w:name="_Toc242966040"/>
+      <w:bookmarkStart w:id="34" w:name="_Toc243165974"/>
       <w:r>
         <w:lastRenderedPageBreak/>
         <w:t>5.2 Tanya jawab singkat</w:t>
@@ -29051,6 +29387,7 @@
               <w:bottom w:val="single" w:sz="4" w:space="0" w:color="C9D3DE"/>
               <w:right w:val="single" w:sz="4" w:space="0" w:color="C9D3DE"/>
             </w:tcBorders>
+            <w:shd w:val="clear" w:color="auto" w:fill="auto"/>
             <w:tcMar>
               <w:top w:w="70" w:type="dxa"/>
               <w:left w:w="110" w:type="dxa"/>
@@ -29080,6 +29417,7 @@
               <w:bottom w:val="single" w:sz="4" w:space="0" w:color="C9D3DE"/>
               <w:right w:val="single" w:sz="4" w:space="0" w:color="C9D3DE"/>
             </w:tcBorders>
+            <w:shd w:val="clear" w:color="auto" w:fill="auto"/>
             <w:tcMar>
               <w:top w:w="70" w:type="dxa"/>
               <w:left w:w="110" w:type="dxa"/>
@@ -29179,6 +29517,7 @@
               <w:bottom w:val="single" w:sz="4" w:space="0" w:color="C9D3DE"/>
               <w:right w:val="single" w:sz="4" w:space="0" w:color="C9D3DE"/>
             </w:tcBorders>
+            <w:shd w:val="clear" w:color="auto" w:fill="auto"/>
             <w:tcMar>
               <w:top w:w="70" w:type="dxa"/>
               <w:left w:w="110" w:type="dxa"/>
@@ -29208,6 +29547,7 @@
               <w:bottom w:val="single" w:sz="4" w:space="0" w:color="C9D3DE"/>
               <w:right w:val="single" w:sz="4" w:space="0" w:color="C9D3DE"/>
             </w:tcBorders>
+            <w:shd w:val="clear" w:color="auto" w:fill="auto"/>
             <w:tcMar>
               <w:top w:w="70" w:type="dxa"/>
               <w:left w:w="110" w:type="dxa"/>
@@ -29307,6 +29647,7 @@
               <w:bottom w:val="single" w:sz="4" w:space="0" w:color="C9D3DE"/>
               <w:right w:val="single" w:sz="4" w:space="0" w:color="C9D3DE"/>
             </w:tcBorders>
+            <w:shd w:val="clear" w:color="auto" w:fill="auto"/>
             <w:tcMar>
               <w:top w:w="70" w:type="dxa"/>
               <w:left w:w="110" w:type="dxa"/>
@@ -29336,6 +29677,7 @@
               <w:bottom w:val="single" w:sz="4" w:space="0" w:color="C9D3DE"/>
               <w:right w:val="single" w:sz="4" w:space="0" w:color="C9D3DE"/>
             </w:tcBorders>
+            <w:shd w:val="clear" w:color="auto" w:fill="auto"/>
             <w:tcMar>
               <w:top w:w="70" w:type="dxa"/>
               <w:left w:w="110" w:type="dxa"/>
@@ -29435,6 +29777,7 @@
               <w:bottom w:val="single" w:sz="4" w:space="0" w:color="C9D3DE"/>
               <w:right w:val="single" w:sz="4" w:space="0" w:color="C9D3DE"/>
             </w:tcBorders>
+            <w:shd w:val="clear" w:color="auto" w:fill="auto"/>
             <w:tcMar>
               <w:top w:w="70" w:type="dxa"/>
               <w:left w:w="110" w:type="dxa"/>
@@ -29464,6 +29807,7 @@
               <w:bottom w:val="single" w:sz="4" w:space="0" w:color="C9D3DE"/>
               <w:right w:val="single" w:sz="4" w:space="0" w:color="C9D3DE"/>
             </w:tcBorders>
+            <w:shd w:val="clear" w:color="auto" w:fill="auto"/>
             <w:tcMar>
               <w:top w:w="70" w:type="dxa"/>
               <w:left w:w="110" w:type="dxa"/>
@@ -29547,21 +29891,7 @@
                 <w:sz w:val="19"/>
                 <w:szCs w:val="19"/>
               </w:rPr>
-              <w:t xml:space="preserve">Siswa tidak bisa membuka level berikutnya (ada ikon </w:t>
-            </w:r>
-            <w:r>
-              <w:rPr>
-                <w:sz w:val="19"/>
-                <w:szCs w:val="19"/>
-              </w:rPr>
-              <w:t>🔒</w:t>
-            </w:r>
-            <w:r>
-              <w:rPr>
-                <w:sz w:val="19"/>
-                <w:szCs w:val="19"/>
-              </w:rPr>
-              <w:t>)?</w:t>
+              <w:t>Siswa tidak bisa membuka level berikutnya (ada ikon 🔒)?</w:t>
             </w:r>
           </w:p>
         </w:tc>
@@ -29625,6 +29955,7 @@
               <w:bottom w:val="single" w:sz="4" w:space="0" w:color="C9D3DE"/>
               <w:right w:val="single" w:sz="4" w:space="0" w:color="C9D3DE"/>
             </w:tcBorders>
+            <w:shd w:val="clear" w:color="auto" w:fill="auto"/>
             <w:tcMar>
               <w:top w:w="70" w:type="dxa"/>
               <w:left w:w="110" w:type="dxa"/>
@@ -29654,30 +29985,24 @@
               <w:bottom w:val="single" w:sz="4" w:space="0" w:color="C9D3DE"/>
               <w:right w:val="single" w:sz="4" w:space="0" w:color="C9D3DE"/>
             </w:tcBorders>
-            <w:tcMar>
-              <w:top w:w="70" w:type="dxa"/>
-              <w:left w:w="110" w:type="dxa"/>
-              <w:bottom w:w="70" w:type="dxa"/>
-              <w:right w:w="110" w:type="dxa"/>
-            </w:tcMar>
-          </w:tcPr>
-          <w:p>
-            <w:pPr>
-              <w:spacing w:after="30"/>
-            </w:pPr>
-            <w:r>
-              <w:rPr>
-                <w:sz w:val="19"/>
-                <w:szCs w:val="19"/>
-              </w:rPr>
-              <w:t>Semua level tahapan khususnya suda</w:t>
-            </w:r>
-            <w:r>
-              <w:rPr>
-                <w:sz w:val="19"/>
-                <w:szCs w:val="19"/>
-              </w:rPr>
-              <w:t xml:space="preserve">h tuntas dan tahapan itu berujung </w:t>
+            <w:shd w:val="clear" w:color="auto" w:fill="auto"/>
+            <w:tcMar>
+              <w:top w:w="70" w:type="dxa"/>
+              <w:left w:w="110" w:type="dxa"/>
+              <w:bottom w:w="70" w:type="dxa"/>
+              <w:right w:w="110" w:type="dxa"/>
+            </w:tcMar>
+          </w:tcPr>
+          <w:p>
+            <w:pPr>
+              <w:spacing w:after="30"/>
+            </w:pPr>
+            <w:r>
+              <w:rPr>
+                <w:sz w:val="19"/>
+                <w:szCs w:val="19"/>
+              </w:rPr>
+              <w:t xml:space="preserve">Semua level tahapan khususnya sudah tuntas dan tahapan itu berujung </w:t>
             </w:r>
             <w:r>
               <w:rPr>
@@ -29792,6 +30117,7 @@
               <w:bottom w:val="single" w:sz="4" w:space="0" w:color="C9D3DE"/>
               <w:right w:val="single" w:sz="4" w:space="0" w:color="C9D3DE"/>
             </w:tcBorders>
+            <w:shd w:val="clear" w:color="auto" w:fill="auto"/>
             <w:tcMar>
               <w:top w:w="70" w:type="dxa"/>
               <w:left w:w="110" w:type="dxa"/>
@@ -29821,6 +30147,7 @@
               <w:bottom w:val="single" w:sz="4" w:space="0" w:color="C9D3DE"/>
               <w:right w:val="single" w:sz="4" w:space="0" w:color="C9D3DE"/>
             </w:tcBorders>
+            <w:shd w:val="clear" w:color="auto" w:fill="auto"/>
             <w:tcMar>
               <w:top w:w="70" w:type="dxa"/>
               <w:left w:w="110" w:type="dxa"/>
@@ -29934,14 +30261,80 @@
                 <w:sz w:val="19"/>
                 <w:szCs w:val="19"/>
               </w:rPr>
-              <w:t>HP itu tidak bisa memakai mikrofon untuk grafik dan pengenal suara sekaligus, sehingga grafik digerakkan sinyal pengenal suara. Penilaian tetap berjalan normal. Saat membaca, kata yang su</w:t>
-            </w:r>
-            <w:r>
-              <w:rPr>
-                <w:sz w:val="19"/>
-                <w:szCs w:val="19"/>
-              </w:rPr>
-              <w:t>dah dikenali berubah menjadi latar hijau tua.</w:t>
+              <w:t>HP itu tidak bisa memakai mikrofon untuk grafik dan pengenal suara sekaligus, sehingga grafik digerakkan sinyal pengenal suara. Penilaian tetap berjalan normal. Saat membaca, kata yang sudah dikenali berubah menjadi latar hijau tua.</w:t>
+            </w:r>
+          </w:p>
+        </w:tc>
+      </w:tr>
+      <w:tr>
+        <w:trPr>
+          <w:cantSplit/>
+        </w:trPr>
+        <w:tc>
+          <w:tcPr>
+            <w:tcW w:w="3855" w:type="dxa"/>
+            <w:tcBorders>
+              <w:top w:val="single" w:sz="4" w:space="0" w:color="C9D3DE"/>
+              <w:left w:val="single" w:sz="4" w:space="0" w:color="C9D3DE"/>
+              <w:bottom w:val="single" w:sz="4" w:space="0" w:color="C9D3DE"/>
+              <w:right w:val="single" w:sz="4" w:space="0" w:color="C9D3DE"/>
+            </w:tcBorders>
+            <w:shd w:val="clear" w:color="auto" w:fill="auto"/>
+            <w:tcMar>
+              <w:top w:w="70" w:type="dxa"/>
+              <w:left w:w="110" w:type="dxa"/>
+              <w:bottom w:w="70" w:type="dxa"/>
+              <w:right w:w="110" w:type="dxa"/>
+            </w:tcMar>
+          </w:tcPr>
+          <w:p>
+            <w:pPr>
+              <w:spacing w:after="30"/>
+              <w:rPr>
+                <w:sz w:val="19"/>
+                <w:szCs w:val="19"/>
+              </w:rPr>
+            </w:pPr>
+            <w:r>
+              <w:rPr>
+                <w:sz w:val="19"/>
+                <w:szCs w:val="19"/>
+              </w:rPr>
+              <w:t>Siapa siswa yang paling rajin berlatih di rumah (latihan mandiri)?</w:t>
+            </w:r>
+          </w:p>
+        </w:tc>
+        <w:tc>
+          <w:tcPr>
+            <w:tcW w:w="5783" w:type="dxa"/>
+            <w:tcBorders>
+              <w:top w:val="single" w:sz="4" w:space="0" w:color="C9D3DE"/>
+              <w:left w:val="single" w:sz="4" w:space="0" w:color="C9D3DE"/>
+              <w:bottom w:val="single" w:sz="4" w:space="0" w:color="C9D3DE"/>
+              <w:right w:val="single" w:sz="4" w:space="0" w:color="C9D3DE"/>
+            </w:tcBorders>
+            <w:shd w:val="clear" w:color="auto" w:fill="auto"/>
+            <w:tcMar>
+              <w:top w:w="70" w:type="dxa"/>
+              <w:left w:w="110" w:type="dxa"/>
+              <w:bottom w:w="70" w:type="dxa"/>
+              <w:right w:w="110" w:type="dxa"/>
+            </w:tcMar>
+          </w:tcPr>
+          <w:p>
+            <w:pPr>
+              <w:spacing w:after="30"/>
+              <w:rPr>
+                <w:sz w:val="19"/>
+                <w:szCs w:val="19"/>
+              </w:rPr>
+            </w:pPr>
+            <w:r>
+              <w:rPr>
+                <w:sz w:val="19"/>
+                <w:szCs w:val="19"/>
+              </w:rPr>
+              <w:t>Buka Perkembangan Siswa → Peringkat → jenis Paling rajin latihan mandiri, lalu pilih periode (mis. 30 hari). Guru hanya melihat siswa dari rombel yang diajarnya (mengajar dua rombel = siswa dari kedua rombel itu); admin melihat semua rombel. Siswa yang belum berlatih mandiri dalam periode itu tidak masuk daftar.</w:t>
             </w:r>
           </w:p>
         </w:tc>

</xml_diff>

<commit_message>
Perkembangan Siswa: sub-tab Rekapitulasi (rapor rombel + grafik, perbandingan), Per Rombel digabung; panduan diperbarui
Co-Authored-By: Claude Opus 5.5 <noreply@anthropic.com>
</commit_message>
<xml_diff>
--- a/Panduan_Membaca_Data_English_Reading.docx
+++ b/Panduan_Membaca_Data_English_Reading.docx
@@ -97,7 +97,7 @@
         <w:t>Perkembangan Siswa</w:t>
       </w:r>
       <w:r>
-        <w:t xml:space="preserve"> — kemajuan seluruh rombel (Per Siswa, Per Rombel, Peringkat)</w:t>
+        <w:t xml:space="preserve"> — kemajuan seluruh rombel (Rekapitulasi, Per Siswa, Peringkat)</w:t>
       </w:r>
     </w:p>
     <w:p>
@@ -191,7 +191,7 @@
           <w:r>
             <w:fldChar w:fldCharType="separate"/>
           </w:r>
-          <w:hyperlink w:anchor="_Toc243165940" w:history="1">
+          <w:hyperlink w:anchor="_Toc243489450" w:history="1">
             <w:r>
               <w:rPr>
                 <w:rStyle w:val="Hyperlink"/>
@@ -215,7 +215,7 @@
               <w:rPr>
                 <w:noProof/>
               </w:rPr>
-              <w:instrText xml:space="preserve"> PAGEREF _Toc243165940 \h </w:instrText>
+              <w:instrText xml:space="preserve"> PAGEREF _Toc243489450 \h </w:instrText>
             </w:r>
             <w:r>
               <w:rPr>
@@ -255,7 +255,7 @@
               <w:szCs w:val="22"/>
             </w:rPr>
           </w:pPr>
-          <w:hyperlink w:anchor="_Toc243165941" w:history="1">
+          <w:hyperlink w:anchor="_Toc243489451" w:history="1">
             <w:r>
               <w:rPr>
                 <w:rStyle w:val="Hyperlink"/>
@@ -279,7 +279,7 @@
               <w:rPr>
                 <w:noProof/>
               </w:rPr>
-              <w:instrText xml:space="preserve"> PAGEREF _Toc243165941 \h </w:instrText>
+              <w:instrText xml:space="preserve"> PAGEREF _Toc243489451 \h </w:instrText>
             </w:r>
             <w:r>
               <w:rPr>
@@ -319,7 +319,7 @@
               <w:szCs w:val="22"/>
             </w:rPr>
           </w:pPr>
-          <w:hyperlink w:anchor="_Toc243165942" w:history="1">
+          <w:hyperlink w:anchor="_Toc243489452" w:history="1">
             <w:r>
               <w:rPr>
                 <w:rStyle w:val="Hyperlink"/>
@@ -343,7 +343,7 @@
               <w:rPr>
                 <w:noProof/>
               </w:rPr>
-              <w:instrText xml:space="preserve"> PAGEREF _Toc243165942 \h </w:instrText>
+              <w:instrText xml:space="preserve"> PAGEREF _Toc243489452 \h </w:instrText>
             </w:r>
             <w:r>
               <w:rPr>
@@ -383,7 +383,7 @@
               <w:szCs w:val="22"/>
             </w:rPr>
           </w:pPr>
-          <w:hyperlink w:anchor="_Toc243165943" w:history="1">
+          <w:hyperlink w:anchor="_Toc243489453" w:history="1">
             <w:r>
               <w:rPr>
                 <w:rStyle w:val="Hyperlink"/>
@@ -407,7 +407,7 @@
               <w:rPr>
                 <w:noProof/>
               </w:rPr>
-              <w:instrText xml:space="preserve"> PAGEREF _Toc243165943 \h </w:instrText>
+              <w:instrText xml:space="preserve"> PAGEREF _Toc243489453 \h </w:instrText>
             </w:r>
             <w:r>
               <w:rPr>
@@ -447,7 +447,7 @@
               <w:szCs w:val="22"/>
             </w:rPr>
           </w:pPr>
-          <w:hyperlink w:anchor="_Toc243165944" w:history="1">
+          <w:hyperlink w:anchor="_Toc243489454" w:history="1">
             <w:r>
               <w:rPr>
                 <w:rStyle w:val="Hyperlink"/>
@@ -471,7 +471,7 @@
               <w:rPr>
                 <w:noProof/>
               </w:rPr>
-              <w:instrText xml:space="preserve"> PAGEREF _Toc243165944 \h </w:instrText>
+              <w:instrText xml:space="preserve"> PAGEREF _Toc243489454 \h </w:instrText>
             </w:r>
             <w:r>
               <w:rPr>
@@ -511,7 +511,7 @@
               <w:szCs w:val="22"/>
             </w:rPr>
           </w:pPr>
-          <w:hyperlink w:anchor="_Toc243165945" w:history="1">
+          <w:hyperlink w:anchor="_Toc243489455" w:history="1">
             <w:r>
               <w:rPr>
                 <w:rStyle w:val="Hyperlink"/>
@@ -535,7 +535,7 @@
               <w:rPr>
                 <w:noProof/>
               </w:rPr>
-              <w:instrText xml:space="preserve"> PAGEREF _Toc243165945 \h </w:instrText>
+              <w:instrText xml:space="preserve"> PAGEREF _Toc243489455 \h </w:instrText>
             </w:r>
             <w:r>
               <w:rPr>
@@ -575,7 +575,7 @@
               <w:szCs w:val="22"/>
             </w:rPr>
           </w:pPr>
-          <w:hyperlink w:anchor="_Toc243165946" w:history="1">
+          <w:hyperlink w:anchor="_Toc243489456" w:history="1">
             <w:r>
               <w:rPr>
                 <w:rStyle w:val="Hyperlink"/>
@@ -599,7 +599,7 @@
               <w:rPr>
                 <w:noProof/>
               </w:rPr>
-              <w:instrText xml:space="preserve"> PAGEREF _Toc243165946 \h </w:instrText>
+              <w:instrText xml:space="preserve"> PAGEREF _Toc243489456 \h </w:instrText>
             </w:r>
             <w:r>
               <w:rPr>
@@ -639,7 +639,7 @@
               <w:szCs w:val="22"/>
             </w:rPr>
           </w:pPr>
-          <w:hyperlink w:anchor="_Toc243165947" w:history="1">
+          <w:hyperlink w:anchor="_Toc243489457" w:history="1">
             <w:r>
               <w:rPr>
                 <w:rStyle w:val="Hyperlink"/>
@@ -663,7 +663,7 @@
               <w:rPr>
                 <w:noProof/>
               </w:rPr>
-              <w:instrText xml:space="preserve"> PAGEREF _Toc243165947 \h </w:instrText>
+              <w:instrText xml:space="preserve"> PAGEREF _Toc243489457 \h </w:instrText>
             </w:r>
             <w:r>
               <w:rPr>
@@ -703,7 +703,7 @@
               <w:szCs w:val="22"/>
             </w:rPr>
           </w:pPr>
-          <w:hyperlink w:anchor="_Toc243165948" w:history="1">
+          <w:hyperlink w:anchor="_Toc243489458" w:history="1">
             <w:r>
               <w:rPr>
                 <w:rStyle w:val="Hyperlink"/>
@@ -727,7 +727,7 @@
               <w:rPr>
                 <w:noProof/>
               </w:rPr>
-              <w:instrText xml:space="preserve"> PAGEREF _Toc243165948 \h </w:instrText>
+              <w:instrText xml:space="preserve"> PAGEREF _Toc243489458 \h </w:instrText>
             </w:r>
             <w:r>
               <w:rPr>
@@ -767,7 +767,7 @@
               <w:szCs w:val="22"/>
             </w:rPr>
           </w:pPr>
-          <w:hyperlink w:anchor="_Toc243165949" w:history="1">
+          <w:hyperlink w:anchor="_Toc243489459" w:history="1">
             <w:r>
               <w:rPr>
                 <w:rStyle w:val="Hyperlink"/>
@@ -791,7 +791,7 @@
               <w:rPr>
                 <w:noProof/>
               </w:rPr>
-              <w:instrText xml:space="preserve"> PAGEREF _Toc243165949 \h </w:instrText>
+              <w:instrText xml:space="preserve"> PAGEREF _Toc243489459 \h </w:instrText>
             </w:r>
             <w:r>
               <w:rPr>
@@ -831,7 +831,7 @@
               <w:szCs w:val="22"/>
             </w:rPr>
           </w:pPr>
-          <w:hyperlink w:anchor="_Toc243165950" w:history="1">
+          <w:hyperlink w:anchor="_Toc243489460" w:history="1">
             <w:r>
               <w:rPr>
                 <w:rStyle w:val="Hyperlink"/>
@@ -855,7 +855,7 @@
               <w:rPr>
                 <w:noProof/>
               </w:rPr>
-              <w:instrText xml:space="preserve"> PAGEREF _Toc243165950 \h </w:instrText>
+              <w:instrText xml:space="preserve"> PAGEREF _Toc243489460 \h </w:instrText>
             </w:r>
             <w:r>
               <w:rPr>
@@ -895,7 +895,7 @@
               <w:szCs w:val="22"/>
             </w:rPr>
           </w:pPr>
-          <w:hyperlink w:anchor="_Toc243165951" w:history="1">
+          <w:hyperlink w:anchor="_Toc243489461" w:history="1">
             <w:r>
               <w:rPr>
                 <w:rStyle w:val="Hyperlink"/>
@@ -919,7 +919,7 @@
               <w:rPr>
                 <w:noProof/>
               </w:rPr>
-              <w:instrText xml:space="preserve"> PAGEREF _Toc243165951 \h </w:instrText>
+              <w:instrText xml:space="preserve"> PAGEREF _Toc243489461 \h </w:instrText>
             </w:r>
             <w:r>
               <w:rPr>
@@ -959,7 +959,7 @@
               <w:szCs w:val="22"/>
             </w:rPr>
           </w:pPr>
-          <w:hyperlink w:anchor="_Toc243165952" w:history="1">
+          <w:hyperlink w:anchor="_Toc243489462" w:history="1">
             <w:r>
               <w:rPr>
                 <w:rStyle w:val="Hyperlink"/>
@@ -983,7 +983,7 @@
               <w:rPr>
                 <w:noProof/>
               </w:rPr>
-              <w:instrText xml:space="preserve"> PAGEREF _Toc243165952 \h </w:instrText>
+              <w:instrText xml:space="preserve"> PAGEREF _Toc243489462 \h </w:instrText>
             </w:r>
             <w:r>
               <w:rPr>
@@ -1023,7 +1023,7 @@
               <w:szCs w:val="22"/>
             </w:rPr>
           </w:pPr>
-          <w:hyperlink w:anchor="_Toc243165953" w:history="1">
+          <w:hyperlink w:anchor="_Toc243489463" w:history="1">
             <w:r>
               <w:rPr>
                 <w:rStyle w:val="Hyperlink"/>
@@ -1047,7 +1047,7 @@
               <w:rPr>
                 <w:noProof/>
               </w:rPr>
-              <w:instrText xml:space="preserve"> PAGEREF _Toc243165953 \h </w:instrText>
+              <w:instrText xml:space="preserve"> PAGEREF _Toc243489463 \h </w:instrText>
             </w:r>
             <w:r>
               <w:rPr>
@@ -1087,7 +1087,7 @@
               <w:szCs w:val="22"/>
             </w:rPr>
           </w:pPr>
-          <w:hyperlink w:anchor="_Toc243165954" w:history="1">
+          <w:hyperlink w:anchor="_Toc243489464" w:history="1">
             <w:r>
               <w:rPr>
                 <w:rStyle w:val="Hyperlink"/>
@@ -1111,7 +1111,7 @@
               <w:rPr>
                 <w:noProof/>
               </w:rPr>
-              <w:instrText xml:space="preserve"> PAGEREF _Toc243165954 \h </w:instrText>
+              <w:instrText xml:space="preserve"> PAGEREF _Toc243489464 \h </w:instrText>
             </w:r>
             <w:r>
               <w:rPr>
@@ -1151,7 +1151,7 @@
               <w:szCs w:val="22"/>
             </w:rPr>
           </w:pPr>
-          <w:hyperlink w:anchor="_Toc243165955" w:history="1">
+          <w:hyperlink w:anchor="_Toc243489465" w:history="1">
             <w:r>
               <w:rPr>
                 <w:rStyle w:val="Hyperlink"/>
@@ -1175,7 +1175,7 @@
               <w:rPr>
                 <w:noProof/>
               </w:rPr>
-              <w:instrText xml:space="preserve"> PAGEREF _Toc243165955 \h </w:instrText>
+              <w:instrText xml:space="preserve"> PAGEREF _Toc243489465 \h </w:instrText>
             </w:r>
             <w:r>
               <w:rPr>
@@ -1215,13 +1215,13 @@
               <w:szCs w:val="22"/>
             </w:rPr>
           </w:pPr>
-          <w:hyperlink w:anchor="_Toc243165956" w:history="1">
+          <w:hyperlink w:anchor="_Toc243489466" w:history="1">
             <w:r>
               <w:rPr>
                 <w:rStyle w:val="Hyperlink"/>
                 <w:noProof/>
               </w:rPr>
-              <w:t>3.1 Sub-tab Per Siswa</w:t>
+              <w:t>3.1 Sub-tab Rekapitulasi</w:t>
             </w:r>
             <w:r>
               <w:rPr>
@@ -1239,7 +1239,7 @@
               <w:rPr>
                 <w:noProof/>
               </w:rPr>
-              <w:instrText xml:space="preserve"> PAGEREF _Toc243165956 \h </w:instrText>
+              <w:instrText xml:space="preserve"> PAGEREF _Toc243489466 \h </w:instrText>
             </w:r>
             <w:r>
               <w:rPr>
@@ -1279,13 +1279,13 @@
               <w:szCs w:val="22"/>
             </w:rPr>
           </w:pPr>
-          <w:hyperlink w:anchor="_Toc243165957" w:history="1">
+          <w:hyperlink w:anchor="_Toc243489467" w:history="1">
             <w:r>
               <w:rPr>
                 <w:rStyle w:val="Hyperlink"/>
                 <w:noProof/>
               </w:rPr>
-              <w:t>3.2 Sub-tab Per Rombel</w:t>
+              <w:t>3.2 Sub-tab Per Siswa</w:t>
             </w:r>
             <w:r>
               <w:rPr>
@@ -1303,7 +1303,7 @@
               <w:rPr>
                 <w:noProof/>
               </w:rPr>
-              <w:instrText xml:space="preserve"> PAGEREF _Toc243165957 \h </w:instrText>
+              <w:instrText xml:space="preserve"> PAGEREF _Toc243489467 \h </w:instrText>
             </w:r>
             <w:r>
               <w:rPr>
@@ -1343,13 +1343,13 @@
               <w:szCs w:val="22"/>
             </w:rPr>
           </w:pPr>
-          <w:hyperlink w:anchor="_Toc243165958" w:history="1">
+          <w:hyperlink w:anchor="_Toc243489468" w:history="1">
             <w:r>
               <w:rPr>
                 <w:rStyle w:val="Hyperlink"/>
                 <w:noProof/>
               </w:rPr>
-              <w:t>3.3 Sub-tab Peringkat</w:t>
+              <w:t>3.3 Ringkasan keseluruhan (bagian bawah Rekapitulasi)</w:t>
             </w:r>
             <w:r>
               <w:rPr>
@@ -1367,7 +1367,7 @@
               <w:rPr>
                 <w:noProof/>
               </w:rPr>
-              <w:instrText xml:space="preserve"> PAGEREF _Toc243165958 \h </w:instrText>
+              <w:instrText xml:space="preserve"> PAGEREF _Toc243489468 \h </w:instrText>
             </w:r>
             <w:r>
               <w:rPr>
@@ -1384,7 +1384,71 @@
               <w:rPr>
                 <w:noProof/>
               </w:rPr>
-              <w:t>14</w:t>
+              <w:t>13</w:t>
+            </w:r>
+            <w:r>
+              <w:rPr>
+                <w:noProof/>
+              </w:rPr>
+              <w:fldChar w:fldCharType="end"/>
+            </w:r>
+          </w:hyperlink>
+        </w:p>
+        <w:p>
+          <w:pPr>
+            <w:pStyle w:val="TOC2"/>
+            <w:tabs>
+              <w:tab w:val="right" w:leader="dot" w:pos="9628"/>
+            </w:tabs>
+            <w:rPr>
+              <w:rFonts w:asciiTheme="minorHAnsi" w:eastAsiaTheme="minorEastAsia" w:hAnsiTheme="minorHAnsi" w:cstheme="minorBidi"/>
+              <w:noProof/>
+              <w:sz w:val="22"/>
+              <w:szCs w:val="22"/>
+            </w:rPr>
+          </w:pPr>
+          <w:hyperlink w:anchor="_Toc243489469" w:history="1">
+            <w:r>
+              <w:rPr>
+                <w:rStyle w:val="Hyperlink"/>
+                <w:noProof/>
+              </w:rPr>
+              <w:t>3.4 Sub-tab Peringkat</w:t>
+            </w:r>
+            <w:r>
+              <w:rPr>
+                <w:noProof/>
+              </w:rPr>
+              <w:tab/>
+            </w:r>
+            <w:r>
+              <w:rPr>
+                <w:noProof/>
+              </w:rPr>
+              <w:fldChar w:fldCharType="begin"/>
+            </w:r>
+            <w:r>
+              <w:rPr>
+                <w:noProof/>
+              </w:rPr>
+              <w:instrText xml:space="preserve"> PAGEREF _Toc243489469 \h </w:instrText>
+            </w:r>
+            <w:r>
+              <w:rPr>
+                <w:noProof/>
+              </w:rPr>
+            </w:r>
+            <w:r>
+              <w:rPr>
+                <w:noProof/>
+              </w:rPr>
+              <w:fldChar w:fldCharType="separate"/>
+            </w:r>
+            <w:r>
+              <w:rPr>
+                <w:noProof/>
+              </w:rPr>
+              <w:t>15</w:t>
             </w:r>
             <w:r>
               <w:rPr>
@@ -1407,7 +1471,7 @@
               <w:szCs w:val="22"/>
             </w:rPr>
           </w:pPr>
-          <w:hyperlink w:anchor="_Toc243165959" w:history="1">
+          <w:hyperlink w:anchor="_Toc243489470" w:history="1">
             <w:r>
               <w:rPr>
                 <w:rStyle w:val="Hyperlink"/>
@@ -1431,7 +1495,7 @@
               <w:rPr>
                 <w:noProof/>
               </w:rPr>
-              <w:instrText xml:space="preserve"> PAGEREF _Toc243165959 \h </w:instrText>
+              <w:instrText xml:space="preserve"> PAGEREF _Toc243489470 \h </w:instrText>
             </w:r>
             <w:r>
               <w:rPr>
@@ -1448,7 +1512,7 @@
               <w:rPr>
                 <w:noProof/>
               </w:rPr>
-              <w:t>17</w:t>
+              <w:t>18</w:t>
             </w:r>
             <w:r>
               <w:rPr>
@@ -1471,7 +1535,7 @@
               <w:szCs w:val="22"/>
             </w:rPr>
           </w:pPr>
-          <w:hyperlink w:anchor="_Toc243165960" w:history="1">
+          <w:hyperlink w:anchor="_Toc243489471" w:history="1">
             <w:r>
               <w:rPr>
                 <w:rStyle w:val="Hyperlink"/>
@@ -1495,7 +1559,7 @@
               <w:rPr>
                 <w:noProof/>
               </w:rPr>
-              <w:instrText xml:space="preserve"> PAGEREF _Toc243165960 \h </w:instrText>
+              <w:instrText xml:space="preserve"> PAGEREF _Toc243489471 \h </w:instrText>
             </w:r>
             <w:r>
               <w:rPr>
@@ -1512,7 +1576,7 @@
               <w:rPr>
                 <w:noProof/>
               </w:rPr>
-              <w:t>17</w:t>
+              <w:t>18</w:t>
             </w:r>
             <w:r>
               <w:rPr>
@@ -1535,7 +1599,7 @@
               <w:szCs w:val="22"/>
             </w:rPr>
           </w:pPr>
-          <w:hyperlink w:anchor="_Toc243165961" w:history="1">
+          <w:hyperlink w:anchor="_Toc243489472" w:history="1">
             <w:r>
               <w:rPr>
                 <w:rStyle w:val="Hyperlink"/>
@@ -1559,7 +1623,7 @@
               <w:rPr>
                 <w:noProof/>
               </w:rPr>
-              <w:instrText xml:space="preserve"> PAGEREF _Toc243165961 \h </w:instrText>
+              <w:instrText xml:space="preserve"> PAGEREF _Toc243489472 \h </w:instrText>
             </w:r>
             <w:r>
               <w:rPr>
@@ -1576,7 +1640,7 @@
               <w:rPr>
                 <w:noProof/>
               </w:rPr>
-              <w:t>17</w:t>
+              <w:t>18</w:t>
             </w:r>
             <w:r>
               <w:rPr>
@@ -1599,7 +1663,7 @@
               <w:szCs w:val="22"/>
             </w:rPr>
           </w:pPr>
-          <w:hyperlink w:anchor="_Toc243165962" w:history="1">
+          <w:hyperlink w:anchor="_Toc243489473" w:history="1">
             <w:r>
               <w:rPr>
                 <w:rStyle w:val="Hyperlink"/>
@@ -1623,7 +1687,7 @@
               <w:rPr>
                 <w:noProof/>
               </w:rPr>
-              <w:instrText xml:space="preserve"> PAGEREF _Toc243165962 \h </w:instrText>
+              <w:instrText xml:space="preserve"> PAGEREF _Toc243489473 \h </w:instrText>
             </w:r>
             <w:r>
               <w:rPr>
@@ -1640,7 +1704,7 @@
               <w:rPr>
                 <w:noProof/>
               </w:rPr>
-              <w:t>18</w:t>
+              <w:t>19</w:t>
             </w:r>
             <w:r>
               <w:rPr>
@@ -1663,7 +1727,7 @@
               <w:szCs w:val="22"/>
             </w:rPr>
           </w:pPr>
-          <w:hyperlink w:anchor="_Toc243165963" w:history="1">
+          <w:hyperlink w:anchor="_Toc243489474" w:history="1">
             <w:r>
               <w:rPr>
                 <w:rStyle w:val="Hyperlink"/>
@@ -1687,7 +1751,7 @@
               <w:rPr>
                 <w:noProof/>
               </w:rPr>
-              <w:instrText xml:space="preserve"> PAGEREF _Toc243165963 \h </w:instrText>
+              <w:instrText xml:space="preserve"> PAGEREF _Toc243489474 \h </w:instrText>
             </w:r>
             <w:r>
               <w:rPr>
@@ -1704,7 +1768,7 @@
               <w:rPr>
                 <w:noProof/>
               </w:rPr>
-              <w:t>18</w:t>
+              <w:t>19</w:t>
             </w:r>
             <w:r>
               <w:rPr>
@@ -1727,7 +1791,7 @@
               <w:szCs w:val="22"/>
             </w:rPr>
           </w:pPr>
-          <w:hyperlink w:anchor="_Toc243165964" w:history="1">
+          <w:hyperlink w:anchor="_Toc243489475" w:history="1">
             <w:r>
               <w:rPr>
                 <w:rStyle w:val="Hyperlink"/>
@@ -1751,7 +1815,7 @@
               <w:rPr>
                 <w:noProof/>
               </w:rPr>
-              <w:instrText xml:space="preserve"> PAGEREF _Toc243165964 \h </w:instrText>
+              <w:instrText xml:space="preserve"> PAGEREF _Toc243489475 \h </w:instrText>
             </w:r>
             <w:r>
               <w:rPr>
@@ -1768,7 +1832,7 @@
               <w:rPr>
                 <w:noProof/>
               </w:rPr>
-              <w:t>19</w:t>
+              <w:t>20</w:t>
             </w:r>
             <w:r>
               <w:rPr>
@@ -1791,7 +1855,7 @@
               <w:szCs w:val="22"/>
             </w:rPr>
           </w:pPr>
-          <w:hyperlink w:anchor="_Toc243165965" w:history="1">
+          <w:hyperlink w:anchor="_Toc243489476" w:history="1">
             <w:r>
               <w:rPr>
                 <w:rStyle w:val="Hyperlink"/>
@@ -1815,7 +1879,7 @@
               <w:rPr>
                 <w:noProof/>
               </w:rPr>
-              <w:instrText xml:space="preserve"> PAGEREF _Toc243165965 \h </w:instrText>
+              <w:instrText xml:space="preserve"> PAGEREF _Toc243489476 \h </w:instrText>
             </w:r>
             <w:r>
               <w:rPr>
@@ -1832,7 +1896,7 @@
               <w:rPr>
                 <w:noProof/>
               </w:rPr>
-              <w:t>19</w:t>
+              <w:t>20</w:t>
             </w:r>
             <w:r>
               <w:rPr>
@@ -1855,7 +1919,7 @@
               <w:szCs w:val="22"/>
             </w:rPr>
           </w:pPr>
-          <w:hyperlink w:anchor="_Toc243165966" w:history="1">
+          <w:hyperlink w:anchor="_Toc243489477" w:history="1">
             <w:r>
               <w:rPr>
                 <w:rStyle w:val="Hyperlink"/>
@@ -1879,7 +1943,7 @@
               <w:rPr>
                 <w:noProof/>
               </w:rPr>
-              <w:instrText xml:space="preserve"> PAGEREF _Toc243165966 \h </w:instrText>
+              <w:instrText xml:space="preserve"> PAGEREF _Toc243489477 \h </w:instrText>
             </w:r>
             <w:r>
               <w:rPr>
@@ -1896,7 +1960,7 @@
               <w:rPr>
                 <w:noProof/>
               </w:rPr>
-              <w:t>19</w:t>
+              <w:t>20</w:t>
             </w:r>
             <w:r>
               <w:rPr>
@@ -1919,7 +1983,7 @@
               <w:szCs w:val="22"/>
             </w:rPr>
           </w:pPr>
-          <w:hyperlink w:anchor="_Toc243165967" w:history="1">
+          <w:hyperlink w:anchor="_Toc243489478" w:history="1">
             <w:r>
               <w:rPr>
                 <w:rStyle w:val="Hyperlink"/>
@@ -1943,7 +2007,7 @@
               <w:rPr>
                 <w:noProof/>
               </w:rPr>
-              <w:instrText xml:space="preserve"> PAGEREF _Toc243165967 \h </w:instrText>
+              <w:instrText xml:space="preserve"> PAGEREF _Toc243489478 \h </w:instrText>
             </w:r>
             <w:r>
               <w:rPr>
@@ -1960,7 +2024,7 @@
               <w:rPr>
                 <w:noProof/>
               </w:rPr>
-              <w:t>19</w:t>
+              <w:t>20</w:t>
             </w:r>
             <w:r>
               <w:rPr>
@@ -1983,7 +2047,7 @@
               <w:szCs w:val="22"/>
             </w:rPr>
           </w:pPr>
-          <w:hyperlink w:anchor="_Toc243165968" w:history="1">
+          <w:hyperlink w:anchor="_Toc243489479" w:history="1">
             <w:r>
               <w:rPr>
                 <w:rStyle w:val="Hyperlink"/>
@@ -2007,7 +2071,7 @@
               <w:rPr>
                 <w:noProof/>
               </w:rPr>
-              <w:instrText xml:space="preserve"> PAGEREF _Toc243165968 \h </w:instrText>
+              <w:instrText xml:space="preserve"> PAGEREF _Toc243489479 \h </w:instrText>
             </w:r>
             <w:r>
               <w:rPr>
@@ -2024,7 +2088,7 @@
               <w:rPr>
                 <w:noProof/>
               </w:rPr>
-              <w:t>20</w:t>
+              <w:t>21</w:t>
             </w:r>
             <w:r>
               <w:rPr>
@@ -2047,7 +2111,7 @@
               <w:szCs w:val="22"/>
             </w:rPr>
           </w:pPr>
-          <w:hyperlink w:anchor="_Toc243165969" w:history="1">
+          <w:hyperlink w:anchor="_Toc243489480" w:history="1">
             <w:r>
               <w:rPr>
                 <w:rStyle w:val="Hyperlink"/>
@@ -2071,7 +2135,7 @@
               <w:rPr>
                 <w:noProof/>
               </w:rPr>
-              <w:instrText xml:space="preserve"> PAGEREF _Toc243165969 \h </w:instrText>
+              <w:instrText xml:space="preserve"> PAGEREF _Toc243489480 \h </w:instrText>
             </w:r>
             <w:r>
               <w:rPr>
@@ -2088,7 +2152,7 @@
               <w:rPr>
                 <w:noProof/>
               </w:rPr>
-              <w:t>20</w:t>
+              <w:t>21</w:t>
             </w:r>
             <w:r>
               <w:rPr>
@@ -2111,7 +2175,7 @@
               <w:szCs w:val="22"/>
             </w:rPr>
           </w:pPr>
-          <w:hyperlink w:anchor="_Toc243165970" w:history="1">
+          <w:hyperlink w:anchor="_Toc243489481" w:history="1">
             <w:r>
               <w:rPr>
                 <w:rStyle w:val="Hyperlink"/>
@@ -2135,7 +2199,7 @@
               <w:rPr>
                 <w:noProof/>
               </w:rPr>
-              <w:instrText xml:space="preserve"> PAGEREF _Toc243165970 \h </w:instrText>
+              <w:instrText xml:space="preserve"> PAGEREF _Toc243489481 \h </w:instrText>
             </w:r>
             <w:r>
               <w:rPr>
@@ -2152,7 +2216,7 @@
               <w:rPr>
                 <w:noProof/>
               </w:rPr>
-              <w:t>21</w:t>
+              <w:t>22</w:t>
             </w:r>
             <w:r>
               <w:rPr>
@@ -2175,7 +2239,7 @@
               <w:szCs w:val="22"/>
             </w:rPr>
           </w:pPr>
-          <w:hyperlink w:anchor="_Toc243165971" w:history="1">
+          <w:hyperlink w:anchor="_Toc243489482" w:history="1">
             <w:r>
               <w:rPr>
                 <w:rStyle w:val="Hyperlink"/>
@@ -2199,7 +2263,7 @@
               <w:rPr>
                 <w:noProof/>
               </w:rPr>
-              <w:instrText xml:space="preserve"> PAGEREF _Toc243165971 \h </w:instrText>
+              <w:instrText xml:space="preserve"> PAGEREF _Toc243489482 \h </w:instrText>
             </w:r>
             <w:r>
               <w:rPr>
@@ -2216,7 +2280,7 @@
               <w:rPr>
                 <w:noProof/>
               </w:rPr>
-              <w:t>21</w:t>
+              <w:t>22</w:t>
             </w:r>
             <w:r>
               <w:rPr>
@@ -2239,7 +2303,7 @@
               <w:szCs w:val="22"/>
             </w:rPr>
           </w:pPr>
-          <w:hyperlink w:anchor="_Toc243165972" w:history="1">
+          <w:hyperlink w:anchor="_Toc243489483" w:history="1">
             <w:r>
               <w:rPr>
                 <w:rStyle w:val="Hyperlink"/>
@@ -2263,7 +2327,7 @@
               <w:rPr>
                 <w:noProof/>
               </w:rPr>
-              <w:instrText xml:space="preserve"> PAGEREF _Toc243165972 \h </w:instrText>
+              <w:instrText xml:space="preserve"> PAGEREF _Toc243489483 \h </w:instrText>
             </w:r>
             <w:r>
               <w:rPr>
@@ -2280,7 +2344,7 @@
               <w:rPr>
                 <w:noProof/>
               </w:rPr>
-              <w:t>22</w:t>
+              <w:t>23</w:t>
             </w:r>
             <w:r>
               <w:rPr>
@@ -2303,7 +2367,7 @@
               <w:szCs w:val="22"/>
             </w:rPr>
           </w:pPr>
-          <w:hyperlink w:anchor="_Toc243165973" w:history="1">
+          <w:hyperlink w:anchor="_Toc243489484" w:history="1">
             <w:r>
               <w:rPr>
                 <w:rStyle w:val="Hyperlink"/>
@@ -2327,7 +2391,7 @@
               <w:rPr>
                 <w:noProof/>
               </w:rPr>
-              <w:instrText xml:space="preserve"> PAGEREF _Toc243165973 \h </w:instrText>
+              <w:instrText xml:space="preserve"> PAGEREF _Toc243489484 \h </w:instrText>
             </w:r>
             <w:r>
               <w:rPr>
@@ -2344,7 +2408,7 @@
               <w:rPr>
                 <w:noProof/>
               </w:rPr>
-              <w:t>22</w:t>
+              <w:t>23</w:t>
             </w:r>
             <w:r>
               <w:rPr>
@@ -2367,7 +2431,7 @@
               <w:szCs w:val="22"/>
             </w:rPr>
           </w:pPr>
-          <w:hyperlink w:anchor="_Toc243165974" w:history="1">
+          <w:hyperlink w:anchor="_Toc243489485" w:history="1">
             <w:r>
               <w:rPr>
                 <w:rStyle w:val="Hyperlink"/>
@@ -2391,7 +2455,7 @@
               <w:rPr>
                 <w:noProof/>
               </w:rPr>
-              <w:instrText xml:space="preserve"> PAGEREF _Toc243165974 \h </w:instrText>
+              <w:instrText xml:space="preserve"> PAGEREF _Toc243489485 \h </w:instrText>
             </w:r>
             <w:r>
               <w:rPr>
@@ -2408,7 +2472,7 @@
               <w:rPr>
                 <w:noProof/>
               </w:rPr>
-              <w:t>23</w:t>
+              <w:t>24</w:t>
             </w:r>
             <w:r>
               <w:rPr>
@@ -2430,7 +2494,7 @@
         <w:pStyle w:val="Heading1"/>
         <w:pageBreakBefore/>
       </w:pPr>
-      <w:bookmarkStart w:id="0" w:name="_Toc243165940"/>
+      <w:bookmarkStart w:id="0" w:name="_Toc243489450"/>
       <w:r>
         <w:lastRenderedPageBreak/>
         <w:t>1. Sebelum Mulai: Istilah Dasar</w:t>
@@ -2449,7 +2513,7 @@
       <w:pPr>
         <w:pStyle w:val="Heading2"/>
       </w:pPr>
-      <w:bookmarkStart w:id="1" w:name="_Toc243165941"/>
+      <w:bookmarkStart w:id="1" w:name="_Toc243489451"/>
       <w:r>
         <w:t>1.1 Susunan materi: Tahap, Level, dan Sub level</w:t>
       </w:r>
@@ -3937,7 +4001,7 @@
       <w:pPr>
         <w:pStyle w:val="Heading2"/>
       </w:pPr>
-      <w:bookmarkStart w:id="2" w:name="_Toc243165942"/>
+      <w:bookmarkStart w:id="2" w:name="_Toc243489452"/>
       <w:r>
         <w:t>1.2 Istilah kemajuan dan nilai</w:t>
       </w:r>
@@ -4879,7 +4943,7 @@
       <w:pPr>
         <w:pStyle w:val="Heading2"/>
       </w:pPr>
-      <w:bookmarkStart w:id="3" w:name="_Toc243165943"/>
+      <w:bookmarkStart w:id="3" w:name="_Toc243489453"/>
       <w:r>
         <w:t>1.3 Sesi kelas dan latihan mandiri</w:t>
       </w:r>
@@ -5584,7 +5648,7 @@
       <w:pPr>
         <w:pStyle w:val="Heading2"/>
       </w:pPr>
-      <w:bookmarkStart w:id="4" w:name="_Toc243165944"/>
+      <w:bookmarkStart w:id="4" w:name="_Toc243489454"/>
       <w:r>
         <w:t>1.4 Ukuran waktu "7 hari" dan "30 hari"</w:t>
       </w:r>
@@ -5706,7 +5770,7 @@
       <w:pPr>
         <w:pStyle w:val="Heading2"/>
       </w:pPr>
-      <w:bookmarkStart w:id="5" w:name="_Toc243165945"/>
+      <w:bookmarkStart w:id="5" w:name="_Toc243489455"/>
       <w:r>
         <w:t>1.5 Arti warna label</w:t>
       </w:r>
@@ -6411,7 +6475,7 @@
       <w:pPr>
         <w:pStyle w:val="Heading2"/>
       </w:pPr>
-      <w:bookmarkStart w:id="6" w:name="_Toc243165946"/>
+      <w:bookmarkStart w:id="6" w:name="_Toc243489456"/>
       <w:r>
         <w:t>1.6 Aturan dan tahapan: cara sistem memilih</w:t>
       </w:r>
@@ -7486,7 +7550,7 @@
         <w:pStyle w:val="Heading1"/>
         <w:pageBreakBefore/>
       </w:pPr>
-      <w:bookmarkStart w:id="7" w:name="_Toc243165947"/>
+      <w:bookmarkStart w:id="7" w:name="_Toc243489457"/>
       <w:r>
         <w:lastRenderedPageBreak/>
         <w:t>2. Tab Sesi Kegiatan</w:t>
@@ -7633,7 +7697,7 @@
       <w:pPr>
         <w:pStyle w:val="Heading2"/>
       </w:pPr>
-      <w:bookmarkStart w:id="8" w:name="_Toc243165948"/>
+      <w:bookmarkStart w:id="8" w:name="_Toc243489458"/>
       <w:r>
         <w:t>2.1 Bilah saringan</w:t>
       </w:r>
@@ -8133,7 +8197,7 @@
       <w:pPr>
         <w:pStyle w:val="Heading2"/>
       </w:pPr>
-      <w:bookmarkStart w:id="9" w:name="_Toc243165949"/>
+      <w:bookmarkStart w:id="9" w:name="_Toc243489459"/>
       <w:r>
         <w:t>2.2 Kartu Sesi latihan</w:t>
       </w:r>
@@ -8950,7 +9014,7 @@
       <w:pPr>
         <w:pStyle w:val="Heading2"/>
       </w:pPr>
-      <w:bookmarkStart w:id="10" w:name="_Toc243165950"/>
+      <w:bookmarkStart w:id="10" w:name="_Toc243489460"/>
       <w:r>
         <w:t>2.3 Kotak Aturan dan tahapan yang berlaku</w:t>
       </w:r>
@@ -9303,7 +9367,7 @@
       <w:pPr>
         <w:pStyle w:val="Heading2"/>
       </w:pPr>
-      <w:bookmarkStart w:id="11" w:name="_Toc243165951"/>
+      <w:bookmarkStart w:id="11" w:name="_Toc243489461"/>
       <w:r>
         <w:t>2.4 Enam kotak ringkasan</w:t>
       </w:r>
@@ -10435,7 +10499,7 @@
       <w:pPr>
         <w:pStyle w:val="Heading2"/>
       </w:pPr>
-      <w:bookmarkStart w:id="12" w:name="_Toc243165952"/>
+      <w:bookmarkStart w:id="12" w:name="_Toc243489462"/>
       <w:r>
         <w:t>2.5 Tabel siswa</w:t>
       </w:r>
@@ -11000,7 +11064,7 @@
       <w:pPr>
         <w:pStyle w:val="Heading2"/>
       </w:pPr>
-      <w:bookmarkStart w:id="13" w:name="_Toc243165953"/>
+      <w:bookmarkStart w:id="13" w:name="_Toc243489463"/>
       <w:r>
         <w:t>2.6 Arti kolom Status</w:t>
       </w:r>
@@ -12016,7 +12080,7 @@
       <w:pPr>
         <w:pStyle w:val="Heading2"/>
       </w:pPr>
-      <w:bookmarkStart w:id="14" w:name="_Toc243165954"/>
+      <w:bookmarkStart w:id="14" w:name="_Toc243489464"/>
       <w:r>
         <w:t>2.7 Bilah aksi untuk siswa terpilih</w:t>
       </w:r>
@@ -12444,7 +12508,7 @@
         <w:pStyle w:val="Heading1"/>
         <w:pageBreakBefore/>
       </w:pPr>
-      <w:bookmarkStart w:id="15" w:name="_Toc243165955"/>
+      <w:bookmarkStart w:id="15" w:name="_Toc243489465"/>
       <w:r>
         <w:lastRenderedPageBreak/>
         <w:t>3. Tab Perkembangan Siswa</w:t>
@@ -12487,27 +12551,34 @@
         <w:spacing w:after="120" w:line="276" w:lineRule="auto"/>
       </w:pPr>
       <w:r>
-        <w:t xml:space="preserve">Di bagian atas ada pilihan rombel, pilihan urutan, tombol </w:t>
+        <w:t xml:space="preserve">Di bagian atas ada pilihan rombel, pilihan urutan, tombol Muat ulang, dan Unduh rekap (Excel berkop berisi rekap kemajuan dan sebaran per tahap). Tab ini punya tiga sub-tab: </w:t>
       </w:r>
       <w:r>
         <w:rPr>
           <w:b/>
           <w:bCs/>
         </w:rPr>
-        <w:t>Muat ulang</w:t>
-      </w:r>
-      <w:r>
-        <w:t xml:space="preserve">, dan </w:t>
+        <w:t>Re</w:t>
       </w:r>
       <w:r>
         <w:rPr>
           <w:b/>
           <w:bCs/>
         </w:rPr>
-        <w:t>Unduh rekap</w:t>
+        <w:t>kapitulasi</w:t>
       </w:r>
       <w:r>
-        <w:t xml:space="preserve"> (Excel berkop berisi rekap kemajuan dan sebaran per tahap). Tab ini punya tiga sub-tab: </w:t>
+        <w:t xml:space="preserve"> (terbuka lebih dulu; di bagian bawahnya ada </w:t>
+      </w:r>
+      <w:r>
+        <w:rPr>
+          <w:b/>
+          <w:bCs/>
+        </w:rPr>
+        <w:t>Ringkasan keseluruhan</w:t>
+      </w:r>
+      <w:r>
+        <w:t xml:space="preserve">, yang dulu menjadi sub-tab Per Rombel), </w:t>
       </w:r>
       <w:r>
         <w:rPr>
@@ -12515,16 +12586,6 @@
           <w:bCs/>
         </w:rPr>
         <w:t>Per Siswa</w:t>
-      </w:r>
-      <w:r>
-        <w:t xml:space="preserve">, </w:t>
-      </w:r>
-      <w:r>
-        <w:rPr>
-          <w:b/>
-          <w:bCs/>
-        </w:rPr>
-        <w:t>Per Rombel</w:t>
       </w:r>
       <w:r>
         <w:t xml:space="preserve">, dan </w:t>
@@ -12544,11 +12605,305 @@
       <w:pPr>
         <w:pStyle w:val="Heading2"/>
       </w:pPr>
-      <w:bookmarkStart w:id="16" w:name="_Toc243165956"/>
+      <w:bookmarkStart w:id="16" w:name="_Toc243489466"/>
       <w:r>
-        <w:t>3.1 Sub-tab Per Siswa</w:t>
+        <w:t>3.1 Sub-tab Rekapitulasi</w:t>
       </w:r>
       <w:bookmarkEnd w:id="16"/>
+    </w:p>
+    <w:p>
+      <w:pPr>
+        <w:spacing w:after="120" w:line="276" w:lineRule="auto"/>
+      </w:pPr>
+      <w:r>
+        <w:t xml:space="preserve">Rapor perkembangan rombel dalam satu layar, dengan grafik: siapa yang maju, siapa yang tertinggal, dan bacaan mana yang perlu diulang. Semua angka memakai </w:t>
+      </w:r>
+      <w:r>
+        <w:rPr>
+          <w:b/>
+          <w:bCs/>
+        </w:rPr>
+        <w:t>sesi kelompok</w:t>
+      </w:r>
+      <w:r>
+        <w:t xml:space="preserve"> (latihan mandiri tidak dihitung). Satuan kemajuan = </w:t>
+      </w:r>
+      <w:r>
+        <w:rPr>
+          <w:b/>
+          <w:bCs/>
+        </w:rPr>
+        <w:t>kegiatan</w:t>
+      </w:r>
+      <w:r>
+        <w:t xml:space="preserve"> (sub-kegiatan yang lulus, nilai 80 atau lebih); ukuran mutu = </w:t>
+      </w:r>
+      <w:r>
+        <w:rPr>
+          <w:b/>
+          <w:bCs/>
+        </w:rPr>
+        <w:t>rata-rata nilai</w:t>
+      </w:r>
+      <w:r>
+        <w:t xml:space="preserve"> sub-kegiatan.</w:t>
+      </w:r>
+    </w:p>
+    <w:p>
+      <w:pPr>
+        <w:pStyle w:val="Heading3"/>
+      </w:pPr>
+      <w:r>
+        <w:t>3.1.1 Pilihan periode</w:t>
+      </w:r>
+    </w:p>
+    <w:p>
+      <w:pPr>
+        <w:spacing w:after="120" w:line="276" w:lineRule="auto"/>
+      </w:pPr>
+      <w:r>
+        <w:rPr>
+          <w:b/>
+          <w:bCs/>
+        </w:rPr>
+        <w:t>7 hari</w:t>
+      </w:r>
+      <w:r>
+        <w:t xml:space="preserve">, </w:t>
+      </w:r>
+      <w:r>
+        <w:rPr>
+          <w:b/>
+          <w:bCs/>
+        </w:rPr>
+        <w:t>30 hari</w:t>
+      </w:r>
+      <w:r>
+        <w:t xml:space="preserve">, </w:t>
+      </w:r>
+      <w:r>
+        <w:rPr>
+          <w:b/>
+          <w:bCs/>
+        </w:rPr>
+        <w:t>Semester ini</w:t>
+      </w:r>
+      <w:r>
+        <w:t xml:space="preserve">, atau </w:t>
+      </w:r>
+      <w:r>
+        <w:rPr>
+          <w:b/>
+          <w:bCs/>
+        </w:rPr>
+        <w:t>Pilih tanggal…</w:t>
+      </w:r>
+      <w:r>
+        <w:t xml:space="preserve"> (isian Dari dan Sampai, terisi periode yang sedang tampil). Di bawah tombol selalu tertulis periode yang berlaku dan pembandingnya, yaitu rentang sama panjang tepat sebelumnya. Periode tidak pernah keluar dari semester berjalan: tombol cepat dipotong di awal semester, pembanding juga dipotong atau tertulis </w:t>
+      </w:r>
+      <w:r>
+        <w:rPr>
+          <w:b/>
+          <w:bCs/>
+        </w:rPr>
+        <w:t>belum ada pembanding</w:t>
+      </w:r>
+      <w:r>
+        <w:t>, dan tanggal di luar semester ditolak. Semester lalu dibuka di halaman Arsip. Pilihan terakhir diingat di perangkat Anda.</w:t>
+      </w:r>
+    </w:p>
+    <w:p>
+      <w:pPr>
+        <w:pStyle w:val="Heading3"/>
+      </w:pPr>
+      <w:r>
+        <w:t>3.1.2 Rapor satu rombel</w:t>
+      </w:r>
+    </w:p>
+    <w:p>
+      <w:pPr>
+        <w:spacing w:after="120" w:line="276" w:lineRule="auto"/>
+      </w:pPr>
+      <w:r>
+        <w:t>Muncul bila pilihan rombel berisi satu rombel. Urutannya:</w:t>
+      </w:r>
+    </w:p>
+    <w:p>
+      <w:pPr>
+        <w:spacing w:after="120" w:line="276" w:lineRule="auto"/>
+      </w:pPr>
+      <w:r>
+        <w:rPr>
+          <w:b/>
+          <w:bCs/>
+        </w:rPr>
+        <w:t>Kalimat ringkas</w:t>
+      </w:r>
+      <w:r>
+        <w:t xml:space="preserve"> — siswa yang berlatih, kegiatan dituntaskan, rata-rata kegiatan per siswa, rata-rata nilai, dan jumlah siswa yang perlu perhatian.</w:t>
+      </w:r>
+    </w:p>
+    <w:p>
+      <w:pPr>
+        <w:spacing w:after="120" w:line="276" w:lineRule="auto"/>
+      </w:pPr>
+      <w:r>
+        <w:rPr>
+          <w:b/>
+          <w:bCs/>
+        </w:rPr>
+        <w:t>Empat kotak angka</w:t>
+      </w:r>
+      <w:r>
+        <w:t xml:space="preserve"> — siswa berlatih, kegiatan dituntaskan, rata-rata nilai, perlu perhatian; dengan panah naik/turun dibanding periode pembanding (atau keterangan </w:t>
+      </w:r>
+      <w:r>
+        <w:rPr>
+          <w:b/>
+          <w:bCs/>
+        </w:rPr>
+        <w:t>periode lalu tidak ada latihan</w:t>
+      </w:r>
+      <w:r>
+        <w:t>).</w:t>
+      </w:r>
+    </w:p>
+    <w:p>
+      <w:pPr>
+        <w:spacing w:after="120" w:line="276" w:lineRule="auto"/>
+      </w:pPr>
+      <w:r>
+        <w:rPr>
+          <w:b/>
+          <w:bCs/>
+        </w:rPr>
+        <w:t>Peta posisi kelas</w:t>
+      </w:r>
+      <w:r>
+        <w:t xml:space="preserve"> — tahap digambar sebagai lintasan; satu titik = satu siswa di level bacaannya (posisi sama dengan kolom Posisi di Per Siswa). Bila siswa hanya menempati sebagian kecil tahap, peta diperbesar ke rentang itu dan nomor level (L1, L2, …) ditulis di bawah lintasan. Hijau = 2 kegiatan atau lebih lulus pada periode ini, emas = 1 kegiatan, merah = belum lulus atau tidak berlatih. Ketuk titik untuk nama, posisi, dan nilainya.</w:t>
+      </w:r>
+    </w:p>
+    <w:p>
+      <w:pPr>
+        <w:spacing w:after="120" w:line="276" w:lineRule="auto"/>
+      </w:pPr>
+      <w:r>
+        <w:rPr>
+          <w:b/>
+          <w:bCs/>
+        </w:rPr>
+        <w:t>Kegiatan dituntaskan per hari latihan</w:t>
+      </w:r>
+      <w:r>
+        <w:t xml:space="preserve"> — kolom per hari (periode panjang diringkas per minggu), dan di bawahnya garis </w:t>
+      </w:r>
+      <w:r>
+        <w:rPr>
+          <w:b/>
+          <w:bCs/>
+        </w:rPr>
+        <w:t>rata-rata nilai</w:t>
+      </w:r>
+      <w:r>
+        <w:t xml:space="preserve"> dengan garis target 80.</w:t>
+      </w:r>
+    </w:p>
+    <w:p>
+      <w:pPr>
+        <w:spacing w:after="120" w:line="276" w:lineRule="auto"/>
+      </w:pPr>
+      <w:r>
+        <w:rPr>
+          <w:b/>
+          <w:bCs/>
+        </w:rPr>
+        <w:t>Di mana siswa macet</w:t>
+      </w:r>
+      <w:r>
+        <w:t xml:space="preserve"> — sub-kegiatan yang dicoba 3 kali atau lebih dalam 30 hari tanpa pernah mencapai nilai 80 (sama dengan label Macet di Per Siswa).</w:t>
+      </w:r>
+    </w:p>
+    <w:p>
+      <w:pPr>
+        <w:spacing w:after="120" w:line="276" w:lineRule="auto"/>
+      </w:pPr>
+      <w:r>
+        <w:rPr>
+          <w:b/>
+          <w:bCs/>
+        </w:rPr>
+        <w:t>Perlu perhatian</w:t>
+      </w:r>
+      <w:r>
+        <w:t xml:space="preserve"> (tidak berlatih pada periode ini, macet, atau rata-rata nilai di bawah 65 dari sedikitnya 10 kegiatan, beserta alasannya) dan </w:t>
+      </w:r>
+      <w:r>
+        <w:rPr>
+          <w:b/>
+          <w:bCs/>
+        </w:rPr>
+        <w:t>Bintang periode ini</w:t>
+      </w:r>
+      <w:r>
+        <w:t xml:space="preserve"> (kegiatan lulus terbanyak). Ketuk nama siswa untuk membuka Analisis Siswa.</w:t>
+      </w:r>
+    </w:p>
+    <w:p>
+      <w:pPr>
+        <w:pStyle w:val="Heading3"/>
+      </w:pPr>
+      <w:r>
+        <w:t>3.1.3 Perbandingan rombel</w:t>
+      </w:r>
+    </w:p>
+    <w:p>
+      <w:pPr>
+        <w:spacing w:after="120" w:line="276" w:lineRule="auto"/>
+      </w:pPr>
+      <w:r>
+        <w:t xml:space="preserve">Muncul bila dipilih </w:t>
+      </w:r>
+      <w:r>
+        <w:rPr>
+          <w:b/>
+          <w:bCs/>
+        </w:rPr>
+        <w:t>Semua rombel</w:t>
+      </w:r>
+      <w:r>
+        <w:t xml:space="preserve"> (admin: semua rombel; guru dengan beberapa rombel: rombel yang diampu). Berisi kalimat temuan (rombel dengan kemajuan terbaik dan yang perlu didorong), grafik </w:t>
+      </w:r>
+      <w:r>
+        <w:rPr>
+          <w:b/>
+          <w:bCs/>
+        </w:rPr>
+        <w:t>kegiatan dituntaskan per siswa</w:t>
+      </w:r>
+      <w:r>
+        <w:t xml:space="preserve"> tiap rombel beserta persentase siswa yang berlatih, dan </w:t>
+      </w:r>
+      <w:r>
+        <w:rPr>
+          <w:b/>
+          <w:bCs/>
+        </w:rPr>
+        <w:t>peta keaktifan per minggu</w:t>
+      </w:r>
+      <w:r>
+        <w:t>. Rombel yang tidak berlatih sama sekali pada periode itu disebut di satu baris dan tidak ikut dibandingkan. Ketuk baris rombel untuk membuka rapornya.</w:t>
+      </w:r>
+    </w:p>
+    <w:p>
+      <w:pPr>
+        <w:pStyle w:val="Heading2"/>
+      </w:pPr>
+      <w:bookmarkStart w:id="17" w:name="_Toc243489467"/>
+      <w:r>
+        <w:lastRenderedPageBreak/>
+        <w:t>3.2 Sub-tab Per Siswa</w:t>
+      </w:r>
+      <w:bookmarkEnd w:id="17"/>
     </w:p>
     <w:p>
       <w:pPr>
@@ -12723,7 +13078,7 @@
                 <w:sz w:val="19"/>
                 <w:szCs w:val="19"/>
               </w:rPr>
-              <w:t>Siswa dengan masalah paling berat (lihat skor pada 3.1.2), lalu yang level tuntasnya paling sedikit.</w:t>
+              <w:t>Siswa dengan masalah paling berat (lihat skor pada 3.2.2), lalu yang level tuntasnya paling sedikit.</w:t>
             </w:r>
           </w:p>
         </w:tc>
@@ -12938,7 +13293,7 @@
         <w:pStyle w:val="Heading3"/>
       </w:pPr>
       <w:r>
-        <w:t>3.1.1 Kolom tabel Per Siswa</w:t>
+        <w:t>3.2.1 Kolom tabel Per Siswa</w:t>
       </w:r>
     </w:p>
     <w:tbl>
@@ -13903,7 +14258,7 @@
                 <w:sz w:val="19"/>
                 <w:szCs w:val="19"/>
               </w:rPr>
-              <w:t>Label otomatis (lihat 3.1.2).</w:t>
+              <w:t>Label otomatis (lihat 3.2.2).</w:t>
             </w:r>
           </w:p>
         </w:tc>
@@ -13948,8 +14303,7 @@
         <w:pStyle w:val="Heading3"/>
       </w:pPr>
       <w:r>
-        <w:lastRenderedPageBreak/>
-        <w:t>3.1.2 Label di kolom Catatan</w:t>
+        <w:t>3.2.2 Label di kolom Catatan</w:t>
       </w:r>
     </w:p>
     <w:p>
@@ -14279,6 +14633,7 @@
                 <w:szCs w:val="18"/>
                 <w:shd w:val="clear" w:color="auto" w:fill="FBE2E2"/>
               </w:rPr>
+              <w:lastRenderedPageBreak/>
               <w:t xml:space="preserve"> Macet </w:t>
             </w:r>
           </w:p>
@@ -15735,11 +16090,42 @@
       <w:pPr>
         <w:pStyle w:val="Heading2"/>
       </w:pPr>
-      <w:bookmarkStart w:id="17" w:name="_Toc243165957"/>
+      <w:bookmarkStart w:id="18" w:name="_Toc243489468"/>
       <w:r>
-        <w:t>3.2 Sub-tab Per Rombel</w:t>
+        <w:t>3.3 Ringkasan keseluruhan (bagian bawah Rekapitulasi)</w:t>
       </w:r>
-      <w:bookmarkEnd w:id="17"/>
+      <w:bookmarkEnd w:id="18"/>
+    </w:p>
+    <w:p>
+      <w:pPr>
+        <w:spacing w:after="120" w:line="276" w:lineRule="auto"/>
+      </w:pPr>
+      <w:r>
+        <w:t xml:space="preserve">Dulu sub-tab Per Rombel; sejak 22 Oktober 2026 berada di bagian bawah sub-tab </w:t>
+      </w:r>
+      <w:r>
+        <w:rPr>
+          <w:b/>
+          <w:bCs/>
+        </w:rPr>
+        <w:t>Rekapitulasi</w:t>
+      </w:r>
+      <w:r>
+        <w:t xml:space="preserve">, di bawah judul </w:t>
+      </w:r>
+      <w:r>
+        <w:rPr>
+          <w:b/>
+          <w:bCs/>
+        </w:rPr>
+        <w:t>Ringkasan keseluruhan</w:t>
+      </w:r>
+      <w:r>
+        <w:t>. Angka di bagian ini dihitung sejak awal latihan dan tidak mengikuti pilihan periode di atasnya. Mengetuk baris pada tabel perb</w:t>
+      </w:r>
+      <w:r>
+        <w:t>andingan rombel membuka rapor rombel itu di Rekapitulasi.</w:t>
+      </w:r>
     </w:p>
     <w:p>
       <w:pPr>
@@ -15754,7 +16140,7 @@
         <w:pStyle w:val="Heading3"/>
       </w:pPr>
       <w:r>
-        <w:t>3.2.1 Kotak ringkasan rombel terpilih</w:t>
+        <w:t>3.3.1 Kotak ringkasan rombel terpilih</w:t>
       </w:r>
     </w:p>
     <w:tbl>
@@ -16070,7 +16456,6 @@
           <w:sz w:val="16"/>
           <w:szCs w:val="16"/>
         </w:rPr>
-        <w:lastRenderedPageBreak/>
         <w:t>Gambaran kotak ringkasan (angka hanya contoh)</w:t>
       </w:r>
     </w:p>
@@ -16124,6 +16509,7 @@
                 <w:sz w:val="19"/>
                 <w:szCs w:val="19"/>
               </w:rPr>
+              <w:lastRenderedPageBreak/>
               <w:t>Kotak</w:t>
             </w:r>
           </w:p>
@@ -16585,7 +16971,7 @@
         <w:pStyle w:val="Heading3"/>
       </w:pPr>
       <w:r>
-        <w:t>3.2.2 Grafik Sebaran posisi siswa</w:t>
+        <w:t>3.3.2 Grafik Sebaran posisi siswa</w:t>
       </w:r>
     </w:p>
     <w:p>
@@ -16671,7 +17057,7 @@
         <w:pStyle w:val="Heading3"/>
       </w:pPr>
       <w:r>
-        <w:t>3.2.3 Tabel Perbandingan rombel</w:t>
+        <w:t>3.3.3 Tabel Perbandingan rombel</w:t>
       </w:r>
     </w:p>
     <w:p>
@@ -17412,12 +17798,12 @@
       <w:pPr>
         <w:pStyle w:val="Heading2"/>
       </w:pPr>
-      <w:bookmarkStart w:id="18" w:name="_Toc243165958"/>
+      <w:bookmarkStart w:id="19" w:name="_Toc243489469"/>
       <w:r>
         <w:lastRenderedPageBreak/>
-        <w:t>3.3 Sub-tab Peringkat</w:t>
+        <w:t>3.4 Sub-tab Peringkat</w:t>
       </w:r>
-      <w:bookmarkEnd w:id="18"/>
+      <w:bookmarkEnd w:id="19"/>
     </w:p>
     <w:p>
       <w:pPr>
@@ -17445,7 +17831,7 @@
         <w:pStyle w:val="Heading3"/>
       </w:pPr>
       <w:r>
-        <w:t>3.3.1 Pilihan di atas tabel</w:t>
+        <w:t>3.4.1 Pilihan di atas tabel</w:t>
       </w:r>
     </w:p>
     <w:tbl>
@@ -17760,7 +18146,7 @@
                 <w:sz w:val="19"/>
                 <w:szCs w:val="19"/>
               </w:rPr>
-              <w:t>Tujuh jenis; lihat 3.3.2.</w:t>
+              <w:t>Tujuh jenis; lihat 3.4.2.</w:t>
             </w:r>
           </w:p>
         </w:tc>
@@ -17908,7 +18294,7 @@
         <w:pStyle w:val="Heading3"/>
       </w:pPr>
       <w:r>
-        <w:t xml:space="preserve">3.3.2 </w:t>
+        <w:t xml:space="preserve">3.4.2 </w:t>
       </w:r>
       <w:r>
         <w:t>Tujuh jenis peringkat</w:t>
@@ -19357,7 +19743,7 @@
       </w:pPr>
       <w:r>
         <w:lastRenderedPageBreak/>
-        <w:t>3.3.3 Kotak ringkasan Peringkat</w:t>
+        <w:t>3.4.3 Kotak ringkasan Peringkat</w:t>
       </w:r>
     </w:p>
     <w:tbl>
@@ -19871,7 +20257,7 @@
         <w:pStyle w:val="Heading3"/>
       </w:pPr>
       <w:r>
-        <w:t>3.3.4 Kolom tabel Peringkat</w:t>
+        <w:t>3.4.4 Kolom tabel Peringkat</w:t>
       </w:r>
     </w:p>
     <w:tbl>
@@ -20720,7 +21106,7 @@
         <w:pStyle w:val="Heading3"/>
       </w:pPr>
       <w:r>
-        <w:t>3.3.5 Tabel Perbandingan</w:t>
+        <w:t>3.4.5 Tabel Perbandingan</w:t>
       </w:r>
     </w:p>
     <w:p>
@@ -21160,12 +21546,12 @@
         <w:pStyle w:val="Heading1"/>
         <w:pageBreakBefore/>
       </w:pPr>
-      <w:bookmarkStart w:id="19" w:name="_Toc243165959"/>
+      <w:bookmarkStart w:id="20" w:name="_Toc243489470"/>
       <w:r>
         <w:lastRenderedPageBreak/>
         <w:t>4. Tab Analisis Siswa</w:t>
       </w:r>
-      <w:bookmarkEnd w:id="19"/>
+      <w:bookmarkEnd w:id="20"/>
     </w:p>
     <w:p>
       <w:pPr>
@@ -22531,11 +22917,11 @@
       <w:pPr>
         <w:pStyle w:val="Heading2"/>
       </w:pPr>
-      <w:bookmarkStart w:id="20" w:name="_Toc243165960"/>
+      <w:bookmarkStart w:id="21" w:name="_Toc243489471"/>
       <w:r>
         <w:t>4.1 Kartu identitas</w:t>
       </w:r>
-      <w:bookmarkEnd w:id="20"/>
+      <w:bookmarkEnd w:id="21"/>
     </w:p>
     <w:p>
       <w:pPr>
@@ -22579,11 +22965,11 @@
       <w:pPr>
         <w:pStyle w:val="Heading2"/>
       </w:pPr>
-      <w:bookmarkStart w:id="21" w:name="_Toc243165961"/>
+      <w:bookmarkStart w:id="22" w:name="_Toc243489472"/>
       <w:r>
         <w:t>4.2 Enam kotak ringkasan</w:t>
       </w:r>
-      <w:bookmarkEnd w:id="21"/>
+      <w:bookmarkEnd w:id="22"/>
     </w:p>
     <w:tbl>
       <w:tblPr>
@@ -23607,11 +23993,11 @@
       <w:pPr>
         <w:pStyle w:val="Heading2"/>
       </w:pPr>
-      <w:bookmarkStart w:id="22" w:name="_Toc243165962"/>
+      <w:bookmarkStart w:id="23" w:name="_Toc243489473"/>
       <w:r>
         <w:t>4.3 Kotak terkunci dan Aturan yang berlaku</w:t>
       </w:r>
-      <w:bookmarkEnd w:id="22"/>
+      <w:bookmarkEnd w:id="23"/>
     </w:p>
     <w:p>
       <w:pPr>
@@ -23805,11 +24191,11 @@
       <w:pPr>
         <w:pStyle w:val="Heading2"/>
       </w:pPr>
-      <w:bookmarkStart w:id="23" w:name="_Toc243165963"/>
+      <w:bookmarkStart w:id="24" w:name="_Toc243489474"/>
       <w:r>
         <w:t>4.4 Catatan otomatis</w:t>
       </w:r>
-      <w:bookmarkEnd w:id="23"/>
+      <w:bookmarkEnd w:id="24"/>
     </w:p>
     <w:p>
       <w:pPr>
@@ -24477,12 +24863,12 @@
       <w:pPr>
         <w:pStyle w:val="Heading2"/>
       </w:pPr>
-      <w:bookmarkStart w:id="24" w:name="_Toc243165964"/>
+      <w:bookmarkStart w:id="25" w:name="_Toc243489475"/>
       <w:r>
         <w:lastRenderedPageBreak/>
         <w:t>4.5 Riwayat semester (arsip)</w:t>
       </w:r>
-      <w:bookmarkEnd w:id="24"/>
+      <w:bookmarkEnd w:id="25"/>
     </w:p>
     <w:p>
       <w:pPr>
@@ -24576,11 +24962,11 @@
       <w:pPr>
         <w:pStyle w:val="Heading2"/>
       </w:pPr>
-      <w:bookmarkStart w:id="25" w:name="_Toc243165965"/>
+      <w:bookmarkStart w:id="26" w:name="_Toc243489476"/>
       <w:r>
         <w:t>4.6 Kartu Latihan mandiri (di luar sesi)</w:t>
       </w:r>
-      <w:bookmarkEnd w:id="25"/>
+      <w:bookmarkEnd w:id="26"/>
     </w:p>
     <w:p>
       <w:pPr>
@@ -25102,11 +25488,11 @@
       <w:pPr>
         <w:pStyle w:val="Heading2"/>
       </w:pPr>
-      <w:bookmarkStart w:id="26" w:name="_Toc243165966"/>
+      <w:bookmarkStart w:id="27" w:name="_Toc243489477"/>
       <w:r>
         <w:t>4.7 Grafik Kemajuan sub level lulus</w:t>
       </w:r>
-      <w:bookmarkEnd w:id="26"/>
+      <w:bookmarkEnd w:id="27"/>
     </w:p>
     <w:p>
       <w:pPr>
@@ -25488,11 +25874,11 @@
       <w:pPr>
         <w:pStyle w:val="Heading2"/>
       </w:pPr>
-      <w:bookmarkStart w:id="27" w:name="_Toc243165967"/>
+      <w:bookmarkStart w:id="28" w:name="_Toc243489478"/>
       <w:r>
         <w:t>4.8 Kegiatan per jenis</w:t>
       </w:r>
-      <w:bookmarkEnd w:id="27"/>
+      <w:bookmarkEnd w:id="28"/>
     </w:p>
     <w:p>
       <w:pPr>
@@ -26456,11 +26842,11 @@
       <w:pPr>
         <w:pStyle w:val="Heading2"/>
       </w:pPr>
-      <w:bookmarkStart w:id="28" w:name="_Toc243165968"/>
+      <w:bookmarkStart w:id="29" w:name="_Toc243489479"/>
       <w:r>
         <w:t>4.9 Per tahap</w:t>
       </w:r>
-      <w:bookmarkEnd w:id="28"/>
+      <w:bookmarkEnd w:id="29"/>
     </w:p>
     <w:tbl>
       <w:tblPr>
@@ -26824,11 +27210,11 @@
       <w:pPr>
         <w:pStyle w:val="Heading2"/>
       </w:pPr>
-      <w:bookmarkStart w:id="29" w:name="_Toc243165969"/>
+      <w:bookmarkStart w:id="30" w:name="_Toc243489480"/>
       <w:r>
         <w:t>4.10 Hasil di bawah 80% terakhir</w:t>
       </w:r>
-      <w:bookmarkEnd w:id="29"/>
+      <w:bookmarkEnd w:id="30"/>
     </w:p>
     <w:p>
       <w:pPr>
@@ -27354,11 +27740,11 @@
       <w:pPr>
         <w:pStyle w:val="Heading2"/>
       </w:pPr>
-      <w:bookmarkStart w:id="30" w:name="_Toc243165970"/>
+      <w:bookmarkStart w:id="31" w:name="_Toc243489481"/>
       <w:r>
         <w:t>4.11 Riwayat sub level lulus</w:t>
       </w:r>
-      <w:bookmarkEnd w:id="30"/>
+      <w:bookmarkEnd w:id="31"/>
     </w:p>
     <w:p>
       <w:pPr>
@@ -27882,11 +28268,11 @@
       <w:pPr>
         <w:pStyle w:val="Heading2"/>
       </w:pPr>
-      <w:bookmarkStart w:id="31" w:name="_Toc243165971"/>
+      <w:bookmarkStart w:id="32" w:name="_Toc243489482"/>
       <w:r>
         <w:t>4.12 Aturan dan tahapan siswa ini, Hapus data latihan</w:t>
       </w:r>
-      <w:bookmarkEnd w:id="31"/>
+      <w:bookmarkEnd w:id="32"/>
     </w:p>
     <w:p>
       <w:pPr>
@@ -28072,22 +28458,22 @@
         <w:pStyle w:val="Heading1"/>
         <w:pageBreakBefore/>
       </w:pPr>
-      <w:bookmarkStart w:id="32" w:name="_Toc243165972"/>
+      <w:bookmarkStart w:id="33" w:name="_Toc243489483"/>
       <w:r>
         <w:lastRenderedPageBreak/>
         <w:t>5. Dari Data ke Tindakan</w:t>
       </w:r>
-      <w:bookmarkEnd w:id="32"/>
+      <w:bookmarkEnd w:id="33"/>
     </w:p>
     <w:p>
       <w:pPr>
         <w:pStyle w:val="Heading2"/>
       </w:pPr>
-      <w:bookmarkStart w:id="33" w:name="_Toc243165973"/>
+      <w:bookmarkStart w:id="34" w:name="_Toc243489484"/>
       <w:r>
         <w:t>5.1 Situasi umum dan tindakan</w:t>
       </w:r>
-      <w:bookmarkEnd w:id="33"/>
+      <w:bookmarkEnd w:id="34"/>
     </w:p>
     <w:p>
       <w:pPr>
@@ -29030,7 +29416,7 @@
                 <w:sz w:val="19"/>
                 <w:szCs w:val="19"/>
               </w:rPr>
-              <w:t>Per Rombel → Posisi tertinggi; Peringkat → Paling cepat naik</w:t>
+              <w:t>Rekapitulasi (Ringkasan keseluruhan) → Posisi tertinggi; Peringkat → Paling cepat naik</w:t>
             </w:r>
           </w:p>
         </w:tc>
@@ -29233,7 +29619,7 @@
                 <w:sz w:val="19"/>
                 <w:szCs w:val="19"/>
               </w:rPr>
-              <w:t>Per Rombel → rata-rata level, nilai; Peringkat → sub level lulus per siswa</w:t>
+              <w:t>Rekapitulasi (Ringkasan keseluruhan) → rata-rata level, nilai; Peringkat → sub level lulus per siswa</w:t>
             </w:r>
           </w:p>
         </w:tc>
@@ -29279,12 +29665,12 @@
         <w:pStyle w:val="Heading2"/>
         <w:pageBreakBefore/>
       </w:pPr>
-      <w:bookmarkStart w:id="34" w:name="_Toc243165974"/>
+      <w:bookmarkStart w:id="35" w:name="_Toc243489485"/>
       <w:r>
         <w:lastRenderedPageBreak/>
         <w:t>5.2 Tanya jawab singkat</w:t>
       </w:r>
-      <w:bookmarkEnd w:id="34"/>
+      <w:bookmarkEnd w:id="35"/>
     </w:p>
     <w:tbl>
       <w:tblPr>

</xml_diff>

<commit_message>
Ringkasan keseluruhan: sebaran posisi hanya tahap yang berisi siswa
Co-Authored-By: Claude Opus 5.5 <noreply@anthropic.com>
</commit_message>
<xml_diff>
--- a/Panduan_Membaca_Data_English_Reading.docx
+++ b/Panduan_Membaca_Data_English_Reading.docx
@@ -191,7 +191,7 @@
           <w:r>
             <w:fldChar w:fldCharType="separate"/>
           </w:r>
-          <w:hyperlink w:anchor="_Toc243489450" w:history="1">
+          <w:hyperlink w:anchor="_Toc243499926" w:history="1">
             <w:r>
               <w:rPr>
                 <w:rStyle w:val="Hyperlink"/>
@@ -215,7 +215,7 @@
               <w:rPr>
                 <w:noProof/>
               </w:rPr>
-              <w:instrText xml:space="preserve"> PAGEREF _Toc243489450 \h </w:instrText>
+              <w:instrText xml:space="preserve"> PAGEREF _Toc243499926 \h </w:instrText>
             </w:r>
             <w:r>
               <w:rPr>
@@ -255,7 +255,7 @@
               <w:szCs w:val="22"/>
             </w:rPr>
           </w:pPr>
-          <w:hyperlink w:anchor="_Toc243489451" w:history="1">
+          <w:hyperlink w:anchor="_Toc243499927" w:history="1">
             <w:r>
               <w:rPr>
                 <w:rStyle w:val="Hyperlink"/>
@@ -279,7 +279,7 @@
               <w:rPr>
                 <w:noProof/>
               </w:rPr>
-              <w:instrText xml:space="preserve"> PAGEREF _Toc243489451 \h </w:instrText>
+              <w:instrText xml:space="preserve"> PAGEREF _Toc243499927 \h </w:instrText>
             </w:r>
             <w:r>
               <w:rPr>
@@ -319,7 +319,7 @@
               <w:szCs w:val="22"/>
             </w:rPr>
           </w:pPr>
-          <w:hyperlink w:anchor="_Toc243489452" w:history="1">
+          <w:hyperlink w:anchor="_Toc243499928" w:history="1">
             <w:r>
               <w:rPr>
                 <w:rStyle w:val="Hyperlink"/>
@@ -343,7 +343,7 @@
               <w:rPr>
                 <w:noProof/>
               </w:rPr>
-              <w:instrText xml:space="preserve"> PAGEREF _Toc243489452 \h </w:instrText>
+              <w:instrText xml:space="preserve"> PAGEREF _Toc243499928 \h </w:instrText>
             </w:r>
             <w:r>
               <w:rPr>
@@ -383,7 +383,7 @@
               <w:szCs w:val="22"/>
             </w:rPr>
           </w:pPr>
-          <w:hyperlink w:anchor="_Toc243489453" w:history="1">
+          <w:hyperlink w:anchor="_Toc243499929" w:history="1">
             <w:r>
               <w:rPr>
                 <w:rStyle w:val="Hyperlink"/>
@@ -407,7 +407,7 @@
               <w:rPr>
                 <w:noProof/>
               </w:rPr>
-              <w:instrText xml:space="preserve"> PAGEREF _Toc243489453 \h </w:instrText>
+              <w:instrText xml:space="preserve"> PAGEREF _Toc243499929 \h </w:instrText>
             </w:r>
             <w:r>
               <w:rPr>
@@ -447,7 +447,7 @@
               <w:szCs w:val="22"/>
             </w:rPr>
           </w:pPr>
-          <w:hyperlink w:anchor="_Toc243489454" w:history="1">
+          <w:hyperlink w:anchor="_Toc243499930" w:history="1">
             <w:r>
               <w:rPr>
                 <w:rStyle w:val="Hyperlink"/>
@@ -471,7 +471,7 @@
               <w:rPr>
                 <w:noProof/>
               </w:rPr>
-              <w:instrText xml:space="preserve"> PAGEREF _Toc243489454 \h </w:instrText>
+              <w:instrText xml:space="preserve"> PAGEREF _Toc243499930 \h </w:instrText>
             </w:r>
             <w:r>
               <w:rPr>
@@ -511,7 +511,7 @@
               <w:szCs w:val="22"/>
             </w:rPr>
           </w:pPr>
-          <w:hyperlink w:anchor="_Toc243489455" w:history="1">
+          <w:hyperlink w:anchor="_Toc243499931" w:history="1">
             <w:r>
               <w:rPr>
                 <w:rStyle w:val="Hyperlink"/>
@@ -535,7 +535,7 @@
               <w:rPr>
                 <w:noProof/>
               </w:rPr>
-              <w:instrText xml:space="preserve"> PAGEREF _Toc243489455 \h </w:instrText>
+              <w:instrText xml:space="preserve"> PAGEREF _Toc243499931 \h </w:instrText>
             </w:r>
             <w:r>
               <w:rPr>
@@ -575,7 +575,7 @@
               <w:szCs w:val="22"/>
             </w:rPr>
           </w:pPr>
-          <w:hyperlink w:anchor="_Toc243489456" w:history="1">
+          <w:hyperlink w:anchor="_Toc243499932" w:history="1">
             <w:r>
               <w:rPr>
                 <w:rStyle w:val="Hyperlink"/>
@@ -599,7 +599,7 @@
               <w:rPr>
                 <w:noProof/>
               </w:rPr>
-              <w:instrText xml:space="preserve"> PAGEREF _Toc243489456 \h </w:instrText>
+              <w:instrText xml:space="preserve"> PAGEREF _Toc243499932 \h </w:instrText>
             </w:r>
             <w:r>
               <w:rPr>
@@ -639,7 +639,7 @@
               <w:szCs w:val="22"/>
             </w:rPr>
           </w:pPr>
-          <w:hyperlink w:anchor="_Toc243489457" w:history="1">
+          <w:hyperlink w:anchor="_Toc243499933" w:history="1">
             <w:r>
               <w:rPr>
                 <w:rStyle w:val="Hyperlink"/>
@@ -663,7 +663,7 @@
               <w:rPr>
                 <w:noProof/>
               </w:rPr>
-              <w:instrText xml:space="preserve"> PAGEREF _Toc243489457 \h </w:instrText>
+              <w:instrText xml:space="preserve"> PAGEREF _Toc243499933 \h </w:instrText>
             </w:r>
             <w:r>
               <w:rPr>
@@ -703,7 +703,7 @@
               <w:szCs w:val="22"/>
             </w:rPr>
           </w:pPr>
-          <w:hyperlink w:anchor="_Toc243489458" w:history="1">
+          <w:hyperlink w:anchor="_Toc243499934" w:history="1">
             <w:r>
               <w:rPr>
                 <w:rStyle w:val="Hyperlink"/>
@@ -727,7 +727,7 @@
               <w:rPr>
                 <w:noProof/>
               </w:rPr>
-              <w:instrText xml:space="preserve"> PAGEREF _Toc243489458 \h </w:instrText>
+              <w:instrText xml:space="preserve"> PAGEREF _Toc243499934 \h </w:instrText>
             </w:r>
             <w:r>
               <w:rPr>
@@ -767,7 +767,7 @@
               <w:szCs w:val="22"/>
             </w:rPr>
           </w:pPr>
-          <w:hyperlink w:anchor="_Toc243489459" w:history="1">
+          <w:hyperlink w:anchor="_Toc243499935" w:history="1">
             <w:r>
               <w:rPr>
                 <w:rStyle w:val="Hyperlink"/>
@@ -791,7 +791,7 @@
               <w:rPr>
                 <w:noProof/>
               </w:rPr>
-              <w:instrText xml:space="preserve"> PAGEREF _Toc243489459 \h </w:instrText>
+              <w:instrText xml:space="preserve"> PAGEREF _Toc243499935 \h </w:instrText>
             </w:r>
             <w:r>
               <w:rPr>
@@ -831,7 +831,7 @@
               <w:szCs w:val="22"/>
             </w:rPr>
           </w:pPr>
-          <w:hyperlink w:anchor="_Toc243489460" w:history="1">
+          <w:hyperlink w:anchor="_Toc243499936" w:history="1">
             <w:r>
               <w:rPr>
                 <w:rStyle w:val="Hyperlink"/>
@@ -855,7 +855,7 @@
               <w:rPr>
                 <w:noProof/>
               </w:rPr>
-              <w:instrText xml:space="preserve"> PAGEREF _Toc243489460 \h </w:instrText>
+              <w:instrText xml:space="preserve"> PAGEREF _Toc243499936 \h </w:instrText>
             </w:r>
             <w:r>
               <w:rPr>
@@ -895,7 +895,7 @@
               <w:szCs w:val="22"/>
             </w:rPr>
           </w:pPr>
-          <w:hyperlink w:anchor="_Toc243489461" w:history="1">
+          <w:hyperlink w:anchor="_Toc243499937" w:history="1">
             <w:r>
               <w:rPr>
                 <w:rStyle w:val="Hyperlink"/>
@@ -919,7 +919,7 @@
               <w:rPr>
                 <w:noProof/>
               </w:rPr>
-              <w:instrText xml:space="preserve"> PAGEREF _Toc243489461 \h </w:instrText>
+              <w:instrText xml:space="preserve"> PAGEREF _Toc243499937 \h </w:instrText>
             </w:r>
             <w:r>
               <w:rPr>
@@ -959,7 +959,7 @@
               <w:szCs w:val="22"/>
             </w:rPr>
           </w:pPr>
-          <w:hyperlink w:anchor="_Toc243489462" w:history="1">
+          <w:hyperlink w:anchor="_Toc243499938" w:history="1">
             <w:r>
               <w:rPr>
                 <w:rStyle w:val="Hyperlink"/>
@@ -983,7 +983,7 @@
               <w:rPr>
                 <w:noProof/>
               </w:rPr>
-              <w:instrText xml:space="preserve"> PAGEREF _Toc243489462 \h </w:instrText>
+              <w:instrText xml:space="preserve"> PAGEREF _Toc243499938 \h </w:instrText>
             </w:r>
             <w:r>
               <w:rPr>
@@ -1023,7 +1023,7 @@
               <w:szCs w:val="22"/>
             </w:rPr>
           </w:pPr>
-          <w:hyperlink w:anchor="_Toc243489463" w:history="1">
+          <w:hyperlink w:anchor="_Toc243499939" w:history="1">
             <w:r>
               <w:rPr>
                 <w:rStyle w:val="Hyperlink"/>
@@ -1047,7 +1047,7 @@
               <w:rPr>
                 <w:noProof/>
               </w:rPr>
-              <w:instrText xml:space="preserve"> PAGEREF _Toc243489463 \h </w:instrText>
+              <w:instrText xml:space="preserve"> PAGEREF _Toc243499939 \h </w:instrText>
             </w:r>
             <w:r>
               <w:rPr>
@@ -1087,7 +1087,7 @@
               <w:szCs w:val="22"/>
             </w:rPr>
           </w:pPr>
-          <w:hyperlink w:anchor="_Toc243489464" w:history="1">
+          <w:hyperlink w:anchor="_Toc243499940" w:history="1">
             <w:r>
               <w:rPr>
                 <w:rStyle w:val="Hyperlink"/>
@@ -1111,7 +1111,7 @@
               <w:rPr>
                 <w:noProof/>
               </w:rPr>
-              <w:instrText xml:space="preserve"> PAGEREF _Toc243489464 \h </w:instrText>
+              <w:instrText xml:space="preserve"> PAGEREF _Toc243499940 \h </w:instrText>
             </w:r>
             <w:r>
               <w:rPr>
@@ -1151,7 +1151,7 @@
               <w:szCs w:val="22"/>
             </w:rPr>
           </w:pPr>
-          <w:hyperlink w:anchor="_Toc243489465" w:history="1">
+          <w:hyperlink w:anchor="_Toc243499941" w:history="1">
             <w:r>
               <w:rPr>
                 <w:rStyle w:val="Hyperlink"/>
@@ -1175,7 +1175,7 @@
               <w:rPr>
                 <w:noProof/>
               </w:rPr>
-              <w:instrText xml:space="preserve"> PAGEREF _Toc243489465 \h </w:instrText>
+              <w:instrText xml:space="preserve"> PAGEREF _Toc243499941 \h </w:instrText>
             </w:r>
             <w:r>
               <w:rPr>
@@ -1215,7 +1215,7 @@
               <w:szCs w:val="22"/>
             </w:rPr>
           </w:pPr>
-          <w:hyperlink w:anchor="_Toc243489466" w:history="1">
+          <w:hyperlink w:anchor="_Toc243499942" w:history="1">
             <w:r>
               <w:rPr>
                 <w:rStyle w:val="Hyperlink"/>
@@ -1239,7 +1239,7 @@
               <w:rPr>
                 <w:noProof/>
               </w:rPr>
-              <w:instrText xml:space="preserve"> PAGEREF _Toc243489466 \h </w:instrText>
+              <w:instrText xml:space="preserve"> PAGEREF _Toc243499942 \h </w:instrText>
             </w:r>
             <w:r>
               <w:rPr>
@@ -1279,7 +1279,7 @@
               <w:szCs w:val="22"/>
             </w:rPr>
           </w:pPr>
-          <w:hyperlink w:anchor="_Toc243489467" w:history="1">
+          <w:hyperlink w:anchor="_Toc243499943" w:history="1">
             <w:r>
               <w:rPr>
                 <w:rStyle w:val="Hyperlink"/>
@@ -1303,7 +1303,7 @@
               <w:rPr>
                 <w:noProof/>
               </w:rPr>
-              <w:instrText xml:space="preserve"> PAGEREF _Toc243489467 \h </w:instrText>
+              <w:instrText xml:space="preserve"> PAGEREF _Toc243499943 \h </w:instrText>
             </w:r>
             <w:r>
               <w:rPr>
@@ -1343,7 +1343,7 @@
               <w:szCs w:val="22"/>
             </w:rPr>
           </w:pPr>
-          <w:hyperlink w:anchor="_Toc243489468" w:history="1">
+          <w:hyperlink w:anchor="_Toc243499944" w:history="1">
             <w:r>
               <w:rPr>
                 <w:rStyle w:val="Hyperlink"/>
@@ -1367,7 +1367,7 @@
               <w:rPr>
                 <w:noProof/>
               </w:rPr>
-              <w:instrText xml:space="preserve"> PAGEREF _Toc243489468 \h </w:instrText>
+              <w:instrText xml:space="preserve"> PAGEREF _Toc243499944 \h </w:instrText>
             </w:r>
             <w:r>
               <w:rPr>
@@ -1407,7 +1407,7 @@
               <w:szCs w:val="22"/>
             </w:rPr>
           </w:pPr>
-          <w:hyperlink w:anchor="_Toc243489469" w:history="1">
+          <w:hyperlink w:anchor="_Toc243499945" w:history="1">
             <w:r>
               <w:rPr>
                 <w:rStyle w:val="Hyperlink"/>
@@ -1431,7 +1431,7 @@
               <w:rPr>
                 <w:noProof/>
               </w:rPr>
-              <w:instrText xml:space="preserve"> PAGEREF _Toc243489469 \h </w:instrText>
+              <w:instrText xml:space="preserve"> PAGEREF _Toc243499945 \h </w:instrText>
             </w:r>
             <w:r>
               <w:rPr>
@@ -1471,7 +1471,7 @@
               <w:szCs w:val="22"/>
             </w:rPr>
           </w:pPr>
-          <w:hyperlink w:anchor="_Toc243489470" w:history="1">
+          <w:hyperlink w:anchor="_Toc243499946" w:history="1">
             <w:r>
               <w:rPr>
                 <w:rStyle w:val="Hyperlink"/>
@@ -1495,7 +1495,7 @@
               <w:rPr>
                 <w:noProof/>
               </w:rPr>
-              <w:instrText xml:space="preserve"> PAGEREF _Toc243489470 \h </w:instrText>
+              <w:instrText xml:space="preserve"> PAGEREF _Toc243499946 \h </w:instrText>
             </w:r>
             <w:r>
               <w:rPr>
@@ -1535,7 +1535,7 @@
               <w:szCs w:val="22"/>
             </w:rPr>
           </w:pPr>
-          <w:hyperlink w:anchor="_Toc243489471" w:history="1">
+          <w:hyperlink w:anchor="_Toc243499947" w:history="1">
             <w:r>
               <w:rPr>
                 <w:rStyle w:val="Hyperlink"/>
@@ -1559,7 +1559,7 @@
               <w:rPr>
                 <w:noProof/>
               </w:rPr>
-              <w:instrText xml:space="preserve"> PAGEREF _Toc243489471 \h </w:instrText>
+              <w:instrText xml:space="preserve"> PAGEREF _Toc243499947 \h </w:instrText>
             </w:r>
             <w:r>
               <w:rPr>
@@ -1599,7 +1599,7 @@
               <w:szCs w:val="22"/>
             </w:rPr>
           </w:pPr>
-          <w:hyperlink w:anchor="_Toc243489472" w:history="1">
+          <w:hyperlink w:anchor="_Toc243499948" w:history="1">
             <w:r>
               <w:rPr>
                 <w:rStyle w:val="Hyperlink"/>
@@ -1623,7 +1623,7 @@
               <w:rPr>
                 <w:noProof/>
               </w:rPr>
-              <w:instrText xml:space="preserve"> PAGEREF _Toc243489472 \h </w:instrText>
+              <w:instrText xml:space="preserve"> PAGEREF _Toc243499948 \h </w:instrText>
             </w:r>
             <w:r>
               <w:rPr>
@@ -1663,7 +1663,7 @@
               <w:szCs w:val="22"/>
             </w:rPr>
           </w:pPr>
-          <w:hyperlink w:anchor="_Toc243489473" w:history="1">
+          <w:hyperlink w:anchor="_Toc243499949" w:history="1">
             <w:r>
               <w:rPr>
                 <w:rStyle w:val="Hyperlink"/>
@@ -1687,7 +1687,7 @@
               <w:rPr>
                 <w:noProof/>
               </w:rPr>
-              <w:instrText xml:space="preserve"> PAGEREF _Toc243489473 \h </w:instrText>
+              <w:instrText xml:space="preserve"> PAGEREF _Toc243499949 \h </w:instrText>
             </w:r>
             <w:r>
               <w:rPr>
@@ -1727,7 +1727,7 @@
               <w:szCs w:val="22"/>
             </w:rPr>
           </w:pPr>
-          <w:hyperlink w:anchor="_Toc243489474" w:history="1">
+          <w:hyperlink w:anchor="_Toc243499950" w:history="1">
             <w:r>
               <w:rPr>
                 <w:rStyle w:val="Hyperlink"/>
@@ -1751,7 +1751,7 @@
               <w:rPr>
                 <w:noProof/>
               </w:rPr>
-              <w:instrText xml:space="preserve"> PAGEREF _Toc243489474 \h </w:instrText>
+              <w:instrText xml:space="preserve"> PAGEREF _Toc243499950 \h </w:instrText>
             </w:r>
             <w:r>
               <w:rPr>
@@ -1791,7 +1791,7 @@
               <w:szCs w:val="22"/>
             </w:rPr>
           </w:pPr>
-          <w:hyperlink w:anchor="_Toc243489475" w:history="1">
+          <w:hyperlink w:anchor="_Toc243499951" w:history="1">
             <w:r>
               <w:rPr>
                 <w:rStyle w:val="Hyperlink"/>
@@ -1815,7 +1815,7 @@
               <w:rPr>
                 <w:noProof/>
               </w:rPr>
-              <w:instrText xml:space="preserve"> PAGEREF _Toc243489475 \h </w:instrText>
+              <w:instrText xml:space="preserve"> PAGEREF _Toc243499951 \h </w:instrText>
             </w:r>
             <w:r>
               <w:rPr>
@@ -1855,7 +1855,7 @@
               <w:szCs w:val="22"/>
             </w:rPr>
           </w:pPr>
-          <w:hyperlink w:anchor="_Toc243489476" w:history="1">
+          <w:hyperlink w:anchor="_Toc243499952" w:history="1">
             <w:r>
               <w:rPr>
                 <w:rStyle w:val="Hyperlink"/>
@@ -1879,7 +1879,7 @@
               <w:rPr>
                 <w:noProof/>
               </w:rPr>
-              <w:instrText xml:space="preserve"> PAGEREF _Toc243489476 \h </w:instrText>
+              <w:instrText xml:space="preserve"> PAGEREF _Toc243499952 \h </w:instrText>
             </w:r>
             <w:r>
               <w:rPr>
@@ -1919,7 +1919,7 @@
               <w:szCs w:val="22"/>
             </w:rPr>
           </w:pPr>
-          <w:hyperlink w:anchor="_Toc243489477" w:history="1">
+          <w:hyperlink w:anchor="_Toc243499953" w:history="1">
             <w:r>
               <w:rPr>
                 <w:rStyle w:val="Hyperlink"/>
@@ -1943,7 +1943,7 @@
               <w:rPr>
                 <w:noProof/>
               </w:rPr>
-              <w:instrText xml:space="preserve"> PAGEREF _Toc243489477 \h </w:instrText>
+              <w:instrText xml:space="preserve"> PAGEREF _Toc243499953 \h </w:instrText>
             </w:r>
             <w:r>
               <w:rPr>
@@ -1983,7 +1983,7 @@
               <w:szCs w:val="22"/>
             </w:rPr>
           </w:pPr>
-          <w:hyperlink w:anchor="_Toc243489478" w:history="1">
+          <w:hyperlink w:anchor="_Toc243499954" w:history="1">
             <w:r>
               <w:rPr>
                 <w:rStyle w:val="Hyperlink"/>
@@ -2007,7 +2007,7 @@
               <w:rPr>
                 <w:noProof/>
               </w:rPr>
-              <w:instrText xml:space="preserve"> PAGEREF _Toc243489478 \h </w:instrText>
+              <w:instrText xml:space="preserve"> PAGEREF _Toc243499954 \h </w:instrText>
             </w:r>
             <w:r>
               <w:rPr>
@@ -2047,7 +2047,7 @@
               <w:szCs w:val="22"/>
             </w:rPr>
           </w:pPr>
-          <w:hyperlink w:anchor="_Toc243489479" w:history="1">
+          <w:hyperlink w:anchor="_Toc243499955" w:history="1">
             <w:r>
               <w:rPr>
                 <w:rStyle w:val="Hyperlink"/>
@@ -2071,7 +2071,7 @@
               <w:rPr>
                 <w:noProof/>
               </w:rPr>
-              <w:instrText xml:space="preserve"> PAGEREF _Toc243489479 \h </w:instrText>
+              <w:instrText xml:space="preserve"> PAGEREF _Toc243499955 \h </w:instrText>
             </w:r>
             <w:r>
               <w:rPr>
@@ -2111,7 +2111,7 @@
               <w:szCs w:val="22"/>
             </w:rPr>
           </w:pPr>
-          <w:hyperlink w:anchor="_Toc243489480" w:history="1">
+          <w:hyperlink w:anchor="_Toc243499956" w:history="1">
             <w:r>
               <w:rPr>
                 <w:rStyle w:val="Hyperlink"/>
@@ -2135,7 +2135,7 @@
               <w:rPr>
                 <w:noProof/>
               </w:rPr>
-              <w:instrText xml:space="preserve"> PAGEREF _Toc243489480 \h </w:instrText>
+              <w:instrText xml:space="preserve"> PAGEREF _Toc243499956 \h </w:instrText>
             </w:r>
             <w:r>
               <w:rPr>
@@ -2175,7 +2175,7 @@
               <w:szCs w:val="22"/>
             </w:rPr>
           </w:pPr>
-          <w:hyperlink w:anchor="_Toc243489481" w:history="1">
+          <w:hyperlink w:anchor="_Toc243499957" w:history="1">
             <w:r>
               <w:rPr>
                 <w:rStyle w:val="Hyperlink"/>
@@ -2199,7 +2199,7 @@
               <w:rPr>
                 <w:noProof/>
               </w:rPr>
-              <w:instrText xml:space="preserve"> PAGEREF _Toc243489481 \h </w:instrText>
+              <w:instrText xml:space="preserve"> PAGEREF _Toc243499957 \h </w:instrText>
             </w:r>
             <w:r>
               <w:rPr>
@@ -2239,7 +2239,7 @@
               <w:szCs w:val="22"/>
             </w:rPr>
           </w:pPr>
-          <w:hyperlink w:anchor="_Toc243489482" w:history="1">
+          <w:hyperlink w:anchor="_Toc243499958" w:history="1">
             <w:r>
               <w:rPr>
                 <w:rStyle w:val="Hyperlink"/>
@@ -2263,7 +2263,7 @@
               <w:rPr>
                 <w:noProof/>
               </w:rPr>
-              <w:instrText xml:space="preserve"> PAGEREF _Toc243489482 \h </w:instrText>
+              <w:instrText xml:space="preserve"> PAGEREF _Toc243499958 \h </w:instrText>
             </w:r>
             <w:r>
               <w:rPr>
@@ -2303,7 +2303,7 @@
               <w:szCs w:val="22"/>
             </w:rPr>
           </w:pPr>
-          <w:hyperlink w:anchor="_Toc243489483" w:history="1">
+          <w:hyperlink w:anchor="_Toc243499959" w:history="1">
             <w:r>
               <w:rPr>
                 <w:rStyle w:val="Hyperlink"/>
@@ -2327,7 +2327,7 @@
               <w:rPr>
                 <w:noProof/>
               </w:rPr>
-              <w:instrText xml:space="preserve"> PAGEREF _Toc243489483 \h </w:instrText>
+              <w:instrText xml:space="preserve"> PAGEREF _Toc243499959 \h </w:instrText>
             </w:r>
             <w:r>
               <w:rPr>
@@ -2367,7 +2367,7 @@
               <w:szCs w:val="22"/>
             </w:rPr>
           </w:pPr>
-          <w:hyperlink w:anchor="_Toc243489484" w:history="1">
+          <w:hyperlink w:anchor="_Toc243499960" w:history="1">
             <w:r>
               <w:rPr>
                 <w:rStyle w:val="Hyperlink"/>
@@ -2391,7 +2391,7 @@
               <w:rPr>
                 <w:noProof/>
               </w:rPr>
-              <w:instrText xml:space="preserve"> PAGEREF _Toc243489484 \h </w:instrText>
+              <w:instrText xml:space="preserve"> PAGEREF _Toc243499960 \h </w:instrText>
             </w:r>
             <w:r>
               <w:rPr>
@@ -2431,7 +2431,7 @@
               <w:szCs w:val="22"/>
             </w:rPr>
           </w:pPr>
-          <w:hyperlink w:anchor="_Toc243489485" w:history="1">
+          <w:hyperlink w:anchor="_Toc243499961" w:history="1">
             <w:r>
               <w:rPr>
                 <w:rStyle w:val="Hyperlink"/>
@@ -2455,7 +2455,7 @@
               <w:rPr>
                 <w:noProof/>
               </w:rPr>
-              <w:instrText xml:space="preserve"> PAGEREF _Toc243489485 \h </w:instrText>
+              <w:instrText xml:space="preserve"> PAGEREF _Toc243499961 \h </w:instrText>
             </w:r>
             <w:r>
               <w:rPr>
@@ -2494,7 +2494,7 @@
         <w:pStyle w:val="Heading1"/>
         <w:pageBreakBefore/>
       </w:pPr>
-      <w:bookmarkStart w:id="0" w:name="_Toc243489450"/>
+      <w:bookmarkStart w:id="0" w:name="_Toc243499926"/>
       <w:r>
         <w:lastRenderedPageBreak/>
         <w:t>1. Sebelum Mulai: Istilah Dasar</w:t>
@@ -2513,7 +2513,7 @@
       <w:pPr>
         <w:pStyle w:val="Heading2"/>
       </w:pPr>
-      <w:bookmarkStart w:id="1" w:name="_Toc243489451"/>
+      <w:bookmarkStart w:id="1" w:name="_Toc243499927"/>
       <w:r>
         <w:t>1.1 Susunan materi: Tahap, Level, dan Sub level</w:t>
       </w:r>
@@ -4001,7 +4001,7 @@
       <w:pPr>
         <w:pStyle w:val="Heading2"/>
       </w:pPr>
-      <w:bookmarkStart w:id="2" w:name="_Toc243489452"/>
+      <w:bookmarkStart w:id="2" w:name="_Toc243499928"/>
       <w:r>
         <w:t>1.2 Istilah kemajuan dan nilai</w:t>
       </w:r>
@@ -4943,7 +4943,7 @@
       <w:pPr>
         <w:pStyle w:val="Heading2"/>
       </w:pPr>
-      <w:bookmarkStart w:id="3" w:name="_Toc243489453"/>
+      <w:bookmarkStart w:id="3" w:name="_Toc243499929"/>
       <w:r>
         <w:t>1.3 Sesi kelas dan latihan mandiri</w:t>
       </w:r>
@@ -5648,7 +5648,7 @@
       <w:pPr>
         <w:pStyle w:val="Heading2"/>
       </w:pPr>
-      <w:bookmarkStart w:id="4" w:name="_Toc243489454"/>
+      <w:bookmarkStart w:id="4" w:name="_Toc243499930"/>
       <w:r>
         <w:t>1.4 Ukuran waktu "7 hari" dan "30 hari"</w:t>
       </w:r>
@@ -5770,7 +5770,7 @@
       <w:pPr>
         <w:pStyle w:val="Heading2"/>
       </w:pPr>
-      <w:bookmarkStart w:id="5" w:name="_Toc243489455"/>
+      <w:bookmarkStart w:id="5" w:name="_Toc243499931"/>
       <w:r>
         <w:t>1.5 Arti warna label</w:t>
       </w:r>
@@ -6475,7 +6475,7 @@
       <w:pPr>
         <w:pStyle w:val="Heading2"/>
       </w:pPr>
-      <w:bookmarkStart w:id="6" w:name="_Toc243489456"/>
+      <w:bookmarkStart w:id="6" w:name="_Toc243499932"/>
       <w:r>
         <w:t>1.6 Aturan dan tahapan: cara sistem memilih</w:t>
       </w:r>
@@ -7550,7 +7550,7 @@
         <w:pStyle w:val="Heading1"/>
         <w:pageBreakBefore/>
       </w:pPr>
-      <w:bookmarkStart w:id="7" w:name="_Toc243489457"/>
+      <w:bookmarkStart w:id="7" w:name="_Toc243499933"/>
       <w:r>
         <w:lastRenderedPageBreak/>
         <w:t>2. Tab Sesi Kegiatan</w:t>
@@ -7697,7 +7697,7 @@
       <w:pPr>
         <w:pStyle w:val="Heading2"/>
       </w:pPr>
-      <w:bookmarkStart w:id="8" w:name="_Toc243489458"/>
+      <w:bookmarkStart w:id="8" w:name="_Toc243499934"/>
       <w:r>
         <w:t>2.1 Bilah saringan</w:t>
       </w:r>
@@ -8197,7 +8197,7 @@
       <w:pPr>
         <w:pStyle w:val="Heading2"/>
       </w:pPr>
-      <w:bookmarkStart w:id="9" w:name="_Toc243489459"/>
+      <w:bookmarkStart w:id="9" w:name="_Toc243499935"/>
       <w:r>
         <w:t>2.2 Kartu Sesi latihan</w:t>
       </w:r>
@@ -9014,7 +9014,7 @@
       <w:pPr>
         <w:pStyle w:val="Heading2"/>
       </w:pPr>
-      <w:bookmarkStart w:id="10" w:name="_Toc243489460"/>
+      <w:bookmarkStart w:id="10" w:name="_Toc243499936"/>
       <w:r>
         <w:t>2.3 Kotak Aturan dan tahapan yang berlaku</w:t>
       </w:r>
@@ -9367,7 +9367,7 @@
       <w:pPr>
         <w:pStyle w:val="Heading2"/>
       </w:pPr>
-      <w:bookmarkStart w:id="11" w:name="_Toc243489461"/>
+      <w:bookmarkStart w:id="11" w:name="_Toc243499937"/>
       <w:r>
         <w:t>2.4 Enam kotak ringkasan</w:t>
       </w:r>
@@ -10499,7 +10499,7 @@
       <w:pPr>
         <w:pStyle w:val="Heading2"/>
       </w:pPr>
-      <w:bookmarkStart w:id="12" w:name="_Toc243489462"/>
+      <w:bookmarkStart w:id="12" w:name="_Toc243499938"/>
       <w:r>
         <w:t>2.5 Tabel siswa</w:t>
       </w:r>
@@ -11064,7 +11064,7 @@
       <w:pPr>
         <w:pStyle w:val="Heading2"/>
       </w:pPr>
-      <w:bookmarkStart w:id="13" w:name="_Toc243489463"/>
+      <w:bookmarkStart w:id="13" w:name="_Toc243499939"/>
       <w:r>
         <w:t>2.6 Arti kolom Status</w:t>
       </w:r>
@@ -12080,7 +12080,7 @@
       <w:pPr>
         <w:pStyle w:val="Heading2"/>
       </w:pPr>
-      <w:bookmarkStart w:id="14" w:name="_Toc243489464"/>
+      <w:bookmarkStart w:id="14" w:name="_Toc243499940"/>
       <w:r>
         <w:t>2.7 Bilah aksi untuk siswa terpilih</w:t>
       </w:r>
@@ -12508,7 +12508,7 @@
         <w:pStyle w:val="Heading1"/>
         <w:pageBreakBefore/>
       </w:pPr>
-      <w:bookmarkStart w:id="15" w:name="_Toc243489465"/>
+      <w:bookmarkStart w:id="15" w:name="_Toc243499941"/>
       <w:r>
         <w:lastRenderedPageBreak/>
         <w:t>3. Tab Perkembangan Siswa</w:t>
@@ -12558,14 +12558,7 @@
           <w:b/>
           <w:bCs/>
         </w:rPr>
-        <w:t>Re</w:t>
-      </w:r>
-      <w:r>
-        <w:rPr>
-          <w:b/>
-          <w:bCs/>
-        </w:rPr>
-        <w:t>kapitulasi</w:t>
+        <w:t>Rekapitulasi</w:t>
       </w:r>
       <w:r>
         <w:t xml:space="preserve"> (terbuka lebih dulu; di bagian bawahnya ada </w:t>
@@ -12605,7 +12598,7 @@
       <w:pPr>
         <w:pStyle w:val="Heading2"/>
       </w:pPr>
-      <w:bookmarkStart w:id="16" w:name="_Toc243489466"/>
+      <w:bookmarkStart w:id="16" w:name="_Toc243499942"/>
       <w:r>
         <w:t>3.1 Sub-tab Rekapitulasi</w:t>
       </w:r>
@@ -12898,7 +12891,7 @@
       <w:pPr>
         <w:pStyle w:val="Heading2"/>
       </w:pPr>
-      <w:bookmarkStart w:id="17" w:name="_Toc243489467"/>
+      <w:bookmarkStart w:id="17" w:name="_Toc243499943"/>
       <w:r>
         <w:lastRenderedPageBreak/>
         <w:t>3.2 Sub-tab Per Siswa</w:t>
@@ -16090,7 +16083,7 @@
       <w:pPr>
         <w:pStyle w:val="Heading2"/>
       </w:pPr>
-      <w:bookmarkStart w:id="18" w:name="_Toc243489468"/>
+      <w:bookmarkStart w:id="18" w:name="_Toc243499944"/>
       <w:r>
         <w:t>3.3 Ringkasan keseluruhan (bagian bawah Rekapitulasi)</w:t>
       </w:r>
@@ -16121,10 +16114,7 @@
         <w:t>Ringkasan keseluruhan</w:t>
       </w:r>
       <w:r>
-        <w:t>. Angka di bagian ini dihitung sejak awal latihan dan tidak mengikuti pilihan periode di atasnya. Mengetuk baris pada tabel perb</w:t>
-      </w:r>
-      <w:r>
-        <w:t>andingan rombel membuka rapor rombel itu di Rekapitulasi.</w:t>
+        <w:t>. Angka di bagian ini dihitung sejak awal latihan dan tidak mengikuti pilihan periode di atasnya. Mengetuk baris pada tabel perbandingan rombel membuka rapor rombel itu di Rekapitulasi.</w:t>
       </w:r>
     </w:p>
     <w:p>
@@ -16989,7 +16979,7 @@
         <w:t>banyak siswa yang sedang berada di tahap itu</w:t>
       </w:r>
       <w:r>
-        <w:t>. Bila ada, ditambah batang "Tamat semua tahap". Di bawah grafik tertulis berapa siswa yang belum mulai.</w:t>
+        <w:t>. Bila ada, ditambah batang "Tamat semua tahap". Di bawah grafik tertulis berapa siswa yang belum mulai. Hanya tahap yang berisi siswa (ditambah satu tahap sebelum dan sesudahnya) yang ditampilkan; jumlah tahap lain yang kosong disebut di catatan bawah grafik.</w:t>
       </w:r>
     </w:p>
     <w:p>
@@ -17798,7 +17788,7 @@
       <w:pPr>
         <w:pStyle w:val="Heading2"/>
       </w:pPr>
-      <w:bookmarkStart w:id="19" w:name="_Toc243489469"/>
+      <w:bookmarkStart w:id="19" w:name="_Toc243499945"/>
       <w:r>
         <w:lastRenderedPageBreak/>
         <w:t>3.4 Sub-tab Peringkat</w:t>
@@ -21546,7 +21536,7 @@
         <w:pStyle w:val="Heading1"/>
         <w:pageBreakBefore/>
       </w:pPr>
-      <w:bookmarkStart w:id="20" w:name="_Toc243489470"/>
+      <w:bookmarkStart w:id="20" w:name="_Toc243499946"/>
       <w:r>
         <w:lastRenderedPageBreak/>
         <w:t>4. Tab Analisis Siswa</w:t>
@@ -22917,7 +22907,7 @@
       <w:pPr>
         <w:pStyle w:val="Heading2"/>
       </w:pPr>
-      <w:bookmarkStart w:id="21" w:name="_Toc243489471"/>
+      <w:bookmarkStart w:id="21" w:name="_Toc243499947"/>
       <w:r>
         <w:t>4.1 Kartu identitas</w:t>
       </w:r>
@@ -22965,7 +22955,7 @@
       <w:pPr>
         <w:pStyle w:val="Heading2"/>
       </w:pPr>
-      <w:bookmarkStart w:id="22" w:name="_Toc243489472"/>
+      <w:bookmarkStart w:id="22" w:name="_Toc243499948"/>
       <w:r>
         <w:t>4.2 Enam kotak ringkasan</w:t>
       </w:r>
@@ -23993,7 +23983,7 @@
       <w:pPr>
         <w:pStyle w:val="Heading2"/>
       </w:pPr>
-      <w:bookmarkStart w:id="23" w:name="_Toc243489473"/>
+      <w:bookmarkStart w:id="23" w:name="_Toc243499949"/>
       <w:r>
         <w:t>4.3 Kotak terkunci dan Aturan yang berlaku</w:t>
       </w:r>
@@ -24191,7 +24181,7 @@
       <w:pPr>
         <w:pStyle w:val="Heading2"/>
       </w:pPr>
-      <w:bookmarkStart w:id="24" w:name="_Toc243489474"/>
+      <w:bookmarkStart w:id="24" w:name="_Toc243499950"/>
       <w:r>
         <w:t>4.4 Catatan otomatis</w:t>
       </w:r>
@@ -24863,7 +24853,7 @@
       <w:pPr>
         <w:pStyle w:val="Heading2"/>
       </w:pPr>
-      <w:bookmarkStart w:id="25" w:name="_Toc243489475"/>
+      <w:bookmarkStart w:id="25" w:name="_Toc243499951"/>
       <w:r>
         <w:lastRenderedPageBreak/>
         <w:t>4.5 Riwayat semester (arsip)</w:t>
@@ -24962,7 +24952,7 @@
       <w:pPr>
         <w:pStyle w:val="Heading2"/>
       </w:pPr>
-      <w:bookmarkStart w:id="26" w:name="_Toc243489476"/>
+      <w:bookmarkStart w:id="26" w:name="_Toc243499952"/>
       <w:r>
         <w:t>4.6 Kartu Latihan mandiri (di luar sesi)</w:t>
       </w:r>
@@ -25488,7 +25478,7 @@
       <w:pPr>
         <w:pStyle w:val="Heading2"/>
       </w:pPr>
-      <w:bookmarkStart w:id="27" w:name="_Toc243489477"/>
+      <w:bookmarkStart w:id="27" w:name="_Toc243499953"/>
       <w:r>
         <w:t>4.7 Grafik Kemajuan sub level lulus</w:t>
       </w:r>
@@ -25874,7 +25864,7 @@
       <w:pPr>
         <w:pStyle w:val="Heading2"/>
       </w:pPr>
-      <w:bookmarkStart w:id="28" w:name="_Toc243489478"/>
+      <w:bookmarkStart w:id="28" w:name="_Toc243499954"/>
       <w:r>
         <w:t>4.8 Kegiatan per jenis</w:t>
       </w:r>
@@ -26842,7 +26832,7 @@
       <w:pPr>
         <w:pStyle w:val="Heading2"/>
       </w:pPr>
-      <w:bookmarkStart w:id="29" w:name="_Toc243489479"/>
+      <w:bookmarkStart w:id="29" w:name="_Toc243499955"/>
       <w:r>
         <w:t>4.9 Per tahap</w:t>
       </w:r>
@@ -27210,7 +27200,7 @@
       <w:pPr>
         <w:pStyle w:val="Heading2"/>
       </w:pPr>
-      <w:bookmarkStart w:id="30" w:name="_Toc243489480"/>
+      <w:bookmarkStart w:id="30" w:name="_Toc243499956"/>
       <w:r>
         <w:t>4.10 Hasil di bawah 80% terakhir</w:t>
       </w:r>
@@ -27740,7 +27730,7 @@
       <w:pPr>
         <w:pStyle w:val="Heading2"/>
       </w:pPr>
-      <w:bookmarkStart w:id="31" w:name="_Toc243489481"/>
+      <w:bookmarkStart w:id="31" w:name="_Toc243499957"/>
       <w:r>
         <w:t>4.11 Riwayat sub level lulus</w:t>
       </w:r>
@@ -28268,7 +28258,7 @@
       <w:pPr>
         <w:pStyle w:val="Heading2"/>
       </w:pPr>
-      <w:bookmarkStart w:id="32" w:name="_Toc243489482"/>
+      <w:bookmarkStart w:id="32" w:name="_Toc243499958"/>
       <w:r>
         <w:t>4.12 Aturan dan tahapan siswa ini, Hapus data latihan</w:t>
       </w:r>
@@ -28458,7 +28448,7 @@
         <w:pStyle w:val="Heading1"/>
         <w:pageBreakBefore/>
       </w:pPr>
-      <w:bookmarkStart w:id="33" w:name="_Toc243489483"/>
+      <w:bookmarkStart w:id="33" w:name="_Toc243499959"/>
       <w:r>
         <w:lastRenderedPageBreak/>
         <w:t>5. Dari Data ke Tindakan</w:t>
@@ -28469,7 +28459,7 @@
       <w:pPr>
         <w:pStyle w:val="Heading2"/>
       </w:pPr>
-      <w:bookmarkStart w:id="34" w:name="_Toc243489484"/>
+      <w:bookmarkStart w:id="34" w:name="_Toc243499960"/>
       <w:r>
         <w:t>5.1 Situasi umum dan tindakan</w:t>
       </w:r>
@@ -29665,7 +29655,7 @@
         <w:pStyle w:val="Heading2"/>
         <w:pageBreakBefore/>
       </w:pPr>
-      <w:bookmarkStart w:id="35" w:name="_Toc243489485"/>
+      <w:bookmarkStart w:id="35" w:name="_Toc243499961"/>
       <w:r>
         <w:lastRenderedPageBreak/>
         <w:t>5.2 Tanya jawab singkat</w:t>

</xml_diff>

<commit_message>
Panduan: bab 6 Bila Siswa Gagal Merekam Suara
Co-Authored-By: Claude Opus 5.5 <noreply@anthropic.com>
</commit_message>
<xml_diff>
--- a/Panduan_Membaca_Data_English_Reading.docx
+++ b/Panduan_Membaca_Data_English_Reading.docx
@@ -191,7 +191,7 @@
           <w:r>
             <w:fldChar w:fldCharType="separate"/>
           </w:r>
-          <w:hyperlink w:anchor="_Toc243499926" w:history="1">
+          <w:hyperlink w:anchor="_Toc244345566" w:history="1">
             <w:r>
               <w:rPr>
                 <w:rStyle w:val="Hyperlink"/>
@@ -215,7 +215,7 @@
               <w:rPr>
                 <w:noProof/>
               </w:rPr>
-              <w:instrText xml:space="preserve"> PAGEREF _Toc243499926 \h </w:instrText>
+              <w:instrText xml:space="preserve"> PAGEREF _Toc244345566 \h </w:instrText>
             </w:r>
             <w:r>
               <w:rPr>
@@ -232,7 +232,7 @@
               <w:rPr>
                 <w:noProof/>
               </w:rPr>
-              <w:t>3</w:t>
+              <w:t>4</w:t>
             </w:r>
             <w:r>
               <w:rPr>
@@ -255,7 +255,7 @@
               <w:szCs w:val="22"/>
             </w:rPr>
           </w:pPr>
-          <w:hyperlink w:anchor="_Toc243499927" w:history="1">
+          <w:hyperlink w:anchor="_Toc244345567" w:history="1">
             <w:r>
               <w:rPr>
                 <w:rStyle w:val="Hyperlink"/>
@@ -279,7 +279,7 @@
               <w:rPr>
                 <w:noProof/>
               </w:rPr>
-              <w:instrText xml:space="preserve"> PAGEREF _Toc243499927 \h </w:instrText>
+              <w:instrText xml:space="preserve"> PAGEREF _Toc244345567 \h </w:instrText>
             </w:r>
             <w:r>
               <w:rPr>
@@ -296,7 +296,7 @@
               <w:rPr>
                 <w:noProof/>
               </w:rPr>
-              <w:t>3</w:t>
+              <w:t>4</w:t>
             </w:r>
             <w:r>
               <w:rPr>
@@ -319,7 +319,7 @@
               <w:szCs w:val="22"/>
             </w:rPr>
           </w:pPr>
-          <w:hyperlink w:anchor="_Toc243499928" w:history="1">
+          <w:hyperlink w:anchor="_Toc244345568" w:history="1">
             <w:r>
               <w:rPr>
                 <w:rStyle w:val="Hyperlink"/>
@@ -343,7 +343,7 @@
               <w:rPr>
                 <w:noProof/>
               </w:rPr>
-              <w:instrText xml:space="preserve"> PAGEREF _Toc243499928 \h </w:instrText>
+              <w:instrText xml:space="preserve"> PAGEREF _Toc244345568 \h </w:instrText>
             </w:r>
             <w:r>
               <w:rPr>
@@ -360,7 +360,7 @@
               <w:rPr>
                 <w:noProof/>
               </w:rPr>
-              <w:t>3</w:t>
+              <w:t>4</w:t>
             </w:r>
             <w:r>
               <w:rPr>
@@ -383,7 +383,7 @@
               <w:szCs w:val="22"/>
             </w:rPr>
           </w:pPr>
-          <w:hyperlink w:anchor="_Toc243499929" w:history="1">
+          <w:hyperlink w:anchor="_Toc244345569" w:history="1">
             <w:r>
               <w:rPr>
                 <w:rStyle w:val="Hyperlink"/>
@@ -407,7 +407,7 @@
               <w:rPr>
                 <w:noProof/>
               </w:rPr>
-              <w:instrText xml:space="preserve"> PAGEREF _Toc243499929 \h </w:instrText>
+              <w:instrText xml:space="preserve"> PAGEREF _Toc244345569 \h </w:instrText>
             </w:r>
             <w:r>
               <w:rPr>
@@ -424,7 +424,7 @@
               <w:rPr>
                 <w:noProof/>
               </w:rPr>
-              <w:t>4</w:t>
+              <w:t>5</w:t>
             </w:r>
             <w:r>
               <w:rPr>
@@ -447,7 +447,7 @@
               <w:szCs w:val="22"/>
             </w:rPr>
           </w:pPr>
-          <w:hyperlink w:anchor="_Toc243499930" w:history="1">
+          <w:hyperlink w:anchor="_Toc244345570" w:history="1">
             <w:r>
               <w:rPr>
                 <w:rStyle w:val="Hyperlink"/>
@@ -471,7 +471,7 @@
               <w:rPr>
                 <w:noProof/>
               </w:rPr>
-              <w:instrText xml:space="preserve"> PAGEREF _Toc243499930 \h </w:instrText>
+              <w:instrText xml:space="preserve"> PAGEREF _Toc244345570 \h </w:instrText>
             </w:r>
             <w:r>
               <w:rPr>
@@ -488,7 +488,7 @@
               <w:rPr>
                 <w:noProof/>
               </w:rPr>
-              <w:t>4</w:t>
+              <w:t>5</w:t>
             </w:r>
             <w:r>
               <w:rPr>
@@ -511,7 +511,7 @@
               <w:szCs w:val="22"/>
             </w:rPr>
           </w:pPr>
-          <w:hyperlink w:anchor="_Toc243499931" w:history="1">
+          <w:hyperlink w:anchor="_Toc244345571" w:history="1">
             <w:r>
               <w:rPr>
                 <w:rStyle w:val="Hyperlink"/>
@@ -535,7 +535,7 @@
               <w:rPr>
                 <w:noProof/>
               </w:rPr>
-              <w:instrText xml:space="preserve"> PAGEREF _Toc243499931 \h </w:instrText>
+              <w:instrText xml:space="preserve"> PAGEREF _Toc244345571 \h </w:instrText>
             </w:r>
             <w:r>
               <w:rPr>
@@ -552,7 +552,7 @@
               <w:rPr>
                 <w:noProof/>
               </w:rPr>
-              <w:t>5</w:t>
+              <w:t>6</w:t>
             </w:r>
             <w:r>
               <w:rPr>
@@ -575,7 +575,7 @@
               <w:szCs w:val="22"/>
             </w:rPr>
           </w:pPr>
-          <w:hyperlink w:anchor="_Toc243499932" w:history="1">
+          <w:hyperlink w:anchor="_Toc244345572" w:history="1">
             <w:r>
               <w:rPr>
                 <w:rStyle w:val="Hyperlink"/>
@@ -599,7 +599,7 @@
               <w:rPr>
                 <w:noProof/>
               </w:rPr>
-              <w:instrText xml:space="preserve"> PAGEREF _Toc243499932 \h </w:instrText>
+              <w:instrText xml:space="preserve"> PAGEREF _Toc244345572 \h </w:instrText>
             </w:r>
             <w:r>
               <w:rPr>
@@ -616,7 +616,7 @@
               <w:rPr>
                 <w:noProof/>
               </w:rPr>
-              <w:t>5</w:t>
+              <w:t>6</w:t>
             </w:r>
             <w:r>
               <w:rPr>
@@ -639,7 +639,7 @@
               <w:szCs w:val="22"/>
             </w:rPr>
           </w:pPr>
-          <w:hyperlink w:anchor="_Toc243499933" w:history="1">
+          <w:hyperlink w:anchor="_Toc244345573" w:history="1">
             <w:r>
               <w:rPr>
                 <w:rStyle w:val="Hyperlink"/>
@@ -663,7 +663,7 @@
               <w:rPr>
                 <w:noProof/>
               </w:rPr>
-              <w:instrText xml:space="preserve"> PAGEREF _Toc243499933 \h </w:instrText>
+              <w:instrText xml:space="preserve"> PAGEREF _Toc244345573 \h </w:instrText>
             </w:r>
             <w:r>
               <w:rPr>
@@ -680,7 +680,7 @@
               <w:rPr>
                 <w:noProof/>
               </w:rPr>
-              <w:t>7</w:t>
+              <w:t>8</w:t>
             </w:r>
             <w:r>
               <w:rPr>
@@ -703,7 +703,7 @@
               <w:szCs w:val="22"/>
             </w:rPr>
           </w:pPr>
-          <w:hyperlink w:anchor="_Toc243499934" w:history="1">
+          <w:hyperlink w:anchor="_Toc244345574" w:history="1">
             <w:r>
               <w:rPr>
                 <w:rStyle w:val="Hyperlink"/>
@@ -727,7 +727,7 @@
               <w:rPr>
                 <w:noProof/>
               </w:rPr>
-              <w:instrText xml:space="preserve"> PAGEREF _Toc243499934 \h </w:instrText>
+              <w:instrText xml:space="preserve"> PAGEREF _Toc244345574 \h </w:instrText>
             </w:r>
             <w:r>
               <w:rPr>
@@ -744,7 +744,7 @@
               <w:rPr>
                 <w:noProof/>
               </w:rPr>
-              <w:t>7</w:t>
+              <w:t>8</w:t>
             </w:r>
             <w:r>
               <w:rPr>
@@ -767,7 +767,7 @@
               <w:szCs w:val="22"/>
             </w:rPr>
           </w:pPr>
-          <w:hyperlink w:anchor="_Toc243499935" w:history="1">
+          <w:hyperlink w:anchor="_Toc244345575" w:history="1">
             <w:r>
               <w:rPr>
                 <w:rStyle w:val="Hyperlink"/>
@@ -791,7 +791,7 @@
               <w:rPr>
                 <w:noProof/>
               </w:rPr>
-              <w:instrText xml:space="preserve"> PAGEREF _Toc243499935 \h </w:instrText>
+              <w:instrText xml:space="preserve"> PAGEREF _Toc244345575 \h </w:instrText>
             </w:r>
             <w:r>
               <w:rPr>
@@ -808,7 +808,7 @@
               <w:rPr>
                 <w:noProof/>
               </w:rPr>
-              <w:t>7</w:t>
+              <w:t>8</w:t>
             </w:r>
             <w:r>
               <w:rPr>
@@ -831,7 +831,7 @@
               <w:szCs w:val="22"/>
             </w:rPr>
           </w:pPr>
-          <w:hyperlink w:anchor="_Toc243499936" w:history="1">
+          <w:hyperlink w:anchor="_Toc244345576" w:history="1">
             <w:r>
               <w:rPr>
                 <w:rStyle w:val="Hyperlink"/>
@@ -855,7 +855,7 @@
               <w:rPr>
                 <w:noProof/>
               </w:rPr>
-              <w:instrText xml:space="preserve"> PAGEREF _Toc243499936 \h </w:instrText>
+              <w:instrText xml:space="preserve"> PAGEREF _Toc244345576 \h </w:instrText>
             </w:r>
             <w:r>
               <w:rPr>
@@ -872,7 +872,7 @@
               <w:rPr>
                 <w:noProof/>
               </w:rPr>
-              <w:t>8</w:t>
+              <w:t>9</w:t>
             </w:r>
             <w:r>
               <w:rPr>
@@ -895,7 +895,7 @@
               <w:szCs w:val="22"/>
             </w:rPr>
           </w:pPr>
-          <w:hyperlink w:anchor="_Toc243499937" w:history="1">
+          <w:hyperlink w:anchor="_Toc244345577" w:history="1">
             <w:r>
               <w:rPr>
                 <w:rStyle w:val="Hyperlink"/>
@@ -919,7 +919,7 @@
               <w:rPr>
                 <w:noProof/>
               </w:rPr>
-              <w:instrText xml:space="preserve"> PAGEREF _Toc243499937 \h </w:instrText>
+              <w:instrText xml:space="preserve"> PAGEREF _Toc244345577 \h </w:instrText>
             </w:r>
             <w:r>
               <w:rPr>
@@ -936,7 +936,7 @@
               <w:rPr>
                 <w:noProof/>
               </w:rPr>
-              <w:t>8</w:t>
+              <w:t>9</w:t>
             </w:r>
             <w:r>
               <w:rPr>
@@ -959,7 +959,7 @@
               <w:szCs w:val="22"/>
             </w:rPr>
           </w:pPr>
-          <w:hyperlink w:anchor="_Toc243499938" w:history="1">
+          <w:hyperlink w:anchor="_Toc244345578" w:history="1">
             <w:r>
               <w:rPr>
                 <w:rStyle w:val="Hyperlink"/>
@@ -983,7 +983,7 @@
               <w:rPr>
                 <w:noProof/>
               </w:rPr>
-              <w:instrText xml:space="preserve"> PAGEREF _Toc243499938 \h </w:instrText>
+              <w:instrText xml:space="preserve"> PAGEREF _Toc244345578 \h </w:instrText>
             </w:r>
             <w:r>
               <w:rPr>
@@ -1000,7 +1000,7 @@
               <w:rPr>
                 <w:noProof/>
               </w:rPr>
-              <w:t>9</w:t>
+              <w:t>10</w:t>
             </w:r>
             <w:r>
               <w:rPr>
@@ -1023,7 +1023,7 @@
               <w:szCs w:val="22"/>
             </w:rPr>
           </w:pPr>
-          <w:hyperlink w:anchor="_Toc243499939" w:history="1">
+          <w:hyperlink w:anchor="_Toc244345579" w:history="1">
             <w:r>
               <w:rPr>
                 <w:rStyle w:val="Hyperlink"/>
@@ -1047,7 +1047,7 @@
               <w:rPr>
                 <w:noProof/>
               </w:rPr>
-              <w:instrText xml:space="preserve"> PAGEREF _Toc243499939 \h </w:instrText>
+              <w:instrText xml:space="preserve"> PAGEREF _Toc244345579 \h </w:instrText>
             </w:r>
             <w:r>
               <w:rPr>
@@ -1064,7 +1064,7 @@
               <w:rPr>
                 <w:noProof/>
               </w:rPr>
-              <w:t>9</w:t>
+              <w:t>10</w:t>
             </w:r>
             <w:r>
               <w:rPr>
@@ -1087,7 +1087,7 @@
               <w:szCs w:val="22"/>
             </w:rPr>
           </w:pPr>
-          <w:hyperlink w:anchor="_Toc243499940" w:history="1">
+          <w:hyperlink w:anchor="_Toc244345580" w:history="1">
             <w:r>
               <w:rPr>
                 <w:rStyle w:val="Hyperlink"/>
@@ -1111,7 +1111,7 @@
               <w:rPr>
                 <w:noProof/>
               </w:rPr>
-              <w:instrText xml:space="preserve"> PAGEREF _Toc243499940 \h </w:instrText>
+              <w:instrText xml:space="preserve"> PAGEREF _Toc244345580 \h </w:instrText>
             </w:r>
             <w:r>
               <w:rPr>
@@ -1128,7 +1128,7 @@
               <w:rPr>
                 <w:noProof/>
               </w:rPr>
-              <w:t>10</w:t>
+              <w:t>11</w:t>
             </w:r>
             <w:r>
               <w:rPr>
@@ -1151,7 +1151,7 @@
               <w:szCs w:val="22"/>
             </w:rPr>
           </w:pPr>
-          <w:hyperlink w:anchor="_Toc243499941" w:history="1">
+          <w:hyperlink w:anchor="_Toc244345581" w:history="1">
             <w:r>
               <w:rPr>
                 <w:rStyle w:val="Hyperlink"/>
@@ -1175,7 +1175,7 @@
               <w:rPr>
                 <w:noProof/>
               </w:rPr>
-              <w:instrText xml:space="preserve"> PAGEREF _Toc243499941 \h </w:instrText>
+              <w:instrText xml:space="preserve"> PAGEREF _Toc244345581 \h </w:instrText>
             </w:r>
             <w:r>
               <w:rPr>
@@ -1192,7 +1192,7 @@
               <w:rPr>
                 <w:noProof/>
               </w:rPr>
-              <w:t>11</w:t>
+              <w:t>12</w:t>
             </w:r>
             <w:r>
               <w:rPr>
@@ -1215,7 +1215,7 @@
               <w:szCs w:val="22"/>
             </w:rPr>
           </w:pPr>
-          <w:hyperlink w:anchor="_Toc243499942" w:history="1">
+          <w:hyperlink w:anchor="_Toc244345582" w:history="1">
             <w:r>
               <w:rPr>
                 <w:rStyle w:val="Hyperlink"/>
@@ -1239,7 +1239,7 @@
               <w:rPr>
                 <w:noProof/>
               </w:rPr>
-              <w:instrText xml:space="preserve"> PAGEREF _Toc243499942 \h </w:instrText>
+              <w:instrText xml:space="preserve"> PAGEREF _Toc244345582 \h </w:instrText>
             </w:r>
             <w:r>
               <w:rPr>
@@ -1256,7 +1256,7 @@
               <w:rPr>
                 <w:noProof/>
               </w:rPr>
-              <w:t>11</w:t>
+              <w:t>12</w:t>
             </w:r>
             <w:r>
               <w:rPr>
@@ -1279,7 +1279,7 @@
               <w:szCs w:val="22"/>
             </w:rPr>
           </w:pPr>
-          <w:hyperlink w:anchor="_Toc243499943" w:history="1">
+          <w:hyperlink w:anchor="_Toc244345583" w:history="1">
             <w:r>
               <w:rPr>
                 <w:rStyle w:val="Hyperlink"/>
@@ -1303,7 +1303,7 @@
               <w:rPr>
                 <w:noProof/>
               </w:rPr>
-              <w:instrText xml:space="preserve"> PAGEREF _Toc243499943 \h </w:instrText>
+              <w:instrText xml:space="preserve"> PAGEREF _Toc244345583 \h </w:instrText>
             </w:r>
             <w:r>
               <w:rPr>
@@ -1320,7 +1320,7 @@
               <w:rPr>
                 <w:noProof/>
               </w:rPr>
-              <w:t>12</w:t>
+              <w:t>13</w:t>
             </w:r>
             <w:r>
               <w:rPr>
@@ -1343,7 +1343,7 @@
               <w:szCs w:val="22"/>
             </w:rPr>
           </w:pPr>
-          <w:hyperlink w:anchor="_Toc243499944" w:history="1">
+          <w:hyperlink w:anchor="_Toc244345584" w:history="1">
             <w:r>
               <w:rPr>
                 <w:rStyle w:val="Hyperlink"/>
@@ -1367,7 +1367,7 @@
               <w:rPr>
                 <w:noProof/>
               </w:rPr>
-              <w:instrText xml:space="preserve"> PAGEREF _Toc243499944 \h </w:instrText>
+              <w:instrText xml:space="preserve"> PAGEREF _Toc244345584 \h </w:instrText>
             </w:r>
             <w:r>
               <w:rPr>
@@ -1384,7 +1384,7 @@
               <w:rPr>
                 <w:noProof/>
               </w:rPr>
-              <w:t>13</w:t>
+              <w:t>14</w:t>
             </w:r>
             <w:r>
               <w:rPr>
@@ -1407,7 +1407,7 @@
               <w:szCs w:val="22"/>
             </w:rPr>
           </w:pPr>
-          <w:hyperlink w:anchor="_Toc243499945" w:history="1">
+          <w:hyperlink w:anchor="_Toc244345585" w:history="1">
             <w:r>
               <w:rPr>
                 <w:rStyle w:val="Hyperlink"/>
@@ -1431,7 +1431,7 @@
               <w:rPr>
                 <w:noProof/>
               </w:rPr>
-              <w:instrText xml:space="preserve"> PAGEREF _Toc243499945 \h </w:instrText>
+              <w:instrText xml:space="preserve"> PAGEREF _Toc244345585 \h </w:instrText>
             </w:r>
             <w:r>
               <w:rPr>
@@ -1448,7 +1448,7 @@
               <w:rPr>
                 <w:noProof/>
               </w:rPr>
-              <w:t>15</w:t>
+              <w:t>16</w:t>
             </w:r>
             <w:r>
               <w:rPr>
@@ -1471,7 +1471,7 @@
               <w:szCs w:val="22"/>
             </w:rPr>
           </w:pPr>
-          <w:hyperlink w:anchor="_Toc243499946" w:history="1">
+          <w:hyperlink w:anchor="_Toc244345586" w:history="1">
             <w:r>
               <w:rPr>
                 <w:rStyle w:val="Hyperlink"/>
@@ -1495,7 +1495,7 @@
               <w:rPr>
                 <w:noProof/>
               </w:rPr>
-              <w:instrText xml:space="preserve"> PAGEREF _Toc243499946 \h </w:instrText>
+              <w:instrText xml:space="preserve"> PAGEREF _Toc244345586 \h </w:instrText>
             </w:r>
             <w:r>
               <w:rPr>
@@ -1512,7 +1512,7 @@
               <w:rPr>
                 <w:noProof/>
               </w:rPr>
-              <w:t>18</w:t>
+              <w:t>19</w:t>
             </w:r>
             <w:r>
               <w:rPr>
@@ -1535,7 +1535,7 @@
               <w:szCs w:val="22"/>
             </w:rPr>
           </w:pPr>
-          <w:hyperlink w:anchor="_Toc243499947" w:history="1">
+          <w:hyperlink w:anchor="_Toc244345587" w:history="1">
             <w:r>
               <w:rPr>
                 <w:rStyle w:val="Hyperlink"/>
@@ -1559,7 +1559,7 @@
               <w:rPr>
                 <w:noProof/>
               </w:rPr>
-              <w:instrText xml:space="preserve"> PAGEREF _Toc243499947 \h </w:instrText>
+              <w:instrText xml:space="preserve"> PAGEREF _Toc244345587 \h </w:instrText>
             </w:r>
             <w:r>
               <w:rPr>
@@ -1576,7 +1576,7 @@
               <w:rPr>
                 <w:noProof/>
               </w:rPr>
-              <w:t>18</w:t>
+              <w:t>19</w:t>
             </w:r>
             <w:r>
               <w:rPr>
@@ -1599,7 +1599,7 @@
               <w:szCs w:val="22"/>
             </w:rPr>
           </w:pPr>
-          <w:hyperlink w:anchor="_Toc243499948" w:history="1">
+          <w:hyperlink w:anchor="_Toc244345588" w:history="1">
             <w:r>
               <w:rPr>
                 <w:rStyle w:val="Hyperlink"/>
@@ -1623,7 +1623,7 @@
               <w:rPr>
                 <w:noProof/>
               </w:rPr>
-              <w:instrText xml:space="preserve"> PAGEREF _Toc243499948 \h </w:instrText>
+              <w:instrText xml:space="preserve"> PAGEREF _Toc244345588 \h </w:instrText>
             </w:r>
             <w:r>
               <w:rPr>
@@ -1640,7 +1640,7 @@
               <w:rPr>
                 <w:noProof/>
               </w:rPr>
-              <w:t>18</w:t>
+              <w:t>19</w:t>
             </w:r>
             <w:r>
               <w:rPr>
@@ -1663,7 +1663,7 @@
               <w:szCs w:val="22"/>
             </w:rPr>
           </w:pPr>
-          <w:hyperlink w:anchor="_Toc243499949" w:history="1">
+          <w:hyperlink w:anchor="_Toc244345589" w:history="1">
             <w:r>
               <w:rPr>
                 <w:rStyle w:val="Hyperlink"/>
@@ -1687,7 +1687,7 @@
               <w:rPr>
                 <w:noProof/>
               </w:rPr>
-              <w:instrText xml:space="preserve"> PAGEREF _Toc243499949 \h </w:instrText>
+              <w:instrText xml:space="preserve"> PAGEREF _Toc244345589 \h </w:instrText>
             </w:r>
             <w:r>
               <w:rPr>
@@ -1704,7 +1704,7 @@
               <w:rPr>
                 <w:noProof/>
               </w:rPr>
-              <w:t>19</w:t>
+              <w:t>20</w:t>
             </w:r>
             <w:r>
               <w:rPr>
@@ -1727,7 +1727,7 @@
               <w:szCs w:val="22"/>
             </w:rPr>
           </w:pPr>
-          <w:hyperlink w:anchor="_Toc243499950" w:history="1">
+          <w:hyperlink w:anchor="_Toc244345590" w:history="1">
             <w:r>
               <w:rPr>
                 <w:rStyle w:val="Hyperlink"/>
@@ -1751,7 +1751,7 @@
               <w:rPr>
                 <w:noProof/>
               </w:rPr>
-              <w:instrText xml:space="preserve"> PAGEREF _Toc243499950 \h </w:instrText>
+              <w:instrText xml:space="preserve"> PAGEREF _Toc244345590 \h </w:instrText>
             </w:r>
             <w:r>
               <w:rPr>
@@ -1768,7 +1768,7 @@
               <w:rPr>
                 <w:noProof/>
               </w:rPr>
-              <w:t>19</w:t>
+              <w:t>20</w:t>
             </w:r>
             <w:r>
               <w:rPr>
@@ -1791,7 +1791,7 @@
               <w:szCs w:val="22"/>
             </w:rPr>
           </w:pPr>
-          <w:hyperlink w:anchor="_Toc243499951" w:history="1">
+          <w:hyperlink w:anchor="_Toc244345591" w:history="1">
             <w:r>
               <w:rPr>
                 <w:rStyle w:val="Hyperlink"/>
@@ -1815,7 +1815,7 @@
               <w:rPr>
                 <w:noProof/>
               </w:rPr>
-              <w:instrText xml:space="preserve"> PAGEREF _Toc243499951 \h </w:instrText>
+              <w:instrText xml:space="preserve"> PAGEREF _Toc244345591 \h </w:instrText>
             </w:r>
             <w:r>
               <w:rPr>
@@ -1832,7 +1832,7 @@
               <w:rPr>
                 <w:noProof/>
               </w:rPr>
-              <w:t>20</w:t>
+              <w:t>21</w:t>
             </w:r>
             <w:r>
               <w:rPr>
@@ -1855,7 +1855,7 @@
               <w:szCs w:val="22"/>
             </w:rPr>
           </w:pPr>
-          <w:hyperlink w:anchor="_Toc243499952" w:history="1">
+          <w:hyperlink w:anchor="_Toc244345592" w:history="1">
             <w:r>
               <w:rPr>
                 <w:rStyle w:val="Hyperlink"/>
@@ -1879,7 +1879,7 @@
               <w:rPr>
                 <w:noProof/>
               </w:rPr>
-              <w:instrText xml:space="preserve"> PAGEREF _Toc243499952 \h </w:instrText>
+              <w:instrText xml:space="preserve"> PAGEREF _Toc244345592 \h </w:instrText>
             </w:r>
             <w:r>
               <w:rPr>
@@ -1896,7 +1896,7 @@
               <w:rPr>
                 <w:noProof/>
               </w:rPr>
-              <w:t>20</w:t>
+              <w:t>21</w:t>
             </w:r>
             <w:r>
               <w:rPr>
@@ -1919,7 +1919,7 @@
               <w:szCs w:val="22"/>
             </w:rPr>
           </w:pPr>
-          <w:hyperlink w:anchor="_Toc243499953" w:history="1">
+          <w:hyperlink w:anchor="_Toc244345593" w:history="1">
             <w:r>
               <w:rPr>
                 <w:rStyle w:val="Hyperlink"/>
@@ -1943,7 +1943,7 @@
               <w:rPr>
                 <w:noProof/>
               </w:rPr>
-              <w:instrText xml:space="preserve"> PAGEREF _Toc243499953 \h </w:instrText>
+              <w:instrText xml:space="preserve"> PAGEREF _Toc244345593 \h </w:instrText>
             </w:r>
             <w:r>
               <w:rPr>
@@ -1960,7 +1960,7 @@
               <w:rPr>
                 <w:noProof/>
               </w:rPr>
-              <w:t>20</w:t>
+              <w:t>21</w:t>
             </w:r>
             <w:r>
               <w:rPr>
@@ -1983,7 +1983,7 @@
               <w:szCs w:val="22"/>
             </w:rPr>
           </w:pPr>
-          <w:hyperlink w:anchor="_Toc243499954" w:history="1">
+          <w:hyperlink w:anchor="_Toc244345594" w:history="1">
             <w:r>
               <w:rPr>
                 <w:rStyle w:val="Hyperlink"/>
@@ -2007,7 +2007,7 @@
               <w:rPr>
                 <w:noProof/>
               </w:rPr>
-              <w:instrText xml:space="preserve"> PAGEREF _Toc243499954 \h </w:instrText>
+              <w:instrText xml:space="preserve"> PAGEREF _Toc244345594 \h </w:instrText>
             </w:r>
             <w:r>
               <w:rPr>
@@ -2024,7 +2024,7 @@
               <w:rPr>
                 <w:noProof/>
               </w:rPr>
-              <w:t>20</w:t>
+              <w:t>21</w:t>
             </w:r>
             <w:r>
               <w:rPr>
@@ -2047,7 +2047,7 @@
               <w:szCs w:val="22"/>
             </w:rPr>
           </w:pPr>
-          <w:hyperlink w:anchor="_Toc243499955" w:history="1">
+          <w:hyperlink w:anchor="_Toc244345595" w:history="1">
             <w:r>
               <w:rPr>
                 <w:rStyle w:val="Hyperlink"/>
@@ -2071,7 +2071,7 @@
               <w:rPr>
                 <w:noProof/>
               </w:rPr>
-              <w:instrText xml:space="preserve"> PAGEREF _Toc243499955 \h </w:instrText>
+              <w:instrText xml:space="preserve"> PAGEREF _Toc244345595 \h </w:instrText>
             </w:r>
             <w:r>
               <w:rPr>
@@ -2088,7 +2088,7 @@
               <w:rPr>
                 <w:noProof/>
               </w:rPr>
-              <w:t>21</w:t>
+              <w:t>22</w:t>
             </w:r>
             <w:r>
               <w:rPr>
@@ -2111,7 +2111,7 @@
               <w:szCs w:val="22"/>
             </w:rPr>
           </w:pPr>
-          <w:hyperlink w:anchor="_Toc243499956" w:history="1">
+          <w:hyperlink w:anchor="_Toc244345596" w:history="1">
             <w:r>
               <w:rPr>
                 <w:rStyle w:val="Hyperlink"/>
@@ -2135,7 +2135,7 @@
               <w:rPr>
                 <w:noProof/>
               </w:rPr>
-              <w:instrText xml:space="preserve"> PAGEREF _Toc243499956 \h </w:instrText>
+              <w:instrText xml:space="preserve"> PAGEREF _Toc244345596 \h </w:instrText>
             </w:r>
             <w:r>
               <w:rPr>
@@ -2152,7 +2152,7 @@
               <w:rPr>
                 <w:noProof/>
               </w:rPr>
-              <w:t>21</w:t>
+              <w:t>22</w:t>
             </w:r>
             <w:r>
               <w:rPr>
@@ -2175,7 +2175,7 @@
               <w:szCs w:val="22"/>
             </w:rPr>
           </w:pPr>
-          <w:hyperlink w:anchor="_Toc243499957" w:history="1">
+          <w:hyperlink w:anchor="_Toc244345597" w:history="1">
             <w:r>
               <w:rPr>
                 <w:rStyle w:val="Hyperlink"/>
@@ -2199,7 +2199,7 @@
               <w:rPr>
                 <w:noProof/>
               </w:rPr>
-              <w:instrText xml:space="preserve"> PAGEREF _Toc243499957 \h </w:instrText>
+              <w:instrText xml:space="preserve"> PAGEREF _Toc244345597 \h </w:instrText>
             </w:r>
             <w:r>
               <w:rPr>
@@ -2216,7 +2216,7 @@
               <w:rPr>
                 <w:noProof/>
               </w:rPr>
-              <w:t>22</w:t>
+              <w:t>23</w:t>
             </w:r>
             <w:r>
               <w:rPr>
@@ -2239,7 +2239,7 @@
               <w:szCs w:val="22"/>
             </w:rPr>
           </w:pPr>
-          <w:hyperlink w:anchor="_Toc243499958" w:history="1">
+          <w:hyperlink w:anchor="_Toc244345598" w:history="1">
             <w:r>
               <w:rPr>
                 <w:rStyle w:val="Hyperlink"/>
@@ -2263,7 +2263,7 @@
               <w:rPr>
                 <w:noProof/>
               </w:rPr>
-              <w:instrText xml:space="preserve"> PAGEREF _Toc243499958 \h </w:instrText>
+              <w:instrText xml:space="preserve"> PAGEREF _Toc244345598 \h </w:instrText>
             </w:r>
             <w:r>
               <w:rPr>
@@ -2280,7 +2280,7 @@
               <w:rPr>
                 <w:noProof/>
               </w:rPr>
-              <w:t>22</w:t>
+              <w:t>23</w:t>
             </w:r>
             <w:r>
               <w:rPr>
@@ -2303,7 +2303,7 @@
               <w:szCs w:val="22"/>
             </w:rPr>
           </w:pPr>
-          <w:hyperlink w:anchor="_Toc243499959" w:history="1">
+          <w:hyperlink w:anchor="_Toc244345599" w:history="1">
             <w:r>
               <w:rPr>
                 <w:rStyle w:val="Hyperlink"/>
@@ -2327,7 +2327,7 @@
               <w:rPr>
                 <w:noProof/>
               </w:rPr>
-              <w:instrText xml:space="preserve"> PAGEREF _Toc243499959 \h </w:instrText>
+              <w:instrText xml:space="preserve"> PAGEREF _Toc244345599 \h </w:instrText>
             </w:r>
             <w:r>
               <w:rPr>
@@ -2344,7 +2344,7 @@
               <w:rPr>
                 <w:noProof/>
               </w:rPr>
-              <w:t>23</w:t>
+              <w:t>24</w:t>
             </w:r>
             <w:r>
               <w:rPr>
@@ -2367,7 +2367,7 @@
               <w:szCs w:val="22"/>
             </w:rPr>
           </w:pPr>
-          <w:hyperlink w:anchor="_Toc243499960" w:history="1">
+          <w:hyperlink w:anchor="_Toc244345600" w:history="1">
             <w:r>
               <w:rPr>
                 <w:rStyle w:val="Hyperlink"/>
@@ -2391,7 +2391,7 @@
               <w:rPr>
                 <w:noProof/>
               </w:rPr>
-              <w:instrText xml:space="preserve"> PAGEREF _Toc243499960 \h </w:instrText>
+              <w:instrText xml:space="preserve"> PAGEREF _Toc244345600 \h </w:instrText>
             </w:r>
             <w:r>
               <w:rPr>
@@ -2408,7 +2408,7 @@
               <w:rPr>
                 <w:noProof/>
               </w:rPr>
-              <w:t>23</w:t>
+              <w:t>24</w:t>
             </w:r>
             <w:r>
               <w:rPr>
@@ -2431,7 +2431,7 @@
               <w:szCs w:val="22"/>
             </w:rPr>
           </w:pPr>
-          <w:hyperlink w:anchor="_Toc243499961" w:history="1">
+          <w:hyperlink w:anchor="_Toc244345601" w:history="1">
             <w:r>
               <w:rPr>
                 <w:rStyle w:val="Hyperlink"/>
@@ -2455,7 +2455,7 @@
               <w:rPr>
                 <w:noProof/>
               </w:rPr>
-              <w:instrText xml:space="preserve"> PAGEREF _Toc243499961 \h </w:instrText>
+              <w:instrText xml:space="preserve"> PAGEREF _Toc244345601 \h </w:instrText>
             </w:r>
             <w:r>
               <w:rPr>
@@ -2472,7 +2472,391 @@
               <w:rPr>
                 <w:noProof/>
               </w:rPr>
-              <w:t>24</w:t>
+              <w:t>25</w:t>
+            </w:r>
+            <w:r>
+              <w:rPr>
+                <w:noProof/>
+              </w:rPr>
+              <w:fldChar w:fldCharType="end"/>
+            </w:r>
+          </w:hyperlink>
+        </w:p>
+        <w:p>
+          <w:pPr>
+            <w:pStyle w:val="TOC1"/>
+            <w:tabs>
+              <w:tab w:val="right" w:leader="dot" w:pos="9628"/>
+            </w:tabs>
+            <w:rPr>
+              <w:rFonts w:asciiTheme="minorHAnsi" w:eastAsiaTheme="minorEastAsia" w:hAnsiTheme="minorHAnsi" w:cstheme="minorBidi"/>
+              <w:noProof/>
+              <w:sz w:val="22"/>
+              <w:szCs w:val="22"/>
+            </w:rPr>
+          </w:pPr>
+          <w:hyperlink w:anchor="_Toc244345602" w:history="1">
+            <w:r>
+              <w:rPr>
+                <w:rStyle w:val="Hyperlink"/>
+                <w:noProof/>
+              </w:rPr>
+              <w:t>6. Bila Siswa Gagal Merekam Suara</w:t>
+            </w:r>
+            <w:r>
+              <w:rPr>
+                <w:noProof/>
+              </w:rPr>
+              <w:tab/>
+            </w:r>
+            <w:r>
+              <w:rPr>
+                <w:noProof/>
+              </w:rPr>
+              <w:fldChar w:fldCharType="begin"/>
+            </w:r>
+            <w:r>
+              <w:rPr>
+                <w:noProof/>
+              </w:rPr>
+              <w:instrText xml:space="preserve"> PAGEREF _Toc244345602 \h </w:instrText>
+            </w:r>
+            <w:r>
+              <w:rPr>
+                <w:noProof/>
+              </w:rPr>
+            </w:r>
+            <w:r>
+              <w:rPr>
+                <w:noProof/>
+              </w:rPr>
+              <w:fldChar w:fldCharType="separate"/>
+            </w:r>
+            <w:r>
+              <w:rPr>
+                <w:noProof/>
+              </w:rPr>
+              <w:t>26</w:t>
+            </w:r>
+            <w:r>
+              <w:rPr>
+                <w:noProof/>
+              </w:rPr>
+              <w:fldChar w:fldCharType="end"/>
+            </w:r>
+          </w:hyperlink>
+        </w:p>
+        <w:p>
+          <w:pPr>
+            <w:pStyle w:val="TOC2"/>
+            <w:tabs>
+              <w:tab w:val="right" w:leader="dot" w:pos="9628"/>
+            </w:tabs>
+            <w:rPr>
+              <w:rFonts w:asciiTheme="minorHAnsi" w:eastAsiaTheme="minorEastAsia" w:hAnsiTheme="minorHAnsi" w:cstheme="minorBidi"/>
+              <w:noProof/>
+              <w:sz w:val="22"/>
+              <w:szCs w:val="22"/>
+            </w:rPr>
+          </w:pPr>
+          <w:hyperlink w:anchor="_Toc244345603" w:history="1">
+            <w:r>
+              <w:rPr>
+                <w:rStyle w:val="Hyperlink"/>
+                <w:noProof/>
+              </w:rPr>
+              <w:t>6.1 Mengenali siswa yang gagal merekam</w:t>
+            </w:r>
+            <w:r>
+              <w:rPr>
+                <w:noProof/>
+              </w:rPr>
+              <w:tab/>
+            </w:r>
+            <w:r>
+              <w:rPr>
+                <w:noProof/>
+              </w:rPr>
+              <w:fldChar w:fldCharType="begin"/>
+            </w:r>
+            <w:r>
+              <w:rPr>
+                <w:noProof/>
+              </w:rPr>
+              <w:instrText xml:space="preserve"> PAGEREF _Toc244345603 \h </w:instrText>
+            </w:r>
+            <w:r>
+              <w:rPr>
+                <w:noProof/>
+              </w:rPr>
+            </w:r>
+            <w:r>
+              <w:rPr>
+                <w:noProof/>
+              </w:rPr>
+              <w:fldChar w:fldCharType="separate"/>
+            </w:r>
+            <w:r>
+              <w:rPr>
+                <w:noProof/>
+              </w:rPr>
+              <w:t>26</w:t>
+            </w:r>
+            <w:r>
+              <w:rPr>
+                <w:noProof/>
+              </w:rPr>
+              <w:fldChar w:fldCharType="end"/>
+            </w:r>
+          </w:hyperlink>
+        </w:p>
+        <w:p>
+          <w:pPr>
+            <w:pStyle w:val="TOC2"/>
+            <w:tabs>
+              <w:tab w:val="right" w:leader="dot" w:pos="9628"/>
+            </w:tabs>
+            <w:rPr>
+              <w:rFonts w:asciiTheme="minorHAnsi" w:eastAsiaTheme="minorEastAsia" w:hAnsiTheme="minorHAnsi" w:cstheme="minorBidi"/>
+              <w:noProof/>
+              <w:sz w:val="22"/>
+              <w:szCs w:val="22"/>
+            </w:rPr>
+          </w:pPr>
+          <w:hyperlink w:anchor="_Toc244345604" w:history="1">
+            <w:r>
+              <w:rPr>
+                <w:rStyle w:val="Hyperlink"/>
+                <w:noProof/>
+              </w:rPr>
+              <w:t>6.2 Pesan di layar siswa dan artinya</w:t>
+            </w:r>
+            <w:r>
+              <w:rPr>
+                <w:noProof/>
+              </w:rPr>
+              <w:tab/>
+            </w:r>
+            <w:r>
+              <w:rPr>
+                <w:noProof/>
+              </w:rPr>
+              <w:fldChar w:fldCharType="begin"/>
+            </w:r>
+            <w:r>
+              <w:rPr>
+                <w:noProof/>
+              </w:rPr>
+              <w:instrText xml:space="preserve"> PAGEREF _Toc244345604 \h </w:instrText>
+            </w:r>
+            <w:r>
+              <w:rPr>
+                <w:noProof/>
+              </w:rPr>
+            </w:r>
+            <w:r>
+              <w:rPr>
+                <w:noProof/>
+              </w:rPr>
+              <w:fldChar w:fldCharType="separate"/>
+            </w:r>
+            <w:r>
+              <w:rPr>
+                <w:noProof/>
+              </w:rPr>
+              <w:t>26</w:t>
+            </w:r>
+            <w:r>
+              <w:rPr>
+                <w:noProof/>
+              </w:rPr>
+              <w:fldChar w:fldCharType="end"/>
+            </w:r>
+          </w:hyperlink>
+        </w:p>
+        <w:p>
+          <w:pPr>
+            <w:pStyle w:val="TOC2"/>
+            <w:tabs>
+              <w:tab w:val="right" w:leader="dot" w:pos="9628"/>
+            </w:tabs>
+            <w:rPr>
+              <w:rFonts w:asciiTheme="minorHAnsi" w:eastAsiaTheme="minorEastAsia" w:hAnsiTheme="minorHAnsi" w:cstheme="minorBidi"/>
+              <w:noProof/>
+              <w:sz w:val="22"/>
+              <w:szCs w:val="22"/>
+            </w:rPr>
+          </w:pPr>
+          <w:hyperlink w:anchor="_Toc244345605" w:history="1">
+            <w:r>
+              <w:rPr>
+                <w:rStyle w:val="Hyperlink"/>
+                <w:noProof/>
+              </w:rPr>
+              <w:t>6.3 Langkah perbaikan berurutan</w:t>
+            </w:r>
+            <w:r>
+              <w:rPr>
+                <w:noProof/>
+              </w:rPr>
+              <w:tab/>
+            </w:r>
+            <w:r>
+              <w:rPr>
+                <w:noProof/>
+              </w:rPr>
+              <w:fldChar w:fldCharType="begin"/>
+            </w:r>
+            <w:r>
+              <w:rPr>
+                <w:noProof/>
+              </w:rPr>
+              <w:instrText xml:space="preserve"> PAGEREF _Toc244345605 \h </w:instrText>
+            </w:r>
+            <w:r>
+              <w:rPr>
+                <w:noProof/>
+              </w:rPr>
+            </w:r>
+            <w:r>
+              <w:rPr>
+                <w:noProof/>
+              </w:rPr>
+              <w:fldChar w:fldCharType="separate"/>
+            </w:r>
+            <w:r>
+              <w:rPr>
+                <w:noProof/>
+              </w:rPr>
+              <w:t>27</w:t>
+            </w:r>
+            <w:r>
+              <w:rPr>
+                <w:noProof/>
+              </w:rPr>
+              <w:fldChar w:fldCharType="end"/>
+            </w:r>
+          </w:hyperlink>
+        </w:p>
+        <w:p>
+          <w:pPr>
+            <w:pStyle w:val="TOC2"/>
+            <w:tabs>
+              <w:tab w:val="right" w:leader="dot" w:pos="9628"/>
+            </w:tabs>
+            <w:rPr>
+              <w:rFonts w:asciiTheme="minorHAnsi" w:eastAsiaTheme="minorEastAsia" w:hAnsiTheme="minorHAnsi" w:cstheme="minorBidi"/>
+              <w:noProof/>
+              <w:sz w:val="22"/>
+              <w:szCs w:val="22"/>
+            </w:rPr>
+          </w:pPr>
+          <w:hyperlink w:anchor="_Toc244345606" w:history="1">
+            <w:r>
+              <w:rPr>
+                <w:rStyle w:val="Hyperlink"/>
+                <w:noProof/>
+              </w:rPr>
+              <w:t>6.4 Bila tetap gagal: pasang Tanpa Baca</w:t>
+            </w:r>
+            <w:r>
+              <w:rPr>
+                <w:noProof/>
+              </w:rPr>
+              <w:tab/>
+            </w:r>
+            <w:r>
+              <w:rPr>
+                <w:noProof/>
+              </w:rPr>
+              <w:fldChar w:fldCharType="begin"/>
+            </w:r>
+            <w:r>
+              <w:rPr>
+                <w:noProof/>
+              </w:rPr>
+              <w:instrText xml:space="preserve"> PAGEREF _Toc244345606 \h </w:instrText>
+            </w:r>
+            <w:r>
+              <w:rPr>
+                <w:noProof/>
+              </w:rPr>
+            </w:r>
+            <w:r>
+              <w:rPr>
+                <w:noProof/>
+              </w:rPr>
+              <w:fldChar w:fldCharType="separate"/>
+            </w:r>
+            <w:r>
+              <w:rPr>
+                <w:noProof/>
+              </w:rPr>
+              <w:t>27</w:t>
+            </w:r>
+            <w:r>
+              <w:rPr>
+                <w:noProof/>
+              </w:rPr>
+              <w:fldChar w:fldCharType="end"/>
+            </w:r>
+          </w:hyperlink>
+        </w:p>
+        <w:p>
+          <w:pPr>
+            <w:pStyle w:val="TOC2"/>
+            <w:tabs>
+              <w:tab w:val="right" w:leader="dot" w:pos="9628"/>
+            </w:tabs>
+            <w:rPr>
+              <w:rFonts w:asciiTheme="minorHAnsi" w:eastAsiaTheme="minorEastAsia" w:hAnsiTheme="minorHAnsi" w:cstheme="minorBidi"/>
+              <w:noProof/>
+              <w:sz w:val="22"/>
+              <w:szCs w:val="22"/>
+            </w:rPr>
+          </w:pPr>
+          <w:hyperlink w:anchor="_Toc244345607" w:history="1">
+            <w:r>
+              <w:rPr>
+                <w:rStyle w:val="Hyperlink"/>
+                <w:noProof/>
+              </w:rPr>
+              <w:t>6.5 Mencegah sebelum sesi</w:t>
+            </w:r>
+            <w:r>
+              <w:rPr>
+                <w:noProof/>
+              </w:rPr>
+              <w:tab/>
+            </w:r>
+            <w:r>
+              <w:rPr>
+                <w:noProof/>
+              </w:rPr>
+              <w:fldChar w:fldCharType="begin"/>
+            </w:r>
+            <w:r>
+              <w:rPr>
+                <w:noProof/>
+              </w:rPr>
+              <w:instrText xml:space="preserve"> PAGEREF _Toc244345607 \h </w:instrText>
+            </w:r>
+            <w:r>
+              <w:rPr>
+                <w:noProof/>
+              </w:rPr>
+            </w:r>
+            <w:r>
+              <w:rPr>
+                <w:noProof/>
+              </w:rPr>
+              <w:fldChar w:fldCharType="separate"/>
+            </w:r>
+            <w:r>
+              <w:rPr>
+                <w:noProof/>
+              </w:rPr>
+              <w:t>28</w:t>
             </w:r>
             <w:r>
               <w:rPr>
@@ -2494,7 +2878,7 @@
         <w:pStyle w:val="Heading1"/>
         <w:pageBreakBefore/>
       </w:pPr>
-      <w:bookmarkStart w:id="0" w:name="_Toc243499926"/>
+      <w:bookmarkStart w:id="0" w:name="_Toc244345566"/>
       <w:r>
         <w:lastRenderedPageBreak/>
         <w:t>1. Sebelum Mulai: Istilah Dasar</w:t>
@@ -2513,7 +2897,7 @@
       <w:pPr>
         <w:pStyle w:val="Heading2"/>
       </w:pPr>
-      <w:bookmarkStart w:id="1" w:name="_Toc243499927"/>
+      <w:bookmarkStart w:id="1" w:name="_Toc244345567"/>
       <w:r>
         <w:t>1.1 Susunan materi: Tahap, Level, dan Sub level</w:t>
       </w:r>
@@ -4001,7 +4385,7 @@
       <w:pPr>
         <w:pStyle w:val="Heading2"/>
       </w:pPr>
-      <w:bookmarkStart w:id="2" w:name="_Toc243499928"/>
+      <w:bookmarkStart w:id="2" w:name="_Toc244345568"/>
       <w:r>
         <w:t>1.2 Istilah kemajuan dan nilai</w:t>
       </w:r>
@@ -4943,7 +5327,7 @@
       <w:pPr>
         <w:pStyle w:val="Heading2"/>
       </w:pPr>
-      <w:bookmarkStart w:id="3" w:name="_Toc243499929"/>
+      <w:bookmarkStart w:id="3" w:name="_Toc244345569"/>
       <w:r>
         <w:t>1.3 Sesi kelas dan latihan mandiri</w:t>
       </w:r>
@@ -5648,7 +6032,7 @@
       <w:pPr>
         <w:pStyle w:val="Heading2"/>
       </w:pPr>
-      <w:bookmarkStart w:id="4" w:name="_Toc243499930"/>
+      <w:bookmarkStart w:id="4" w:name="_Toc244345570"/>
       <w:r>
         <w:t>1.4 Ukuran waktu "7 hari" dan "30 hari"</w:t>
       </w:r>
@@ -5770,7 +6154,7 @@
       <w:pPr>
         <w:pStyle w:val="Heading2"/>
       </w:pPr>
-      <w:bookmarkStart w:id="5" w:name="_Toc243499931"/>
+      <w:bookmarkStart w:id="5" w:name="_Toc244345571"/>
       <w:r>
         <w:t>1.5 Arti warna label</w:t>
       </w:r>
@@ -6475,7 +6859,7 @@
       <w:pPr>
         <w:pStyle w:val="Heading2"/>
       </w:pPr>
-      <w:bookmarkStart w:id="6" w:name="_Toc243499932"/>
+      <w:bookmarkStart w:id="6" w:name="_Toc244345572"/>
       <w:r>
         <w:t>1.6 Aturan dan tahapan: cara sistem memilih</w:t>
       </w:r>
@@ -7550,7 +7934,7 @@
         <w:pStyle w:val="Heading1"/>
         <w:pageBreakBefore/>
       </w:pPr>
-      <w:bookmarkStart w:id="7" w:name="_Toc243499933"/>
+      <w:bookmarkStart w:id="7" w:name="_Toc244345573"/>
       <w:r>
         <w:lastRenderedPageBreak/>
         <w:t>2. Tab Sesi Kegiatan</w:t>
@@ -7697,7 +8081,7 @@
       <w:pPr>
         <w:pStyle w:val="Heading2"/>
       </w:pPr>
-      <w:bookmarkStart w:id="8" w:name="_Toc243499934"/>
+      <w:bookmarkStart w:id="8" w:name="_Toc244345574"/>
       <w:r>
         <w:t>2.1 Bilah saringan</w:t>
       </w:r>
@@ -8197,7 +8581,7 @@
       <w:pPr>
         <w:pStyle w:val="Heading2"/>
       </w:pPr>
-      <w:bookmarkStart w:id="9" w:name="_Toc243499935"/>
+      <w:bookmarkStart w:id="9" w:name="_Toc244345575"/>
       <w:r>
         <w:t>2.2 Kartu Sesi latihan</w:t>
       </w:r>
@@ -9014,7 +9398,7 @@
       <w:pPr>
         <w:pStyle w:val="Heading2"/>
       </w:pPr>
-      <w:bookmarkStart w:id="10" w:name="_Toc243499936"/>
+      <w:bookmarkStart w:id="10" w:name="_Toc244345576"/>
       <w:r>
         <w:t>2.3 Kotak Aturan dan tahapan yang berlaku</w:t>
       </w:r>
@@ -9367,7 +9751,7 @@
       <w:pPr>
         <w:pStyle w:val="Heading2"/>
       </w:pPr>
-      <w:bookmarkStart w:id="11" w:name="_Toc243499937"/>
+      <w:bookmarkStart w:id="11" w:name="_Toc244345577"/>
       <w:r>
         <w:t>2.4 Enam kotak ringkasan</w:t>
       </w:r>
@@ -10499,7 +10883,7 @@
       <w:pPr>
         <w:pStyle w:val="Heading2"/>
       </w:pPr>
-      <w:bookmarkStart w:id="12" w:name="_Toc243499938"/>
+      <w:bookmarkStart w:id="12" w:name="_Toc244345578"/>
       <w:r>
         <w:t>2.5 Tabel siswa</w:t>
       </w:r>
@@ -11064,7 +11448,7 @@
       <w:pPr>
         <w:pStyle w:val="Heading2"/>
       </w:pPr>
-      <w:bookmarkStart w:id="13" w:name="_Toc243499939"/>
+      <w:bookmarkStart w:id="13" w:name="_Toc244345579"/>
       <w:r>
         <w:t>2.6 Arti kolom Status</w:t>
       </w:r>
@@ -12080,7 +12464,7 @@
       <w:pPr>
         <w:pStyle w:val="Heading2"/>
       </w:pPr>
-      <w:bookmarkStart w:id="14" w:name="_Toc243499940"/>
+      <w:bookmarkStart w:id="14" w:name="_Toc244345580"/>
       <w:r>
         <w:t>2.7 Bilah aksi untuk siswa terpilih</w:t>
       </w:r>
@@ -12508,7 +12892,7 @@
         <w:pStyle w:val="Heading1"/>
         <w:pageBreakBefore/>
       </w:pPr>
-      <w:bookmarkStart w:id="15" w:name="_Toc243499941"/>
+      <w:bookmarkStart w:id="15" w:name="_Toc244345581"/>
       <w:r>
         <w:lastRenderedPageBreak/>
         <w:t>3. Tab Perkembangan Siswa</w:t>
@@ -12598,7 +12982,7 @@
       <w:pPr>
         <w:pStyle w:val="Heading2"/>
       </w:pPr>
-      <w:bookmarkStart w:id="16" w:name="_Toc243499942"/>
+      <w:bookmarkStart w:id="16" w:name="_Toc244345582"/>
       <w:r>
         <w:t>3.1 Sub-tab Rekapitulasi</w:t>
       </w:r>
@@ -12891,7 +13275,7 @@
       <w:pPr>
         <w:pStyle w:val="Heading2"/>
       </w:pPr>
-      <w:bookmarkStart w:id="17" w:name="_Toc243499943"/>
+      <w:bookmarkStart w:id="17" w:name="_Toc244345583"/>
       <w:r>
         <w:lastRenderedPageBreak/>
         <w:t>3.2 Sub-tab Per Siswa</w:t>
@@ -16083,7 +16467,7 @@
       <w:pPr>
         <w:pStyle w:val="Heading2"/>
       </w:pPr>
-      <w:bookmarkStart w:id="18" w:name="_Toc243499944"/>
+      <w:bookmarkStart w:id="18" w:name="_Toc244345584"/>
       <w:r>
         <w:t>3.3 Ringkasan keseluruhan (bagian bawah Rekapitulasi)</w:t>
       </w:r>
@@ -17788,7 +18172,7 @@
       <w:pPr>
         <w:pStyle w:val="Heading2"/>
       </w:pPr>
-      <w:bookmarkStart w:id="19" w:name="_Toc243499945"/>
+      <w:bookmarkStart w:id="19" w:name="_Toc244345585"/>
       <w:r>
         <w:lastRenderedPageBreak/>
         <w:t>3.4 Sub-tab Peringkat</w:t>
@@ -21536,7 +21920,7 @@
         <w:pStyle w:val="Heading1"/>
         <w:pageBreakBefore/>
       </w:pPr>
-      <w:bookmarkStart w:id="20" w:name="_Toc243499946"/>
+      <w:bookmarkStart w:id="20" w:name="_Toc244345586"/>
       <w:r>
         <w:lastRenderedPageBreak/>
         <w:t>4. Tab Analisis Siswa</w:t>
@@ -22907,7 +23291,7 @@
       <w:pPr>
         <w:pStyle w:val="Heading2"/>
       </w:pPr>
-      <w:bookmarkStart w:id="21" w:name="_Toc243499947"/>
+      <w:bookmarkStart w:id="21" w:name="_Toc244345587"/>
       <w:r>
         <w:t>4.1 Kartu identitas</w:t>
       </w:r>
@@ -22955,7 +23339,7 @@
       <w:pPr>
         <w:pStyle w:val="Heading2"/>
       </w:pPr>
-      <w:bookmarkStart w:id="22" w:name="_Toc243499948"/>
+      <w:bookmarkStart w:id="22" w:name="_Toc244345588"/>
       <w:r>
         <w:t>4.2 Enam kotak ringkasan</w:t>
       </w:r>
@@ -23983,7 +24367,7 @@
       <w:pPr>
         <w:pStyle w:val="Heading2"/>
       </w:pPr>
-      <w:bookmarkStart w:id="23" w:name="_Toc243499949"/>
+      <w:bookmarkStart w:id="23" w:name="_Toc244345589"/>
       <w:r>
         <w:t>4.3 Kotak terkunci dan Aturan yang berlaku</w:t>
       </w:r>
@@ -24181,7 +24565,7 @@
       <w:pPr>
         <w:pStyle w:val="Heading2"/>
       </w:pPr>
-      <w:bookmarkStart w:id="24" w:name="_Toc243499950"/>
+      <w:bookmarkStart w:id="24" w:name="_Toc244345590"/>
       <w:r>
         <w:t>4.4 Catatan otomatis</w:t>
       </w:r>
@@ -24853,7 +25237,7 @@
       <w:pPr>
         <w:pStyle w:val="Heading2"/>
       </w:pPr>
-      <w:bookmarkStart w:id="25" w:name="_Toc243499951"/>
+      <w:bookmarkStart w:id="25" w:name="_Toc244345591"/>
       <w:r>
         <w:lastRenderedPageBreak/>
         <w:t>4.5 Riwayat semester (arsip)</w:t>
@@ -24952,7 +25336,7 @@
       <w:pPr>
         <w:pStyle w:val="Heading2"/>
       </w:pPr>
-      <w:bookmarkStart w:id="26" w:name="_Toc243499952"/>
+      <w:bookmarkStart w:id="26" w:name="_Toc244345592"/>
       <w:r>
         <w:t>4.6 Kartu Latihan mandiri (di luar sesi)</w:t>
       </w:r>
@@ -25478,7 +25862,7 @@
       <w:pPr>
         <w:pStyle w:val="Heading2"/>
       </w:pPr>
-      <w:bookmarkStart w:id="27" w:name="_Toc243499953"/>
+      <w:bookmarkStart w:id="27" w:name="_Toc244345593"/>
       <w:r>
         <w:t>4.7 Grafik Kemajuan sub level lulus</w:t>
       </w:r>
@@ -25864,7 +26248,7 @@
       <w:pPr>
         <w:pStyle w:val="Heading2"/>
       </w:pPr>
-      <w:bookmarkStart w:id="28" w:name="_Toc243499954"/>
+      <w:bookmarkStart w:id="28" w:name="_Toc244345594"/>
       <w:r>
         <w:t>4.8 Kegiatan per jenis</w:t>
       </w:r>
@@ -26832,7 +27216,7 @@
       <w:pPr>
         <w:pStyle w:val="Heading2"/>
       </w:pPr>
-      <w:bookmarkStart w:id="29" w:name="_Toc243499955"/>
+      <w:bookmarkStart w:id="29" w:name="_Toc244345595"/>
       <w:r>
         <w:t>4.9 Per tahap</w:t>
       </w:r>
@@ -27200,7 +27584,7 @@
       <w:pPr>
         <w:pStyle w:val="Heading2"/>
       </w:pPr>
-      <w:bookmarkStart w:id="30" w:name="_Toc243499956"/>
+      <w:bookmarkStart w:id="30" w:name="_Toc244345596"/>
       <w:r>
         <w:t>4.10 Hasil di bawah 80% terakhir</w:t>
       </w:r>
@@ -27730,7 +28114,7 @@
       <w:pPr>
         <w:pStyle w:val="Heading2"/>
       </w:pPr>
-      <w:bookmarkStart w:id="31" w:name="_Toc243499957"/>
+      <w:bookmarkStart w:id="31" w:name="_Toc244345597"/>
       <w:r>
         <w:t>4.11 Riwayat sub level lulus</w:t>
       </w:r>
@@ -28258,7 +28642,7 @@
       <w:pPr>
         <w:pStyle w:val="Heading2"/>
       </w:pPr>
-      <w:bookmarkStart w:id="32" w:name="_Toc243499958"/>
+      <w:bookmarkStart w:id="32" w:name="_Toc244345598"/>
       <w:r>
         <w:t>4.12 Aturan dan tahapan siswa ini, Hapus data latihan</w:t>
       </w:r>
@@ -28448,7 +28832,7 @@
         <w:pStyle w:val="Heading1"/>
         <w:pageBreakBefore/>
       </w:pPr>
-      <w:bookmarkStart w:id="33" w:name="_Toc243499959"/>
+      <w:bookmarkStart w:id="33" w:name="_Toc244345599"/>
       <w:r>
         <w:lastRenderedPageBreak/>
         <w:t>5. Dari Data ke Tindakan</w:t>
@@ -28459,7 +28843,7 @@
       <w:pPr>
         <w:pStyle w:val="Heading2"/>
       </w:pPr>
-      <w:bookmarkStart w:id="34" w:name="_Toc243499960"/>
+      <w:bookmarkStart w:id="34" w:name="_Toc244345600"/>
       <w:r>
         <w:t>5.1 Situasi umum dan tindakan</w:t>
       </w:r>
@@ -29655,7 +30039,7 @@
         <w:pStyle w:val="Heading2"/>
         <w:pageBreakBefore/>
       </w:pPr>
-      <w:bookmarkStart w:id="35" w:name="_Toc243499961"/>
+      <w:bookmarkStart w:id="35" w:name="_Toc244345601"/>
       <w:r>
         <w:lastRenderedPageBreak/>
         <w:t>5.2 Tanya jawab singkat</w:t>
@@ -30719,6 +31103,2053 @@
     <w:p>
       <w:pPr>
         <w:spacing w:after="120"/>
+      </w:pPr>
+    </w:p>
+    <w:p>
+      <w:pPr>
+        <w:pStyle w:val="Heading1"/>
+        <w:pageBreakBefore/>
+      </w:pPr>
+      <w:bookmarkStart w:id="36" w:name="_Toc244345602"/>
+      <w:r>
+        <w:lastRenderedPageBreak/>
+        <w:t>6. Bila Siswa Gagal Merekam Suara</w:t>
+      </w:r>
+      <w:bookmarkEnd w:id="36"/>
+    </w:p>
+    <w:p>
+      <w:pPr>
+        <w:spacing w:after="120" w:line="276" w:lineRule="auto"/>
+      </w:pPr>
+      <w:r>
+        <w:rPr>
+          <w:b/>
+          <w:bCs/>
+        </w:rPr>
+        <w:t>Baca &amp; Koreksi</w:t>
+      </w:r>
+      <w:r>
+        <w:t xml:space="preserve"> dan soal </w:t>
+      </w:r>
+      <w:r>
+        <w:rPr>
+          <w:b/>
+          <w:bCs/>
+        </w:rPr>
+        <w:t>🎤</w:t>
+      </w:r>
+      <w:r>
+        <w:rPr>
+          <w:b/>
+          <w:bCs/>
+        </w:rPr>
+        <w:t xml:space="preserve"> Ucapkan</w:t>
+      </w:r>
+      <w:r>
+        <w:t xml:space="preserve"> memakai mikrofon HP dan pengenal suara bawaan browser. Pengenal suara itu mengirim suara siswa ke server Google untuk diubah menjadi teks. Karena itu perekaman hanya berjalan bila tiga hal terpenuhi: browser yang tepat, izin mikrofon, dan internet yang la</w:t>
+      </w:r>
+      <w:r>
+        <w:t>ncar.</w:t>
+      </w:r>
+    </w:p>
+    <w:tbl>
+      <w:tblPr>
+        <w:tblW w:w="9638" w:type="dxa"/>
+        <w:tblBorders>
+          <w:top w:val="single" w:sz="4" w:space="0" w:color="auto"/>
+          <w:left w:val="single" w:sz="4" w:space="0" w:color="auto"/>
+          <w:bottom w:val="single" w:sz="4" w:space="0" w:color="auto"/>
+          <w:right w:val="single" w:sz="4" w:space="0" w:color="auto"/>
+          <w:insideH w:val="single" w:sz="4" w:space="0" w:color="auto"/>
+          <w:insideV w:val="single" w:sz="4" w:space="0" w:color="auto"/>
+        </w:tblBorders>
+        <w:tblLook w:val="04A0" w:firstRow="1" w:lastRow="0" w:firstColumn="1" w:lastColumn="0" w:noHBand="0" w:noVBand="1"/>
+      </w:tblPr>
+      <w:tblGrid>
+        <w:gridCol w:w="9638"/>
+      </w:tblGrid>
+      <w:tr>
+        <w:trPr>
+          <w:cantSplit/>
+        </w:trPr>
+        <w:tc>
+          <w:tcPr>
+            <w:tcW w:w="9638" w:type="dxa"/>
+            <w:tcBorders>
+              <w:top w:val="single" w:sz="4" w:space="0" w:color="EAF1F7"/>
+              <w:left w:val="single" w:sz="24" w:space="0" w:color="2F5D7C"/>
+              <w:bottom w:val="single" w:sz="4" w:space="0" w:color="EAF1F7"/>
+              <w:right w:val="single" w:sz="4" w:space="0" w:color="EAF1F7"/>
+            </w:tcBorders>
+            <w:shd w:val="clear" w:color="auto" w:fill="EAF1F7"/>
+            <w:tcMar>
+              <w:top w:w="110" w:type="dxa"/>
+              <w:left w:w="200" w:type="dxa"/>
+              <w:bottom w:w="110" w:type="dxa"/>
+              <w:right w:w="160" w:type="dxa"/>
+            </w:tcMar>
+          </w:tcPr>
+          <w:p>
+            <w:pPr>
+              <w:spacing w:after="60"/>
+            </w:pPr>
+            <w:r>
+              <w:rPr>
+                <w:b/>
+                <w:bCs/>
+                <w:color w:val="2F5D7C"/>
+                <w:sz w:val="20"/>
+                <w:szCs w:val="20"/>
+              </w:rPr>
+              <w:t>Perlu diingat</w:t>
+            </w:r>
+          </w:p>
+          <w:p>
+            <w:pPr>
+              <w:spacing w:after="50" w:line="264" w:lineRule="auto"/>
+            </w:pPr>
+            <w:r>
+              <w:rPr>
+                <w:sz w:val="19"/>
+                <w:szCs w:val="19"/>
+              </w:rPr>
+              <w:t xml:space="preserve">Bila browser sama sekali </w:t>
+            </w:r>
+            <w:r>
+              <w:rPr>
+                <w:b/>
+                <w:bCs/>
+                <w:sz w:val="19"/>
+                <w:szCs w:val="19"/>
+              </w:rPr>
+              <w:t>tidak punya</w:t>
+            </w:r>
+            <w:r>
+              <w:rPr>
+                <w:sz w:val="19"/>
+                <w:szCs w:val="19"/>
+              </w:rPr>
+              <w:t xml:space="preserve"> pengenal suara (mis. Firefox), aplikasi menyesuaikan diri: syarat Baca dilewati dan soal Ucapkan diganti jawaban ketik. Siswa tetap bisa maju, hanya tanpa latihan pelafalan.</w:t>
+            </w:r>
+          </w:p>
+          <w:p>
+            <w:pPr>
+              <w:spacing w:after="50" w:line="264" w:lineRule="auto"/>
+            </w:pPr>
+            <w:r>
+              <w:rPr>
+                <w:sz w:val="19"/>
+                <w:szCs w:val="19"/>
+              </w:rPr>
+              <w:t xml:space="preserve">Yang membuat siswa </w:t>
+            </w:r>
+            <w:r>
+              <w:rPr>
+                <w:b/>
+                <w:bCs/>
+                <w:sz w:val="19"/>
+                <w:szCs w:val="19"/>
+              </w:rPr>
+              <w:t>tersen</w:t>
+            </w:r>
+            <w:r>
+              <w:rPr>
+                <w:b/>
+                <w:bCs/>
+                <w:sz w:val="19"/>
+                <w:szCs w:val="19"/>
+              </w:rPr>
+              <w:t>dat</w:t>
+            </w:r>
+            <w:r>
+              <w:rPr>
+                <w:sz w:val="19"/>
+                <w:szCs w:val="19"/>
+              </w:rPr>
+              <w:t xml:space="preserve"> adalah pengenal suara yang ada tetapi tidak berfungsi: izin mikrofon ditolak, internet atau VPN bermasalah, atau layanan suara Google di HP mati. Bab ini terutama membahas keadaan itu.</w:t>
+            </w:r>
+          </w:p>
+        </w:tc>
+      </w:tr>
+    </w:tbl>
+    <w:p>
+      <w:pPr>
+        <w:spacing w:after="140"/>
+      </w:pPr>
+    </w:p>
+    <w:p>
+      <w:pPr>
+        <w:pStyle w:val="Heading2"/>
+      </w:pPr>
+      <w:bookmarkStart w:id="37" w:name="_Toc244345603"/>
+      <w:r>
+        <w:t>6.1 Mengenali siswa yang gagal merekam</w:t>
+      </w:r>
+      <w:bookmarkEnd w:id="37"/>
+    </w:p>
+    <w:p>
+      <w:pPr>
+        <w:pStyle w:val="ListParagraph"/>
+        <w:numPr>
+          <w:ilvl w:val="0"/>
+          <w:numId w:val="2"/>
+        </w:numPr>
+        <w:spacing w:after="60" w:line="276" w:lineRule="auto"/>
+      </w:pPr>
+      <w:r>
+        <w:rPr>
+          <w:b/>
+          <w:bCs/>
+        </w:rPr>
+        <w:t>Saat sesi berjalan.</w:t>
+      </w:r>
+      <w:r>
+        <w:t xml:space="preserve"> Siswa </w:t>
+      </w:r>
+      <w:r>
+        <w:t xml:space="preserve">berstatus </w:t>
+      </w:r>
+      <w:r>
+        <w:rPr>
+          <w:i/>
+          <w:iCs/>
+        </w:rPr>
+        <w:t>Sedang berlatih (sesi)</w:t>
+      </w:r>
+      <w:r>
+        <w:t>, tetapi posisinya tidak bergerak dan ia tertahan di Baca &amp; Koreksi atau soal Ucapkan. Tanyakan pesan yang muncul di bawah teks, lalu cocokkan dengan tabel 6.2.</w:t>
+      </w:r>
+    </w:p>
+    <w:p>
+      <w:pPr>
+        <w:pStyle w:val="ListParagraph"/>
+        <w:numPr>
+          <w:ilvl w:val="0"/>
+          <w:numId w:val="2"/>
+        </w:numPr>
+        <w:spacing w:after="60" w:line="276" w:lineRule="auto"/>
+      </w:pPr>
+      <w:r>
+        <w:rPr>
+          <w:b/>
+          <w:bCs/>
+        </w:rPr>
+        <w:t>Sesudah sesi.</w:t>
+      </w:r>
+      <w:r>
+        <w:t xml:space="preserve"> Buka Analisis Siswa untuk siswa itu. Pada tanggal</w:t>
+      </w:r>
+      <w:r>
+        <w:t xml:space="preserve"> sesi tidak ada hasil Baca atau </w:t>
+      </w:r>
+      <w:r>
+        <w:t>🎤</w:t>
+      </w:r>
+      <w:r>
+        <w:t xml:space="preserve"> Ucapkan, padahal ada kegiatan Dengar dan waktu latihannya panjang.</w:t>
+      </w:r>
+    </w:p>
+    <w:p>
+      <w:pPr>
+        <w:pStyle w:val="ListParagraph"/>
+        <w:numPr>
+          <w:ilvl w:val="0"/>
+          <w:numId w:val="2"/>
+        </w:numPr>
+        <w:spacing w:after="60" w:line="276" w:lineRule="auto"/>
+      </w:pPr>
+      <w:r>
+        <w:rPr>
+          <w:b/>
+          <w:bCs/>
+        </w:rPr>
+        <w:t>Siswa yang belum pernah berhasil sama sekali.</w:t>
+      </w:r>
+      <w:r>
+        <w:t xml:space="preserve"> Kotak </w:t>
+      </w:r>
+      <w:r>
+        <w:rPr>
+          <w:i/>
+          <w:iCs/>
+        </w:rPr>
+        <w:t>akurasi membaca</w:t>
+      </w:r>
+      <w:r>
+        <w:t xml:space="preserve"> kosong sejak awal. Kemungkinan besar HP atau browsernya yang bermasalah, bukan cara membacanya.</w:t>
+      </w:r>
+    </w:p>
+    <w:tbl>
+      <w:tblPr>
+        <w:tblW w:w="9638" w:type="dxa"/>
+        <w:tblBorders>
+          <w:top w:val="single" w:sz="4" w:space="0" w:color="auto"/>
+          <w:left w:val="single" w:sz="4" w:space="0" w:color="auto"/>
+          <w:bottom w:val="single" w:sz="4" w:space="0" w:color="auto"/>
+          <w:right w:val="single" w:sz="4" w:space="0" w:color="auto"/>
+          <w:insideH w:val="single" w:sz="4" w:space="0" w:color="auto"/>
+          <w:insideV w:val="single" w:sz="4" w:space="0" w:color="auto"/>
+        </w:tblBorders>
+        <w:tblLook w:val="04A0" w:firstRow="1" w:lastRow="0" w:firstColumn="1" w:lastColumn="0" w:noHBand="0" w:noVBand="1"/>
+      </w:tblPr>
+      <w:tblGrid>
+        <w:gridCol w:w="9638"/>
+      </w:tblGrid>
+      <w:tr>
+        <w:trPr>
+          <w:cantSplit/>
+        </w:trPr>
+        <w:tc>
+          <w:tcPr>
+            <w:tcW w:w="9638" w:type="dxa"/>
+            <w:tcBorders>
+              <w:top w:val="single" w:sz="4" w:space="0" w:color="EAF1F7"/>
+              <w:left w:val="single" w:sz="24" w:space="0" w:color="2F5D7C"/>
+              <w:bottom w:val="single" w:sz="4" w:space="0" w:color="EAF1F7"/>
+              <w:right w:val="single" w:sz="4" w:space="0" w:color="EAF1F7"/>
+            </w:tcBorders>
+            <w:shd w:val="clear" w:color="auto" w:fill="EAF1F7"/>
+            <w:tcMar>
+              <w:top w:w="110" w:type="dxa"/>
+              <w:left w:w="200" w:type="dxa"/>
+              <w:bottom w:w="110" w:type="dxa"/>
+              <w:right w:w="160" w:type="dxa"/>
+            </w:tcMar>
+          </w:tcPr>
+          <w:p>
+            <w:pPr>
+              <w:spacing w:after="60"/>
+            </w:pPr>
+            <w:r>
+              <w:rPr>
+                <w:b/>
+                <w:bCs/>
+                <w:color w:val="2F5D7C"/>
+                <w:sz w:val="20"/>
+                <w:szCs w:val="20"/>
+              </w:rPr>
+              <w:t>Bukan selalu gagal merekam</w:t>
+            </w:r>
+          </w:p>
+          <w:p>
+            <w:pPr>
+              <w:spacing w:after="50" w:line="264" w:lineRule="auto"/>
+            </w:pPr>
+            <w:r>
+              <w:rPr>
+                <w:sz w:val="19"/>
+                <w:szCs w:val="19"/>
+              </w:rPr>
+              <w:t xml:space="preserve">Nilai Baca &amp; Koreksi </w:t>
+            </w:r>
+            <w:r>
+              <w:rPr>
+                <w:b/>
+                <w:bCs/>
+                <w:sz w:val="19"/>
+                <w:szCs w:val="19"/>
+              </w:rPr>
+              <w:t>hanya disimpan bila paragraf dibaca sampai (hampir) akhir</w:t>
+            </w:r>
+            <w:r>
+              <w:rPr>
+                <w:sz w:val="19"/>
+                <w:szCs w:val="19"/>
+              </w:rPr>
+              <w:t>: paling banyak 5% kata, atau 2 kata, yang terlewat. S</w:t>
+            </w:r>
+            <w:r>
+              <w:rPr>
+                <w:sz w:val="19"/>
+                <w:szCs w:val="19"/>
+              </w:rPr>
+              <w:t>iswa yang berhenti di tengah melihat kata-kata berwarna, tetapi tidak ada nilai yang tercatat. Siswa sering mengira rekamannya gagal.</w:t>
+            </w:r>
+          </w:p>
+          <w:p>
+            <w:pPr>
+              <w:spacing w:after="50" w:line="264" w:lineRule="auto"/>
+            </w:pPr>
+            <w:r>
+              <w:rPr>
+                <w:sz w:val="19"/>
+                <w:szCs w:val="19"/>
+              </w:rPr>
+              <w:t>Hal serupa berlaku untuk sub level: nilainya baru tercatat ketika satu sub level selesai dikerjakan.</w:t>
+            </w:r>
+          </w:p>
+        </w:tc>
+      </w:tr>
+    </w:tbl>
+    <w:p>
+      <w:pPr>
+        <w:spacing w:after="140"/>
+      </w:pPr>
+    </w:p>
+    <w:p>
+      <w:pPr>
+        <w:pStyle w:val="Heading2"/>
+      </w:pPr>
+      <w:bookmarkStart w:id="38" w:name="_Toc244345604"/>
+      <w:r>
+        <w:t xml:space="preserve">6.2 Pesan di layar </w:t>
+      </w:r>
+      <w:r>
+        <w:t>siswa dan artinya</w:t>
+      </w:r>
+      <w:bookmarkEnd w:id="38"/>
+    </w:p>
+    <w:p>
+      <w:pPr>
+        <w:spacing w:after="120" w:line="276" w:lineRule="auto"/>
+      </w:pPr>
+      <w:r>
+        <w:t xml:space="preserve">Pesan berikut muncul di bawah teks (Baca &amp; Koreksi) atau di bawah tombol </w:t>
+      </w:r>
+      <w:r>
+        <w:t>🎤</w:t>
+      </w:r>
+      <w:r>
+        <w:t xml:space="preserve"> (soal Ucapkan).</w:t>
+      </w:r>
+    </w:p>
+    <w:tbl>
+      <w:tblPr>
+        <w:tblW w:w="9638" w:type="dxa"/>
+        <w:tblBorders>
+          <w:top w:val="single" w:sz="4" w:space="0" w:color="auto"/>
+          <w:left w:val="single" w:sz="4" w:space="0" w:color="auto"/>
+          <w:bottom w:val="single" w:sz="4" w:space="0" w:color="auto"/>
+          <w:right w:val="single" w:sz="4" w:space="0" w:color="auto"/>
+          <w:insideH w:val="single" w:sz="4" w:space="0" w:color="auto"/>
+          <w:insideV w:val="single" w:sz="4" w:space="0" w:color="auto"/>
+        </w:tblBorders>
+        <w:tblLook w:val="04A0" w:firstRow="1" w:lastRow="0" w:firstColumn="1" w:lastColumn="0" w:noHBand="0" w:noVBand="1"/>
+      </w:tblPr>
+      <w:tblGrid>
+        <w:gridCol w:w="3300"/>
+        <w:gridCol w:w="2600"/>
+        <w:gridCol w:w="3738"/>
+      </w:tblGrid>
+      <w:tr>
+        <w:trPr>
+          <w:tblHeader/>
+        </w:trPr>
+        <w:tc>
+          <w:tcPr>
+            <w:tcW w:w="3300" w:type="dxa"/>
+            <w:tcBorders>
+              <w:top w:val="single" w:sz="4" w:space="0" w:color="C9D3DE"/>
+              <w:left w:val="single" w:sz="4" w:space="0" w:color="C9D3DE"/>
+              <w:bottom w:val="single" w:sz="4" w:space="0" w:color="C9D3DE"/>
+              <w:right w:val="single" w:sz="4" w:space="0" w:color="C9D3DE"/>
+            </w:tcBorders>
+            <w:shd w:val="clear" w:color="auto" w:fill="1F3A5F"/>
+            <w:tcMar>
+              <w:top w:w="70" w:type="dxa"/>
+              <w:left w:w="110" w:type="dxa"/>
+              <w:bottom w:w="70" w:type="dxa"/>
+              <w:right w:w="110" w:type="dxa"/>
+            </w:tcMar>
+          </w:tcPr>
+          <w:p>
+            <w:pPr>
+              <w:spacing w:after="30"/>
+            </w:pPr>
+            <w:r>
+              <w:rPr>
+                <w:b/>
+                <w:bCs/>
+                <w:color w:val="FFFFFF"/>
+                <w:sz w:val="19"/>
+                <w:szCs w:val="19"/>
+              </w:rPr>
+              <w:t>Pesan yang muncul</w:t>
+            </w:r>
+          </w:p>
+        </w:tc>
+        <w:tc>
+          <w:tcPr>
+            <w:tcW w:w="2600" w:type="dxa"/>
+            <w:tcBorders>
+              <w:top w:val="single" w:sz="4" w:space="0" w:color="C9D3DE"/>
+              <w:left w:val="single" w:sz="4" w:space="0" w:color="C9D3DE"/>
+              <w:bottom w:val="single" w:sz="4" w:space="0" w:color="C9D3DE"/>
+              <w:right w:val="single" w:sz="4" w:space="0" w:color="C9D3DE"/>
+            </w:tcBorders>
+            <w:shd w:val="clear" w:color="auto" w:fill="1F3A5F"/>
+            <w:tcMar>
+              <w:top w:w="70" w:type="dxa"/>
+              <w:left w:w="110" w:type="dxa"/>
+              <w:bottom w:w="70" w:type="dxa"/>
+              <w:right w:w="110" w:type="dxa"/>
+            </w:tcMar>
+          </w:tcPr>
+          <w:p>
+            <w:pPr>
+              <w:spacing w:after="30"/>
+            </w:pPr>
+            <w:r>
+              <w:rPr>
+                <w:b/>
+                <w:bCs/>
+                <w:color w:val="FFFFFF"/>
+                <w:sz w:val="19"/>
+                <w:szCs w:val="19"/>
+              </w:rPr>
+              <w:t>Penyebab</w:t>
+            </w:r>
+          </w:p>
+        </w:tc>
+        <w:tc>
+          <w:tcPr>
+            <w:tcW w:w="3738" w:type="dxa"/>
+            <w:tcBorders>
+              <w:top w:val="single" w:sz="4" w:space="0" w:color="C9D3DE"/>
+              <w:left w:val="single" w:sz="4" w:space="0" w:color="C9D3DE"/>
+              <w:bottom w:val="single" w:sz="4" w:space="0" w:color="C9D3DE"/>
+              <w:right w:val="single" w:sz="4" w:space="0" w:color="C9D3DE"/>
+            </w:tcBorders>
+            <w:shd w:val="clear" w:color="auto" w:fill="1F3A5F"/>
+            <w:tcMar>
+              <w:top w:w="70" w:type="dxa"/>
+              <w:left w:w="110" w:type="dxa"/>
+              <w:bottom w:w="70" w:type="dxa"/>
+              <w:right w:w="110" w:type="dxa"/>
+            </w:tcMar>
+          </w:tcPr>
+          <w:p>
+            <w:pPr>
+              <w:spacing w:after="30"/>
+            </w:pPr>
+            <w:r>
+              <w:rPr>
+                <w:b/>
+                <w:bCs/>
+                <w:color w:val="FFFFFF"/>
+                <w:sz w:val="19"/>
+                <w:szCs w:val="19"/>
+              </w:rPr>
+              <w:t>Yang dilakukan</w:t>
+            </w:r>
+          </w:p>
+        </w:tc>
+      </w:tr>
+      <w:tr>
+        <w:trPr>
+          <w:cantSplit/>
+        </w:trPr>
+        <w:tc>
+          <w:tcPr>
+            <w:tcW w:w="3300" w:type="dxa"/>
+            <w:tcBorders>
+              <w:top w:val="single" w:sz="4" w:space="0" w:color="C9D3DE"/>
+              <w:left w:val="single" w:sz="4" w:space="0" w:color="C9D3DE"/>
+              <w:bottom w:val="single" w:sz="4" w:space="0" w:color="C9D3DE"/>
+              <w:right w:val="single" w:sz="4" w:space="0" w:color="C9D3DE"/>
+            </w:tcBorders>
+            <w:shd w:val="clear" w:color="auto" w:fill="auto"/>
+            <w:tcMar>
+              <w:top w:w="70" w:type="dxa"/>
+              <w:left w:w="110" w:type="dxa"/>
+              <w:bottom w:w="70" w:type="dxa"/>
+              <w:right w:w="110" w:type="dxa"/>
+            </w:tcMar>
+          </w:tcPr>
+          <w:p>
+            <w:pPr>
+              <w:spacing w:after="30"/>
+            </w:pPr>
+            <w:r>
+              <w:rPr>
+                <w:sz w:val="19"/>
+                <w:szCs w:val="19"/>
+              </w:rPr>
+              <w:t>⚠</w:t>
+            </w:r>
+            <w:r>
+              <w:rPr>
+                <w:sz w:val="19"/>
+                <w:szCs w:val="19"/>
+              </w:rPr>
+              <w:t>️</w:t>
+            </w:r>
+            <w:r>
+              <w:rPr>
+                <w:sz w:val="19"/>
+                <w:szCs w:val="19"/>
+              </w:rPr>
+              <w:t xml:space="preserve"> Buka di Chrome agar koreksi suara berjalan</w:t>
+            </w:r>
+          </w:p>
+        </w:tc>
+        <w:tc>
+          <w:tcPr>
+            <w:tcW w:w="2600" w:type="dxa"/>
+            <w:tcBorders>
+              <w:top w:val="single" w:sz="4" w:space="0" w:color="C9D3DE"/>
+              <w:left w:val="single" w:sz="4" w:space="0" w:color="C9D3DE"/>
+              <w:bottom w:val="single" w:sz="4" w:space="0" w:color="C9D3DE"/>
+              <w:right w:val="single" w:sz="4" w:space="0" w:color="C9D3DE"/>
+            </w:tcBorders>
+            <w:shd w:val="clear" w:color="auto" w:fill="auto"/>
+            <w:tcMar>
+              <w:top w:w="70" w:type="dxa"/>
+              <w:left w:w="110" w:type="dxa"/>
+              <w:bottom w:w="70" w:type="dxa"/>
+              <w:right w:w="110" w:type="dxa"/>
+            </w:tcMar>
+          </w:tcPr>
+          <w:p>
+            <w:pPr>
+              <w:spacing w:after="30"/>
+            </w:pPr>
+            <w:r>
+              <w:rPr>
+                <w:sz w:val="19"/>
+                <w:szCs w:val="19"/>
+              </w:rPr>
+              <w:t>Tautan dibuka dari dalam WhatsApp, Instagram, dan sejenisnya.</w:t>
+            </w:r>
+          </w:p>
+        </w:tc>
+        <w:tc>
+          <w:tcPr>
+            <w:tcW w:w="3738" w:type="dxa"/>
+            <w:tcBorders>
+              <w:top w:val="single" w:sz="4" w:space="0" w:color="C9D3DE"/>
+              <w:left w:val="single" w:sz="4" w:space="0" w:color="C9D3DE"/>
+              <w:bottom w:val="single" w:sz="4" w:space="0" w:color="C9D3DE"/>
+              <w:right w:val="single" w:sz="4" w:space="0" w:color="C9D3DE"/>
+            </w:tcBorders>
+            <w:shd w:val="clear" w:color="auto" w:fill="auto"/>
+            <w:tcMar>
+              <w:top w:w="70" w:type="dxa"/>
+              <w:left w:w="110" w:type="dxa"/>
+              <w:bottom w:w="70" w:type="dxa"/>
+              <w:right w:w="110" w:type="dxa"/>
+            </w:tcMar>
+          </w:tcPr>
+          <w:p>
+            <w:pPr>
+              <w:spacing w:after="30"/>
+            </w:pPr>
+            <w:r>
+              <w:rPr>
+                <w:sz w:val="19"/>
+                <w:szCs w:val="19"/>
+              </w:rPr>
+              <w:t>Ketuk ⋮ lalu Buka di Chrome. Di iPhone pilih Buka di Safari.</w:t>
+            </w:r>
+          </w:p>
+        </w:tc>
+      </w:tr>
+      <w:tr>
+        <w:trPr>
+          <w:cantSplit/>
+        </w:trPr>
+        <w:tc>
+          <w:tcPr>
+            <w:tcW w:w="3300" w:type="dxa"/>
+            <w:tcBorders>
+              <w:top w:val="single" w:sz="4" w:space="0" w:color="C9D3DE"/>
+              <w:left w:val="single" w:sz="4" w:space="0" w:color="C9D3DE"/>
+              <w:bottom w:val="single" w:sz="4" w:space="0" w:color="C9D3DE"/>
+              <w:right w:val="single" w:sz="4" w:space="0" w:color="C9D3DE"/>
+            </w:tcBorders>
+            <w:shd w:val="clear" w:color="auto" w:fill="F8FAFC"/>
+            <w:tcMar>
+              <w:top w:w="70" w:type="dxa"/>
+              <w:left w:w="110" w:type="dxa"/>
+              <w:bottom w:w="70" w:type="dxa"/>
+              <w:right w:w="110" w:type="dxa"/>
+            </w:tcMar>
+          </w:tcPr>
+          <w:p>
+            <w:pPr>
+              <w:spacing w:after="30"/>
+            </w:pPr>
+            <w:r>
+              <w:rPr>
+                <w:sz w:val="19"/>
+                <w:szCs w:val="19"/>
+              </w:rPr>
+              <w:t>⚠</w:t>
+            </w:r>
+            <w:r>
+              <w:rPr>
+                <w:sz w:val="19"/>
+                <w:szCs w:val="19"/>
+              </w:rPr>
+              <w:t>️</w:t>
+            </w:r>
+            <w:r>
+              <w:rPr>
+                <w:sz w:val="19"/>
+                <w:szCs w:val="19"/>
+              </w:rPr>
+              <w:t xml:space="preserve"> Brave memblokir pengenal suara / Browser ini belum mendukung koreksi suara</w:t>
+            </w:r>
+          </w:p>
+        </w:tc>
+        <w:tc>
+          <w:tcPr>
+            <w:tcW w:w="2600" w:type="dxa"/>
+            <w:tcBorders>
+              <w:top w:val="single" w:sz="4" w:space="0" w:color="C9D3DE"/>
+              <w:left w:val="single" w:sz="4" w:space="0" w:color="C9D3DE"/>
+              <w:bottom w:val="single" w:sz="4" w:space="0" w:color="C9D3DE"/>
+              <w:right w:val="single" w:sz="4" w:space="0" w:color="C9D3DE"/>
+            </w:tcBorders>
+            <w:shd w:val="clear" w:color="auto" w:fill="F8FAFC"/>
+            <w:tcMar>
+              <w:top w:w="70" w:type="dxa"/>
+              <w:left w:w="110" w:type="dxa"/>
+              <w:bottom w:w="70" w:type="dxa"/>
+              <w:right w:w="110" w:type="dxa"/>
+            </w:tcMar>
+          </w:tcPr>
+          <w:p>
+            <w:pPr>
+              <w:spacing w:after="30"/>
+            </w:pPr>
+            <w:r>
+              <w:rPr>
+                <w:sz w:val="19"/>
+                <w:szCs w:val="19"/>
+              </w:rPr>
+              <w:t>Browser Brave, Firefox, Samsung Internet, dan sejenisnya.</w:t>
+            </w:r>
+          </w:p>
+        </w:tc>
+        <w:tc>
+          <w:tcPr>
+            <w:tcW w:w="3738" w:type="dxa"/>
+            <w:tcBorders>
+              <w:top w:val="single" w:sz="4" w:space="0" w:color="C9D3DE"/>
+              <w:left w:val="single" w:sz="4" w:space="0" w:color="C9D3DE"/>
+              <w:bottom w:val="single" w:sz="4" w:space="0" w:color="C9D3DE"/>
+              <w:right w:val="single" w:sz="4" w:space="0" w:color="C9D3DE"/>
+            </w:tcBorders>
+            <w:shd w:val="clear" w:color="auto" w:fill="F8FAFC"/>
+            <w:tcMar>
+              <w:top w:w="70" w:type="dxa"/>
+              <w:left w:w="110" w:type="dxa"/>
+              <w:bottom w:w="70" w:type="dxa"/>
+              <w:right w:w="110" w:type="dxa"/>
+            </w:tcMar>
+          </w:tcPr>
+          <w:p>
+            <w:pPr>
+              <w:spacing w:after="30"/>
+            </w:pPr>
+            <w:r>
+              <w:rPr>
+                <w:sz w:val="19"/>
+                <w:szCs w:val="19"/>
+              </w:rPr>
+              <w:t>Buka tautan di Google Chrome (iPhone: Safari).</w:t>
+            </w:r>
+          </w:p>
+        </w:tc>
+      </w:tr>
+      <w:tr>
+        <w:trPr>
+          <w:cantSplit/>
+        </w:trPr>
+        <w:tc>
+          <w:tcPr>
+            <w:tcW w:w="3300" w:type="dxa"/>
+            <w:tcBorders>
+              <w:top w:val="single" w:sz="4" w:space="0" w:color="C9D3DE"/>
+              <w:left w:val="single" w:sz="4" w:space="0" w:color="C9D3DE"/>
+              <w:bottom w:val="single" w:sz="4" w:space="0" w:color="C9D3DE"/>
+              <w:right w:val="single" w:sz="4" w:space="0" w:color="C9D3DE"/>
+            </w:tcBorders>
+            <w:shd w:val="clear" w:color="auto" w:fill="auto"/>
+            <w:tcMar>
+              <w:top w:w="70" w:type="dxa"/>
+              <w:left w:w="110" w:type="dxa"/>
+              <w:bottom w:w="70" w:type="dxa"/>
+              <w:right w:w="110" w:type="dxa"/>
+            </w:tcMar>
+          </w:tcPr>
+          <w:p>
+            <w:pPr>
+              <w:spacing w:after="30"/>
+            </w:pPr>
+            <w:r>
+              <w:rPr>
+                <w:sz w:val="19"/>
+                <w:szCs w:val="19"/>
+              </w:rPr>
+              <w:t>Izin mikrofon ditolak…</w:t>
+            </w:r>
+          </w:p>
+        </w:tc>
+        <w:tc>
+          <w:tcPr>
+            <w:tcW w:w="2600" w:type="dxa"/>
+            <w:tcBorders>
+              <w:top w:val="single" w:sz="4" w:space="0" w:color="C9D3DE"/>
+              <w:left w:val="single" w:sz="4" w:space="0" w:color="C9D3DE"/>
+              <w:bottom w:val="single" w:sz="4" w:space="0" w:color="C9D3DE"/>
+              <w:right w:val="single" w:sz="4" w:space="0" w:color="C9D3DE"/>
+            </w:tcBorders>
+            <w:shd w:val="clear" w:color="auto" w:fill="auto"/>
+            <w:tcMar>
+              <w:top w:w="70" w:type="dxa"/>
+              <w:left w:w="110" w:type="dxa"/>
+              <w:bottom w:w="70" w:type="dxa"/>
+              <w:right w:w="110" w:type="dxa"/>
+            </w:tcMar>
+          </w:tcPr>
+          <w:p>
+            <w:pPr>
+              <w:spacing w:after="30"/>
+            </w:pPr>
+            <w:r>
+              <w:rPr>
+                <w:sz w:val="19"/>
+                <w:szCs w:val="19"/>
+              </w:rPr>
+              <w:t>Siswa pernah menekan Blokir, atau izin mikrofon Chrome dimatikan di Setelan HP.</w:t>
+            </w:r>
+          </w:p>
+        </w:tc>
+        <w:tc>
+          <w:tcPr>
+            <w:tcW w:w="3738" w:type="dxa"/>
+            <w:tcBorders>
+              <w:top w:val="single" w:sz="4" w:space="0" w:color="C9D3DE"/>
+              <w:left w:val="single" w:sz="4" w:space="0" w:color="C9D3DE"/>
+              <w:bottom w:val="single" w:sz="4" w:space="0" w:color="C9D3DE"/>
+              <w:right w:val="single" w:sz="4" w:space="0" w:color="C9D3DE"/>
+            </w:tcBorders>
+            <w:shd w:val="clear" w:color="auto" w:fill="auto"/>
+            <w:tcMar>
+              <w:top w:w="70" w:type="dxa"/>
+              <w:left w:w="110" w:type="dxa"/>
+              <w:bottom w:w="70" w:type="dxa"/>
+              <w:right w:w="110" w:type="dxa"/>
+            </w:tcMar>
+          </w:tcPr>
+          <w:p>
+            <w:pPr>
+              <w:spacing w:after="30"/>
+            </w:pPr>
+            <w:r>
+              <w:rPr>
+                <w:sz w:val="19"/>
+                <w:szCs w:val="19"/>
+              </w:rPr>
+              <w:t>Ketuk ikon gembok di samping alamat, atur Mikrofon ke Izinkan, lalu muat ulang. Bila tetap gagal: Setelan HP → Aplikasi → Chrome → Izin → Mikrofon.</w:t>
+            </w:r>
+          </w:p>
+        </w:tc>
+      </w:tr>
+      <w:tr>
+        <w:trPr>
+          <w:cantSplit/>
+        </w:trPr>
+        <w:tc>
+          <w:tcPr>
+            <w:tcW w:w="3300" w:type="dxa"/>
+            <w:tcBorders>
+              <w:top w:val="single" w:sz="4" w:space="0" w:color="C9D3DE"/>
+              <w:left w:val="single" w:sz="4" w:space="0" w:color="C9D3DE"/>
+              <w:bottom w:val="single" w:sz="4" w:space="0" w:color="C9D3DE"/>
+              <w:right w:val="single" w:sz="4" w:space="0" w:color="C9D3DE"/>
+            </w:tcBorders>
+            <w:shd w:val="clear" w:color="auto" w:fill="F8FAFC"/>
+            <w:tcMar>
+              <w:top w:w="70" w:type="dxa"/>
+              <w:left w:w="110" w:type="dxa"/>
+              <w:bottom w:w="70" w:type="dxa"/>
+              <w:right w:w="110" w:type="dxa"/>
+            </w:tcMar>
+          </w:tcPr>
+          <w:p>
+            <w:pPr>
+              <w:spacing w:after="30"/>
+            </w:pPr>
+            <w:r>
+              <w:rPr>
+                <w:sz w:val="19"/>
+                <w:szCs w:val="19"/>
+              </w:rPr>
+              <w:t>Pengenal suara membutuhkan internet…</w:t>
+            </w:r>
+          </w:p>
+        </w:tc>
+        <w:tc>
+          <w:tcPr>
+            <w:tcW w:w="2600" w:type="dxa"/>
+            <w:tcBorders>
+              <w:top w:val="single" w:sz="4" w:space="0" w:color="C9D3DE"/>
+              <w:left w:val="single" w:sz="4" w:space="0" w:color="C9D3DE"/>
+              <w:bottom w:val="single" w:sz="4" w:space="0" w:color="C9D3DE"/>
+              <w:right w:val="single" w:sz="4" w:space="0" w:color="C9D3DE"/>
+            </w:tcBorders>
+            <w:shd w:val="clear" w:color="auto" w:fill="F8FAFC"/>
+            <w:tcMar>
+              <w:top w:w="70" w:type="dxa"/>
+              <w:left w:w="110" w:type="dxa"/>
+              <w:bottom w:w="70" w:type="dxa"/>
+              <w:right w:w="110" w:type="dxa"/>
+            </w:tcMar>
+          </w:tcPr>
+          <w:p>
+            <w:pPr>
+              <w:spacing w:after="30"/>
+            </w:pPr>
+            <w:r>
+              <w:rPr>
+                <w:sz w:val="19"/>
+                <w:szCs w:val="19"/>
+              </w:rPr>
+              <w:t>Sinyal lemah, Wi-Fi padat, atau VPN menyala.</w:t>
+            </w:r>
+          </w:p>
+        </w:tc>
+        <w:tc>
+          <w:tcPr>
+            <w:tcW w:w="3738" w:type="dxa"/>
+            <w:tcBorders>
+              <w:top w:val="single" w:sz="4" w:space="0" w:color="C9D3DE"/>
+              <w:left w:val="single" w:sz="4" w:space="0" w:color="C9D3DE"/>
+              <w:bottom w:val="single" w:sz="4" w:space="0" w:color="C9D3DE"/>
+              <w:right w:val="single" w:sz="4" w:space="0" w:color="C9D3DE"/>
+            </w:tcBorders>
+            <w:shd w:val="clear" w:color="auto" w:fill="F8FAFC"/>
+            <w:tcMar>
+              <w:top w:w="70" w:type="dxa"/>
+              <w:left w:w="110" w:type="dxa"/>
+              <w:bottom w:w="70" w:type="dxa"/>
+              <w:right w:w="110" w:type="dxa"/>
+            </w:tcMar>
+          </w:tcPr>
+          <w:p>
+            <w:pPr>
+              <w:spacing w:after="30"/>
+            </w:pPr>
+            <w:r>
+              <w:rPr>
+                <w:sz w:val="19"/>
+                <w:szCs w:val="19"/>
+              </w:rPr>
+              <w:t>Matikan VPN, pindah ke data seluler atau Wi-Fi lain, lalu coba lagi.</w:t>
+            </w:r>
+          </w:p>
+        </w:tc>
+      </w:tr>
+      <w:tr>
+        <w:trPr>
+          <w:cantSplit/>
+        </w:trPr>
+        <w:tc>
+          <w:tcPr>
+            <w:tcW w:w="3300" w:type="dxa"/>
+            <w:tcBorders>
+              <w:top w:val="single" w:sz="4" w:space="0" w:color="C9D3DE"/>
+              <w:left w:val="single" w:sz="4" w:space="0" w:color="C9D3DE"/>
+              <w:bottom w:val="single" w:sz="4" w:space="0" w:color="C9D3DE"/>
+              <w:right w:val="single" w:sz="4" w:space="0" w:color="C9D3DE"/>
+            </w:tcBorders>
+            <w:shd w:val="clear" w:color="auto" w:fill="auto"/>
+            <w:tcMar>
+              <w:top w:w="70" w:type="dxa"/>
+              <w:left w:w="110" w:type="dxa"/>
+              <w:bottom w:w="70" w:type="dxa"/>
+              <w:right w:w="110" w:type="dxa"/>
+            </w:tcMar>
+          </w:tcPr>
+          <w:p>
+            <w:pPr>
+              <w:spacing w:after="30"/>
+            </w:pPr>
+            <w:r>
+              <w:rPr>
+                <w:sz w:val="19"/>
+                <w:szCs w:val="19"/>
+              </w:rPr>
+              <w:lastRenderedPageBreak/>
+              <w:t>Pengenal suara tidak diizinkan di browser ini</w:t>
+            </w:r>
+          </w:p>
+        </w:tc>
+        <w:tc>
+          <w:tcPr>
+            <w:tcW w:w="2600" w:type="dxa"/>
+            <w:tcBorders>
+              <w:top w:val="single" w:sz="4" w:space="0" w:color="C9D3DE"/>
+              <w:left w:val="single" w:sz="4" w:space="0" w:color="C9D3DE"/>
+              <w:bottom w:val="single" w:sz="4" w:space="0" w:color="C9D3DE"/>
+              <w:right w:val="single" w:sz="4" w:space="0" w:color="C9D3DE"/>
+            </w:tcBorders>
+            <w:shd w:val="clear" w:color="auto" w:fill="auto"/>
+            <w:tcMar>
+              <w:top w:w="70" w:type="dxa"/>
+              <w:left w:w="110" w:type="dxa"/>
+              <w:bottom w:w="70" w:type="dxa"/>
+              <w:right w:w="110" w:type="dxa"/>
+            </w:tcMar>
+          </w:tcPr>
+          <w:p>
+            <w:pPr>
+              <w:spacing w:after="30"/>
+            </w:pPr>
+            <w:r>
+              <w:rPr>
+                <w:sz w:val="19"/>
+                <w:szCs w:val="19"/>
+              </w:rPr>
+              <w:t>Layanan suara Google di HP mati, atau browser bukan Chrome.</w:t>
+            </w:r>
+          </w:p>
+        </w:tc>
+        <w:tc>
+          <w:tcPr>
+            <w:tcW w:w="3738" w:type="dxa"/>
+            <w:tcBorders>
+              <w:top w:val="single" w:sz="4" w:space="0" w:color="C9D3DE"/>
+              <w:left w:val="single" w:sz="4" w:space="0" w:color="C9D3DE"/>
+              <w:bottom w:val="single" w:sz="4" w:space="0" w:color="C9D3DE"/>
+              <w:right w:val="single" w:sz="4" w:space="0" w:color="C9D3DE"/>
+            </w:tcBorders>
+            <w:shd w:val="clear" w:color="auto" w:fill="auto"/>
+            <w:tcMar>
+              <w:top w:w="70" w:type="dxa"/>
+              <w:left w:w="110" w:type="dxa"/>
+              <w:bottom w:w="70" w:type="dxa"/>
+              <w:right w:w="110" w:type="dxa"/>
+            </w:tcMar>
+          </w:tcPr>
+          <w:p>
+            <w:pPr>
+              <w:spacing w:after="30"/>
+            </w:pPr>
+            <w:r>
+              <w:rPr>
+                <w:sz w:val="19"/>
+                <w:szCs w:val="19"/>
+              </w:rPr>
+              <w:t>Pakai Chrome. Perbarui atau aktifkan aplikasi Google di Play Store.</w:t>
+            </w:r>
+          </w:p>
+        </w:tc>
+      </w:tr>
+      <w:tr>
+        <w:trPr>
+          <w:cantSplit/>
+        </w:trPr>
+        <w:tc>
+          <w:tcPr>
+            <w:tcW w:w="3300" w:type="dxa"/>
+            <w:tcBorders>
+              <w:top w:val="single" w:sz="4" w:space="0" w:color="C9D3DE"/>
+              <w:left w:val="single" w:sz="4" w:space="0" w:color="C9D3DE"/>
+              <w:bottom w:val="single" w:sz="4" w:space="0" w:color="C9D3DE"/>
+              <w:right w:val="single" w:sz="4" w:space="0" w:color="C9D3DE"/>
+            </w:tcBorders>
+            <w:shd w:val="clear" w:color="auto" w:fill="F8FAFC"/>
+            <w:tcMar>
+              <w:top w:w="70" w:type="dxa"/>
+              <w:left w:w="110" w:type="dxa"/>
+              <w:bottom w:w="70" w:type="dxa"/>
+              <w:right w:w="110" w:type="dxa"/>
+            </w:tcMar>
+          </w:tcPr>
+          <w:p>
+            <w:pPr>
+              <w:spacing w:after="30"/>
+            </w:pPr>
+            <w:r>
+              <w:rPr>
+                <w:sz w:val="19"/>
+                <w:szCs w:val="19"/>
+              </w:rPr>
+              <w:t>Mikrofon tidak ditemukan…</w:t>
+            </w:r>
+          </w:p>
+        </w:tc>
+        <w:tc>
+          <w:tcPr>
+            <w:tcW w:w="2600" w:type="dxa"/>
+            <w:tcBorders>
+              <w:top w:val="single" w:sz="4" w:space="0" w:color="C9D3DE"/>
+              <w:left w:val="single" w:sz="4" w:space="0" w:color="C9D3DE"/>
+              <w:bottom w:val="single" w:sz="4" w:space="0" w:color="C9D3DE"/>
+              <w:right w:val="single" w:sz="4" w:space="0" w:color="C9D3DE"/>
+            </w:tcBorders>
+            <w:shd w:val="clear" w:color="auto" w:fill="F8FAFC"/>
+            <w:tcMar>
+              <w:top w:w="70" w:type="dxa"/>
+              <w:left w:w="110" w:type="dxa"/>
+              <w:bottom w:w="70" w:type="dxa"/>
+              <w:right w:w="110" w:type="dxa"/>
+            </w:tcMar>
+          </w:tcPr>
+          <w:p>
+            <w:pPr>
+              <w:spacing w:after="30"/>
+            </w:pPr>
+            <w:r>
+              <w:rPr>
+                <w:sz w:val="19"/>
+                <w:szCs w:val="19"/>
+              </w:rPr>
+              <w:t>Mikrofon sedang dipakai aplikasi lain, atau headset bermasalah.</w:t>
+            </w:r>
+          </w:p>
+        </w:tc>
+        <w:tc>
+          <w:tcPr>
+            <w:tcW w:w="3738" w:type="dxa"/>
+            <w:tcBorders>
+              <w:top w:val="single" w:sz="4" w:space="0" w:color="C9D3DE"/>
+              <w:left w:val="single" w:sz="4" w:space="0" w:color="C9D3DE"/>
+              <w:bottom w:val="single" w:sz="4" w:space="0" w:color="C9D3DE"/>
+              <w:right w:val="single" w:sz="4" w:space="0" w:color="C9D3DE"/>
+            </w:tcBorders>
+            <w:shd w:val="clear" w:color="auto" w:fill="F8FAFC"/>
+            <w:tcMar>
+              <w:top w:w="70" w:type="dxa"/>
+              <w:left w:w="110" w:type="dxa"/>
+              <w:bottom w:w="70" w:type="dxa"/>
+              <w:right w:w="110" w:type="dxa"/>
+            </w:tcMar>
+          </w:tcPr>
+          <w:p>
+            <w:pPr>
+              <w:spacing w:after="30"/>
+            </w:pPr>
+            <w:r>
+              <w:rPr>
+                <w:sz w:val="19"/>
+                <w:szCs w:val="19"/>
+              </w:rPr>
+              <w:t>Tutup aplikasi lain yang memakai mikrofon (perekam, panggilan), lepas headset, lalu coba lagi.</w:t>
+            </w:r>
+          </w:p>
+        </w:tc>
+      </w:tr>
+      <w:tr>
+        <w:trPr>
+          <w:cantSplit/>
+        </w:trPr>
+        <w:tc>
+          <w:tcPr>
+            <w:tcW w:w="3300" w:type="dxa"/>
+            <w:tcBorders>
+              <w:top w:val="single" w:sz="4" w:space="0" w:color="C9D3DE"/>
+              <w:left w:val="single" w:sz="4" w:space="0" w:color="C9D3DE"/>
+              <w:bottom w:val="single" w:sz="4" w:space="0" w:color="C9D3DE"/>
+              <w:right w:val="single" w:sz="4" w:space="0" w:color="C9D3DE"/>
+            </w:tcBorders>
+            <w:shd w:val="clear" w:color="auto" w:fill="auto"/>
+            <w:tcMar>
+              <w:top w:w="70" w:type="dxa"/>
+              <w:left w:w="110" w:type="dxa"/>
+              <w:bottom w:w="70" w:type="dxa"/>
+              <w:right w:w="110" w:type="dxa"/>
+            </w:tcMar>
+          </w:tcPr>
+          <w:p>
+            <w:pPr>
+              <w:spacing w:after="30"/>
+            </w:pPr>
+            <w:r>
+              <w:rPr>
+                <w:sz w:val="19"/>
+                <w:szCs w:val="19"/>
+              </w:rPr>
+              <w:t>Bahasa Inggris tidak didukung pengenal suara…</w:t>
+            </w:r>
+          </w:p>
+        </w:tc>
+        <w:tc>
+          <w:tcPr>
+            <w:tcW w:w="2600" w:type="dxa"/>
+            <w:tcBorders>
+              <w:top w:val="single" w:sz="4" w:space="0" w:color="C9D3DE"/>
+              <w:left w:val="single" w:sz="4" w:space="0" w:color="C9D3DE"/>
+              <w:bottom w:val="single" w:sz="4" w:space="0" w:color="C9D3DE"/>
+              <w:right w:val="single" w:sz="4" w:space="0" w:color="C9D3DE"/>
+            </w:tcBorders>
+            <w:shd w:val="clear" w:color="auto" w:fill="auto"/>
+            <w:tcMar>
+              <w:top w:w="70" w:type="dxa"/>
+              <w:left w:w="110" w:type="dxa"/>
+              <w:bottom w:w="70" w:type="dxa"/>
+              <w:right w:w="110" w:type="dxa"/>
+            </w:tcMar>
+          </w:tcPr>
+          <w:p>
+            <w:pPr>
+              <w:spacing w:after="30"/>
+            </w:pPr>
+            <w:r>
+              <w:rPr>
+                <w:sz w:val="19"/>
+                <w:szCs w:val="19"/>
+              </w:rPr>
+              <w:t>Paket bahasa layanan suara Google di HP tidak lengkap.</w:t>
+            </w:r>
+          </w:p>
+        </w:tc>
+        <w:tc>
+          <w:tcPr>
+            <w:tcW w:w="3738" w:type="dxa"/>
+            <w:tcBorders>
+              <w:top w:val="single" w:sz="4" w:space="0" w:color="C9D3DE"/>
+              <w:left w:val="single" w:sz="4" w:space="0" w:color="C9D3DE"/>
+              <w:bottom w:val="single" w:sz="4" w:space="0" w:color="C9D3DE"/>
+              <w:right w:val="single" w:sz="4" w:space="0" w:color="C9D3DE"/>
+            </w:tcBorders>
+            <w:shd w:val="clear" w:color="auto" w:fill="auto"/>
+            <w:tcMar>
+              <w:top w:w="70" w:type="dxa"/>
+              <w:left w:w="110" w:type="dxa"/>
+              <w:bottom w:w="70" w:type="dxa"/>
+              <w:right w:w="110" w:type="dxa"/>
+            </w:tcMar>
+          </w:tcPr>
+          <w:p>
+            <w:pPr>
+              <w:spacing w:after="30"/>
+            </w:pPr>
+            <w:r>
+              <w:rPr>
+                <w:sz w:val="19"/>
+                <w:szCs w:val="19"/>
+              </w:rPr>
+              <w:t>Perbarui aplikasi Google. Bila tetap muncul, gunakan HP lain atau pakai Tanpa Baca (6.4).</w:t>
+            </w:r>
+          </w:p>
+        </w:tc>
+      </w:tr>
+      <w:tr>
+        <w:trPr>
+          <w:cantSplit/>
+        </w:trPr>
+        <w:tc>
+          <w:tcPr>
+            <w:tcW w:w="3300" w:type="dxa"/>
+            <w:tcBorders>
+              <w:top w:val="single" w:sz="4" w:space="0" w:color="C9D3DE"/>
+              <w:left w:val="single" w:sz="4" w:space="0" w:color="C9D3DE"/>
+              <w:bottom w:val="single" w:sz="4" w:space="0" w:color="C9D3DE"/>
+              <w:right w:val="single" w:sz="4" w:space="0" w:color="C9D3DE"/>
+            </w:tcBorders>
+            <w:shd w:val="clear" w:color="auto" w:fill="F8FAFC"/>
+            <w:tcMar>
+              <w:top w:w="70" w:type="dxa"/>
+              <w:left w:w="110" w:type="dxa"/>
+              <w:bottom w:w="70" w:type="dxa"/>
+              <w:right w:w="110" w:type="dxa"/>
+            </w:tcMar>
+          </w:tcPr>
+          <w:p>
+            <w:pPr>
+              <w:spacing w:after="30"/>
+            </w:pPr>
+            <w:r>
+              <w:rPr>
+                <w:sz w:val="19"/>
+                <w:szCs w:val="19"/>
+              </w:rPr>
+              <w:t>Pengenal suara gagal dinyalakan…</w:t>
+            </w:r>
+          </w:p>
+        </w:tc>
+        <w:tc>
+          <w:tcPr>
+            <w:tcW w:w="2600" w:type="dxa"/>
+            <w:tcBorders>
+              <w:top w:val="single" w:sz="4" w:space="0" w:color="C9D3DE"/>
+              <w:left w:val="single" w:sz="4" w:space="0" w:color="C9D3DE"/>
+              <w:bottom w:val="single" w:sz="4" w:space="0" w:color="C9D3DE"/>
+              <w:right w:val="single" w:sz="4" w:space="0" w:color="C9D3DE"/>
+            </w:tcBorders>
+            <w:shd w:val="clear" w:color="auto" w:fill="F8FAFC"/>
+            <w:tcMar>
+              <w:top w:w="70" w:type="dxa"/>
+              <w:left w:w="110" w:type="dxa"/>
+              <w:bottom w:w="70" w:type="dxa"/>
+              <w:right w:w="110" w:type="dxa"/>
+            </w:tcMar>
+          </w:tcPr>
+          <w:p>
+            <w:pPr>
+              <w:spacing w:after="30"/>
+            </w:pPr>
+            <w:r>
+              <w:rPr>
+                <w:sz w:val="19"/>
+                <w:szCs w:val="19"/>
+              </w:rPr>
+              <w:t>Browser macet sesaat.</w:t>
+            </w:r>
+          </w:p>
+        </w:tc>
+        <w:tc>
+          <w:tcPr>
+            <w:tcW w:w="3738" w:type="dxa"/>
+            <w:tcBorders>
+              <w:top w:val="single" w:sz="4" w:space="0" w:color="C9D3DE"/>
+              <w:left w:val="single" w:sz="4" w:space="0" w:color="C9D3DE"/>
+              <w:bottom w:val="single" w:sz="4" w:space="0" w:color="C9D3DE"/>
+              <w:right w:val="single" w:sz="4" w:space="0" w:color="C9D3DE"/>
+            </w:tcBorders>
+            <w:shd w:val="clear" w:color="auto" w:fill="F8FAFC"/>
+            <w:tcMar>
+              <w:top w:w="70" w:type="dxa"/>
+              <w:left w:w="110" w:type="dxa"/>
+              <w:bottom w:w="70" w:type="dxa"/>
+              <w:right w:w="110" w:type="dxa"/>
+            </w:tcMar>
+          </w:tcPr>
+          <w:p>
+            <w:pPr>
+              <w:spacing w:after="30"/>
+            </w:pPr>
+            <w:r>
+              <w:rPr>
+                <w:sz w:val="19"/>
+                <w:szCs w:val="19"/>
+              </w:rPr>
+              <w:t>Muat ulang halaman, lalu coba lagi.</w:t>
+            </w:r>
+          </w:p>
+        </w:tc>
+      </w:tr>
+      <w:tr>
+        <w:trPr>
+          <w:cantSplit/>
+        </w:trPr>
+        <w:tc>
+          <w:tcPr>
+            <w:tcW w:w="3300" w:type="dxa"/>
+            <w:tcBorders>
+              <w:top w:val="single" w:sz="4" w:space="0" w:color="C9D3DE"/>
+              <w:left w:val="single" w:sz="4" w:space="0" w:color="C9D3DE"/>
+              <w:bottom w:val="single" w:sz="4" w:space="0" w:color="C9D3DE"/>
+              <w:right w:val="single" w:sz="4" w:space="0" w:color="C9D3DE"/>
+            </w:tcBorders>
+            <w:shd w:val="clear" w:color="auto" w:fill="auto"/>
+            <w:tcMar>
+              <w:top w:w="70" w:type="dxa"/>
+              <w:left w:w="110" w:type="dxa"/>
+              <w:bottom w:w="70" w:type="dxa"/>
+              <w:right w:w="110" w:type="dxa"/>
+            </w:tcMar>
+          </w:tcPr>
+          <w:p>
+            <w:pPr>
+              <w:spacing w:after="30"/>
+            </w:pPr>
+            <w:r>
+              <w:rPr>
+                <w:sz w:val="19"/>
+                <w:szCs w:val="19"/>
+              </w:rPr>
+              <w:t>Mikrofon menangkap suaramu, tetapi pengenal suara belum mengenali kata apa pun…</w:t>
+            </w:r>
+          </w:p>
+        </w:tc>
+        <w:tc>
+          <w:tcPr>
+            <w:tcW w:w="2600" w:type="dxa"/>
+            <w:tcBorders>
+              <w:top w:val="single" w:sz="4" w:space="0" w:color="C9D3DE"/>
+              <w:left w:val="single" w:sz="4" w:space="0" w:color="C9D3DE"/>
+              <w:bottom w:val="single" w:sz="4" w:space="0" w:color="C9D3DE"/>
+              <w:right w:val="single" w:sz="4" w:space="0" w:color="C9D3DE"/>
+            </w:tcBorders>
+            <w:shd w:val="clear" w:color="auto" w:fill="auto"/>
+            <w:tcMar>
+              <w:top w:w="70" w:type="dxa"/>
+              <w:left w:w="110" w:type="dxa"/>
+              <w:bottom w:w="70" w:type="dxa"/>
+              <w:right w:w="110" w:type="dxa"/>
+            </w:tcMar>
+          </w:tcPr>
+          <w:p>
+            <w:pPr>
+              <w:spacing w:after="30"/>
+            </w:pPr>
+            <w:r>
+              <w:rPr>
+                <w:sz w:val="19"/>
+                <w:szCs w:val="19"/>
+              </w:rPr>
+              <w:t>Suara masuk ke HP, tetapi tidak sampai atau tidak dikenali server Google. Biasanya internet atau VPN.</w:t>
+            </w:r>
+          </w:p>
+        </w:tc>
+        <w:tc>
+          <w:tcPr>
+            <w:tcW w:w="3738" w:type="dxa"/>
+            <w:tcBorders>
+              <w:top w:val="single" w:sz="4" w:space="0" w:color="C9D3DE"/>
+              <w:left w:val="single" w:sz="4" w:space="0" w:color="C9D3DE"/>
+              <w:bottom w:val="single" w:sz="4" w:space="0" w:color="C9D3DE"/>
+              <w:right w:val="single" w:sz="4" w:space="0" w:color="C9D3DE"/>
+            </w:tcBorders>
+            <w:shd w:val="clear" w:color="auto" w:fill="auto"/>
+            <w:tcMar>
+              <w:top w:w="70" w:type="dxa"/>
+              <w:left w:w="110" w:type="dxa"/>
+              <w:bottom w:w="70" w:type="dxa"/>
+              <w:right w:w="110" w:type="dxa"/>
+            </w:tcMar>
+          </w:tcPr>
+          <w:p>
+            <w:pPr>
+              <w:spacing w:after="30"/>
+            </w:pPr>
+            <w:r>
+              <w:rPr>
+                <w:sz w:val="19"/>
+                <w:szCs w:val="19"/>
+              </w:rPr>
+              <w:t>Matikan VPN, pastikan internet lancar, baca teks bahasa Inggrisnya dengan jelas.</w:t>
+            </w:r>
+          </w:p>
+        </w:tc>
+      </w:tr>
+      <w:tr>
+        <w:trPr>
+          <w:cantSplit/>
+        </w:trPr>
+        <w:tc>
+          <w:tcPr>
+            <w:tcW w:w="3300" w:type="dxa"/>
+            <w:tcBorders>
+              <w:top w:val="single" w:sz="4" w:space="0" w:color="C9D3DE"/>
+              <w:left w:val="single" w:sz="4" w:space="0" w:color="C9D3DE"/>
+              <w:bottom w:val="single" w:sz="4" w:space="0" w:color="C9D3DE"/>
+              <w:right w:val="single" w:sz="4" w:space="0" w:color="C9D3DE"/>
+            </w:tcBorders>
+            <w:shd w:val="clear" w:color="auto" w:fill="F8FAFC"/>
+            <w:tcMar>
+              <w:top w:w="70" w:type="dxa"/>
+              <w:left w:w="110" w:type="dxa"/>
+              <w:bottom w:w="70" w:type="dxa"/>
+              <w:right w:w="110" w:type="dxa"/>
+            </w:tcMar>
+          </w:tcPr>
+          <w:p>
+            <w:pPr>
+              <w:spacing w:after="30"/>
+            </w:pPr>
+            <w:r>
+              <w:rPr>
+                <w:sz w:val="19"/>
+                <w:szCs w:val="19"/>
+              </w:rPr>
+              <w:t>Tidak ada suara yang terdengar…</w:t>
+            </w:r>
+          </w:p>
+        </w:tc>
+        <w:tc>
+          <w:tcPr>
+            <w:tcW w:w="2600" w:type="dxa"/>
+            <w:tcBorders>
+              <w:top w:val="single" w:sz="4" w:space="0" w:color="C9D3DE"/>
+              <w:left w:val="single" w:sz="4" w:space="0" w:color="C9D3DE"/>
+              <w:bottom w:val="single" w:sz="4" w:space="0" w:color="C9D3DE"/>
+              <w:right w:val="single" w:sz="4" w:space="0" w:color="C9D3DE"/>
+            </w:tcBorders>
+            <w:shd w:val="clear" w:color="auto" w:fill="F8FAFC"/>
+            <w:tcMar>
+              <w:top w:w="70" w:type="dxa"/>
+              <w:left w:w="110" w:type="dxa"/>
+              <w:bottom w:w="70" w:type="dxa"/>
+              <w:right w:w="110" w:type="dxa"/>
+            </w:tcMar>
+          </w:tcPr>
+          <w:p>
+            <w:pPr>
+              <w:spacing w:after="30"/>
+            </w:pPr>
+            <w:r>
+              <w:rPr>
+                <w:sz w:val="19"/>
+                <w:szCs w:val="19"/>
+              </w:rPr>
+              <w:t>Suara terlalu pelan, atau lubang mikrofon tertutup jari atau casing.</w:t>
+            </w:r>
+          </w:p>
+        </w:tc>
+        <w:tc>
+          <w:tcPr>
+            <w:tcW w:w="3738" w:type="dxa"/>
+            <w:tcBorders>
+              <w:top w:val="single" w:sz="4" w:space="0" w:color="C9D3DE"/>
+              <w:left w:val="single" w:sz="4" w:space="0" w:color="C9D3DE"/>
+              <w:bottom w:val="single" w:sz="4" w:space="0" w:color="C9D3DE"/>
+              <w:right w:val="single" w:sz="4" w:space="0" w:color="C9D3DE"/>
+            </w:tcBorders>
+            <w:shd w:val="clear" w:color="auto" w:fill="F8FAFC"/>
+            <w:tcMar>
+              <w:top w:w="70" w:type="dxa"/>
+              <w:left w:w="110" w:type="dxa"/>
+              <w:bottom w:w="70" w:type="dxa"/>
+              <w:right w:w="110" w:type="dxa"/>
+            </w:tcMar>
+          </w:tcPr>
+          <w:p>
+            <w:pPr>
+              <w:spacing w:after="30"/>
+            </w:pPr>
+            <w:r>
+              <w:rPr>
+                <w:sz w:val="19"/>
+                <w:szCs w:val="19"/>
+              </w:rPr>
+              <w:t>Dekatkan HP, baca lebih keras, pastikan lubang mikrofon tidak tertutup.</w:t>
+            </w:r>
+          </w:p>
+        </w:tc>
+      </w:tr>
+    </w:tbl>
+    <w:p>
+      <w:pPr>
+        <w:spacing w:after="140"/>
+      </w:pPr>
+    </w:p>
+    <w:p>
+      <w:pPr>
+        <w:pStyle w:val="Heading2"/>
+      </w:pPr>
+      <w:bookmarkStart w:id="39" w:name="_Toc244345605"/>
+      <w:r>
+        <w:t>6.3 Langkah perbaikan berurutan</w:t>
+      </w:r>
+      <w:bookmarkEnd w:id="39"/>
+    </w:p>
+    <w:p>
+      <w:pPr>
+        <w:spacing w:after="120" w:line="276" w:lineRule="auto"/>
+      </w:pPr>
+      <w:r>
+        <w:t>Jalankan langkah berikut berurutan. Sesudah tiap langkah, minta siswa menekan Baca &amp; Koreksi lagi.</w:t>
+      </w:r>
+    </w:p>
+    <w:p>
+      <w:pPr>
+        <w:pStyle w:val="ListParagraph"/>
+        <w:numPr>
+          <w:ilvl w:val="0"/>
+          <w:numId w:val="4"/>
+        </w:numPr>
+        <w:spacing w:after="60" w:line="276" w:lineRule="auto"/>
+      </w:pPr>
+      <w:r>
+        <w:t xml:space="preserve">Pastikan halaman terbuka di </w:t>
+      </w:r>
+      <w:r>
+        <w:rPr>
+          <w:b/>
+          <w:bCs/>
+        </w:rPr>
+        <w:t>Google Chrome</w:t>
+      </w:r>
+      <w:r>
+        <w:t xml:space="preserve"> (iPhone: </w:t>
+      </w:r>
+      <w:r>
+        <w:rPr>
+          <w:b/>
+          <w:bCs/>
+        </w:rPr>
+        <w:t>Safari</w:t>
+      </w:r>
+      <w:r>
+        <w:t>), bukan dari dalam WhatsApp atau aplikasi lain.</w:t>
+      </w:r>
+    </w:p>
+    <w:p>
+      <w:pPr>
+        <w:pStyle w:val="ListParagraph"/>
+        <w:numPr>
+          <w:ilvl w:val="0"/>
+          <w:numId w:val="4"/>
+        </w:numPr>
+        <w:spacing w:after="60" w:line="276" w:lineRule="auto"/>
+      </w:pPr>
+      <w:r>
+        <w:t xml:space="preserve">Ketuk </w:t>
+      </w:r>
+      <w:r>
+        <w:rPr>
+          <w:b/>
+          <w:bCs/>
+        </w:rPr>
+        <w:t>ikon gembok</w:t>
+      </w:r>
+      <w:r>
+        <w:t xml:space="preserve"> di samping alamat, lalu atur </w:t>
+      </w:r>
+      <w:r>
+        <w:rPr>
+          <w:b/>
+          <w:bCs/>
+        </w:rPr>
+        <w:t>Mikr</w:t>
+      </w:r>
+      <w:r>
+        <w:rPr>
+          <w:b/>
+          <w:bCs/>
+        </w:rPr>
+        <w:t>ofon</w:t>
+      </w:r>
+      <w:r>
+        <w:t xml:space="preserve"> ke </w:t>
+      </w:r>
+      <w:r>
+        <w:rPr>
+          <w:b/>
+          <w:bCs/>
+        </w:rPr>
+        <w:t>Izinkan</w:t>
+      </w:r>
+      <w:r>
+        <w:t>. Muat ulang halaman.</w:t>
+      </w:r>
+    </w:p>
+    <w:p>
+      <w:pPr>
+        <w:pStyle w:val="ListParagraph"/>
+        <w:numPr>
+          <w:ilvl w:val="0"/>
+          <w:numId w:val="4"/>
+        </w:numPr>
+        <w:spacing w:after="60" w:line="276" w:lineRule="auto"/>
+      </w:pPr>
+      <w:r>
+        <w:rPr>
+          <w:b/>
+          <w:bCs/>
+        </w:rPr>
+        <w:t>Matikan VPN</w:t>
+      </w:r>
+      <w:r>
+        <w:t xml:space="preserve"> dan pastikan internet lancar. Bila Wi-Fi sekolah padat, coba data seluler.</w:t>
+      </w:r>
+    </w:p>
+    <w:p>
+      <w:pPr>
+        <w:pStyle w:val="ListParagraph"/>
+        <w:numPr>
+          <w:ilvl w:val="0"/>
+          <w:numId w:val="4"/>
+        </w:numPr>
+        <w:spacing w:after="60" w:line="276" w:lineRule="auto"/>
+      </w:pPr>
+      <w:r>
+        <w:t xml:space="preserve">Perbarui </w:t>
+      </w:r>
+      <w:r>
+        <w:rPr>
+          <w:b/>
+          <w:bCs/>
+        </w:rPr>
+        <w:t>Chrome</w:t>
+      </w:r>
+      <w:r>
+        <w:t xml:space="preserve"> dan aplikasi </w:t>
+      </w:r>
+      <w:r>
+        <w:rPr>
+          <w:b/>
+          <w:bCs/>
+        </w:rPr>
+        <w:t>Google</w:t>
+      </w:r>
+      <w:r>
+        <w:t xml:space="preserve"> di Play Store. Di sebagian HP Android (Xiaomi, Oppo, Vivo, dll.) layanan suara Google perlu akti</w:t>
+      </w:r>
+      <w:r>
+        <w:t>f agar pengenal suara berjalan.</w:t>
+      </w:r>
+    </w:p>
+    <w:p>
+      <w:pPr>
+        <w:pStyle w:val="ListParagraph"/>
+        <w:numPr>
+          <w:ilvl w:val="0"/>
+          <w:numId w:val="4"/>
+        </w:numPr>
+        <w:spacing w:after="60" w:line="276" w:lineRule="auto"/>
+      </w:pPr>
+      <w:r>
+        <w:t xml:space="preserve">Di iPhone: Pengaturan → Umum → Papan Ketik → nyalakan </w:t>
+      </w:r>
+      <w:r>
+        <w:rPr>
+          <w:b/>
+          <w:bCs/>
+        </w:rPr>
+        <w:t>Aktifkan Dikte</w:t>
+      </w:r>
+      <w:r>
+        <w:t>.</w:t>
+      </w:r>
+    </w:p>
+    <w:p>
+      <w:pPr>
+        <w:pStyle w:val="ListParagraph"/>
+        <w:numPr>
+          <w:ilvl w:val="0"/>
+          <w:numId w:val="4"/>
+        </w:numPr>
+        <w:spacing w:after="60" w:line="276" w:lineRule="auto"/>
+      </w:pPr>
+      <w:r>
+        <w:t>Bila tetap gagal, minta siswa memakai HP lain, atau pasang Tanpa Baca untuk siswa itu (6.4).</w:t>
+      </w:r>
+    </w:p>
+    <w:p>
+      <w:pPr>
+        <w:spacing w:after="140"/>
+      </w:pPr>
+    </w:p>
+    <w:p>
+      <w:pPr>
+        <w:pStyle w:val="Heading2"/>
+      </w:pPr>
+      <w:bookmarkStart w:id="40" w:name="_Toc244345606"/>
+      <w:r>
+        <w:t>6.4 Bila tetap gagal: pasang Tanpa Baca</w:t>
+      </w:r>
+      <w:bookmarkEnd w:id="40"/>
+    </w:p>
+    <w:p>
+      <w:pPr>
+        <w:spacing w:after="120" w:line="276" w:lineRule="auto"/>
+      </w:pPr>
+      <w:r>
+        <w:t>Agar siswa tidak ter</w:t>
+      </w:r>
+      <w:r>
+        <w:t>tahan, matikan syarat membaca khusus untuk siswa tersebut:</w:t>
+      </w:r>
+    </w:p>
+    <w:p>
+      <w:pPr>
+        <w:pStyle w:val="ListParagraph"/>
+        <w:numPr>
+          <w:ilvl w:val="0"/>
+          <w:numId w:val="5"/>
+        </w:numPr>
+        <w:spacing w:after="60" w:line="276" w:lineRule="auto"/>
+      </w:pPr>
+      <w:r>
+        <w:t xml:space="preserve">Buat atau pilih </w:t>
+      </w:r>
+      <w:r>
+        <w:rPr>
+          <w:b/>
+          <w:bCs/>
+        </w:rPr>
+        <w:t>profil aturan</w:t>
+      </w:r>
+      <w:r>
+        <w:t xml:space="preserve"> yang isian </w:t>
+      </w:r>
+      <w:r>
+        <w:rPr>
+          <w:i/>
+          <w:iCs/>
+        </w:rPr>
+        <w:t>Baca teks dulu</w:t>
+      </w:r>
+      <w:r>
+        <w:t xml:space="preserve"> diatur </w:t>
+      </w:r>
+      <w:r>
+        <w:rPr>
+          <w:b/>
+          <w:bCs/>
+        </w:rPr>
+        <w:t>Tanpa Baca</w:t>
+      </w:r>
+      <w:r>
+        <w:t>.</w:t>
+      </w:r>
+    </w:p>
+    <w:p>
+      <w:pPr>
+        <w:pStyle w:val="ListParagraph"/>
+        <w:numPr>
+          <w:ilvl w:val="0"/>
+          <w:numId w:val="5"/>
+        </w:numPr>
+        <w:spacing w:after="60" w:line="276" w:lineRule="auto"/>
+      </w:pPr>
+      <w:r>
+        <w:t xml:space="preserve">Di </w:t>
+      </w:r>
+      <w:r>
+        <w:rPr>
+          <w:b/>
+          <w:bCs/>
+        </w:rPr>
+        <w:t>Sesi Kegiatan</w:t>
+      </w:r>
+      <w:r>
+        <w:t xml:space="preserve">, centang siswa itu, tekan </w:t>
+      </w:r>
+      <w:r>
+        <w:rPr>
+          <w:b/>
+          <w:bCs/>
+        </w:rPr>
+        <w:t>Atur aturan &amp; tahapan</w:t>
+      </w:r>
+      <w:r>
+        <w:t xml:space="preserve">, lalu pilih profil tadi sebagai </w:t>
+      </w:r>
+      <w:r>
+        <w:rPr>
+          <w:i/>
+          <w:iCs/>
+        </w:rPr>
+        <w:t>Aturan sesi</w:t>
+      </w:r>
+      <w:r>
+        <w:t>. Bisa juga lewat Analisis Siswa (bagian 4.12).</w:t>
+      </w:r>
+    </w:p>
+    <w:p>
+      <w:pPr>
+        <w:pStyle w:val="ListParagraph"/>
+        <w:numPr>
+          <w:ilvl w:val="0"/>
+          <w:numId w:val="5"/>
+        </w:numPr>
+        <w:spacing w:after="60" w:line="276" w:lineRule="auto"/>
+      </w:pPr>
+      <w:r>
+        <w:t xml:space="preserve">Tekan </w:t>
+      </w:r>
+      <w:r>
+        <w:rPr>
+          <w:b/>
+          <w:bCs/>
+        </w:rPr>
+        <w:t>Simpan</w:t>
+      </w:r>
+      <w:r>
+        <w:t xml:space="preserve">. Siswa memuat ulang halamannya. Bila HP-nya sudah beres, kembalikan ke </w:t>
+      </w:r>
+      <w:r>
+        <w:rPr>
+          <w:b/>
+          <w:bCs/>
+        </w:rPr>
+        <w:t>Ikut rombel</w:t>
+      </w:r>
+      <w:r>
+        <w:t>.</w:t>
+      </w:r>
+    </w:p>
+    <w:tbl>
+      <w:tblPr>
+        <w:tblW w:w="9638" w:type="dxa"/>
+        <w:tblBorders>
+          <w:top w:val="single" w:sz="4" w:space="0" w:color="auto"/>
+          <w:left w:val="single" w:sz="4" w:space="0" w:color="auto"/>
+          <w:bottom w:val="single" w:sz="4" w:space="0" w:color="auto"/>
+          <w:right w:val="single" w:sz="4" w:space="0" w:color="auto"/>
+          <w:insideH w:val="single" w:sz="4" w:space="0" w:color="auto"/>
+          <w:insideV w:val="single" w:sz="4" w:space="0" w:color="auto"/>
+        </w:tblBorders>
+        <w:tblLook w:val="04A0" w:firstRow="1" w:lastRow="0" w:firstColumn="1" w:lastColumn="0" w:noHBand="0" w:noVBand="1"/>
+      </w:tblPr>
+      <w:tblGrid>
+        <w:gridCol w:w="9638"/>
+      </w:tblGrid>
+      <w:tr>
+        <w:trPr>
+          <w:cantSplit/>
+        </w:trPr>
+        <w:tc>
+          <w:tcPr>
+            <w:tcW w:w="9638" w:type="dxa"/>
+            <w:tcBorders>
+              <w:top w:val="single" w:sz="4" w:space="0" w:color="FBEAEA"/>
+              <w:left w:val="single" w:sz="24" w:space="0" w:color="B83232"/>
+              <w:bottom w:val="single" w:sz="4" w:space="0" w:color="FBEAEA"/>
+              <w:right w:val="single" w:sz="4" w:space="0" w:color="FBEAEA"/>
+            </w:tcBorders>
+            <w:shd w:val="clear" w:color="auto" w:fill="FBEAEA"/>
+            <w:tcMar>
+              <w:top w:w="110" w:type="dxa"/>
+              <w:left w:w="200" w:type="dxa"/>
+              <w:bottom w:w="110" w:type="dxa"/>
+              <w:right w:w="160" w:type="dxa"/>
+            </w:tcMar>
+          </w:tcPr>
+          <w:p>
+            <w:pPr>
+              <w:spacing w:after="60"/>
+            </w:pPr>
+            <w:r>
+              <w:rPr>
+                <w:b/>
+                <w:bCs/>
+                <w:color w:val="B83232"/>
+                <w:sz w:val="20"/>
+                <w:szCs w:val="20"/>
+              </w:rPr>
+              <w:t>Hati-hati</w:t>
+            </w:r>
+          </w:p>
+          <w:p>
+            <w:pPr>
+              <w:spacing w:after="50" w:line="264" w:lineRule="auto"/>
+            </w:pPr>
+            <w:r>
+              <w:rPr>
+                <w:sz w:val="19"/>
+                <w:szCs w:val="19"/>
+              </w:rPr>
+              <w:t xml:space="preserve">Tanpa Baca hanya melepas syarat membaca teks sebelum sub </w:t>
+            </w:r>
+            <w:r>
+              <w:rPr>
+                <w:sz w:val="19"/>
+                <w:szCs w:val="19"/>
+              </w:rPr>
+              <w:t xml:space="preserve">level. Soal </w:t>
+            </w:r>
+            <w:r>
+              <w:rPr>
+                <w:b/>
+                <w:bCs/>
+                <w:sz w:val="19"/>
+                <w:szCs w:val="19"/>
+              </w:rPr>
+              <w:t>🎤</w:t>
+            </w:r>
+            <w:r>
+              <w:rPr>
+                <w:b/>
+                <w:bCs/>
+                <w:sz w:val="19"/>
+                <w:szCs w:val="19"/>
+              </w:rPr>
+              <w:t xml:space="preserve"> Ucapkan</w:t>
+            </w:r>
+            <w:r>
+              <w:rPr>
+                <w:sz w:val="19"/>
+                <w:szCs w:val="19"/>
+              </w:rPr>
+              <w:t xml:space="preserve"> di dalam sub level tetap memakai mikrofon. Bila sub level berisi soal Ucapkan, siswa tetap memerlukan HP yang perekamannya berfungsi.</w:t>
+            </w:r>
+          </w:p>
+          <w:p>
+            <w:pPr>
+              <w:spacing w:after="50" w:line="264" w:lineRule="auto"/>
+            </w:pPr>
+            <w:r>
+              <w:rPr>
+                <w:sz w:val="19"/>
+                <w:szCs w:val="19"/>
+              </w:rPr>
+              <w:t>Untuk satu kelas yang sinyalnya buruk, Tanpa Baca bisa dipasang di profil aturan rombel. Kembalikan</w:t>
+            </w:r>
+            <w:r>
+              <w:rPr>
+                <w:sz w:val="19"/>
+                <w:szCs w:val="19"/>
+              </w:rPr>
+              <w:t xml:space="preserve"> ke Harus Baca bila keadaan sudah normal.</w:t>
+            </w:r>
+          </w:p>
+        </w:tc>
+      </w:tr>
+    </w:tbl>
+    <w:p>
+      <w:pPr>
+        <w:spacing w:after="140"/>
+      </w:pPr>
+    </w:p>
+    <w:p>
+      <w:pPr>
+        <w:pStyle w:val="Heading2"/>
+      </w:pPr>
+      <w:bookmarkStart w:id="41" w:name="_Toc244345607"/>
+      <w:r>
+        <w:lastRenderedPageBreak/>
+        <w:t>6.5 Mencegah sebelum sesi</w:t>
+      </w:r>
+      <w:bookmarkEnd w:id="41"/>
+    </w:p>
+    <w:p>
+      <w:pPr>
+        <w:pStyle w:val="ListParagraph"/>
+        <w:numPr>
+          <w:ilvl w:val="0"/>
+          <w:numId w:val="2"/>
+        </w:numPr>
+        <w:spacing w:after="60" w:line="276" w:lineRule="auto"/>
+      </w:pPr>
+      <w:r>
+        <w:t>Bagikan tautan atau QR yang dibuka langsung di Chrome, bukan diteruskan lewat grup WhatsApp.</w:t>
+      </w:r>
+    </w:p>
+    <w:p>
+      <w:pPr>
+        <w:pStyle w:val="ListParagraph"/>
+        <w:numPr>
+          <w:ilvl w:val="0"/>
+          <w:numId w:val="2"/>
+        </w:numPr>
+        <w:spacing w:after="60" w:line="276" w:lineRule="auto"/>
+      </w:pPr>
+      <w:r>
+        <w:t>Minta siswa mencoba Baca &amp; Koreksi sekali sebelum sesi pertama, agar izin mikrofon sudah dibe</w:t>
+      </w:r>
+      <w:r>
+        <w:t>rikan.</w:t>
+      </w:r>
+    </w:p>
+    <w:p>
+      <w:pPr>
+        <w:pStyle w:val="ListParagraph"/>
+        <w:numPr>
+          <w:ilvl w:val="0"/>
+          <w:numId w:val="2"/>
+        </w:numPr>
+        <w:spacing w:after="60" w:line="276" w:lineRule="auto"/>
+      </w:pPr>
+      <w:r>
+        <w:t>Ingatkan siswa mematikan VPN dan aplikasi penghemat data yang memblokir browser.</w:t>
+      </w:r>
+    </w:p>
+    <w:p>
+      <w:pPr>
+        <w:pStyle w:val="ListParagraph"/>
+        <w:numPr>
+          <w:ilvl w:val="0"/>
+          <w:numId w:val="2"/>
+        </w:numPr>
+        <w:spacing w:after="60" w:line="276" w:lineRule="auto"/>
+      </w:pPr>
+      <w:r>
+        <w:t>Ruang yang tenang membantu pengenal suara mengenali kata dengan benar.</w:t>
+      </w:r>
+    </w:p>
+    <w:p>
+      <w:pPr>
+        <w:spacing w:after="140"/>
       </w:pPr>
     </w:p>
     <w:sectPr>
@@ -32093,6 +34524,18 @@
       <w:startOverride w:val="1"/>
     </w:lvlOverride>
   </w:num>
+  <w:num w:numId="4">
+    <w:abstractNumId w:val="0"/>
+    <w:lvlOverride w:ilvl="0">
+      <w:startOverride w:val="1"/>
+    </w:lvlOverride>
+  </w:num>
+  <w:num w:numId="5">
+    <w:abstractNumId w:val="0"/>
+    <w:lvlOverride w:ilvl="0">
+      <w:startOverride w:val="1"/>
+    </w:lvlOverride>
+  </w:num>
 </w:numbering>
 </file>
 

</xml_diff>

<commit_message>
Penjelasan rinci bila perekaman gagal (penyebab, langkah, alasan bukan kerusakan aplikasi) + tips rekaman; panduan 6.2 diperbarui
Co-Authored-By: Claude Opus 5.5 <noreply@anthropic.com>
</commit_message>
<xml_diff>
--- a/Panduan_Membaca_Data_English_Reading.docx
+++ b/Panduan_Membaca_Data_English_Reading.docx
@@ -191,7 +191,7 @@
           <w:r>
             <w:fldChar w:fldCharType="separate"/>
           </w:r>
-          <w:hyperlink w:anchor="_Toc244345566" w:history="1">
+          <w:hyperlink w:anchor="_Toc244361673" w:history="1">
             <w:r>
               <w:rPr>
                 <w:rStyle w:val="Hyperlink"/>
@@ -215,7 +215,7 @@
               <w:rPr>
                 <w:noProof/>
               </w:rPr>
-              <w:instrText xml:space="preserve"> PAGEREF _Toc244345566 \h </w:instrText>
+              <w:instrText xml:space="preserve"> PAGEREF _Toc244361673 \h </w:instrText>
             </w:r>
             <w:r>
               <w:rPr>
@@ -255,7 +255,7 @@
               <w:szCs w:val="22"/>
             </w:rPr>
           </w:pPr>
-          <w:hyperlink w:anchor="_Toc244345567" w:history="1">
+          <w:hyperlink w:anchor="_Toc244361674" w:history="1">
             <w:r>
               <w:rPr>
                 <w:rStyle w:val="Hyperlink"/>
@@ -279,7 +279,7 @@
               <w:rPr>
                 <w:noProof/>
               </w:rPr>
-              <w:instrText xml:space="preserve"> PAGEREF _Toc244345567 \h </w:instrText>
+              <w:instrText xml:space="preserve"> PAGEREF _Toc244361674 \h </w:instrText>
             </w:r>
             <w:r>
               <w:rPr>
@@ -319,7 +319,7 @@
               <w:szCs w:val="22"/>
             </w:rPr>
           </w:pPr>
-          <w:hyperlink w:anchor="_Toc244345568" w:history="1">
+          <w:hyperlink w:anchor="_Toc244361675" w:history="1">
             <w:r>
               <w:rPr>
                 <w:rStyle w:val="Hyperlink"/>
@@ -343,7 +343,7 @@
               <w:rPr>
                 <w:noProof/>
               </w:rPr>
-              <w:instrText xml:space="preserve"> PAGEREF _Toc244345568 \h </w:instrText>
+              <w:instrText xml:space="preserve"> PAGEREF _Toc244361675 \h </w:instrText>
             </w:r>
             <w:r>
               <w:rPr>
@@ -383,7 +383,7 @@
               <w:szCs w:val="22"/>
             </w:rPr>
           </w:pPr>
-          <w:hyperlink w:anchor="_Toc244345569" w:history="1">
+          <w:hyperlink w:anchor="_Toc244361676" w:history="1">
             <w:r>
               <w:rPr>
                 <w:rStyle w:val="Hyperlink"/>
@@ -407,7 +407,7 @@
               <w:rPr>
                 <w:noProof/>
               </w:rPr>
-              <w:instrText xml:space="preserve"> PAGEREF _Toc244345569 \h </w:instrText>
+              <w:instrText xml:space="preserve"> PAGEREF _Toc244361676 \h </w:instrText>
             </w:r>
             <w:r>
               <w:rPr>
@@ -447,7 +447,7 @@
               <w:szCs w:val="22"/>
             </w:rPr>
           </w:pPr>
-          <w:hyperlink w:anchor="_Toc244345570" w:history="1">
+          <w:hyperlink w:anchor="_Toc244361677" w:history="1">
             <w:r>
               <w:rPr>
                 <w:rStyle w:val="Hyperlink"/>
@@ -471,7 +471,7 @@
               <w:rPr>
                 <w:noProof/>
               </w:rPr>
-              <w:instrText xml:space="preserve"> PAGEREF _Toc244345570 \h </w:instrText>
+              <w:instrText xml:space="preserve"> PAGEREF _Toc244361677 \h </w:instrText>
             </w:r>
             <w:r>
               <w:rPr>
@@ -511,7 +511,7 @@
               <w:szCs w:val="22"/>
             </w:rPr>
           </w:pPr>
-          <w:hyperlink w:anchor="_Toc244345571" w:history="1">
+          <w:hyperlink w:anchor="_Toc244361678" w:history="1">
             <w:r>
               <w:rPr>
                 <w:rStyle w:val="Hyperlink"/>
@@ -535,7 +535,7 @@
               <w:rPr>
                 <w:noProof/>
               </w:rPr>
-              <w:instrText xml:space="preserve"> PAGEREF _Toc244345571 \h </w:instrText>
+              <w:instrText xml:space="preserve"> PAGEREF _Toc244361678 \h </w:instrText>
             </w:r>
             <w:r>
               <w:rPr>
@@ -575,7 +575,7 @@
               <w:szCs w:val="22"/>
             </w:rPr>
           </w:pPr>
-          <w:hyperlink w:anchor="_Toc244345572" w:history="1">
+          <w:hyperlink w:anchor="_Toc244361679" w:history="1">
             <w:r>
               <w:rPr>
                 <w:rStyle w:val="Hyperlink"/>
@@ -599,7 +599,7 @@
               <w:rPr>
                 <w:noProof/>
               </w:rPr>
-              <w:instrText xml:space="preserve"> PAGEREF _Toc244345572 \h </w:instrText>
+              <w:instrText xml:space="preserve"> PAGEREF _Toc244361679 \h </w:instrText>
             </w:r>
             <w:r>
               <w:rPr>
@@ -639,7 +639,7 @@
               <w:szCs w:val="22"/>
             </w:rPr>
           </w:pPr>
-          <w:hyperlink w:anchor="_Toc244345573" w:history="1">
+          <w:hyperlink w:anchor="_Toc244361680" w:history="1">
             <w:r>
               <w:rPr>
                 <w:rStyle w:val="Hyperlink"/>
@@ -663,7 +663,7 @@
               <w:rPr>
                 <w:noProof/>
               </w:rPr>
-              <w:instrText xml:space="preserve"> PAGEREF _Toc244345573 \h </w:instrText>
+              <w:instrText xml:space="preserve"> PAGEREF _Toc244361680 \h </w:instrText>
             </w:r>
             <w:r>
               <w:rPr>
@@ -703,7 +703,7 @@
               <w:szCs w:val="22"/>
             </w:rPr>
           </w:pPr>
-          <w:hyperlink w:anchor="_Toc244345574" w:history="1">
+          <w:hyperlink w:anchor="_Toc244361681" w:history="1">
             <w:r>
               <w:rPr>
                 <w:rStyle w:val="Hyperlink"/>
@@ -727,7 +727,7 @@
               <w:rPr>
                 <w:noProof/>
               </w:rPr>
-              <w:instrText xml:space="preserve"> PAGEREF _Toc244345574 \h </w:instrText>
+              <w:instrText xml:space="preserve"> PAGEREF _Toc244361681 \h </w:instrText>
             </w:r>
             <w:r>
               <w:rPr>
@@ -767,7 +767,7 @@
               <w:szCs w:val="22"/>
             </w:rPr>
           </w:pPr>
-          <w:hyperlink w:anchor="_Toc244345575" w:history="1">
+          <w:hyperlink w:anchor="_Toc244361682" w:history="1">
             <w:r>
               <w:rPr>
                 <w:rStyle w:val="Hyperlink"/>
@@ -791,7 +791,7 @@
               <w:rPr>
                 <w:noProof/>
               </w:rPr>
-              <w:instrText xml:space="preserve"> PAGEREF _Toc244345575 \h </w:instrText>
+              <w:instrText xml:space="preserve"> PAGEREF _Toc244361682 \h </w:instrText>
             </w:r>
             <w:r>
               <w:rPr>
@@ -831,7 +831,7 @@
               <w:szCs w:val="22"/>
             </w:rPr>
           </w:pPr>
-          <w:hyperlink w:anchor="_Toc244345576" w:history="1">
+          <w:hyperlink w:anchor="_Toc244361683" w:history="1">
             <w:r>
               <w:rPr>
                 <w:rStyle w:val="Hyperlink"/>
@@ -855,7 +855,7 @@
               <w:rPr>
                 <w:noProof/>
               </w:rPr>
-              <w:instrText xml:space="preserve"> PAGEREF _Toc244345576 \h </w:instrText>
+              <w:instrText xml:space="preserve"> PAGEREF _Toc244361683 \h </w:instrText>
             </w:r>
             <w:r>
               <w:rPr>
@@ -895,7 +895,7 @@
               <w:szCs w:val="22"/>
             </w:rPr>
           </w:pPr>
-          <w:hyperlink w:anchor="_Toc244345577" w:history="1">
+          <w:hyperlink w:anchor="_Toc244361684" w:history="1">
             <w:r>
               <w:rPr>
                 <w:rStyle w:val="Hyperlink"/>
@@ -919,7 +919,7 @@
               <w:rPr>
                 <w:noProof/>
               </w:rPr>
-              <w:instrText xml:space="preserve"> PAGEREF _Toc244345577 \h </w:instrText>
+              <w:instrText xml:space="preserve"> PAGEREF _Toc244361684 \h </w:instrText>
             </w:r>
             <w:r>
               <w:rPr>
@@ -959,7 +959,7 @@
               <w:szCs w:val="22"/>
             </w:rPr>
           </w:pPr>
-          <w:hyperlink w:anchor="_Toc244345578" w:history="1">
+          <w:hyperlink w:anchor="_Toc244361685" w:history="1">
             <w:r>
               <w:rPr>
                 <w:rStyle w:val="Hyperlink"/>
@@ -983,7 +983,7 @@
               <w:rPr>
                 <w:noProof/>
               </w:rPr>
-              <w:instrText xml:space="preserve"> PAGEREF _Toc244345578 \h </w:instrText>
+              <w:instrText xml:space="preserve"> PAGEREF _Toc244361685 \h </w:instrText>
             </w:r>
             <w:r>
               <w:rPr>
@@ -1023,7 +1023,7 @@
               <w:szCs w:val="22"/>
             </w:rPr>
           </w:pPr>
-          <w:hyperlink w:anchor="_Toc244345579" w:history="1">
+          <w:hyperlink w:anchor="_Toc244361686" w:history="1">
             <w:r>
               <w:rPr>
                 <w:rStyle w:val="Hyperlink"/>
@@ -1047,7 +1047,7 @@
               <w:rPr>
                 <w:noProof/>
               </w:rPr>
-              <w:instrText xml:space="preserve"> PAGEREF _Toc244345579 \h </w:instrText>
+              <w:instrText xml:space="preserve"> PAGEREF _Toc244361686 \h </w:instrText>
             </w:r>
             <w:r>
               <w:rPr>
@@ -1087,7 +1087,7 @@
               <w:szCs w:val="22"/>
             </w:rPr>
           </w:pPr>
-          <w:hyperlink w:anchor="_Toc244345580" w:history="1">
+          <w:hyperlink w:anchor="_Toc244361687" w:history="1">
             <w:r>
               <w:rPr>
                 <w:rStyle w:val="Hyperlink"/>
@@ -1111,7 +1111,7 @@
               <w:rPr>
                 <w:noProof/>
               </w:rPr>
-              <w:instrText xml:space="preserve"> PAGEREF _Toc244345580 \h </w:instrText>
+              <w:instrText xml:space="preserve"> PAGEREF _Toc244361687 \h </w:instrText>
             </w:r>
             <w:r>
               <w:rPr>
@@ -1151,7 +1151,7 @@
               <w:szCs w:val="22"/>
             </w:rPr>
           </w:pPr>
-          <w:hyperlink w:anchor="_Toc244345581" w:history="1">
+          <w:hyperlink w:anchor="_Toc244361688" w:history="1">
             <w:r>
               <w:rPr>
                 <w:rStyle w:val="Hyperlink"/>
@@ -1175,7 +1175,7 @@
               <w:rPr>
                 <w:noProof/>
               </w:rPr>
-              <w:instrText xml:space="preserve"> PAGEREF _Toc244345581 \h </w:instrText>
+              <w:instrText xml:space="preserve"> PAGEREF _Toc244361688 \h </w:instrText>
             </w:r>
             <w:r>
               <w:rPr>
@@ -1215,7 +1215,7 @@
               <w:szCs w:val="22"/>
             </w:rPr>
           </w:pPr>
-          <w:hyperlink w:anchor="_Toc244345582" w:history="1">
+          <w:hyperlink w:anchor="_Toc244361689" w:history="1">
             <w:r>
               <w:rPr>
                 <w:rStyle w:val="Hyperlink"/>
@@ -1239,7 +1239,7 @@
               <w:rPr>
                 <w:noProof/>
               </w:rPr>
-              <w:instrText xml:space="preserve"> PAGEREF _Toc244345582 \h </w:instrText>
+              <w:instrText xml:space="preserve"> PAGEREF _Toc244361689 \h </w:instrText>
             </w:r>
             <w:r>
               <w:rPr>
@@ -1279,7 +1279,7 @@
               <w:szCs w:val="22"/>
             </w:rPr>
           </w:pPr>
-          <w:hyperlink w:anchor="_Toc244345583" w:history="1">
+          <w:hyperlink w:anchor="_Toc244361690" w:history="1">
             <w:r>
               <w:rPr>
                 <w:rStyle w:val="Hyperlink"/>
@@ -1303,7 +1303,7 @@
               <w:rPr>
                 <w:noProof/>
               </w:rPr>
-              <w:instrText xml:space="preserve"> PAGEREF _Toc244345583 \h </w:instrText>
+              <w:instrText xml:space="preserve"> PAGEREF _Toc244361690 \h </w:instrText>
             </w:r>
             <w:r>
               <w:rPr>
@@ -1343,7 +1343,7 @@
               <w:szCs w:val="22"/>
             </w:rPr>
           </w:pPr>
-          <w:hyperlink w:anchor="_Toc244345584" w:history="1">
+          <w:hyperlink w:anchor="_Toc244361691" w:history="1">
             <w:r>
               <w:rPr>
                 <w:rStyle w:val="Hyperlink"/>
@@ -1367,7 +1367,7 @@
               <w:rPr>
                 <w:noProof/>
               </w:rPr>
-              <w:instrText xml:space="preserve"> PAGEREF _Toc244345584 \h </w:instrText>
+              <w:instrText xml:space="preserve"> PAGEREF _Toc244361691 \h </w:instrText>
             </w:r>
             <w:r>
               <w:rPr>
@@ -1407,7 +1407,7 @@
               <w:szCs w:val="22"/>
             </w:rPr>
           </w:pPr>
-          <w:hyperlink w:anchor="_Toc244345585" w:history="1">
+          <w:hyperlink w:anchor="_Toc244361692" w:history="1">
             <w:r>
               <w:rPr>
                 <w:rStyle w:val="Hyperlink"/>
@@ -1431,7 +1431,7 @@
               <w:rPr>
                 <w:noProof/>
               </w:rPr>
-              <w:instrText xml:space="preserve"> PAGEREF _Toc244345585 \h </w:instrText>
+              <w:instrText xml:space="preserve"> PAGEREF _Toc244361692 \h </w:instrText>
             </w:r>
             <w:r>
               <w:rPr>
@@ -1471,7 +1471,7 @@
               <w:szCs w:val="22"/>
             </w:rPr>
           </w:pPr>
-          <w:hyperlink w:anchor="_Toc244345586" w:history="1">
+          <w:hyperlink w:anchor="_Toc244361693" w:history="1">
             <w:r>
               <w:rPr>
                 <w:rStyle w:val="Hyperlink"/>
@@ -1495,7 +1495,7 @@
               <w:rPr>
                 <w:noProof/>
               </w:rPr>
-              <w:instrText xml:space="preserve"> PAGEREF _Toc244345586 \h </w:instrText>
+              <w:instrText xml:space="preserve"> PAGEREF _Toc244361693 \h </w:instrText>
             </w:r>
             <w:r>
               <w:rPr>
@@ -1535,7 +1535,7 @@
               <w:szCs w:val="22"/>
             </w:rPr>
           </w:pPr>
-          <w:hyperlink w:anchor="_Toc244345587" w:history="1">
+          <w:hyperlink w:anchor="_Toc244361694" w:history="1">
             <w:r>
               <w:rPr>
                 <w:rStyle w:val="Hyperlink"/>
@@ -1559,7 +1559,7 @@
               <w:rPr>
                 <w:noProof/>
               </w:rPr>
-              <w:instrText xml:space="preserve"> PAGEREF _Toc244345587 \h </w:instrText>
+              <w:instrText xml:space="preserve"> PAGEREF _Toc244361694 \h </w:instrText>
             </w:r>
             <w:r>
               <w:rPr>
@@ -1599,7 +1599,7 @@
               <w:szCs w:val="22"/>
             </w:rPr>
           </w:pPr>
-          <w:hyperlink w:anchor="_Toc244345588" w:history="1">
+          <w:hyperlink w:anchor="_Toc244361695" w:history="1">
             <w:r>
               <w:rPr>
                 <w:rStyle w:val="Hyperlink"/>
@@ -1623,7 +1623,7 @@
               <w:rPr>
                 <w:noProof/>
               </w:rPr>
-              <w:instrText xml:space="preserve"> PAGEREF _Toc244345588 \h </w:instrText>
+              <w:instrText xml:space="preserve"> PAGEREF _Toc244361695 \h </w:instrText>
             </w:r>
             <w:r>
               <w:rPr>
@@ -1663,7 +1663,7 @@
               <w:szCs w:val="22"/>
             </w:rPr>
           </w:pPr>
-          <w:hyperlink w:anchor="_Toc244345589" w:history="1">
+          <w:hyperlink w:anchor="_Toc244361696" w:history="1">
             <w:r>
               <w:rPr>
                 <w:rStyle w:val="Hyperlink"/>
@@ -1687,7 +1687,7 @@
               <w:rPr>
                 <w:noProof/>
               </w:rPr>
-              <w:instrText xml:space="preserve"> PAGEREF _Toc244345589 \h </w:instrText>
+              <w:instrText xml:space="preserve"> PAGEREF _Toc244361696 \h </w:instrText>
             </w:r>
             <w:r>
               <w:rPr>
@@ -1727,7 +1727,7 @@
               <w:szCs w:val="22"/>
             </w:rPr>
           </w:pPr>
-          <w:hyperlink w:anchor="_Toc244345590" w:history="1">
+          <w:hyperlink w:anchor="_Toc244361697" w:history="1">
             <w:r>
               <w:rPr>
                 <w:rStyle w:val="Hyperlink"/>
@@ -1751,7 +1751,7 @@
               <w:rPr>
                 <w:noProof/>
               </w:rPr>
-              <w:instrText xml:space="preserve"> PAGEREF _Toc244345590 \h </w:instrText>
+              <w:instrText xml:space="preserve"> PAGEREF _Toc244361697 \h </w:instrText>
             </w:r>
             <w:r>
               <w:rPr>
@@ -1791,7 +1791,7 @@
               <w:szCs w:val="22"/>
             </w:rPr>
           </w:pPr>
-          <w:hyperlink w:anchor="_Toc244345591" w:history="1">
+          <w:hyperlink w:anchor="_Toc244361698" w:history="1">
             <w:r>
               <w:rPr>
                 <w:rStyle w:val="Hyperlink"/>
@@ -1815,7 +1815,7 @@
               <w:rPr>
                 <w:noProof/>
               </w:rPr>
-              <w:instrText xml:space="preserve"> PAGEREF _Toc244345591 \h </w:instrText>
+              <w:instrText xml:space="preserve"> PAGEREF _Toc244361698 \h </w:instrText>
             </w:r>
             <w:r>
               <w:rPr>
@@ -1855,7 +1855,7 @@
               <w:szCs w:val="22"/>
             </w:rPr>
           </w:pPr>
-          <w:hyperlink w:anchor="_Toc244345592" w:history="1">
+          <w:hyperlink w:anchor="_Toc244361699" w:history="1">
             <w:r>
               <w:rPr>
                 <w:rStyle w:val="Hyperlink"/>
@@ -1879,7 +1879,7 @@
               <w:rPr>
                 <w:noProof/>
               </w:rPr>
-              <w:instrText xml:space="preserve"> PAGEREF _Toc244345592 \h </w:instrText>
+              <w:instrText xml:space="preserve"> PAGEREF _Toc244361699 \h </w:instrText>
             </w:r>
             <w:r>
               <w:rPr>
@@ -1919,7 +1919,7 @@
               <w:szCs w:val="22"/>
             </w:rPr>
           </w:pPr>
-          <w:hyperlink w:anchor="_Toc244345593" w:history="1">
+          <w:hyperlink w:anchor="_Toc244361700" w:history="1">
             <w:r>
               <w:rPr>
                 <w:rStyle w:val="Hyperlink"/>
@@ -1943,7 +1943,7 @@
               <w:rPr>
                 <w:noProof/>
               </w:rPr>
-              <w:instrText xml:space="preserve"> PAGEREF _Toc244345593 \h </w:instrText>
+              <w:instrText xml:space="preserve"> PAGEREF _Toc244361700 \h </w:instrText>
             </w:r>
             <w:r>
               <w:rPr>
@@ -1983,7 +1983,7 @@
               <w:szCs w:val="22"/>
             </w:rPr>
           </w:pPr>
-          <w:hyperlink w:anchor="_Toc244345594" w:history="1">
+          <w:hyperlink w:anchor="_Toc244361701" w:history="1">
             <w:r>
               <w:rPr>
                 <w:rStyle w:val="Hyperlink"/>
@@ -2007,7 +2007,7 @@
               <w:rPr>
                 <w:noProof/>
               </w:rPr>
-              <w:instrText xml:space="preserve"> PAGEREF _Toc244345594 \h </w:instrText>
+              <w:instrText xml:space="preserve"> PAGEREF _Toc244361701 \h </w:instrText>
             </w:r>
             <w:r>
               <w:rPr>
@@ -2047,7 +2047,7 @@
               <w:szCs w:val="22"/>
             </w:rPr>
           </w:pPr>
-          <w:hyperlink w:anchor="_Toc244345595" w:history="1">
+          <w:hyperlink w:anchor="_Toc244361702" w:history="1">
             <w:r>
               <w:rPr>
                 <w:rStyle w:val="Hyperlink"/>
@@ -2071,7 +2071,7 @@
               <w:rPr>
                 <w:noProof/>
               </w:rPr>
-              <w:instrText xml:space="preserve"> PAGEREF _Toc244345595 \h </w:instrText>
+              <w:instrText xml:space="preserve"> PAGEREF _Toc244361702 \h </w:instrText>
             </w:r>
             <w:r>
               <w:rPr>
@@ -2111,7 +2111,7 @@
               <w:szCs w:val="22"/>
             </w:rPr>
           </w:pPr>
-          <w:hyperlink w:anchor="_Toc244345596" w:history="1">
+          <w:hyperlink w:anchor="_Toc244361703" w:history="1">
             <w:r>
               <w:rPr>
                 <w:rStyle w:val="Hyperlink"/>
@@ -2135,7 +2135,7 @@
               <w:rPr>
                 <w:noProof/>
               </w:rPr>
-              <w:instrText xml:space="preserve"> PAGEREF _Toc244345596 \h </w:instrText>
+              <w:instrText xml:space="preserve"> PAGEREF _Toc244361703 \h </w:instrText>
             </w:r>
             <w:r>
               <w:rPr>
@@ -2175,7 +2175,7 @@
               <w:szCs w:val="22"/>
             </w:rPr>
           </w:pPr>
-          <w:hyperlink w:anchor="_Toc244345597" w:history="1">
+          <w:hyperlink w:anchor="_Toc244361704" w:history="1">
             <w:r>
               <w:rPr>
                 <w:rStyle w:val="Hyperlink"/>
@@ -2199,7 +2199,7 @@
               <w:rPr>
                 <w:noProof/>
               </w:rPr>
-              <w:instrText xml:space="preserve"> PAGEREF _Toc244345597 \h </w:instrText>
+              <w:instrText xml:space="preserve"> PAGEREF _Toc244361704 \h </w:instrText>
             </w:r>
             <w:r>
               <w:rPr>
@@ -2239,7 +2239,7 @@
               <w:szCs w:val="22"/>
             </w:rPr>
           </w:pPr>
-          <w:hyperlink w:anchor="_Toc244345598" w:history="1">
+          <w:hyperlink w:anchor="_Toc244361705" w:history="1">
             <w:r>
               <w:rPr>
                 <w:rStyle w:val="Hyperlink"/>
@@ -2263,7 +2263,7 @@
               <w:rPr>
                 <w:noProof/>
               </w:rPr>
-              <w:instrText xml:space="preserve"> PAGEREF _Toc244345598 \h </w:instrText>
+              <w:instrText xml:space="preserve"> PAGEREF _Toc244361705 \h </w:instrText>
             </w:r>
             <w:r>
               <w:rPr>
@@ -2303,7 +2303,7 @@
               <w:szCs w:val="22"/>
             </w:rPr>
           </w:pPr>
-          <w:hyperlink w:anchor="_Toc244345599" w:history="1">
+          <w:hyperlink w:anchor="_Toc244361706" w:history="1">
             <w:r>
               <w:rPr>
                 <w:rStyle w:val="Hyperlink"/>
@@ -2327,7 +2327,7 @@
               <w:rPr>
                 <w:noProof/>
               </w:rPr>
-              <w:instrText xml:space="preserve"> PAGEREF _Toc244345599 \h </w:instrText>
+              <w:instrText xml:space="preserve"> PAGEREF _Toc244361706 \h </w:instrText>
             </w:r>
             <w:r>
               <w:rPr>
@@ -2367,7 +2367,7 @@
               <w:szCs w:val="22"/>
             </w:rPr>
           </w:pPr>
-          <w:hyperlink w:anchor="_Toc244345600" w:history="1">
+          <w:hyperlink w:anchor="_Toc244361707" w:history="1">
             <w:r>
               <w:rPr>
                 <w:rStyle w:val="Hyperlink"/>
@@ -2391,7 +2391,7 @@
               <w:rPr>
                 <w:noProof/>
               </w:rPr>
-              <w:instrText xml:space="preserve"> PAGEREF _Toc244345600 \h </w:instrText>
+              <w:instrText xml:space="preserve"> PAGEREF _Toc244361707 \h </w:instrText>
             </w:r>
             <w:r>
               <w:rPr>
@@ -2431,7 +2431,7 @@
               <w:szCs w:val="22"/>
             </w:rPr>
           </w:pPr>
-          <w:hyperlink w:anchor="_Toc244345601" w:history="1">
+          <w:hyperlink w:anchor="_Toc244361708" w:history="1">
             <w:r>
               <w:rPr>
                 <w:rStyle w:val="Hyperlink"/>
@@ -2455,7 +2455,7 @@
               <w:rPr>
                 <w:noProof/>
               </w:rPr>
-              <w:instrText xml:space="preserve"> PAGEREF _Toc244345601 \h </w:instrText>
+              <w:instrText xml:space="preserve"> PAGEREF _Toc244361708 \h </w:instrText>
             </w:r>
             <w:r>
               <w:rPr>
@@ -2495,7 +2495,7 @@
               <w:szCs w:val="22"/>
             </w:rPr>
           </w:pPr>
-          <w:hyperlink w:anchor="_Toc244345602" w:history="1">
+          <w:hyperlink w:anchor="_Toc244361709" w:history="1">
             <w:r>
               <w:rPr>
                 <w:rStyle w:val="Hyperlink"/>
@@ -2519,7 +2519,7 @@
               <w:rPr>
                 <w:noProof/>
               </w:rPr>
-              <w:instrText xml:space="preserve"> PAGEREF _Toc244345602 \h </w:instrText>
+              <w:instrText xml:space="preserve"> PAGEREF _Toc244361709 \h </w:instrText>
             </w:r>
             <w:r>
               <w:rPr>
@@ -2559,7 +2559,7 @@
               <w:szCs w:val="22"/>
             </w:rPr>
           </w:pPr>
-          <w:hyperlink w:anchor="_Toc244345603" w:history="1">
+          <w:hyperlink w:anchor="_Toc244361710" w:history="1">
             <w:r>
               <w:rPr>
                 <w:rStyle w:val="Hyperlink"/>
@@ -2583,7 +2583,7 @@
               <w:rPr>
                 <w:noProof/>
               </w:rPr>
-              <w:instrText xml:space="preserve"> PAGEREF _Toc244345603 \h </w:instrText>
+              <w:instrText xml:space="preserve"> PAGEREF _Toc244361710 \h </w:instrText>
             </w:r>
             <w:r>
               <w:rPr>
@@ -2623,7 +2623,7 @@
               <w:szCs w:val="22"/>
             </w:rPr>
           </w:pPr>
-          <w:hyperlink w:anchor="_Toc244345604" w:history="1">
+          <w:hyperlink w:anchor="_Toc244361711" w:history="1">
             <w:r>
               <w:rPr>
                 <w:rStyle w:val="Hyperlink"/>
@@ -2647,7 +2647,7 @@
               <w:rPr>
                 <w:noProof/>
               </w:rPr>
-              <w:instrText xml:space="preserve"> PAGEREF _Toc244345604 \h </w:instrText>
+              <w:instrText xml:space="preserve"> PAGEREF _Toc244361711 \h </w:instrText>
             </w:r>
             <w:r>
               <w:rPr>
@@ -2687,7 +2687,7 @@
               <w:szCs w:val="22"/>
             </w:rPr>
           </w:pPr>
-          <w:hyperlink w:anchor="_Toc244345605" w:history="1">
+          <w:hyperlink w:anchor="_Toc244361712" w:history="1">
             <w:r>
               <w:rPr>
                 <w:rStyle w:val="Hyperlink"/>
@@ -2711,7 +2711,7 @@
               <w:rPr>
                 <w:noProof/>
               </w:rPr>
-              <w:instrText xml:space="preserve"> PAGEREF _Toc244345605 \h </w:instrText>
+              <w:instrText xml:space="preserve"> PAGEREF _Toc244361712 \h </w:instrText>
             </w:r>
             <w:r>
               <w:rPr>
@@ -2751,7 +2751,7 @@
               <w:szCs w:val="22"/>
             </w:rPr>
           </w:pPr>
-          <w:hyperlink w:anchor="_Toc244345606" w:history="1">
+          <w:hyperlink w:anchor="_Toc244361713" w:history="1">
             <w:r>
               <w:rPr>
                 <w:rStyle w:val="Hyperlink"/>
@@ -2775,7 +2775,7 @@
               <w:rPr>
                 <w:noProof/>
               </w:rPr>
-              <w:instrText xml:space="preserve"> PAGEREF _Toc244345606 \h </w:instrText>
+              <w:instrText xml:space="preserve"> PAGEREF _Toc244361713 \h </w:instrText>
             </w:r>
             <w:r>
               <w:rPr>
@@ -2815,7 +2815,7 @@
               <w:szCs w:val="22"/>
             </w:rPr>
           </w:pPr>
-          <w:hyperlink w:anchor="_Toc244345607" w:history="1">
+          <w:hyperlink w:anchor="_Toc244361714" w:history="1">
             <w:r>
               <w:rPr>
                 <w:rStyle w:val="Hyperlink"/>
@@ -2839,7 +2839,7 @@
               <w:rPr>
                 <w:noProof/>
               </w:rPr>
-              <w:instrText xml:space="preserve"> PAGEREF _Toc244345607 \h </w:instrText>
+              <w:instrText xml:space="preserve"> PAGEREF _Toc244361714 \h </w:instrText>
             </w:r>
             <w:r>
               <w:rPr>
@@ -2878,7 +2878,7 @@
         <w:pStyle w:val="Heading1"/>
         <w:pageBreakBefore/>
       </w:pPr>
-      <w:bookmarkStart w:id="0" w:name="_Toc244345566"/>
+      <w:bookmarkStart w:id="0" w:name="_Toc244361673"/>
       <w:r>
         <w:lastRenderedPageBreak/>
         <w:t>1. Sebelum Mulai: Istilah Dasar</w:t>
@@ -2897,7 +2897,7 @@
       <w:pPr>
         <w:pStyle w:val="Heading2"/>
       </w:pPr>
-      <w:bookmarkStart w:id="1" w:name="_Toc244345567"/>
+      <w:bookmarkStart w:id="1" w:name="_Toc244361674"/>
       <w:r>
         <w:t>1.1 Susunan materi: Tahap, Level, dan Sub level</w:t>
       </w:r>
@@ -4385,7 +4385,7 @@
       <w:pPr>
         <w:pStyle w:val="Heading2"/>
       </w:pPr>
-      <w:bookmarkStart w:id="2" w:name="_Toc244345568"/>
+      <w:bookmarkStart w:id="2" w:name="_Toc244361675"/>
       <w:r>
         <w:t>1.2 Istilah kemajuan dan nilai</w:t>
       </w:r>
@@ -5327,7 +5327,7 @@
       <w:pPr>
         <w:pStyle w:val="Heading2"/>
       </w:pPr>
-      <w:bookmarkStart w:id="3" w:name="_Toc244345569"/>
+      <w:bookmarkStart w:id="3" w:name="_Toc244361676"/>
       <w:r>
         <w:t>1.3 Sesi kelas dan latihan mandiri</w:t>
       </w:r>
@@ -6032,7 +6032,7 @@
       <w:pPr>
         <w:pStyle w:val="Heading2"/>
       </w:pPr>
-      <w:bookmarkStart w:id="4" w:name="_Toc244345570"/>
+      <w:bookmarkStart w:id="4" w:name="_Toc244361677"/>
       <w:r>
         <w:t>1.4 Ukuran waktu "7 hari" dan "30 hari"</w:t>
       </w:r>
@@ -6154,7 +6154,7 @@
       <w:pPr>
         <w:pStyle w:val="Heading2"/>
       </w:pPr>
-      <w:bookmarkStart w:id="5" w:name="_Toc244345571"/>
+      <w:bookmarkStart w:id="5" w:name="_Toc244361678"/>
       <w:r>
         <w:t>1.5 Arti warna label</w:t>
       </w:r>
@@ -6859,7 +6859,7 @@
       <w:pPr>
         <w:pStyle w:val="Heading2"/>
       </w:pPr>
-      <w:bookmarkStart w:id="6" w:name="_Toc244345572"/>
+      <w:bookmarkStart w:id="6" w:name="_Toc244361679"/>
       <w:r>
         <w:t>1.6 Aturan dan tahapan: cara sistem memilih</w:t>
       </w:r>
@@ -7934,7 +7934,7 @@
         <w:pStyle w:val="Heading1"/>
         <w:pageBreakBefore/>
       </w:pPr>
-      <w:bookmarkStart w:id="7" w:name="_Toc244345573"/>
+      <w:bookmarkStart w:id="7" w:name="_Toc244361680"/>
       <w:r>
         <w:lastRenderedPageBreak/>
         <w:t>2. Tab Sesi Kegiatan</w:t>
@@ -8081,7 +8081,7 @@
       <w:pPr>
         <w:pStyle w:val="Heading2"/>
       </w:pPr>
-      <w:bookmarkStart w:id="8" w:name="_Toc244345574"/>
+      <w:bookmarkStart w:id="8" w:name="_Toc244361681"/>
       <w:r>
         <w:t>2.1 Bilah saringan</w:t>
       </w:r>
@@ -8581,7 +8581,7 @@
       <w:pPr>
         <w:pStyle w:val="Heading2"/>
       </w:pPr>
-      <w:bookmarkStart w:id="9" w:name="_Toc244345575"/>
+      <w:bookmarkStart w:id="9" w:name="_Toc244361682"/>
       <w:r>
         <w:t>2.2 Kartu Sesi latihan</w:t>
       </w:r>
@@ -9398,7 +9398,7 @@
       <w:pPr>
         <w:pStyle w:val="Heading2"/>
       </w:pPr>
-      <w:bookmarkStart w:id="10" w:name="_Toc244345576"/>
+      <w:bookmarkStart w:id="10" w:name="_Toc244361683"/>
       <w:r>
         <w:t>2.3 Kotak Aturan dan tahapan yang berlaku</w:t>
       </w:r>
@@ -9751,7 +9751,7 @@
       <w:pPr>
         <w:pStyle w:val="Heading2"/>
       </w:pPr>
-      <w:bookmarkStart w:id="11" w:name="_Toc244345577"/>
+      <w:bookmarkStart w:id="11" w:name="_Toc244361684"/>
       <w:r>
         <w:t>2.4 Enam kotak ringkasan</w:t>
       </w:r>
@@ -10883,7 +10883,7 @@
       <w:pPr>
         <w:pStyle w:val="Heading2"/>
       </w:pPr>
-      <w:bookmarkStart w:id="12" w:name="_Toc244345578"/>
+      <w:bookmarkStart w:id="12" w:name="_Toc244361685"/>
       <w:r>
         <w:t>2.5 Tabel siswa</w:t>
       </w:r>
@@ -11448,7 +11448,7 @@
       <w:pPr>
         <w:pStyle w:val="Heading2"/>
       </w:pPr>
-      <w:bookmarkStart w:id="13" w:name="_Toc244345579"/>
+      <w:bookmarkStart w:id="13" w:name="_Toc244361686"/>
       <w:r>
         <w:t>2.6 Arti kolom Status</w:t>
       </w:r>
@@ -12464,7 +12464,7 @@
       <w:pPr>
         <w:pStyle w:val="Heading2"/>
       </w:pPr>
-      <w:bookmarkStart w:id="14" w:name="_Toc244345580"/>
+      <w:bookmarkStart w:id="14" w:name="_Toc244361687"/>
       <w:r>
         <w:t>2.7 Bilah aksi untuk siswa terpilih</w:t>
       </w:r>
@@ -12892,7 +12892,7 @@
         <w:pStyle w:val="Heading1"/>
         <w:pageBreakBefore/>
       </w:pPr>
-      <w:bookmarkStart w:id="15" w:name="_Toc244345581"/>
+      <w:bookmarkStart w:id="15" w:name="_Toc244361688"/>
       <w:r>
         <w:lastRenderedPageBreak/>
         <w:t>3. Tab Perkembangan Siswa</w:t>
@@ -12982,7 +12982,7 @@
       <w:pPr>
         <w:pStyle w:val="Heading2"/>
       </w:pPr>
-      <w:bookmarkStart w:id="16" w:name="_Toc244345582"/>
+      <w:bookmarkStart w:id="16" w:name="_Toc244361689"/>
       <w:r>
         <w:t>3.1 Sub-tab Rekapitulasi</w:t>
       </w:r>
@@ -13275,7 +13275,7 @@
       <w:pPr>
         <w:pStyle w:val="Heading2"/>
       </w:pPr>
-      <w:bookmarkStart w:id="17" w:name="_Toc244345583"/>
+      <w:bookmarkStart w:id="17" w:name="_Toc244361690"/>
       <w:r>
         <w:lastRenderedPageBreak/>
         <w:t>3.2 Sub-tab Per Siswa</w:t>
@@ -16467,7 +16467,7 @@
       <w:pPr>
         <w:pStyle w:val="Heading2"/>
       </w:pPr>
-      <w:bookmarkStart w:id="18" w:name="_Toc244345584"/>
+      <w:bookmarkStart w:id="18" w:name="_Toc244361691"/>
       <w:r>
         <w:t>3.3 Ringkasan keseluruhan (bagian bawah Rekapitulasi)</w:t>
       </w:r>
@@ -18172,7 +18172,7 @@
       <w:pPr>
         <w:pStyle w:val="Heading2"/>
       </w:pPr>
-      <w:bookmarkStart w:id="19" w:name="_Toc244345585"/>
+      <w:bookmarkStart w:id="19" w:name="_Toc244361692"/>
       <w:r>
         <w:lastRenderedPageBreak/>
         <w:t>3.4 Sub-tab Peringkat</w:t>
@@ -21920,7 +21920,7 @@
         <w:pStyle w:val="Heading1"/>
         <w:pageBreakBefore/>
       </w:pPr>
-      <w:bookmarkStart w:id="20" w:name="_Toc244345586"/>
+      <w:bookmarkStart w:id="20" w:name="_Toc244361693"/>
       <w:r>
         <w:lastRenderedPageBreak/>
         <w:t>4. Tab Analisis Siswa</w:t>
@@ -23291,7 +23291,7 @@
       <w:pPr>
         <w:pStyle w:val="Heading2"/>
       </w:pPr>
-      <w:bookmarkStart w:id="21" w:name="_Toc244345587"/>
+      <w:bookmarkStart w:id="21" w:name="_Toc244361694"/>
       <w:r>
         <w:t>4.1 Kartu identitas</w:t>
       </w:r>
@@ -23339,7 +23339,7 @@
       <w:pPr>
         <w:pStyle w:val="Heading2"/>
       </w:pPr>
-      <w:bookmarkStart w:id="22" w:name="_Toc244345588"/>
+      <w:bookmarkStart w:id="22" w:name="_Toc244361695"/>
       <w:r>
         <w:t>4.2 Enam kotak ringkasan</w:t>
       </w:r>
@@ -24367,7 +24367,7 @@
       <w:pPr>
         <w:pStyle w:val="Heading2"/>
       </w:pPr>
-      <w:bookmarkStart w:id="23" w:name="_Toc244345589"/>
+      <w:bookmarkStart w:id="23" w:name="_Toc244361696"/>
       <w:r>
         <w:t>4.3 Kotak terkunci dan Aturan yang berlaku</w:t>
       </w:r>
@@ -24565,7 +24565,7 @@
       <w:pPr>
         <w:pStyle w:val="Heading2"/>
       </w:pPr>
-      <w:bookmarkStart w:id="24" w:name="_Toc244345590"/>
+      <w:bookmarkStart w:id="24" w:name="_Toc244361697"/>
       <w:r>
         <w:t>4.4 Catatan otomatis</w:t>
       </w:r>
@@ -25237,7 +25237,7 @@
       <w:pPr>
         <w:pStyle w:val="Heading2"/>
       </w:pPr>
-      <w:bookmarkStart w:id="25" w:name="_Toc244345591"/>
+      <w:bookmarkStart w:id="25" w:name="_Toc244361698"/>
       <w:r>
         <w:lastRenderedPageBreak/>
         <w:t>4.5 Riwayat semester (arsip)</w:t>
@@ -25336,7 +25336,7 @@
       <w:pPr>
         <w:pStyle w:val="Heading2"/>
       </w:pPr>
-      <w:bookmarkStart w:id="26" w:name="_Toc244345592"/>
+      <w:bookmarkStart w:id="26" w:name="_Toc244361699"/>
       <w:r>
         <w:t>4.6 Kartu Latihan mandiri (di luar sesi)</w:t>
       </w:r>
@@ -25862,7 +25862,7 @@
       <w:pPr>
         <w:pStyle w:val="Heading2"/>
       </w:pPr>
-      <w:bookmarkStart w:id="27" w:name="_Toc244345593"/>
+      <w:bookmarkStart w:id="27" w:name="_Toc244361700"/>
       <w:r>
         <w:t>4.7 Grafik Kemajuan sub level lulus</w:t>
       </w:r>
@@ -26248,7 +26248,7 @@
       <w:pPr>
         <w:pStyle w:val="Heading2"/>
       </w:pPr>
-      <w:bookmarkStart w:id="28" w:name="_Toc244345594"/>
+      <w:bookmarkStart w:id="28" w:name="_Toc244361701"/>
       <w:r>
         <w:t>4.8 Kegiatan per jenis</w:t>
       </w:r>
@@ -27216,7 +27216,7 @@
       <w:pPr>
         <w:pStyle w:val="Heading2"/>
       </w:pPr>
-      <w:bookmarkStart w:id="29" w:name="_Toc244345595"/>
+      <w:bookmarkStart w:id="29" w:name="_Toc244361702"/>
       <w:r>
         <w:t>4.9 Per tahap</w:t>
       </w:r>
@@ -27584,7 +27584,7 @@
       <w:pPr>
         <w:pStyle w:val="Heading2"/>
       </w:pPr>
-      <w:bookmarkStart w:id="30" w:name="_Toc244345596"/>
+      <w:bookmarkStart w:id="30" w:name="_Toc244361703"/>
       <w:r>
         <w:t>4.10 Hasil di bawah 80% terakhir</w:t>
       </w:r>
@@ -28114,7 +28114,7 @@
       <w:pPr>
         <w:pStyle w:val="Heading2"/>
       </w:pPr>
-      <w:bookmarkStart w:id="31" w:name="_Toc244345597"/>
+      <w:bookmarkStart w:id="31" w:name="_Toc244361704"/>
       <w:r>
         <w:t>4.11 Riwayat sub level lulus</w:t>
       </w:r>
@@ -28642,7 +28642,7 @@
       <w:pPr>
         <w:pStyle w:val="Heading2"/>
       </w:pPr>
-      <w:bookmarkStart w:id="32" w:name="_Toc244345598"/>
+      <w:bookmarkStart w:id="32" w:name="_Toc244361705"/>
       <w:r>
         <w:t>4.12 Aturan dan tahapan siswa ini, Hapus data latihan</w:t>
       </w:r>
@@ -28832,7 +28832,7 @@
         <w:pStyle w:val="Heading1"/>
         <w:pageBreakBefore/>
       </w:pPr>
-      <w:bookmarkStart w:id="33" w:name="_Toc244345599"/>
+      <w:bookmarkStart w:id="33" w:name="_Toc244361706"/>
       <w:r>
         <w:lastRenderedPageBreak/>
         <w:t>5. Dari Data ke Tindakan</w:t>
@@ -28843,7 +28843,7 @@
       <w:pPr>
         <w:pStyle w:val="Heading2"/>
       </w:pPr>
-      <w:bookmarkStart w:id="34" w:name="_Toc244345600"/>
+      <w:bookmarkStart w:id="34" w:name="_Toc244361707"/>
       <w:r>
         <w:t>5.1 Situasi umum dan tindakan</w:t>
       </w:r>
@@ -30039,7 +30039,7 @@
         <w:pStyle w:val="Heading2"/>
         <w:pageBreakBefore/>
       </w:pPr>
-      <w:bookmarkStart w:id="35" w:name="_Toc244345601"/>
+      <w:bookmarkStart w:id="35" w:name="_Toc244361708"/>
       <w:r>
         <w:lastRenderedPageBreak/>
         <w:t>5.2 Tanya jawab singkat</w:t>
@@ -31110,7 +31110,7 @@
         <w:pStyle w:val="Heading1"/>
         <w:pageBreakBefore/>
       </w:pPr>
-      <w:bookmarkStart w:id="36" w:name="_Toc244345602"/>
+      <w:bookmarkStart w:id="36" w:name="_Toc244361709"/>
       <w:r>
         <w:lastRenderedPageBreak/>
         <w:t>6. Bila Siswa Gagal Merekam Suara</w:t>
@@ -31136,20 +31136,10 @@
           <w:b/>
           <w:bCs/>
         </w:rPr>
-        <w:t>🎤</w:t>
-      </w:r>
-      <w:r>
-        <w:rPr>
-          <w:b/>
-          <w:bCs/>
-        </w:rPr>
-        <w:t xml:space="preserve"> Ucapkan</w:t>
-      </w:r>
-      <w:r>
-        <w:t xml:space="preserve"> memakai mikrofon HP dan pengenal suara bawaan browser. Pengenal suara itu mengirim suara siswa ke server Google untuk diubah menjadi teks. Karena itu perekaman hanya berjalan bila tiga hal terpenuhi: browser yang tepat, izin mikrofon, dan internet yang la</w:t>
-      </w:r>
-      <w:r>
-        <w:t>ncar.</w:t>
+        <w:t>🎤 Ucapkan</w:t>
+      </w:r>
+      <w:r>
+        <w:t xml:space="preserve"> memakai mikrofon HP dan pengenal suara bawaan browser. Pengenal suara itu mengirim suara siswa ke server Google untuk diubah menjadi teks. Karena itu perekaman hanya berjalan bila tiga hal terpenuhi: browser yang tepat, izin mikrofon, dan internet yang lancar.</w:t>
       </w:r>
     </w:p>
     <w:tbl>
@@ -31250,16 +31240,7 @@
                 <w:sz w:val="19"/>
                 <w:szCs w:val="19"/>
               </w:rPr>
-              <w:t>tersen</w:t>
-            </w:r>
-            <w:r>
-              <w:rPr>
-                <w:b/>
-                <w:bCs/>
-                <w:sz w:val="19"/>
-                <w:szCs w:val="19"/>
-              </w:rPr>
-              <w:t>dat</w:t>
+              <w:t>tersendat</w:t>
             </w:r>
             <w:r>
               <w:rPr>
@@ -31281,7 +31262,7 @@
       <w:pPr>
         <w:pStyle w:val="Heading2"/>
       </w:pPr>
-      <w:bookmarkStart w:id="37" w:name="_Toc244345603"/>
+      <w:bookmarkStart w:id="37" w:name="_Toc244361710"/>
       <w:r>
         <w:t>6.1 Mengenali siswa yang gagal merekam</w:t>
       </w:r>
@@ -31304,10 +31285,7 @@
         <w:t>Saat sesi berjalan.</w:t>
       </w:r>
       <w:r>
-        <w:t xml:space="preserve"> Siswa </w:t>
-      </w:r>
-      <w:r>
-        <w:t xml:space="preserve">berstatus </w:t>
+        <w:t xml:space="preserve"> Siswa berstatus </w:t>
       </w:r>
       <w:r>
         <w:rPr>
@@ -31337,16 +31315,7 @@
         <w:t>Sesudah sesi.</w:t>
       </w:r>
       <w:r>
-        <w:t xml:space="preserve"> Buka Analisis Siswa untuk siswa itu. Pada tanggal</w:t>
-      </w:r>
-      <w:r>
-        <w:t xml:space="preserve"> sesi tidak ada hasil Baca atau </w:t>
-      </w:r>
-      <w:r>
-        <w:t>🎤</w:t>
-      </w:r>
-      <w:r>
-        <w:t xml:space="preserve"> Ucapkan, padahal ada kegiatan Dengar dan waktu latihannya panjang.</w:t>
+        <w:t xml:space="preserve"> Buka Analisis Siswa untuk siswa itu. Pada tanggal sesi tidak ada hasil Baca atau 🎤 Ucapkan, padahal ada kegiatan Dengar dan waktu latihannya panjang.</w:t>
       </w:r>
     </w:p>
     <w:p>
@@ -31456,14 +31425,7 @@
                 <w:sz w:val="19"/>
                 <w:szCs w:val="19"/>
               </w:rPr>
-              <w:t>: paling banyak 5% kata, atau 2 kata, yang terlewat. S</w:t>
-            </w:r>
-            <w:r>
-              <w:rPr>
-                <w:sz w:val="19"/>
-                <w:szCs w:val="19"/>
-              </w:rPr>
-              <w:t>iswa yang berhenti di tengah melihat kata-kata berwarna, tetapi tidak ada nilai yang tercatat. Siswa sering mengira rekamannya gagal.</w:t>
+              <w:t>: paling banyak 5% kata, atau 2 kata, yang terlewat. Siswa yang berhenti di tengah melihat kata-kata berwarna, tetapi tidak ada nilai yang tercatat. Siswa sering mengira rekamannya gagal.</w:t>
             </w:r>
           </w:p>
           <w:p>
@@ -31490,12 +31452,9 @@
       <w:pPr>
         <w:pStyle w:val="Heading2"/>
       </w:pPr>
-      <w:bookmarkStart w:id="38" w:name="_Toc244345604"/>
-      <w:r>
-        <w:t xml:space="preserve">6.2 Pesan di layar </w:t>
-      </w:r>
-      <w:r>
-        <w:t>siswa dan artinya</w:t>
+      <w:bookmarkStart w:id="38" w:name="_Toc244361711"/>
+      <w:r>
+        <w:t>6.2 Pesan di layar siswa dan artinya</w:t>
       </w:r>
       <w:bookmarkEnd w:id="38"/>
     </w:p>
@@ -31504,13 +31463,7 @@
         <w:spacing w:after="120" w:line="276" w:lineRule="auto"/>
       </w:pPr>
       <w:r>
-        <w:t xml:space="preserve">Pesan berikut muncul di bawah teks (Baca &amp; Koreksi) atau di bawah tombol </w:t>
-      </w:r>
-      <w:r>
-        <w:t>🎤</w:t>
-      </w:r>
-      <w:r>
-        <w:t xml:space="preserve"> (soal Ucapkan).</w:t>
+        <w:t>Judul pesan berikut muncul di bawah teks (Baca &amp; Koreksi) atau di bawah tombol 🎤 (soal Ucapkan). Sejak 31 Oktober 2026 setiap pesan dilengkapi penjelasan apa yang terjadi, langkah perbaikan, daftar semua kemungkinan penyebab, dan alasan mengapa ini bukan kerusakan aplikasi. Di halaman bacaan juga ada tautan "Tips agar rekaman berhasil".</w:t>
       </w:r>
     </w:p>
     <w:tbl>
@@ -31665,21 +31618,7 @@
                 <w:sz w:val="19"/>
                 <w:szCs w:val="19"/>
               </w:rPr>
-              <w:t>⚠</w:t>
-            </w:r>
-            <w:r>
-              <w:rPr>
-                <w:sz w:val="19"/>
-                <w:szCs w:val="19"/>
-              </w:rPr>
-              <w:t>️</w:t>
-            </w:r>
-            <w:r>
-              <w:rPr>
-                <w:sz w:val="19"/>
-                <w:szCs w:val="19"/>
-              </w:rPr>
-              <w:t xml:space="preserve"> Buka di Chrome agar koreksi suara berjalan</w:t>
+              <w:t>⚠️ Buka di Chrome agar koreksi suara berjalan</w:t>
             </w:r>
           </w:p>
         </w:tc>
@@ -31774,21 +31713,7 @@
                 <w:sz w:val="19"/>
                 <w:szCs w:val="19"/>
               </w:rPr>
-              <w:t>⚠</w:t>
-            </w:r>
-            <w:r>
-              <w:rPr>
-                <w:sz w:val="19"/>
-                <w:szCs w:val="19"/>
-              </w:rPr>
-              <w:t>️</w:t>
-            </w:r>
-            <w:r>
-              <w:rPr>
-                <w:sz w:val="19"/>
-                <w:szCs w:val="19"/>
-              </w:rPr>
-              <w:t xml:space="preserve"> Brave memblokir pengenal suara / Browser ini belum mendukung koreksi suara</w:t>
+              <w:t>⚠️ Brave memblokir pengenal suara / Browser ini belum mendukung koreksi suara</w:t>
             </w:r>
           </w:p>
         </w:tc>
@@ -31883,7 +31808,7 @@
                 <w:sz w:val="19"/>
                 <w:szCs w:val="19"/>
               </w:rPr>
-              <w:t>Izin mikrofon ditolak…</w:t>
+              <w:t>Izin mikrofon belum diberikan</w:t>
             </w:r>
           </w:p>
         </w:tc>
@@ -31978,7 +31903,8 @@
                 <w:sz w:val="19"/>
                 <w:szCs w:val="19"/>
               </w:rPr>
-              <w:t>Pengenal suara membutuhkan internet…</w:t>
+              <w:lastRenderedPageBreak/>
+              <w:t>Internet tidak sampai ke pengenal suara</w:t>
             </w:r>
           </w:p>
         </w:tc>
@@ -32073,8 +31999,7 @@
                 <w:sz w:val="19"/>
                 <w:szCs w:val="19"/>
               </w:rPr>
-              <w:lastRenderedPageBreak/>
-              <w:t>Pengenal suara tidak diizinkan di browser ini</w:t>
+              <w:t>Pengenal suara tidak aktif di perangkat ini</w:t>
             </w:r>
           </w:p>
         </w:tc>
@@ -32169,7 +32094,7 @@
                 <w:sz w:val="19"/>
                 <w:szCs w:val="19"/>
               </w:rPr>
-              <w:t>Mikrofon tidak ditemukan…</w:t>
+              <w:t>Mikrofon tidak bisa dipakai</w:t>
             </w:r>
           </w:p>
         </w:tc>
@@ -32264,7 +32189,7 @@
                 <w:sz w:val="19"/>
                 <w:szCs w:val="19"/>
               </w:rPr>
-              <w:t>Bahasa Inggris tidak didukung pengenal suara…</w:t>
+              <w:t>Bahasa Inggris belum tersedia di pengenal suara HP ini</w:t>
             </w:r>
           </w:p>
         </w:tc>
@@ -32359,7 +32284,7 @@
                 <w:sz w:val="19"/>
                 <w:szCs w:val="19"/>
               </w:rPr>
-              <w:t>Pengenal suara gagal dinyalakan…</w:t>
+              <w:t>Pengenal suara belum siap</w:t>
             </w:r>
           </w:p>
         </w:tc>
@@ -32454,7 +32379,7 @@
                 <w:sz w:val="19"/>
                 <w:szCs w:val="19"/>
               </w:rPr>
-              <w:t>Mikrofon menangkap suaramu, tetapi pengenal suara belum mengenali kata apa pun…</w:t>
+              <w:t>Suaramu terdengar, tetapi belum dikenali sebagai kata</w:t>
             </w:r>
           </w:p>
         </w:tc>
@@ -32549,7 +32474,7 @@
                 <w:sz w:val="19"/>
                 <w:szCs w:val="19"/>
               </w:rPr>
-              <w:t>Tidak ada suara yang terdengar…</w:t>
+              <w:t>Tidak ada suara yang terdengar</w:t>
             </w:r>
           </w:p>
         </w:tc>
@@ -32624,7 +32549,7 @@
       <w:pPr>
         <w:pStyle w:val="Heading2"/>
       </w:pPr>
-      <w:bookmarkStart w:id="39" w:name="_Toc244345605"/>
+      <w:bookmarkStart w:id="39" w:name="_Toc244361712"/>
       <w:r>
         <w:t>6.3 Langkah perbaikan berurutan</w:t>
       </w:r>
@@ -32698,14 +32623,7 @@
           <w:b/>
           <w:bCs/>
         </w:rPr>
-        <w:t>Mikr</w:t>
-      </w:r>
-      <w:r>
-        <w:rPr>
-          <w:b/>
-          <w:bCs/>
-        </w:rPr>
-        <w:t>ofon</w:t>
+        <w:t>Mikrofon</w:t>
       </w:r>
       <w:r>
         <w:t xml:space="preserve"> ke </w:t>
@@ -32771,10 +32689,7 @@
         <w:t>Google</w:t>
       </w:r>
       <w:r>
-        <w:t xml:space="preserve"> di Play Store. Di sebagian HP Android (Xiaomi, Oppo, Vivo, dll.) layanan suara Google perlu akti</w:t>
-      </w:r>
-      <w:r>
-        <w:t>f agar pengenal suara berjalan.</w:t>
+        <w:t xml:space="preserve"> di Play Store. Di sebagian HP Android (Xiaomi, Oppo, Vivo, dll.) layanan suara Google perlu aktif agar pengenal suara berjalan.</w:t>
       </w:r>
     </w:p>
     <w:p>
@@ -32822,7 +32737,7 @@
       <w:pPr>
         <w:pStyle w:val="Heading2"/>
       </w:pPr>
-      <w:bookmarkStart w:id="40" w:name="_Toc244345606"/>
+      <w:bookmarkStart w:id="40" w:name="_Toc244361713"/>
       <w:r>
         <w:t>6.4 Bila tetap gagal: pasang Tanpa Baca</w:t>
       </w:r>
@@ -32833,10 +32748,7 @@
         <w:spacing w:after="120" w:line="276" w:lineRule="auto"/>
       </w:pPr>
       <w:r>
-        <w:t>Agar siswa tidak ter</w:t>
-      </w:r>
-      <w:r>
-        <w:t>tahan, matikan syarat membaca khusus untuk siswa tersebut:</w:t>
+        <w:t>Agar siswa tidak tertahan, matikan syarat membaca khusus untuk siswa tersebut:</w:t>
       </w:r>
     </w:p>
     <w:p>
@@ -33019,32 +32931,16 @@
                 <w:sz w:val="19"/>
                 <w:szCs w:val="19"/>
               </w:rPr>
-              <w:t xml:space="preserve">Tanpa Baca hanya melepas syarat membaca teks sebelum sub </w:t>
-            </w:r>
-            <w:r>
-              <w:rPr>
-                <w:sz w:val="19"/>
-                <w:szCs w:val="19"/>
-              </w:rPr>
-              <w:t xml:space="preserve">level. Soal </w:t>
-            </w:r>
-            <w:r>
-              <w:rPr>
-                <w:b/>
-                <w:bCs/>
-                <w:sz w:val="19"/>
-                <w:szCs w:val="19"/>
-              </w:rPr>
-              <w:t>🎤</w:t>
-            </w:r>
-            <w:r>
-              <w:rPr>
-                <w:b/>
-                <w:bCs/>
-                <w:sz w:val="19"/>
-                <w:szCs w:val="19"/>
-              </w:rPr>
-              <w:t xml:space="preserve"> Ucapkan</w:t>
+              <w:t xml:space="preserve">Tanpa Baca hanya melepas syarat membaca teks sebelum sub level. Soal </w:t>
+            </w:r>
+            <w:r>
+              <w:rPr>
+                <w:b/>
+                <w:bCs/>
+                <w:sz w:val="19"/>
+                <w:szCs w:val="19"/>
+              </w:rPr>
+              <w:t>🎤 Ucapkan</w:t>
             </w:r>
             <w:r>
               <w:rPr>
@@ -33063,14 +32959,7 @@
                 <w:sz w:val="19"/>
                 <w:szCs w:val="19"/>
               </w:rPr>
-              <w:t>Untuk satu kelas yang sinyalnya buruk, Tanpa Baca bisa dipasang di profil aturan rombel. Kembalikan</w:t>
-            </w:r>
-            <w:r>
-              <w:rPr>
-                <w:sz w:val="19"/>
-                <w:szCs w:val="19"/>
-              </w:rPr>
-              <w:t xml:space="preserve"> ke Harus Baca bila keadaan sudah normal.</w:t>
+              <w:t>Untuk satu kelas yang sinyalnya buruk, Tanpa Baca bisa dipasang di profil aturan rombel. Kembalikan ke Harus Baca bila keadaan sudah normal.</w:t>
             </w:r>
           </w:p>
         </w:tc>
@@ -33085,9 +32974,8 @@
       <w:pPr>
         <w:pStyle w:val="Heading2"/>
       </w:pPr>
-      <w:bookmarkStart w:id="41" w:name="_Toc244345607"/>
-      <w:r>
-        <w:lastRenderedPageBreak/>
+      <w:bookmarkStart w:id="41" w:name="_Toc244361714"/>
+      <w:r>
         <w:t>6.5 Mencegah sebelum sesi</w:t>
       </w:r>
       <w:bookmarkEnd w:id="41"/>
@@ -33115,10 +33003,7 @@
         <w:spacing w:after="60" w:line="276" w:lineRule="auto"/>
       </w:pPr>
       <w:r>
-        <w:t>Minta siswa mencoba Baca &amp; Koreksi sekali sebelum sesi pertama, agar izin mikrofon sudah dibe</w:t>
-      </w:r>
-      <w:r>
-        <w:t>rikan.</w:t>
+        <w:t>Minta siswa mencoba Baca &amp; Koreksi sekali sebelum sesi pertama, agar izin mikrofon sudah diberikan.</w:t>
       </w:r>
     </w:p>
     <w:p>

</xml_diff>